<commit_message>
transformando la comunidad y el control d las actividades culturales. Un poquito
</commit_message>
<xml_diff>
--- a/docs/Servilo_Kerno Cult API Justificacion .docx
+++ b/docs/Servilo_Kerno Cult API Justificacion .docx
@@ -69,12 +69,6 @@
         <w:gridCol w:w="1815"/>
       </w:tblGrid>
       <w:tr>
-        <w:tblPrEx>
-          <w:tblCellMar>
-            <w:top w:w="0" w:type="dxa"/>
-            <w:bottom w:w="0" w:type="dxa"/>
-          </w:tblCellMar>
-        </w:tblPrEx>
         <w:trPr>
           <w:trHeight w:val="468"/>
         </w:trPr>
@@ -1349,6 +1343,25 @@
         </w:tc>
       </w:tr>
     </w:tbl>
+    <w:p>
+      <w:pPr>
+        <w:pStyle w:val="Encabezadonivel1"/>
+      </w:pPr>
+    </w:p>
+    <w:p>
+      <w:pPr>
+        <w:suppressAutoHyphens w:val="0"/>
+        <w:rPr>
+          <w:rFonts w:ascii="Arial" w:eastAsia="Arial" w:hAnsi="Arial" w:cs="Arial"/>
+          <w:b/>
+          <w:sz w:val="24"/>
+          <w:u w:val="single"/>
+        </w:rPr>
+      </w:pPr>
+      <w:r>
+        <w:br w:type="page"/>
+      </w:r>
+    </w:p>
     <w:p>
       <w:pPr>
         <w:pStyle w:val="Encabezadonivel1"/>
@@ -1791,7 +1804,6 @@
               <w:rPr>
                 <w:lang w:val="es-ES"/>
               </w:rPr>
-              <w:lastRenderedPageBreak/>
               <w:t>search</w:t>
             </w:r>
             <w:proofErr w:type="spellEnd"/>
@@ -1832,7 +1844,6 @@
               <w:rPr>
                 <w:lang w:val="es-ES"/>
               </w:rPr>
-              <w:lastRenderedPageBreak/>
               <w:t>Dependencia</w:t>
             </w:r>
           </w:p>
@@ -1870,11 +1881,7 @@
         </w:tc>
       </w:tr>
     </w:tbl>
-    <w:p>
-      <w:pPr>
-        <w:pageBreakBefore/>
-      </w:pPr>
-    </w:p>
+    <w:p/>
     <w:p>
       <w:r>
         <w:rPr>
@@ -2451,6 +2458,27 @@
     </w:p>
     <w:p>
       <w:pPr>
+        <w:suppressAutoHyphens w:val="0"/>
+        <w:rPr>
+          <w:lang w:val="es-ES"/>
+        </w:rPr>
+      </w:pPr>
+      <w:r>
+        <w:rPr>
+          <w:lang w:val="es-ES"/>
+        </w:rPr>
+        <w:br w:type="page"/>
+      </w:r>
+    </w:p>
+    <w:p>
+      <w:pPr>
+        <w:rPr>
+          <w:lang w:val="es-ES"/>
+        </w:rPr>
+      </w:pPr>
+    </w:p>
+    <w:p>
+      <w:pPr>
         <w:pStyle w:val="Heading2"/>
       </w:pPr>
       <w:proofErr w:type="spellStart"/>
@@ -3439,31 +3467,87 @@
               <w:rPr>
                 <w:lang w:val="es-ES"/>
               </w:rPr>
-              <w:t>Proyecto_Sociocultural_Comunitario</w:t>
-            </w:r>
-            <w:proofErr w:type="spellEnd"/>
-          </w:p>
-          <w:p>
-            <w:pPr>
-              <w:spacing w:after="0"/>
-              <w:rPr>
-                <w:lang w:val="es-ES"/>
-              </w:rPr>
-            </w:pPr>
-            <w:r>
-              <w:rPr>
-                <w:lang w:val="es-ES"/>
-              </w:rPr>
-              <w:t>nombre: nombre del proyecto</w:t>
-            </w:r>
-          </w:p>
-          <w:p>
-            <w:pPr>
-              <w:spacing w:after="0"/>
-              <w:rPr>
-                <w:lang w:val="es-ES"/>
-              </w:rPr>
-            </w:pPr>
+              <w:t>p</w:t>
+            </w:r>
+            <w:r>
+              <w:rPr>
+                <w:lang w:val="es-ES"/>
+              </w:rPr>
+              <w:t>royecto_</w:t>
+            </w:r>
+            <w:r>
+              <w:rPr>
+                <w:lang w:val="es-ES"/>
+              </w:rPr>
+              <w:t>s</w:t>
+            </w:r>
+            <w:r>
+              <w:rPr>
+                <w:lang w:val="es-ES"/>
+              </w:rPr>
+              <w:t>ociocultural_</w:t>
+            </w:r>
+            <w:r>
+              <w:rPr>
+                <w:lang w:val="es-ES"/>
+              </w:rPr>
+              <w:t>c</w:t>
+            </w:r>
+            <w:r>
+              <w:rPr>
+                <w:lang w:val="es-ES"/>
+              </w:rPr>
+              <w:t>omunitario</w:t>
+            </w:r>
+            <w:proofErr w:type="spellEnd"/>
+          </w:p>
+          <w:p>
+            <w:pPr>
+              <w:spacing w:after="0"/>
+              <w:rPr>
+                <w:lang w:val="es-ES"/>
+              </w:rPr>
+            </w:pPr>
+            <w:proofErr w:type="spellStart"/>
+            <w:r>
+              <w:rPr>
+                <w:lang w:val="es-ES"/>
+              </w:rPr>
+              <w:t>n</w:t>
+            </w:r>
+            <w:r>
+              <w:rPr>
+                <w:lang w:val="es-ES"/>
+              </w:rPr>
+              <w:t>a</w:t>
+            </w:r>
+            <w:r>
+              <w:rPr>
+                <w:lang w:val="es-ES"/>
+              </w:rPr>
+              <w:t>me</w:t>
+            </w:r>
+            <w:proofErr w:type="spellEnd"/>
+            <w:r>
+              <w:rPr>
+                <w:lang w:val="es-ES"/>
+              </w:rPr>
+              <w:t>: nombre del proyecto</w:t>
+            </w:r>
+          </w:p>
+          <w:p>
+            <w:pPr>
+              <w:spacing w:after="0"/>
+              <w:rPr>
+                <w:lang w:val="es-ES"/>
+              </w:rPr>
+            </w:pPr>
+            <w:r>
+              <w:rPr>
+                <w:lang w:val="es-ES"/>
+              </w:rPr>
+              <w:t xml:space="preserve">//no -&gt; </w:t>
+            </w:r>
             <w:r>
               <w:rPr>
                 <w:lang w:val="es-ES"/>
@@ -3576,49 +3660,45 @@
               <w:rPr>
                 <w:lang w:val="es-ES"/>
               </w:rPr>
-              <w:t xml:space="preserve">aprobado: contrato que lo </w:t>
-            </w:r>
-            <w:proofErr w:type="gramStart"/>
-            <w:r>
-              <w:rPr>
-                <w:lang w:val="es-ES"/>
-              </w:rPr>
-              <w:t>aprueba[</w:t>
-            </w:r>
-            <w:proofErr w:type="gramEnd"/>
-            <w:r>
-              <w:rPr>
-                <w:lang w:val="es-ES"/>
-              </w:rPr>
-              <w:t>acuerdo #x acta #x fecha día del mes del año]</w:t>
-            </w:r>
-          </w:p>
-          <w:p>
-            <w:pPr>
-              <w:spacing w:after="0"/>
-              <w:rPr>
-                <w:lang w:val="es-ES"/>
-              </w:rPr>
-            </w:pPr>
-            <w:r>
-              <w:rPr>
-                <w:lang w:val="es-ES"/>
-              </w:rPr>
-              <w:t xml:space="preserve">cancelado: contrato que lo </w:t>
-            </w:r>
-            <w:proofErr w:type="gramStart"/>
-            <w:r>
-              <w:rPr>
-                <w:lang w:val="es-ES"/>
-              </w:rPr>
-              <w:t>cancela[</w:t>
-            </w:r>
-            <w:proofErr w:type="gramEnd"/>
-            <w:r>
-              <w:rPr>
-                <w:lang w:val="es-ES"/>
-              </w:rPr>
-              <w:t>acuerdo #x acta #x fecha día del mes del año]</w:t>
+              <w:t>aprobado: contrato que lo aprueba</w:t>
+            </w:r>
+            <w:r>
+              <w:rPr>
+                <w:lang w:val="es-ES"/>
+              </w:rPr>
+              <w:t xml:space="preserve"> </w:t>
+            </w:r>
+            <w:r>
+              <w:rPr>
+                <w:lang w:val="es-ES"/>
+              </w:rPr>
+              <w:t>[acuerdo #x acta #x fecha día del mes del año]</w:t>
+            </w:r>
+          </w:p>
+          <w:p>
+            <w:pPr>
+              <w:spacing w:after="0"/>
+              <w:rPr>
+                <w:lang w:val="es-ES"/>
+              </w:rPr>
+            </w:pPr>
+            <w:r>
+              <w:rPr>
+                <w:lang w:val="es-ES"/>
+              </w:rPr>
+              <w:t>cancelado: contrato que lo cancela</w:t>
+            </w:r>
+            <w:r>
+              <w:rPr>
+                <w:lang w:val="es-ES"/>
+              </w:rPr>
+              <w:t xml:space="preserve"> </w:t>
+            </w:r>
+            <w:r>
+              <w:rPr>
+                <w:lang w:val="es-ES"/>
+              </w:rPr>
+              <w:t>[acuerdo #x acta #x fecha día del mes del año]</w:t>
             </w:r>
           </w:p>
         </w:tc>
@@ -4024,6 +4104,12 @@
               <w:rPr>
                 <w:lang w:val="es-ES"/>
               </w:rPr>
+              <w:t xml:space="preserve">// </w:t>
+            </w:r>
+            <w:r>
+              <w:rPr>
+                <w:lang w:val="es-ES"/>
+              </w:rPr>
               <w:t>Municipio=&gt; municipio</w:t>
             </w:r>
           </w:p>
@@ -4046,7 +4132,27 @@
               <w:rPr>
                 <w:lang w:val="es-ES"/>
               </w:rPr>
-              <w:t>=&gt;consejo popular municipal</w:t>
+              <w:t xml:space="preserve">=&gt;consejo popular </w:t>
+            </w:r>
+            <w:proofErr w:type="gramStart"/>
+            <w:r>
+              <w:rPr>
+                <w:lang w:val="es-ES"/>
+              </w:rPr>
+              <w:t>municipal</w:t>
+            </w:r>
+            <w:r>
+              <w:rPr>
+                <w:lang w:val="es-ES"/>
+              </w:rPr>
+              <w:t xml:space="preserve">  es</w:t>
+            </w:r>
+            <w:proofErr w:type="gramEnd"/>
+            <w:r>
+              <w:rPr>
+                <w:lang w:val="es-ES"/>
+              </w:rPr>
+              <w:t xml:space="preserve"> suficiente</w:t>
             </w:r>
           </w:p>
         </w:tc>
@@ -4055,7 +4161,43 @@
     <w:p>
       <w:pPr>
         <w:rPr>
-          <w:rFonts w:ascii="Liberation Sans" w:eastAsia="MS Gothic" w:hAnsi="Liberation Sans" w:cs="Tahoma"/>
+          <w:rFonts w:ascii="Liberation Sans" w:eastAsia="MS Gothic" w:hAnsi="Liberation Sans" w:cs="Tahoma" w:hint="eastAsia"/>
+          <w:b/>
+          <w:bCs/>
+          <w:sz w:val="28"/>
+          <w:szCs w:val="28"/>
+          <w:lang w:val="es-ES"/>
+        </w:rPr>
+      </w:pPr>
+    </w:p>
+    <w:p>
+      <w:pPr>
+        <w:suppressAutoHyphens w:val="0"/>
+        <w:rPr>
+          <w:rFonts w:ascii="Liberation Sans" w:eastAsia="MS Gothic" w:hAnsi="Liberation Sans" w:cs="Tahoma" w:hint="eastAsia"/>
+          <w:b/>
+          <w:bCs/>
+          <w:sz w:val="28"/>
+          <w:szCs w:val="28"/>
+          <w:lang w:val="es-ES"/>
+        </w:rPr>
+      </w:pPr>
+      <w:r>
+        <w:rPr>
+          <w:rFonts w:ascii="Liberation Sans" w:eastAsia="MS Gothic" w:hAnsi="Liberation Sans" w:cs="Tahoma" w:hint="eastAsia"/>
+          <w:b/>
+          <w:bCs/>
+          <w:sz w:val="28"/>
+          <w:szCs w:val="28"/>
+          <w:lang w:val="es-ES"/>
+        </w:rPr>
+        <w:br w:type="page"/>
+      </w:r>
+    </w:p>
+    <w:p>
+      <w:pPr>
+        <w:rPr>
+          <w:rFonts w:ascii="Liberation Sans" w:eastAsia="MS Gothic" w:hAnsi="Liberation Sans" w:cs="Tahoma" w:hint="eastAsia"/>
           <w:b/>
           <w:bCs/>
           <w:sz w:val="28"/>
@@ -4401,7 +4543,6 @@
               <w:rPr>
                 <w:lang w:val="es-ES"/>
               </w:rPr>
-              <w:lastRenderedPageBreak/>
               <w:t>findAll</w:t>
             </w:r>
             <w:proofErr w:type="spellEnd"/>
@@ -4612,7 +4753,6 @@
               <w:rPr>
                 <w:lang w:val="es-ES"/>
               </w:rPr>
-              <w:lastRenderedPageBreak/>
               <w:t>Dependencia</w:t>
             </w:r>
           </w:p>
@@ -4675,7 +4815,7 @@
     <w:p>
       <w:pPr>
         <w:rPr>
-          <w:rFonts w:ascii="Liberation Sans" w:eastAsia="MS Gothic" w:hAnsi="Liberation Sans" w:cs="Tahoma"/>
+          <w:rFonts w:ascii="Liberation Sans" w:eastAsia="MS Gothic" w:hAnsi="Liberation Sans" w:cs="Tahoma" w:hint="eastAsia"/>
           <w:b/>
           <w:bCs/>
           <w:sz w:val="28"/>
@@ -5233,7 +5373,7 @@
     <w:p>
       <w:pPr>
         <w:rPr>
-          <w:rFonts w:ascii="Liberation Sans" w:eastAsia="MS Gothic" w:hAnsi="Liberation Sans" w:cs="Tahoma"/>
+          <w:rFonts w:ascii="Liberation Sans" w:eastAsia="MS Gothic" w:hAnsi="Liberation Sans" w:cs="Tahoma" w:hint="eastAsia"/>
           <w:b/>
           <w:bCs/>
           <w:sz w:val="28"/>
@@ -5798,6 +5938,15 @@
     <w:p/>
     <w:p>
       <w:pPr>
+        <w:suppressAutoHyphens w:val="0"/>
+      </w:pPr>
+      <w:r>
+        <w:br w:type="page"/>
+      </w:r>
+    </w:p>
+    <w:p/>
+    <w:p>
+      <w:pPr>
         <w:pStyle w:val="Heading2"/>
         <w:rPr>
           <w:rFonts w:eastAsia="MS Gothic"/>
@@ -6432,7 +6581,6 @@
         <w:rPr>
           <w:rFonts w:eastAsia="MS Gothic"/>
         </w:rPr>
-        <w:lastRenderedPageBreak/>
         <w:t xml:space="preserve">Talento y Apoyo </w:t>
       </w:r>
     </w:p>
@@ -7225,6 +7373,27 @@
     </w:p>
     <w:p>
       <w:pPr>
+        <w:suppressAutoHyphens w:val="0"/>
+        <w:rPr>
+          <w:lang w:val="es-ES"/>
+        </w:rPr>
+      </w:pPr>
+      <w:r>
+        <w:rPr>
+          <w:lang w:val="es-ES"/>
+        </w:rPr>
+        <w:br w:type="page"/>
+      </w:r>
+    </w:p>
+    <w:p>
+      <w:pPr>
+        <w:rPr>
+          <w:lang w:val="es-ES"/>
+        </w:rPr>
+      </w:pPr>
+    </w:p>
+    <w:p>
+      <w:pPr>
         <w:pStyle w:val="Heading1"/>
         <w:rPr>
           <w:lang w:val="es-ES"/>
@@ -8241,7 +8410,7 @@
             <w:pPr>
               <w:spacing w:after="0"/>
               <w:rPr>
-                <w:lang w:val="es-ES"/>
+                <w:lang w:val="en-GB"/>
               </w:rPr>
             </w:pPr>
             <w:r>
@@ -8250,9 +8419,327 @@
             <w:proofErr w:type="spellStart"/>
             <w:r>
               <w:rPr>
-                <w:lang w:val="es-ES"/>
-              </w:rPr>
-              <w:t>hora_actcult</w:t>
+                <w:lang w:val="en-GB"/>
+              </w:rPr>
+              <w:t>hora_</w:t>
+            </w:r>
+            <w:proofErr w:type="gramStart"/>
+            <w:r>
+              <w:rPr>
+                <w:lang w:val="en-GB"/>
+              </w:rPr>
+              <w:t>actcult</w:t>
+            </w:r>
+            <w:proofErr w:type="spellEnd"/>
+            <w:r>
+              <w:rPr>
+                <w:lang w:val="en-GB"/>
+              </w:rPr>
+              <w:t>?:string  /</w:t>
+            </w:r>
+            <w:proofErr w:type="gramEnd"/>
+            <w:r>
+              <w:rPr>
+                <w:lang w:val="en-GB"/>
+              </w:rPr>
+              <w:t xml:space="preserve">/ </w:t>
+            </w:r>
+            <w:proofErr w:type="spellStart"/>
+            <w:r>
+              <w:rPr>
+                <w:lang w:val="en-GB"/>
+              </w:rPr>
+              <w:t>DateTimestamp</w:t>
+            </w:r>
+            <w:proofErr w:type="spellEnd"/>
+          </w:p>
+          <w:p>
+            <w:pPr>
+              <w:spacing w:after="0"/>
+              <w:rPr>
+                <w:lang w:val="es-ES"/>
+              </w:rPr>
+            </w:pPr>
+            <w:r>
+              <w:rPr>
+                <w:lang w:val="en-GB"/>
+              </w:rPr>
+              <w:t xml:space="preserve">    </w:t>
+            </w:r>
+            <w:proofErr w:type="spellStart"/>
+            <w:r>
+              <w:rPr>
+                <w:lang w:val="es-ES"/>
+              </w:rPr>
+              <w:t>entidad_</w:t>
+            </w:r>
+            <w:proofErr w:type="gramStart"/>
+            <w:r>
+              <w:rPr>
+                <w:lang w:val="es-ES"/>
+              </w:rPr>
+              <w:t>responsable:string</w:t>
+            </w:r>
+            <w:proofErr w:type="spellEnd"/>
+            <w:proofErr w:type="gramEnd"/>
+            <w:r>
+              <w:rPr>
+                <w:lang w:val="es-ES"/>
+              </w:rPr>
+              <w:t xml:space="preserve"> //quien planifica </w:t>
+            </w:r>
+            <w:proofErr w:type="spellStart"/>
+            <w:r>
+              <w:rPr>
+                <w:lang w:val="es-ES"/>
+              </w:rPr>
+              <w:t>Entity_Entity</w:t>
+            </w:r>
+            <w:proofErr w:type="spellEnd"/>
+          </w:p>
+          <w:p>
+            <w:pPr>
+              <w:spacing w:after="0"/>
+              <w:rPr>
+                <w:lang w:val="es-ES"/>
+              </w:rPr>
+            </w:pPr>
+            <w:r>
+              <w:rPr>
+                <w:lang w:val="es-ES"/>
+              </w:rPr>
+              <w:t xml:space="preserve">    </w:t>
+            </w:r>
+            <w:proofErr w:type="spellStart"/>
+            <w:r>
+              <w:rPr>
+                <w:lang w:val="es-ES"/>
+              </w:rPr>
+              <w:t>lugar_planificado</w:t>
+            </w:r>
+            <w:proofErr w:type="spellEnd"/>
+            <w:r>
+              <w:rPr>
+                <w:lang w:val="es-ES"/>
+              </w:rPr>
+              <w:t xml:space="preserve">?:String // </w:t>
+            </w:r>
+            <w:r>
+              <w:rPr>
+                <w:lang w:val="es-ES"/>
+              </w:rPr>
+              <w:t>Place</w:t>
+            </w:r>
+          </w:p>
+          <w:p>
+            <w:pPr>
+              <w:spacing w:after="0"/>
+              <w:rPr>
+                <w:lang w:val="es-ES"/>
+              </w:rPr>
+            </w:pPr>
+            <w:r>
+              <w:rPr>
+                <w:lang w:val="es-ES"/>
+              </w:rPr>
+              <w:t xml:space="preserve">    </w:t>
+            </w:r>
+            <w:proofErr w:type="spellStart"/>
+            <w:r>
+              <w:rPr>
+                <w:lang w:val="es-ES"/>
+              </w:rPr>
+              <w:t>ic</w:t>
+            </w:r>
+            <w:r>
+              <w:rPr>
+                <w:lang w:val="es-ES"/>
+              </w:rPr>
+              <w:t>_planificado</w:t>
+            </w:r>
+            <w:proofErr w:type="spellEnd"/>
+            <w:r>
+              <w:rPr>
+                <w:lang w:val="es-ES"/>
+              </w:rPr>
+              <w:t xml:space="preserve">?:String// </w:t>
+            </w:r>
+            <w:proofErr w:type="spellStart"/>
+            <w:r>
+              <w:rPr>
+                <w:lang w:val="es-ES"/>
+              </w:rPr>
+              <w:t>InstCult</w:t>
+            </w:r>
+            <w:proofErr w:type="spellEnd"/>
+          </w:p>
+          <w:p>
+            <w:pPr>
+              <w:spacing w:after="0"/>
+              <w:rPr>
+                <w:lang w:val="es-ES"/>
+              </w:rPr>
+            </w:pPr>
+            <w:r>
+              <w:rPr>
+                <w:lang w:val="es-ES"/>
+              </w:rPr>
+              <w:t xml:space="preserve">    </w:t>
+            </w:r>
+            <w:proofErr w:type="spellStart"/>
+            <w:r>
+              <w:rPr>
+                <w:lang w:val="es-ES"/>
+              </w:rPr>
+              <w:t>cp</w:t>
+            </w:r>
+            <w:r>
+              <w:rPr>
+                <w:lang w:val="es-ES"/>
+              </w:rPr>
+              <w:t>_planificado</w:t>
+            </w:r>
+            <w:proofErr w:type="spellEnd"/>
+            <w:r>
+              <w:rPr>
+                <w:lang w:val="es-ES"/>
+              </w:rPr>
+              <w:t xml:space="preserve">?:String// </w:t>
+            </w:r>
+            <w:proofErr w:type="spellStart"/>
+            <w:r>
+              <w:rPr>
+                <w:lang w:val="es-ES"/>
+              </w:rPr>
+              <w:t>ConsjPop</w:t>
+            </w:r>
+            <w:proofErr w:type="spellEnd"/>
+          </w:p>
+          <w:p>
+            <w:pPr>
+              <w:spacing w:after="0"/>
+              <w:rPr>
+                <w:lang w:val="es-ES"/>
+              </w:rPr>
+            </w:pPr>
+            <w:r>
+              <w:rPr>
+                <w:lang w:val="es-ES"/>
+              </w:rPr>
+              <w:t xml:space="preserve">    </w:t>
+            </w:r>
+            <w:proofErr w:type="spellStart"/>
+            <w:r>
+              <w:rPr>
+                <w:lang w:val="es-ES"/>
+              </w:rPr>
+              <w:t>ct</w:t>
+            </w:r>
+            <w:r>
+              <w:rPr>
+                <w:lang w:val="es-ES"/>
+              </w:rPr>
+              <w:t>_planificado</w:t>
+            </w:r>
+            <w:proofErr w:type="spellEnd"/>
+            <w:r>
+              <w:rPr>
+                <w:lang w:val="es-ES"/>
+              </w:rPr>
+              <w:t xml:space="preserve">?:String// </w:t>
+            </w:r>
+            <w:proofErr w:type="spellStart"/>
+            <w:r>
+              <w:rPr>
+                <w:lang w:val="es-ES"/>
+              </w:rPr>
+              <w:t>ComnTransf</w:t>
+            </w:r>
+            <w:proofErr w:type="spellEnd"/>
+          </w:p>
+          <w:p>
+            <w:pPr>
+              <w:spacing w:after="0"/>
+              <w:rPr>
+                <w:lang w:val="es-ES"/>
+              </w:rPr>
+            </w:pPr>
+            <w:r>
+              <w:rPr>
+                <w:lang w:val="es-ES"/>
+              </w:rPr>
+              <w:t xml:space="preserve">    edad?:</w:t>
+            </w:r>
+            <w:proofErr w:type="spellStart"/>
+            <w:r>
+              <w:rPr>
+                <w:lang w:val="es-ES"/>
+              </w:rPr>
+              <w:t>Nomenclador_GrupoEtareo</w:t>
+            </w:r>
+            <w:proofErr w:type="spellEnd"/>
+            <w:r>
+              <w:rPr>
+                <w:lang w:val="es-ES"/>
+              </w:rPr>
+              <w:t xml:space="preserve"> //grupo </w:t>
+            </w:r>
+            <w:proofErr w:type="spellStart"/>
+            <w:r>
+              <w:rPr>
+                <w:lang w:val="es-ES"/>
+              </w:rPr>
+              <w:t>etareo</w:t>
+            </w:r>
+            <w:proofErr w:type="spellEnd"/>
+          </w:p>
+          <w:p>
+            <w:pPr>
+              <w:spacing w:after="0"/>
+              <w:rPr>
+                <w:lang w:val="es-ES"/>
+              </w:rPr>
+            </w:pPr>
+            <w:r>
+              <w:rPr>
+                <w:lang w:val="es-ES"/>
+              </w:rPr>
+              <w:t xml:space="preserve">    </w:t>
+            </w:r>
+            <w:proofErr w:type="spellStart"/>
+            <w:r>
+              <w:rPr>
+                <w:lang w:val="es-ES"/>
+              </w:rPr>
+              <w:t>edad_asitencia</w:t>
+            </w:r>
+            <w:proofErr w:type="spellEnd"/>
+            <w:r>
+              <w:rPr>
+                <w:lang w:val="es-ES"/>
+              </w:rPr>
+              <w:t>?:Number //cantidad</w:t>
+            </w:r>
+          </w:p>
+          <w:p>
+            <w:pPr>
+              <w:spacing w:after="0"/>
+              <w:rPr>
+                <w:lang w:val="es-ES"/>
+              </w:rPr>
+            </w:pPr>
+            <w:r>
+              <w:rPr>
+                <w:lang w:val="es-ES"/>
+              </w:rPr>
+              <w:t xml:space="preserve">    </w:t>
+            </w:r>
+            <w:proofErr w:type="spellStart"/>
+            <w:r>
+              <w:rPr>
+                <w:lang w:val="es-ES"/>
+              </w:rPr>
+              <w:t>tipoActividad_extraPlan</w:t>
             </w:r>
             <w:proofErr w:type="spellEnd"/>
             <w:r>
@@ -8262,35 +8749,278 @@
               <w:t>?:</w:t>
             </w:r>
             <w:proofErr w:type="spellStart"/>
+            <w:r>
+              <w:rPr>
+                <w:lang w:val="es-ES"/>
+              </w:rPr>
+              <w:t>boolean</w:t>
+            </w:r>
+            <w:proofErr w:type="spellEnd"/>
+            <w:r>
+              <w:rPr>
+                <w:lang w:val="es-ES"/>
+              </w:rPr>
+              <w:t xml:space="preserve"> //no </w:t>
+            </w:r>
+          </w:p>
+          <w:p>
+            <w:pPr>
+              <w:spacing w:after="0"/>
+              <w:rPr>
+                <w:lang w:val="es-ES"/>
+              </w:rPr>
+            </w:pPr>
+            <w:r>
+              <w:rPr>
+                <w:lang w:val="es-ES"/>
+              </w:rPr>
+              <w:t xml:space="preserve">    </w:t>
+            </w:r>
+            <w:proofErr w:type="spellStart"/>
+            <w:r>
+              <w:rPr>
+                <w:lang w:val="es-ES"/>
+              </w:rPr>
+              <w:t>tipoActividad_Prov_Entidad</w:t>
+            </w:r>
+            <w:proofErr w:type="spellEnd"/>
+            <w:r>
+              <w:rPr>
+                <w:lang w:val="es-ES"/>
+              </w:rPr>
+              <w:t>?:</w:t>
+            </w:r>
+            <w:proofErr w:type="spellStart"/>
+            <w:r>
+              <w:rPr>
+                <w:lang w:val="es-ES"/>
+              </w:rPr>
+              <w:t>Entity_Entity</w:t>
+            </w:r>
+            <w:proofErr w:type="spellEnd"/>
+            <w:r>
+              <w:rPr>
+                <w:lang w:val="es-ES"/>
+              </w:rPr>
+              <w:t xml:space="preserve"> //</w:t>
+            </w:r>
+            <w:proofErr w:type="spellStart"/>
+            <w:r>
+              <w:rPr>
+                <w:lang w:val="es-ES"/>
+              </w:rPr>
+              <w:t>null</w:t>
+            </w:r>
+            <w:proofErr w:type="spellEnd"/>
+            <w:r>
+              <w:rPr>
+                <w:lang w:val="es-ES"/>
+              </w:rPr>
+              <w:t xml:space="preserve"> o entidad </w:t>
+            </w:r>
+            <w:proofErr w:type="spellStart"/>
+            <w:r>
+              <w:rPr>
+                <w:lang w:val="es-ES"/>
+              </w:rPr>
+              <w:t>prov</w:t>
+            </w:r>
+            <w:proofErr w:type="spellEnd"/>
+            <w:r>
+              <w:rPr>
+                <w:lang w:val="es-ES"/>
+              </w:rPr>
+              <w:t xml:space="preserve"> </w:t>
+            </w:r>
+            <w:proofErr w:type="spellStart"/>
+            <w:r>
+              <w:rPr>
+                <w:lang w:val="es-ES"/>
+              </w:rPr>
+              <w:t>only</w:t>
+            </w:r>
+            <w:proofErr w:type="spellEnd"/>
+          </w:p>
+          <w:p>
+            <w:pPr>
+              <w:spacing w:after="0"/>
+              <w:rPr>
+                <w:lang w:val="es-ES"/>
+              </w:rPr>
+            </w:pPr>
+            <w:r>
+              <w:rPr>
+                <w:lang w:val="es-ES"/>
+              </w:rPr>
+              <w:t xml:space="preserve">    </w:t>
+            </w:r>
+            <w:proofErr w:type="spellStart"/>
+            <w:r>
+              <w:rPr>
+                <w:lang w:val="es-ES"/>
+              </w:rPr>
+              <w:t>estados_actividad</w:t>
+            </w:r>
+            <w:proofErr w:type="spellEnd"/>
+            <w:r>
+              <w:rPr>
+                <w:lang w:val="es-ES"/>
+              </w:rPr>
+              <w:t>?:</w:t>
+            </w:r>
+            <w:proofErr w:type="spellStart"/>
+            <w:r>
+              <w:rPr>
+                <w:lang w:val="es-ES"/>
+              </w:rPr>
+              <w:t>Estado_</w:t>
+            </w:r>
             <w:proofErr w:type="gramStart"/>
             <w:r>
               <w:rPr>
                 <w:lang w:val="es-ES"/>
               </w:rPr>
-              <w:t>string</w:t>
-            </w:r>
-            <w:proofErr w:type="spellEnd"/>
-            <w:r>
-              <w:rPr>
-                <w:lang w:val="es-ES"/>
-              </w:rPr>
-              <w:t xml:space="preserve">  /</w:t>
+              <w:t>ActividadCultural</w:t>
+            </w:r>
+            <w:proofErr w:type="spellEnd"/>
+            <w:r>
+              <w:rPr>
+                <w:lang w:val="es-ES"/>
+              </w:rPr>
+              <w:t>[</w:t>
             </w:r>
             <w:proofErr w:type="gramEnd"/>
             <w:r>
               <w:rPr>
                 <w:lang w:val="es-ES"/>
               </w:rPr>
-              <w:t xml:space="preserve">/ </w:t>
-            </w:r>
-            <w:proofErr w:type="spellStart"/>
-            <w:r>
-              <w:rPr>
-                <w:lang w:val="es-ES"/>
-              </w:rPr>
-              <w:t>DateTimestamp</w:t>
-            </w:r>
-            <w:proofErr w:type="spellEnd"/>
+              <w:t>] //estado actividad</w:t>
+            </w:r>
+          </w:p>
+          <w:p>
+            <w:pPr>
+              <w:spacing w:after="0"/>
+              <w:rPr>
+                <w:lang w:val="es-ES"/>
+              </w:rPr>
+            </w:pPr>
+            <w:r>
+              <w:rPr>
+                <w:lang w:val="es-ES"/>
+              </w:rPr>
+              <w:lastRenderedPageBreak/>
+              <w:t xml:space="preserve">  </w:t>
+            </w:r>
+            <w:r>
+              <w:rPr>
+                <w:lang w:val="es-ES"/>
+              </w:rPr>
+              <w:t>//</w:t>
+            </w:r>
+            <w:proofErr w:type="gramStart"/>
+            <w:r>
+              <w:rPr>
+                <w:lang w:val="es-ES"/>
+              </w:rPr>
+              <w:t>no ,</w:t>
+            </w:r>
+            <w:proofErr w:type="gramEnd"/>
+            <w:r>
+              <w:rPr>
+                <w:lang w:val="es-ES"/>
+              </w:rPr>
+              <w:t xml:space="preserve"> eso va en la justificación del </w:t>
+            </w:r>
+            <w:proofErr w:type="gramStart"/>
+            <w:r>
+              <w:rPr>
+                <w:lang w:val="es-ES"/>
+              </w:rPr>
+              <w:t>estado</w:t>
+            </w:r>
+            <w:r>
+              <w:rPr>
+                <w:lang w:val="es-ES"/>
+              </w:rPr>
+              <w:t xml:space="preserve">  </w:t>
+            </w:r>
+            <w:proofErr w:type="spellStart"/>
+            <w:r>
+              <w:rPr>
+                <w:lang w:val="es-ES"/>
+              </w:rPr>
+              <w:t>justifica</w:t>
+            </w:r>
+            <w:proofErr w:type="gramEnd"/>
+            <w:r>
+              <w:rPr>
+                <w:lang w:val="es-ES"/>
+              </w:rPr>
+              <w:t>_motivo</w:t>
+            </w:r>
+            <w:proofErr w:type="spellEnd"/>
+            <w:r>
+              <w:rPr>
+                <w:lang w:val="es-ES"/>
+              </w:rPr>
+              <w:t>?:String //justifica No se hizo, Fin 1ra opción        manifestaciones_artisticas?:NomenclaCat_ContManifestacion_Especialidad_</w:t>
+            </w:r>
+            <w:proofErr w:type="gramStart"/>
+            <w:r>
+              <w:rPr>
+                <w:lang w:val="es-ES"/>
+              </w:rPr>
+              <w:t>Entity[</w:t>
+            </w:r>
+            <w:proofErr w:type="gramEnd"/>
+            <w:r>
+              <w:rPr>
+                <w:lang w:val="es-ES"/>
+              </w:rPr>
+              <w:t>]//manifestaciones implicadas, la principal es la primera</w:t>
+            </w:r>
+          </w:p>
+          <w:p>
+            <w:pPr>
+              <w:spacing w:after="0"/>
+              <w:rPr>
+                <w:lang w:val="es-ES"/>
+              </w:rPr>
+            </w:pPr>
+            <w:r>
+              <w:rPr>
+                <w:lang w:val="es-ES"/>
+              </w:rPr>
+              <w:t xml:space="preserve">    talentos?:</w:t>
+            </w:r>
+            <w:proofErr w:type="spellStart"/>
+            <w:r>
+              <w:rPr>
+                <w:lang w:val="es-ES"/>
+              </w:rPr>
+              <w:t>Talento_Artistico_Contratado_</w:t>
+            </w:r>
+            <w:proofErr w:type="gramStart"/>
+            <w:r>
+              <w:rPr>
+                <w:lang w:val="es-ES"/>
+              </w:rPr>
+              <w:t>Entity</w:t>
+            </w:r>
+            <w:proofErr w:type="spellEnd"/>
+            <w:r>
+              <w:rPr>
+                <w:lang w:val="es-ES"/>
+              </w:rPr>
+              <w:t>[</w:t>
+            </w:r>
+            <w:proofErr w:type="gramEnd"/>
+            <w:r>
+              <w:rPr>
+                <w:lang w:val="es-ES"/>
+              </w:rPr>
+              <w:t>]//talentos contratados</w:t>
+            </w:r>
           </w:p>
           <w:p>
             <w:pPr>
@@ -8310,503 +9040,105 @@
               <w:rPr>
                 <w:lang w:val="es-ES"/>
               </w:rPr>
-              <w:t>entidad_</w:t>
+              <w:t>programas_tributa</w:t>
+            </w:r>
+            <w:proofErr w:type="spellEnd"/>
+            <w:r>
+              <w:rPr>
+                <w:lang w:val="es-ES"/>
+              </w:rPr>
+              <w:t>?:</w:t>
+            </w:r>
+            <w:proofErr w:type="spellStart"/>
+            <w:r>
+              <w:rPr>
+                <w:lang w:val="es-ES"/>
+              </w:rPr>
+              <w:t>ProgramaSocial_Especial_</w:t>
             </w:r>
             <w:proofErr w:type="gramStart"/>
             <w:r>
               <w:rPr>
                 <w:lang w:val="es-ES"/>
               </w:rPr>
-              <w:t>responsable:string</w:t>
-            </w:r>
-            <w:proofErr w:type="spellEnd"/>
+              <w:t>Entity</w:t>
+            </w:r>
+            <w:proofErr w:type="spellEnd"/>
+            <w:r>
+              <w:rPr>
+                <w:lang w:val="es-ES"/>
+              </w:rPr>
+              <w:t>[</w:t>
+            </w:r>
             <w:proofErr w:type="gramEnd"/>
             <w:r>
               <w:rPr>
                 <w:lang w:val="es-ES"/>
               </w:rPr>
-              <w:t xml:space="preserve"> //quien planifica </w:t>
-            </w:r>
-            <w:proofErr w:type="spellStart"/>
-            <w:r>
-              <w:rPr>
-                <w:lang w:val="es-ES"/>
-              </w:rPr>
-              <w:t>Entity_Entity</w:t>
-            </w:r>
-            <w:proofErr w:type="spellEnd"/>
-          </w:p>
-          <w:p>
-            <w:pPr>
-              <w:spacing w:after="0"/>
-              <w:rPr>
-                <w:lang w:val="es-ES"/>
-              </w:rPr>
-            </w:pPr>
-            <w:r>
-              <w:rPr>
-                <w:lang w:val="es-ES"/>
-              </w:rPr>
-              <w:t xml:space="preserve">    </w:t>
-            </w:r>
-            <w:proofErr w:type="spellStart"/>
-            <w:r>
-              <w:rPr>
-                <w:lang w:val="es-ES"/>
-              </w:rPr>
-              <w:t>lugar_planificado</w:t>
-            </w:r>
-            <w:proofErr w:type="spellEnd"/>
-            <w:r>
-              <w:rPr>
-                <w:lang w:val="es-ES"/>
-              </w:rPr>
-              <w:t xml:space="preserve">?:String // </w:t>
-            </w:r>
-            <w:proofErr w:type="spellStart"/>
-            <w:r>
-              <w:rPr>
-                <w:lang w:val="es-ES"/>
-              </w:rPr>
-              <w:t>InstCult</w:t>
-            </w:r>
-            <w:proofErr w:type="spellEnd"/>
-            <w:r>
-              <w:rPr>
-                <w:lang w:val="es-ES"/>
-              </w:rPr>
-              <w:t xml:space="preserve"> | </w:t>
-            </w:r>
-            <w:proofErr w:type="spellStart"/>
-            <w:r>
-              <w:rPr>
-                <w:lang w:val="es-ES"/>
-              </w:rPr>
-              <w:t>ConsjPop</w:t>
-            </w:r>
-            <w:proofErr w:type="spellEnd"/>
-            <w:r>
-              <w:rPr>
-                <w:lang w:val="es-ES"/>
-              </w:rPr>
-              <w:t xml:space="preserve"> | </w:t>
-            </w:r>
-            <w:proofErr w:type="spellStart"/>
-            <w:r>
-              <w:rPr>
-                <w:lang w:val="es-ES"/>
-              </w:rPr>
-              <w:t>ComnTransf</w:t>
-            </w:r>
-            <w:proofErr w:type="spellEnd"/>
-          </w:p>
-          <w:p>
-            <w:pPr>
-              <w:spacing w:after="0"/>
-              <w:rPr>
-                <w:lang w:val="es-ES"/>
-              </w:rPr>
-            </w:pPr>
-            <w:r>
-              <w:rPr>
-                <w:lang w:val="es-ES"/>
-              </w:rPr>
-              <w:t xml:space="preserve">    edad?:</w:t>
-            </w:r>
-            <w:proofErr w:type="spellStart"/>
-            <w:r>
-              <w:rPr>
-                <w:lang w:val="es-ES"/>
-              </w:rPr>
-              <w:t>Nomenclador_GrupoEtareo</w:t>
-            </w:r>
-            <w:proofErr w:type="spellEnd"/>
-            <w:r>
-              <w:rPr>
-                <w:lang w:val="es-ES"/>
-              </w:rPr>
-              <w:t xml:space="preserve"> //grupo </w:t>
-            </w:r>
-            <w:proofErr w:type="spellStart"/>
-            <w:r>
-              <w:rPr>
-                <w:lang w:val="es-ES"/>
-              </w:rPr>
-              <w:t>etareo</w:t>
-            </w:r>
-            <w:proofErr w:type="spellEnd"/>
-          </w:p>
-          <w:p>
-            <w:pPr>
-              <w:spacing w:after="0"/>
-              <w:rPr>
-                <w:lang w:val="es-ES"/>
-              </w:rPr>
-            </w:pPr>
-            <w:r>
-              <w:rPr>
-                <w:lang w:val="es-ES"/>
-              </w:rPr>
-              <w:t xml:space="preserve">    </w:t>
-            </w:r>
-            <w:proofErr w:type="spellStart"/>
-            <w:r>
-              <w:rPr>
-                <w:lang w:val="es-ES"/>
-              </w:rPr>
-              <w:t>edad_asitencia</w:t>
-            </w:r>
-            <w:proofErr w:type="spellEnd"/>
-            <w:r>
-              <w:rPr>
-                <w:lang w:val="es-ES"/>
-              </w:rPr>
-              <w:t>?:Number //cantidad</w:t>
-            </w:r>
-          </w:p>
-          <w:p>
-            <w:pPr>
-              <w:spacing w:after="0"/>
-              <w:rPr>
-                <w:lang w:val="es-ES"/>
-              </w:rPr>
-            </w:pPr>
-            <w:r>
-              <w:rPr>
-                <w:lang w:val="es-ES"/>
-              </w:rPr>
-              <w:t xml:space="preserve">    </w:t>
-            </w:r>
-            <w:proofErr w:type="spellStart"/>
-            <w:r>
-              <w:rPr>
-                <w:lang w:val="es-ES"/>
-              </w:rPr>
-              <w:t>tipoActividad_extraPlan</w:t>
-            </w:r>
-            <w:proofErr w:type="spellEnd"/>
-            <w:r>
-              <w:rPr>
-                <w:lang w:val="es-ES"/>
-              </w:rPr>
-              <w:t>?:</w:t>
-            </w:r>
-            <w:proofErr w:type="spellStart"/>
-            <w:r>
-              <w:rPr>
-                <w:lang w:val="es-ES"/>
-              </w:rPr>
-              <w:t>boolean</w:t>
-            </w:r>
-            <w:proofErr w:type="spellEnd"/>
-            <w:r>
-              <w:rPr>
-                <w:lang w:val="es-ES"/>
-              </w:rPr>
-              <w:t xml:space="preserve"> //no </w:t>
-            </w:r>
-          </w:p>
-          <w:p>
-            <w:pPr>
-              <w:spacing w:after="0"/>
-              <w:rPr>
-                <w:lang w:val="es-ES"/>
-              </w:rPr>
-            </w:pPr>
-            <w:r>
-              <w:rPr>
-                <w:lang w:val="es-ES"/>
-              </w:rPr>
-              <w:t xml:space="preserve">    </w:t>
-            </w:r>
-            <w:proofErr w:type="spellStart"/>
-            <w:r>
-              <w:rPr>
-                <w:lang w:val="es-ES"/>
-              </w:rPr>
-              <w:t>tipoActividad_Prov_Entidad</w:t>
-            </w:r>
-            <w:proofErr w:type="spellEnd"/>
-            <w:r>
-              <w:rPr>
-                <w:lang w:val="es-ES"/>
-              </w:rPr>
-              <w:t>?:</w:t>
-            </w:r>
-            <w:proofErr w:type="spellStart"/>
-            <w:r>
-              <w:rPr>
-                <w:lang w:val="es-ES"/>
-              </w:rPr>
-              <w:t>Entity_Entity</w:t>
-            </w:r>
-            <w:proofErr w:type="spellEnd"/>
-            <w:r>
-              <w:rPr>
-                <w:lang w:val="es-ES"/>
-              </w:rPr>
-              <w:t xml:space="preserve"> //</w:t>
-            </w:r>
-            <w:proofErr w:type="spellStart"/>
-            <w:r>
-              <w:rPr>
-                <w:lang w:val="es-ES"/>
-              </w:rPr>
-              <w:t>null</w:t>
-            </w:r>
-            <w:proofErr w:type="spellEnd"/>
-            <w:r>
-              <w:rPr>
-                <w:lang w:val="es-ES"/>
-              </w:rPr>
-              <w:t xml:space="preserve"> o entidad </w:t>
-            </w:r>
-            <w:proofErr w:type="spellStart"/>
-            <w:r>
-              <w:rPr>
-                <w:lang w:val="es-ES"/>
-              </w:rPr>
-              <w:t>prov</w:t>
-            </w:r>
-            <w:proofErr w:type="spellEnd"/>
-            <w:r>
-              <w:rPr>
-                <w:lang w:val="es-ES"/>
-              </w:rPr>
-              <w:t xml:space="preserve"> </w:t>
-            </w:r>
-            <w:proofErr w:type="spellStart"/>
-            <w:r>
-              <w:rPr>
-                <w:lang w:val="es-ES"/>
-              </w:rPr>
-              <w:t>only</w:t>
-            </w:r>
-            <w:proofErr w:type="spellEnd"/>
-          </w:p>
-          <w:p>
-            <w:pPr>
-              <w:spacing w:after="0"/>
-              <w:rPr>
-                <w:lang w:val="es-ES"/>
-              </w:rPr>
-            </w:pPr>
-            <w:r>
-              <w:rPr>
-                <w:lang w:val="es-ES"/>
-              </w:rPr>
-              <w:t xml:space="preserve">    </w:t>
-            </w:r>
-            <w:proofErr w:type="spellStart"/>
-            <w:r>
-              <w:rPr>
-                <w:lang w:val="es-ES"/>
-              </w:rPr>
-              <w:t>estados_actividad</w:t>
-            </w:r>
-            <w:proofErr w:type="spellEnd"/>
-            <w:r>
-              <w:rPr>
-                <w:lang w:val="es-ES"/>
-              </w:rPr>
-              <w:t>?:</w:t>
-            </w:r>
-            <w:proofErr w:type="spellStart"/>
-            <w:r>
-              <w:rPr>
-                <w:lang w:val="es-ES"/>
-              </w:rPr>
-              <w:t>Estado_</w:t>
+              <w:t xml:space="preserve">] //programas sociales </w:t>
+            </w:r>
+            <w:proofErr w:type="spellStart"/>
+            <w:r>
+              <w:rPr>
+                <w:lang w:val="es-ES"/>
+              </w:rPr>
+              <w:t>entity</w:t>
+            </w:r>
+            <w:proofErr w:type="spellEnd"/>
+          </w:p>
+          <w:p>
+            <w:pPr>
+              <w:spacing w:after="0"/>
+              <w:rPr>
+                <w:lang w:val="es-ES"/>
+              </w:rPr>
+            </w:pPr>
+            <w:r>
+              <w:rPr>
+                <w:lang w:val="es-ES"/>
+              </w:rPr>
+              <w:t xml:space="preserve">   </w:t>
+            </w:r>
+            <w:r>
+              <w:rPr>
+                <w:lang w:val="es-ES"/>
+              </w:rPr>
+              <w:t xml:space="preserve">  //</w:t>
             </w:r>
             <w:proofErr w:type="gramStart"/>
             <w:r>
               <w:rPr>
                 <w:lang w:val="es-ES"/>
               </w:rPr>
-              <w:t>ActividadCultural</w:t>
-            </w:r>
-            <w:proofErr w:type="spellEnd"/>
-            <w:r>
-              <w:rPr>
-                <w:lang w:val="es-ES"/>
-              </w:rPr>
-              <w:t>[</w:t>
+              <w:t>no ,</w:t>
             </w:r>
             <w:proofErr w:type="gramEnd"/>
             <w:r>
               <w:rPr>
                 <w:lang w:val="es-ES"/>
               </w:rPr>
-              <w:t>] //estado actividad</w:t>
-            </w:r>
-          </w:p>
-          <w:p>
-            <w:pPr>
-              <w:spacing w:after="0"/>
-              <w:rPr>
-                <w:lang w:val="es-ES"/>
-              </w:rPr>
-            </w:pPr>
-            <w:r>
-              <w:rPr>
-                <w:lang w:val="es-ES"/>
-              </w:rPr>
-              <w:t xml:space="preserve">    </w:t>
-            </w:r>
-            <w:proofErr w:type="spellStart"/>
-            <w:r>
-              <w:rPr>
-                <w:lang w:val="es-ES"/>
-              </w:rPr>
-              <w:t>justifica_motivo</w:t>
-            </w:r>
-            <w:proofErr w:type="spellEnd"/>
-            <w:r>
-              <w:rPr>
-                <w:lang w:val="es-ES"/>
-              </w:rPr>
-              <w:t>?:String //justifica No se hizo, Fin 1ra opción        manifestaciones_artisticas?:NomenclaCat_ContManifestacion_Especialidad_</w:t>
+              <w:t xml:space="preserve"> eso va en la justificación del </w:t>
             </w:r>
             <w:proofErr w:type="gramStart"/>
             <w:r>
               <w:rPr>
                 <w:lang w:val="es-ES"/>
               </w:rPr>
-              <w:t>Entity[</w:t>
+              <w:t xml:space="preserve">estado  </w:t>
+            </w:r>
+            <w:proofErr w:type="spellStart"/>
+            <w:r>
+              <w:rPr>
+                <w:lang w:val="es-ES"/>
+              </w:rPr>
+              <w:t>descripcion</w:t>
             </w:r>
             <w:proofErr w:type="gramEnd"/>
             <w:r>
               <w:rPr>
                 <w:lang w:val="es-ES"/>
               </w:rPr>
-              <w:t>]//manifestaciones implicadas, la principal es la primera</w:t>
-            </w:r>
-          </w:p>
-          <w:p>
-            <w:pPr>
-              <w:spacing w:after="0"/>
-              <w:rPr>
-                <w:lang w:val="es-ES"/>
-              </w:rPr>
-            </w:pPr>
-            <w:r>
-              <w:rPr>
-                <w:lang w:val="es-ES"/>
-              </w:rPr>
-              <w:t xml:space="preserve">    talentos?:</w:t>
-            </w:r>
-            <w:proofErr w:type="spellStart"/>
-            <w:r>
-              <w:rPr>
-                <w:lang w:val="es-ES"/>
-              </w:rPr>
-              <w:t>Talento_Artistico_Contratado_</w:t>
-            </w:r>
-            <w:proofErr w:type="gramStart"/>
-            <w:r>
-              <w:rPr>
-                <w:lang w:val="es-ES"/>
-              </w:rPr>
-              <w:t>Entity</w:t>
-            </w:r>
-            <w:proofErr w:type="spellEnd"/>
-            <w:r>
-              <w:rPr>
-                <w:lang w:val="es-ES"/>
-              </w:rPr>
-              <w:t>[</w:t>
-            </w:r>
-            <w:proofErr w:type="gramEnd"/>
-            <w:r>
-              <w:rPr>
-                <w:lang w:val="es-ES"/>
-              </w:rPr>
-              <w:t>]//talentos contratados</w:t>
-            </w:r>
-          </w:p>
-          <w:p>
-            <w:pPr>
-              <w:spacing w:after="0"/>
-              <w:rPr>
-                <w:lang w:val="es-ES"/>
-              </w:rPr>
-            </w:pPr>
-            <w:r>
-              <w:rPr>
-                <w:lang w:val="es-ES"/>
-              </w:rPr>
-              <w:t xml:space="preserve">    </w:t>
-            </w:r>
-            <w:proofErr w:type="spellStart"/>
-            <w:r>
-              <w:rPr>
-                <w:lang w:val="es-ES"/>
-              </w:rPr>
-              <w:t>programas_tributa</w:t>
-            </w:r>
-            <w:proofErr w:type="spellEnd"/>
-            <w:r>
-              <w:rPr>
-                <w:lang w:val="es-ES"/>
-              </w:rPr>
-              <w:t>?:</w:t>
-            </w:r>
-            <w:proofErr w:type="spellStart"/>
-            <w:r>
-              <w:rPr>
-                <w:lang w:val="es-ES"/>
-              </w:rPr>
-              <w:t>ProgramaSocial_Especial_</w:t>
-            </w:r>
-            <w:proofErr w:type="gramStart"/>
-            <w:r>
-              <w:rPr>
-                <w:lang w:val="es-ES"/>
-              </w:rPr>
-              <w:t>Entity</w:t>
-            </w:r>
-            <w:proofErr w:type="spellEnd"/>
-            <w:r>
-              <w:rPr>
-                <w:lang w:val="es-ES"/>
-              </w:rPr>
-              <w:t>[</w:t>
-            </w:r>
-            <w:proofErr w:type="gramEnd"/>
-            <w:r>
-              <w:rPr>
-                <w:lang w:val="es-ES"/>
-              </w:rPr>
-              <w:t xml:space="preserve">] //programas sociales </w:t>
-            </w:r>
-            <w:proofErr w:type="spellStart"/>
-            <w:r>
-              <w:rPr>
-                <w:lang w:val="es-ES"/>
-              </w:rPr>
-              <w:t>entity</w:t>
-            </w:r>
-            <w:proofErr w:type="spellEnd"/>
-          </w:p>
-          <w:p>
-            <w:pPr>
-              <w:spacing w:after="0"/>
-              <w:rPr>
-                <w:lang w:val="es-ES"/>
-              </w:rPr>
-            </w:pPr>
-            <w:r>
-              <w:rPr>
-                <w:lang w:val="es-ES"/>
-              </w:rPr>
-              <w:t xml:space="preserve">    </w:t>
-            </w:r>
-            <w:proofErr w:type="spellStart"/>
-            <w:r>
-              <w:rPr>
-                <w:lang w:val="es-ES"/>
-              </w:rPr>
-              <w:t>descripcion_actv</w:t>
+              <w:t>_actv</w:t>
             </w:r>
             <w:proofErr w:type="spellEnd"/>
             <w:r>
@@ -8969,6 +9301,7 @@
             </w:pPr>
             <w:proofErr w:type="spellStart"/>
             <w:r>
+              <w:lastRenderedPageBreak/>
               <w:t>Controlador</w:t>
             </w:r>
             <w:proofErr w:type="spellEnd"/>
@@ -9436,6 +9769,7 @@
       <w:pPr>
         <w:pStyle w:val="Heading3"/>
         <w:rPr>
+          <w:rFonts w:hint="eastAsia"/>
           <w:lang w:val="es-ES"/>
         </w:rPr>
       </w:pPr>

</xml_diff>

<commit_message>
haciendo cambio en : -charge -categorie -person -API doc
</commit_message>
<xml_diff>
--- a/docs/Servilo_Kerno Cult API Justificacion .docx
+++ b/docs/Servilo_Kerno Cult API Justificacion .docx
@@ -298,13 +298,7 @@
         <w:rPr>
           <w:lang w:val="es-ES"/>
         </w:rPr>
-        <w:t xml:space="preserve">En caso de haber un error, se </w:t>
-      </w:r>
-      <w:r>
-        <w:rPr>
-          <w:lang w:val="es-ES"/>
-        </w:rPr>
-        <w:t>devuelve la razón.</w:t>
+        <w:t>En caso de haber un error, se devuelve la razón.</w:t>
       </w:r>
     </w:p>
     <w:p>
@@ -348,13 +342,7 @@
         <w:rPr>
           <w:lang w:val="es-ES"/>
         </w:rPr>
-        <w:t>: significa que se hace un registro de la acción que se realizó, erro</w:t>
-      </w:r>
-      <w:r>
-        <w:rPr>
-          <w:lang w:val="es-ES"/>
-        </w:rPr>
-        <w:t>r y por quien.</w:t>
+        <w:t>: significa que se hace un registro de la acción que se realizó, error y por quien.</w:t>
       </w:r>
     </w:p>
     <w:p>
@@ -598,13 +586,7 @@
               <w:rPr>
                 <w:lang w:val="es-ES"/>
               </w:rPr>
-              <w:t xml:space="preserve">(id): devuelve los </w:t>
-            </w:r>
-            <w:r>
-              <w:rPr>
-                <w:lang w:val="es-ES"/>
-              </w:rPr>
-              <w:t>atributos de ese documento en especifico</w:t>
+              <w:t>(id): devuelve los atributos de ese documento en especifico</w:t>
             </w:r>
           </w:p>
           <w:p>
@@ -813,10 +795,7 @@
               <w:spacing w:after="0"/>
             </w:pPr>
             <w:r>
-              <w:t>Coll</w:t>
-            </w:r>
-            <w:r>
-              <w:t>ection</w:t>
+              <w:t>Collection</w:t>
             </w:r>
           </w:p>
         </w:tc>
@@ -1023,13 +1002,7 @@
               <w:rPr>
                 <w:lang w:val="es-ES"/>
               </w:rPr>
-              <w:t xml:space="preserve">): se devuelven todos los elementos en </w:t>
-            </w:r>
-            <w:r>
-              <w:rPr>
-                <w:lang w:val="es-ES"/>
-              </w:rPr>
-              <w:t>paginación</w:t>
+              <w:t>): se devuelven todos los elementos en paginación</w:t>
             </w:r>
           </w:p>
           <w:p>
@@ -1161,13 +1134,7 @@
               <w:rPr>
                 <w:lang w:val="es-ES"/>
               </w:rPr>
-              <w:t>(criterio): se busca en criterios de nombr</w:t>
-            </w:r>
-            <w:r>
-              <w:rPr>
-                <w:lang w:val="es-ES"/>
-              </w:rPr>
-              <w:t>e</w:t>
+              <w:t>(criterio): se busca en criterios de nombre</w:t>
             </w:r>
           </w:p>
         </w:tc>
@@ -1463,13 +1430,7 @@
               <w:rPr>
                 <w:lang w:val="es-ES"/>
               </w:rPr>
-              <w:t>]:mínimo 3 letras, único y orden jerárquico del 0(Ministerio) hasta el</w:t>
-            </w:r>
-            <w:r>
-              <w:rPr>
-                <w:lang w:val="es-ES"/>
-              </w:rPr>
-              <w:t xml:space="preserve"> 4(Instituciones)</w:t>
+              <w:t>]:mínimo 3 letras, único y orden jerárquico del 0(Ministerio) hasta el 4(Instituciones)</w:t>
             </w:r>
           </w:p>
           <w:p>
@@ -1695,6 +1656,1927 @@
         </w:tc>
       </w:tr>
     </w:tbl>
+    <w:p/>
+    <w:p>
+      <w:pPr>
+        <w:pStyle w:val="Ttulo2"/>
+      </w:pPr>
+      <w:r>
+        <w:t xml:space="preserve">Persona  [Módulos que define roles y donde tendrá acceso]  </w:t>
+      </w:r>
+    </w:p>
+    <w:tbl>
+      <w:tblPr>
+        <w:tblW w:w="9810" w:type="dxa"/>
+        <w:tblInd w:w="-15" w:type="dxa"/>
+        <w:tblLayout w:type="fixed"/>
+        <w:tblLook w:val="0000" w:firstRow="0" w:lastRow="0" w:firstColumn="0" w:lastColumn="0" w:noHBand="0" w:noVBand="0"/>
+      </w:tblPr>
+      <w:tblGrid>
+        <w:gridCol w:w="1800"/>
+        <w:gridCol w:w="8010"/>
+      </w:tblGrid>
+      <w:tr>
+        <w:tc>
+          <w:tcPr>
+            <w:tcW w:w="1800" w:type="dxa"/>
+            <w:tcBorders>
+              <w:top w:val="single" w:sz="4" w:space="0" w:color="000000"/>
+              <w:left w:val="single" w:sz="4" w:space="0" w:color="000000"/>
+              <w:bottom w:val="single" w:sz="4" w:space="0" w:color="000000"/>
+              <w:right w:val="single" w:sz="4" w:space="0" w:color="000000"/>
+            </w:tcBorders>
+          </w:tcPr>
+          <w:p>
+            <w:pPr>
+              <w:spacing w:after="0"/>
+            </w:pPr>
+            <w:r>
+              <w:t>Collection</w:t>
+            </w:r>
+          </w:p>
+        </w:tc>
+        <w:tc>
+          <w:tcPr>
+            <w:tcW w:w="8009" w:type="dxa"/>
+            <w:tcBorders>
+              <w:top w:val="single" w:sz="4" w:space="0" w:color="000000"/>
+              <w:left w:val="single" w:sz="4" w:space="0" w:color="000000"/>
+              <w:bottom w:val="single" w:sz="4" w:space="0" w:color="000000"/>
+              <w:right w:val="single" w:sz="4" w:space="0" w:color="000000"/>
+            </w:tcBorders>
+          </w:tcPr>
+          <w:p>
+            <w:pPr>
+              <w:spacing w:after="0"/>
+            </w:pPr>
+            <w:r>
+              <w:t>person</w:t>
+            </w:r>
+          </w:p>
+          <w:p>
+            <w:pPr>
+              <w:spacing w:after="0"/>
+            </w:pPr>
+            <w:r>
+              <w:t>id: string;</w:t>
+            </w:r>
+          </w:p>
+          <w:p>
+            <w:pPr>
+              <w:spacing w:after="0"/>
+            </w:pPr>
+            <w:r>
+              <w:t xml:space="preserve">  name: </w:t>
+            </w:r>
+            <w:r>
+              <w:t xml:space="preserve"> </w:t>
+            </w:r>
+            <w:proofErr w:type="spellStart"/>
+            <w:r>
+              <w:t>obligatorio</w:t>
+            </w:r>
+            <w:proofErr w:type="spellEnd"/>
+            <w:r>
+              <w:t>;</w:t>
+            </w:r>
+          </w:p>
+          <w:p>
+            <w:pPr>
+              <w:spacing w:after="0"/>
+            </w:pPr>
+            <w:r>
+              <w:t xml:space="preserve">  lastName1: string;</w:t>
+            </w:r>
+          </w:p>
+          <w:p>
+            <w:pPr>
+              <w:spacing w:after="0"/>
+            </w:pPr>
+            <w:r>
+              <w:t xml:space="preserve">  lastName2: string;</w:t>
+            </w:r>
+          </w:p>
+          <w:p>
+            <w:pPr>
+              <w:spacing w:after="0"/>
+            </w:pPr>
+            <w:r>
+              <w:t xml:space="preserve">  ci: </w:t>
+            </w:r>
+            <w:proofErr w:type="spellStart"/>
+            <w:r>
+              <w:t>obligatorio</w:t>
+            </w:r>
+            <w:proofErr w:type="spellEnd"/>
+            <w:r>
+              <w:t>;</w:t>
+            </w:r>
+          </w:p>
+          <w:p>
+            <w:pPr>
+              <w:spacing w:after="0"/>
+            </w:pPr>
+            <w:r>
+              <w:t xml:space="preserve">  email: string;</w:t>
+            </w:r>
+          </w:p>
+          <w:p>
+            <w:pPr>
+              <w:spacing w:after="0"/>
+            </w:pPr>
+            <w:r>
+              <w:t xml:space="preserve">  </w:t>
+            </w:r>
+            <w:proofErr w:type="spellStart"/>
+            <w:r>
+              <w:t>skinColor</w:t>
+            </w:r>
+            <w:proofErr w:type="spellEnd"/>
+            <w:r>
+              <w:t>: string;</w:t>
+            </w:r>
+          </w:p>
+          <w:p>
+            <w:pPr>
+              <w:spacing w:after="0"/>
+            </w:pPr>
+            <w:r>
+              <w:t xml:space="preserve">  phone: string;</w:t>
+            </w:r>
+          </w:p>
+          <w:p>
+            <w:pPr>
+              <w:spacing w:after="0"/>
+            </w:pPr>
+            <w:r>
+              <w:t xml:space="preserve">  </w:t>
+            </w:r>
+            <w:proofErr w:type="spellStart"/>
+            <w:r>
+              <w:t>isActive</w:t>
+            </w:r>
+            <w:proofErr w:type="spellEnd"/>
+            <w:r>
+              <w:t xml:space="preserve">: </w:t>
+            </w:r>
+            <w:proofErr w:type="spellStart"/>
+            <w:r>
+              <w:t>boolean</w:t>
+            </w:r>
+            <w:proofErr w:type="spellEnd"/>
+            <w:r>
+              <w:t>;</w:t>
+            </w:r>
+          </w:p>
+          <w:p>
+            <w:pPr>
+              <w:spacing w:after="0"/>
+            </w:pPr>
+            <w:r>
+              <w:t xml:space="preserve">  username: </w:t>
+            </w:r>
+            <w:proofErr w:type="spellStart"/>
+            <w:r>
+              <w:t>obligatorio</w:t>
+            </w:r>
+            <w:proofErr w:type="spellEnd"/>
+            <w:r>
+              <w:t>;</w:t>
+            </w:r>
+          </w:p>
+          <w:p>
+            <w:pPr>
+              <w:spacing w:after="0"/>
+            </w:pPr>
+            <w:r>
+              <w:t xml:space="preserve">  </w:t>
+            </w:r>
+            <w:proofErr w:type="spellStart"/>
+            <w:r>
+              <w:t>passwordExpirationDate</w:t>
+            </w:r>
+            <w:proofErr w:type="spellEnd"/>
+            <w:r>
+              <w:t>: Date;</w:t>
+            </w:r>
+          </w:p>
+          <w:p>
+            <w:pPr>
+              <w:spacing w:after="0"/>
+            </w:pPr>
+            <w:r>
+              <w:t xml:space="preserve">  address: string;</w:t>
+            </w:r>
+          </w:p>
+          <w:p>
+            <w:pPr>
+              <w:spacing w:after="0"/>
+            </w:pPr>
+            <w:r>
+              <w:t xml:space="preserve">  image: string;</w:t>
+            </w:r>
+          </w:p>
+          <w:p>
+            <w:pPr>
+              <w:spacing w:after="0"/>
+            </w:pPr>
+            <w:r>
+              <w:t xml:space="preserve">  role: string;</w:t>
+            </w:r>
+          </w:p>
+          <w:p>
+            <w:pPr>
+              <w:spacing w:after="0"/>
+            </w:pPr>
+            <w:r>
+              <w:t xml:space="preserve">  entity: </w:t>
+            </w:r>
+            <w:proofErr w:type="spellStart"/>
+            <w:r>
+              <w:t>Entity_Entity</w:t>
+            </w:r>
+            <w:proofErr w:type="spellEnd"/>
+            <w:r>
+              <w:t>;</w:t>
+            </w:r>
+          </w:p>
+          <w:p>
+            <w:pPr>
+              <w:spacing w:after="0"/>
+            </w:pPr>
+            <w:r>
+              <w:t xml:space="preserve">  gender: string;</w:t>
+            </w:r>
+          </w:p>
+          <w:p>
+            <w:pPr>
+              <w:spacing w:after="0"/>
+            </w:pPr>
+            <w:r>
+              <w:t xml:space="preserve">  </w:t>
+            </w:r>
+            <w:proofErr w:type="spellStart"/>
+            <w:r>
+              <w:t>updatedAt</w:t>
+            </w:r>
+            <w:proofErr w:type="spellEnd"/>
+            <w:r>
+              <w:t>: Date;</w:t>
+            </w:r>
+          </w:p>
+          <w:p>
+            <w:pPr>
+              <w:spacing w:after="0"/>
+            </w:pPr>
+            <w:r>
+              <w:t xml:space="preserve">  </w:t>
+            </w:r>
+            <w:proofErr w:type="spellStart"/>
+            <w:r>
+              <w:t>createdAt</w:t>
+            </w:r>
+            <w:proofErr w:type="spellEnd"/>
+            <w:r>
+              <w:t>: Date;</w:t>
+            </w:r>
+          </w:p>
+          <w:p>
+            <w:pPr>
+              <w:spacing w:after="0"/>
+            </w:pPr>
+            <w:r>
+              <w:t xml:space="preserve">  municipality: Municipality;</w:t>
+            </w:r>
+          </w:p>
+          <w:p>
+            <w:pPr>
+              <w:spacing w:after="0"/>
+            </w:pPr>
+            <w:r>
+              <w:t xml:space="preserve">  </w:t>
+            </w:r>
+            <w:proofErr w:type="spellStart"/>
+            <w:r>
+              <w:t>charge:Charge_Entity</w:t>
+            </w:r>
+            <w:proofErr w:type="spellEnd"/>
+            <w:r>
+              <w:t>;</w:t>
+            </w:r>
+          </w:p>
+          <w:p>
+            <w:pPr>
+              <w:spacing w:after="0"/>
+            </w:pPr>
+            <w:r>
+              <w:t xml:space="preserve">  </w:t>
+            </w:r>
+            <w:proofErr w:type="spellStart"/>
+            <w:r>
+              <w:rPr>
+                <w:lang w:val="es-ES"/>
+              </w:rPr>
+              <w:t>isDeleted:boolean</w:t>
+            </w:r>
+            <w:proofErr w:type="spellEnd"/>
+            <w:r>
+              <w:rPr>
+                <w:lang w:val="es-ES"/>
+              </w:rPr>
+              <w:t>;</w:t>
+            </w:r>
+          </w:p>
+        </w:tc>
+      </w:tr>
+      <w:tr>
+        <w:tc>
+          <w:tcPr>
+            <w:tcW w:w="1800" w:type="dxa"/>
+            <w:tcBorders>
+              <w:top w:val="single" w:sz="4" w:space="0" w:color="000000"/>
+              <w:left w:val="single" w:sz="4" w:space="0" w:color="000000"/>
+              <w:bottom w:val="single" w:sz="4" w:space="0" w:color="000000"/>
+              <w:right w:val="single" w:sz="4" w:space="0" w:color="000000"/>
+            </w:tcBorders>
+          </w:tcPr>
+          <w:p>
+            <w:pPr>
+              <w:spacing w:after="0"/>
+            </w:pPr>
+            <w:proofErr w:type="spellStart"/>
+            <w:r>
+              <w:t>Controlador</w:t>
+            </w:r>
+            <w:proofErr w:type="spellEnd"/>
+          </w:p>
+        </w:tc>
+        <w:tc>
+          <w:tcPr>
+            <w:tcW w:w="8009" w:type="dxa"/>
+            <w:tcBorders>
+              <w:top w:val="single" w:sz="4" w:space="0" w:color="000000"/>
+              <w:left w:val="single" w:sz="4" w:space="0" w:color="000000"/>
+              <w:bottom w:val="single" w:sz="4" w:space="0" w:color="000000"/>
+              <w:right w:val="single" w:sz="4" w:space="0" w:color="000000"/>
+            </w:tcBorders>
+          </w:tcPr>
+          <w:p>
+            <w:pPr>
+              <w:spacing w:after="0"/>
+              <w:rPr>
+                <w:lang w:val="es-ES"/>
+              </w:rPr>
+            </w:pPr>
+            <w:proofErr w:type="spellStart"/>
+            <w:r>
+              <w:rPr>
+                <w:lang w:val="es-ES"/>
+              </w:rPr>
+              <w:t>p</w:t>
+            </w:r>
+            <w:r>
+              <w:rPr>
+                <w:lang w:val="es-ES"/>
+              </w:rPr>
+              <w:t>e</w:t>
+            </w:r>
+            <w:r>
+              <w:rPr>
+                <w:lang w:val="es-ES"/>
+              </w:rPr>
+              <w:t>rson</w:t>
+            </w:r>
+            <w:proofErr w:type="spellEnd"/>
+          </w:p>
+          <w:p>
+            <w:pPr>
+              <w:spacing w:after="0"/>
+              <w:rPr>
+                <w:lang w:val="es-ES"/>
+              </w:rPr>
+            </w:pPr>
+            <w:proofErr w:type="spellStart"/>
+            <w:r>
+              <w:rPr>
+                <w:lang w:val="es-ES"/>
+              </w:rPr>
+              <w:t>create</w:t>
+            </w:r>
+            <w:proofErr w:type="spellEnd"/>
+            <w:r>
+              <w:rPr>
+                <w:lang w:val="es-ES"/>
+              </w:rPr>
+              <w:t>(</w:t>
+            </w:r>
+            <w:proofErr w:type="spellStart"/>
+            <w:r>
+              <w:rPr>
+                <w:lang w:val="es-ES"/>
+              </w:rPr>
+              <w:t>name,hierarchy</w:t>
+            </w:r>
+            <w:proofErr w:type="spellEnd"/>
+            <w:r>
+              <w:rPr>
+                <w:lang w:val="es-ES"/>
+              </w:rPr>
+              <w:t>)[</w:t>
+            </w:r>
+            <w:proofErr w:type="spellStart"/>
+            <w:r>
+              <w:rPr>
+                <w:lang w:val="es-ES"/>
+              </w:rPr>
+              <w:t>Trz</w:t>
+            </w:r>
+            <w:proofErr w:type="spellEnd"/>
+            <w:r>
+              <w:rPr>
+                <w:lang w:val="es-ES"/>
+              </w:rPr>
+              <w:t>]:mínimo 3 letras</w:t>
+            </w:r>
+          </w:p>
+          <w:p>
+            <w:pPr>
+              <w:spacing w:after="0"/>
+              <w:rPr>
+                <w:lang w:val="es-ES"/>
+              </w:rPr>
+            </w:pPr>
+            <w:proofErr w:type="spellStart"/>
+            <w:r>
+              <w:rPr>
+                <w:lang w:val="es-ES"/>
+              </w:rPr>
+              <w:t>findAll</w:t>
+            </w:r>
+            <w:proofErr w:type="spellEnd"/>
+            <w:r>
+              <w:rPr>
+                <w:lang w:val="es-ES"/>
+              </w:rPr>
+              <w:t>(</w:t>
+            </w:r>
+            <w:proofErr w:type="spellStart"/>
+            <w:r>
+              <w:rPr>
+                <w:lang w:val="es-ES"/>
+              </w:rPr>
+              <w:t>paginaActual,cantidaXPagina</w:t>
+            </w:r>
+            <w:proofErr w:type="spellEnd"/>
+            <w:r>
+              <w:rPr>
+                <w:lang w:val="es-ES"/>
+              </w:rPr>
+              <w:t>):se devuelven todos los elementos en paginación</w:t>
+            </w:r>
+          </w:p>
+          <w:p>
+            <w:pPr>
+              <w:spacing w:after="0"/>
+              <w:rPr>
+                <w:lang w:val="es-ES"/>
+              </w:rPr>
+            </w:pPr>
+            <w:proofErr w:type="spellStart"/>
+            <w:r>
+              <w:rPr>
+                <w:lang w:val="es-ES"/>
+              </w:rPr>
+              <w:t>findOne</w:t>
+            </w:r>
+            <w:proofErr w:type="spellEnd"/>
+            <w:r>
+              <w:rPr>
+                <w:lang w:val="es-ES"/>
+              </w:rPr>
+              <w:t>(id):devuelve los atributos de ese documento en especifico</w:t>
+            </w:r>
+          </w:p>
+          <w:p>
+            <w:pPr>
+              <w:spacing w:after="0"/>
+              <w:rPr>
+                <w:lang w:val="es-ES"/>
+              </w:rPr>
+            </w:pPr>
+            <w:proofErr w:type="spellStart"/>
+            <w:proofErr w:type="gramStart"/>
+            <w:r>
+              <w:rPr>
+                <w:lang w:val="es-ES"/>
+              </w:rPr>
+              <w:t>update</w:t>
+            </w:r>
+            <w:proofErr w:type="spellEnd"/>
+            <w:r>
+              <w:rPr>
+                <w:lang w:val="es-ES"/>
+              </w:rPr>
+              <w:t>(</w:t>
+            </w:r>
+            <w:proofErr w:type="spellStart"/>
+            <w:proofErr w:type="gramEnd"/>
+            <w:r>
+              <w:rPr>
+                <w:lang w:val="es-ES"/>
+              </w:rPr>
+              <w:t>id,datos</w:t>
+            </w:r>
+            <w:proofErr w:type="spellEnd"/>
+            <w:r>
+              <w:rPr>
+                <w:lang w:val="es-ES"/>
+              </w:rPr>
+              <w:t>)[</w:t>
+            </w:r>
+            <w:proofErr w:type="spellStart"/>
+            <w:r>
+              <w:rPr>
+                <w:lang w:val="es-ES"/>
+              </w:rPr>
+              <w:t>Trz</w:t>
+            </w:r>
+            <w:proofErr w:type="spellEnd"/>
+            <w:r>
+              <w:rPr>
+                <w:lang w:val="es-ES"/>
+              </w:rPr>
+              <w:t>]:se actualizan los datos de ese elemento en específico.</w:t>
+            </w:r>
+          </w:p>
+          <w:p>
+            <w:pPr>
+              <w:spacing w:after="0"/>
+              <w:rPr>
+                <w:lang w:val="es-ES"/>
+              </w:rPr>
+            </w:pPr>
+            <w:proofErr w:type="spellStart"/>
+            <w:r>
+              <w:rPr>
+                <w:lang w:val="es-ES"/>
+              </w:rPr>
+              <w:t>remove</w:t>
+            </w:r>
+            <w:proofErr w:type="spellEnd"/>
+            <w:r>
+              <w:rPr>
+                <w:lang w:val="es-ES"/>
+              </w:rPr>
+              <w:t>(id)[</w:t>
+            </w:r>
+            <w:proofErr w:type="spellStart"/>
+            <w:r>
+              <w:rPr>
+                <w:lang w:val="es-ES"/>
+              </w:rPr>
+              <w:t>Trz</w:t>
+            </w:r>
+            <w:proofErr w:type="spellEnd"/>
+            <w:r>
+              <w:rPr>
+                <w:lang w:val="es-ES"/>
+              </w:rPr>
+              <w:t>]:elimina de forma lógica el elemento</w:t>
+            </w:r>
+          </w:p>
+          <w:p>
+            <w:pPr>
+              <w:spacing w:after="0"/>
+              <w:rPr>
+                <w:lang w:val="es-ES"/>
+              </w:rPr>
+            </w:pPr>
+            <w:proofErr w:type="spellStart"/>
+            <w:r>
+              <w:rPr>
+                <w:lang w:val="es-ES"/>
+              </w:rPr>
+              <w:t>search</w:t>
+            </w:r>
+            <w:proofErr w:type="spellEnd"/>
+            <w:r>
+              <w:rPr>
+                <w:lang w:val="es-ES"/>
+              </w:rPr>
+              <w:t>(criterio):se busca en criterios de nombre</w:t>
+            </w:r>
+          </w:p>
+        </w:tc>
+      </w:tr>
+      <w:tr>
+        <w:tc>
+          <w:tcPr>
+            <w:tcW w:w="1800" w:type="dxa"/>
+            <w:tcBorders>
+              <w:top w:val="single" w:sz="4" w:space="0" w:color="000000"/>
+              <w:left w:val="single" w:sz="4" w:space="0" w:color="000000"/>
+              <w:bottom w:val="single" w:sz="4" w:space="0" w:color="000000"/>
+              <w:right w:val="single" w:sz="4" w:space="0" w:color="000000"/>
+            </w:tcBorders>
+          </w:tcPr>
+          <w:p>
+            <w:pPr>
+              <w:spacing w:after="0"/>
+              <w:rPr>
+                <w:lang w:val="es-ES"/>
+              </w:rPr>
+            </w:pPr>
+            <w:r>
+              <w:rPr>
+                <w:lang w:val="es-ES"/>
+              </w:rPr>
+              <w:t>Dependencia</w:t>
+            </w:r>
+          </w:p>
+        </w:tc>
+        <w:tc>
+          <w:tcPr>
+            <w:tcW w:w="8009" w:type="dxa"/>
+            <w:tcBorders>
+              <w:top w:val="single" w:sz="4" w:space="0" w:color="000000"/>
+              <w:left w:val="single" w:sz="4" w:space="0" w:color="000000"/>
+              <w:bottom w:val="single" w:sz="4" w:space="0" w:color="000000"/>
+              <w:right w:val="single" w:sz="4" w:space="0" w:color="000000"/>
+            </w:tcBorders>
+          </w:tcPr>
+          <w:p>
+            <w:pPr>
+              <w:spacing w:after="0"/>
+              <w:rPr>
+                <w:lang w:val="es-ES"/>
+              </w:rPr>
+            </w:pPr>
+            <w:proofErr w:type="spellStart"/>
+            <w:r>
+              <w:rPr>
+                <w:lang w:val="es-ES"/>
+              </w:rPr>
+              <w:t>Entity</w:t>
+            </w:r>
+            <w:proofErr w:type="spellEnd"/>
+          </w:p>
+          <w:p>
+            <w:pPr>
+              <w:spacing w:after="0"/>
+              <w:rPr>
+                <w:lang w:val="es-ES"/>
+              </w:rPr>
+            </w:pPr>
+            <w:proofErr w:type="spellStart"/>
+            <w:r>
+              <w:rPr>
+                <w:lang w:val="es-ES"/>
+              </w:rPr>
+              <w:t>Municipality</w:t>
+            </w:r>
+            <w:proofErr w:type="spellEnd"/>
+          </w:p>
+        </w:tc>
+      </w:tr>
+    </w:tbl>
+    <w:p>
+      <w:r>
+        <w:br w:type="page"/>
+      </w:r>
+    </w:p>
+    <w:p>
+      <w:bookmarkStart w:id="0" w:name="_GoBack"/>
+      <w:bookmarkEnd w:id="0"/>
+    </w:p>
+    <w:p>
+      <w:pPr>
+        <w:pStyle w:val="Ttulo2"/>
+      </w:pPr>
+      <w:r>
+        <w:t xml:space="preserve">Cargo en la entidad [se tendrán en toda la aplicación] </w:t>
+      </w:r>
+    </w:p>
+    <w:tbl>
+      <w:tblPr>
+        <w:tblW w:w="9810" w:type="dxa"/>
+        <w:tblInd w:w="-15" w:type="dxa"/>
+        <w:tblLayout w:type="fixed"/>
+        <w:tblLook w:val="0000" w:firstRow="0" w:lastRow="0" w:firstColumn="0" w:lastColumn="0" w:noHBand="0" w:noVBand="0"/>
+      </w:tblPr>
+      <w:tblGrid>
+        <w:gridCol w:w="1800"/>
+        <w:gridCol w:w="8010"/>
+      </w:tblGrid>
+      <w:tr>
+        <w:tc>
+          <w:tcPr>
+            <w:tcW w:w="1800" w:type="dxa"/>
+            <w:tcBorders>
+              <w:top w:val="single" w:sz="4" w:space="0" w:color="000000"/>
+              <w:left w:val="single" w:sz="4" w:space="0" w:color="000000"/>
+              <w:bottom w:val="single" w:sz="4" w:space="0" w:color="000000"/>
+              <w:right w:val="single" w:sz="4" w:space="0" w:color="000000"/>
+            </w:tcBorders>
+          </w:tcPr>
+          <w:p>
+            <w:pPr>
+              <w:spacing w:after="0"/>
+            </w:pPr>
+            <w:r>
+              <w:t>Collection</w:t>
+            </w:r>
+          </w:p>
+        </w:tc>
+        <w:tc>
+          <w:tcPr>
+            <w:tcW w:w="8009" w:type="dxa"/>
+            <w:tcBorders>
+              <w:top w:val="single" w:sz="4" w:space="0" w:color="000000"/>
+              <w:left w:val="single" w:sz="4" w:space="0" w:color="000000"/>
+              <w:bottom w:val="single" w:sz="4" w:space="0" w:color="000000"/>
+              <w:right w:val="single" w:sz="4" w:space="0" w:color="000000"/>
+            </w:tcBorders>
+          </w:tcPr>
+          <w:p>
+            <w:pPr>
+              <w:spacing w:after="0"/>
+              <w:rPr>
+                <w:lang w:val="es-ES"/>
+              </w:rPr>
+            </w:pPr>
+            <w:proofErr w:type="spellStart"/>
+            <w:r>
+              <w:rPr>
+                <w:lang w:val="es-ES"/>
+              </w:rPr>
+              <w:t>charge</w:t>
+            </w:r>
+            <w:proofErr w:type="spellEnd"/>
+          </w:p>
+          <w:p>
+            <w:pPr>
+              <w:spacing w:after="0"/>
+              <w:rPr>
+                <w:lang w:val="es-ES"/>
+              </w:rPr>
+            </w:pPr>
+            <w:proofErr w:type="spellStart"/>
+            <w:r>
+              <w:rPr>
+                <w:lang w:val="es-ES"/>
+              </w:rPr>
+              <w:t>name</w:t>
+            </w:r>
+            <w:proofErr w:type="spellEnd"/>
+            <w:r>
+              <w:rPr>
+                <w:lang w:val="es-ES"/>
+              </w:rPr>
+              <w:t xml:space="preserve">: nombre del </w:t>
+            </w:r>
+            <w:r>
+              <w:rPr>
+                <w:lang w:val="es-ES"/>
+              </w:rPr>
+              <w:t xml:space="preserve">cargo que se ocupa en la </w:t>
+            </w:r>
+            <w:r>
+              <w:rPr>
+                <w:lang w:val="es-ES"/>
+              </w:rPr>
+              <w:t>entidad</w:t>
+            </w:r>
+          </w:p>
+          <w:p>
+            <w:pPr>
+              <w:spacing w:after="0"/>
+              <w:rPr>
+                <w:lang w:val="es-ES"/>
+              </w:rPr>
+            </w:pPr>
+            <w:proofErr w:type="spellStart"/>
+            <w:r>
+              <w:rPr>
+                <w:lang w:val="es-ES"/>
+              </w:rPr>
+              <w:t>entity</w:t>
+            </w:r>
+            <w:proofErr w:type="spellEnd"/>
+            <w:r>
+              <w:rPr>
+                <w:lang w:val="es-ES"/>
+              </w:rPr>
+              <w:t>: entidad a quien pertenece</w:t>
+            </w:r>
+          </w:p>
+          <w:p>
+            <w:pPr>
+              <w:spacing w:after="0"/>
+              <w:rPr>
+                <w:lang w:val="es-ES"/>
+              </w:rPr>
+            </w:pPr>
+            <w:proofErr w:type="spellStart"/>
+            <w:r>
+              <w:rPr>
+                <w:lang w:val="es-ES"/>
+              </w:rPr>
+              <w:t>access</w:t>
+            </w:r>
+            <w:proofErr w:type="spellEnd"/>
+            <w:r>
+              <w:rPr>
+                <w:lang w:val="es-ES"/>
+              </w:rPr>
+              <w:t>: acceso que tiene en ese cargo, funcionalidades a las que puede acceder</w:t>
+            </w:r>
+          </w:p>
+          <w:p>
+            <w:pPr>
+              <w:spacing w:after="0"/>
+              <w:ind w:left="720"/>
+              <w:rPr>
+                <w:lang w:val="es-ES"/>
+              </w:rPr>
+            </w:pPr>
+            <w:r>
+              <w:rPr>
+                <w:lang w:val="es-ES"/>
+              </w:rPr>
+              <w:t xml:space="preserve"> [ puntos de categorías que puede hacer ]</w:t>
+            </w:r>
+          </w:p>
+          <w:p>
+            <w:pPr>
+              <w:spacing w:after="0"/>
+              <w:rPr>
+                <w:lang w:val="es-ES"/>
+              </w:rPr>
+            </w:pPr>
+            <w:proofErr w:type="spellStart"/>
+            <w:r>
+              <w:rPr>
+                <w:lang w:val="es-ES"/>
+              </w:rPr>
+              <w:t>Subord</w:t>
+            </w:r>
+            <w:proofErr w:type="spellEnd"/>
+            <w:r>
+              <w:rPr>
+                <w:lang w:val="es-ES"/>
+              </w:rPr>
+              <w:t>: [ entidades id ]</w:t>
+            </w:r>
+            <w:r>
+              <w:rPr>
+                <w:lang w:val="es-ES"/>
+              </w:rPr>
+              <w:t xml:space="preserve"> entidades en las que puedo transformar</w:t>
+            </w:r>
+          </w:p>
+          <w:p>
+            <w:pPr>
+              <w:spacing w:after="0"/>
+              <w:rPr>
+                <w:lang w:val="es-ES"/>
+              </w:rPr>
+            </w:pPr>
+          </w:p>
+        </w:tc>
+      </w:tr>
+      <w:tr>
+        <w:tc>
+          <w:tcPr>
+            <w:tcW w:w="1800" w:type="dxa"/>
+            <w:tcBorders>
+              <w:top w:val="single" w:sz="4" w:space="0" w:color="000000"/>
+              <w:left w:val="single" w:sz="4" w:space="0" w:color="000000"/>
+              <w:bottom w:val="single" w:sz="4" w:space="0" w:color="000000"/>
+              <w:right w:val="single" w:sz="4" w:space="0" w:color="000000"/>
+            </w:tcBorders>
+          </w:tcPr>
+          <w:p>
+            <w:pPr>
+              <w:spacing w:after="0"/>
+            </w:pPr>
+            <w:proofErr w:type="spellStart"/>
+            <w:r>
+              <w:t>Controlador</w:t>
+            </w:r>
+            <w:proofErr w:type="spellEnd"/>
+          </w:p>
+        </w:tc>
+        <w:tc>
+          <w:tcPr>
+            <w:tcW w:w="8009" w:type="dxa"/>
+            <w:tcBorders>
+              <w:top w:val="single" w:sz="4" w:space="0" w:color="000000"/>
+              <w:left w:val="single" w:sz="4" w:space="0" w:color="000000"/>
+              <w:bottom w:val="single" w:sz="4" w:space="0" w:color="000000"/>
+              <w:right w:val="single" w:sz="4" w:space="0" w:color="000000"/>
+            </w:tcBorders>
+          </w:tcPr>
+          <w:p>
+            <w:pPr>
+              <w:spacing w:after="0"/>
+              <w:rPr>
+                <w:lang w:val="es-ES"/>
+              </w:rPr>
+            </w:pPr>
+            <w:proofErr w:type="spellStart"/>
+            <w:r>
+              <w:rPr>
+                <w:lang w:val="es-ES"/>
+              </w:rPr>
+              <w:t>charge</w:t>
+            </w:r>
+            <w:proofErr w:type="spellEnd"/>
+          </w:p>
+          <w:p>
+            <w:pPr>
+              <w:spacing w:after="0"/>
+              <w:rPr>
+                <w:lang w:val="es-ES"/>
+              </w:rPr>
+            </w:pPr>
+            <w:proofErr w:type="spellStart"/>
+            <w:r>
+              <w:rPr>
+                <w:lang w:val="es-ES"/>
+              </w:rPr>
+              <w:t>create</w:t>
+            </w:r>
+            <w:proofErr w:type="spellEnd"/>
+            <w:r>
+              <w:rPr>
+                <w:lang w:val="es-ES"/>
+              </w:rPr>
+              <w:t>(</w:t>
+            </w:r>
+            <w:proofErr w:type="spellStart"/>
+            <w:r>
+              <w:rPr>
+                <w:lang w:val="es-ES"/>
+              </w:rPr>
+              <w:t>name,hierarchy</w:t>
+            </w:r>
+            <w:proofErr w:type="spellEnd"/>
+            <w:r>
+              <w:rPr>
+                <w:lang w:val="es-ES"/>
+              </w:rPr>
+              <w:t>)[</w:t>
+            </w:r>
+            <w:proofErr w:type="spellStart"/>
+            <w:r>
+              <w:rPr>
+                <w:lang w:val="es-ES"/>
+              </w:rPr>
+              <w:t>Trz</w:t>
+            </w:r>
+            <w:proofErr w:type="spellEnd"/>
+            <w:r>
+              <w:rPr>
+                <w:lang w:val="es-ES"/>
+              </w:rPr>
+              <w:t xml:space="preserve">]:mínimo 3 letras, único y </w:t>
+            </w:r>
+            <w:r>
+              <w:rPr>
+                <w:lang w:val="es-ES"/>
+              </w:rPr>
+              <w:t>el id entidad</w:t>
+            </w:r>
+          </w:p>
+          <w:p>
+            <w:pPr>
+              <w:spacing w:after="0"/>
+              <w:rPr>
+                <w:lang w:val="es-ES"/>
+              </w:rPr>
+            </w:pPr>
+            <w:proofErr w:type="spellStart"/>
+            <w:r>
+              <w:rPr>
+                <w:lang w:val="es-ES"/>
+              </w:rPr>
+              <w:t>findAll</w:t>
+            </w:r>
+            <w:proofErr w:type="spellEnd"/>
+            <w:r>
+              <w:rPr>
+                <w:lang w:val="es-ES"/>
+              </w:rPr>
+              <w:t>(</w:t>
+            </w:r>
+            <w:proofErr w:type="spellStart"/>
+            <w:r>
+              <w:rPr>
+                <w:lang w:val="es-ES"/>
+              </w:rPr>
+              <w:t>paginaActual,cantidaXPagina</w:t>
+            </w:r>
+            <w:proofErr w:type="spellEnd"/>
+            <w:r>
+              <w:rPr>
+                <w:lang w:val="es-ES"/>
+              </w:rPr>
+              <w:t>):se devuelven todos los elementos en paginación</w:t>
+            </w:r>
+          </w:p>
+          <w:p>
+            <w:pPr>
+              <w:spacing w:after="0"/>
+              <w:rPr>
+                <w:lang w:val="es-ES"/>
+              </w:rPr>
+            </w:pPr>
+            <w:proofErr w:type="spellStart"/>
+            <w:r>
+              <w:rPr>
+                <w:lang w:val="es-ES"/>
+              </w:rPr>
+              <w:t>findOne</w:t>
+            </w:r>
+            <w:proofErr w:type="spellEnd"/>
+            <w:r>
+              <w:rPr>
+                <w:lang w:val="es-ES"/>
+              </w:rPr>
+              <w:t>(id):devuelve los atributos de ese documento en especifico</w:t>
+            </w:r>
+          </w:p>
+          <w:p>
+            <w:pPr>
+              <w:spacing w:after="0"/>
+              <w:rPr>
+                <w:lang w:val="es-ES"/>
+              </w:rPr>
+            </w:pPr>
+            <w:proofErr w:type="spellStart"/>
+            <w:proofErr w:type="gramStart"/>
+            <w:r>
+              <w:rPr>
+                <w:lang w:val="es-ES"/>
+              </w:rPr>
+              <w:t>update</w:t>
+            </w:r>
+            <w:proofErr w:type="spellEnd"/>
+            <w:r>
+              <w:rPr>
+                <w:lang w:val="es-ES"/>
+              </w:rPr>
+              <w:t>(</w:t>
+            </w:r>
+            <w:proofErr w:type="spellStart"/>
+            <w:proofErr w:type="gramEnd"/>
+            <w:r>
+              <w:rPr>
+                <w:lang w:val="es-ES"/>
+              </w:rPr>
+              <w:t>id,datos</w:t>
+            </w:r>
+            <w:proofErr w:type="spellEnd"/>
+            <w:r>
+              <w:rPr>
+                <w:lang w:val="es-ES"/>
+              </w:rPr>
+              <w:t>)[</w:t>
+            </w:r>
+            <w:proofErr w:type="spellStart"/>
+            <w:r>
+              <w:rPr>
+                <w:lang w:val="es-ES"/>
+              </w:rPr>
+              <w:t>Trz</w:t>
+            </w:r>
+            <w:proofErr w:type="spellEnd"/>
+            <w:r>
+              <w:rPr>
+                <w:lang w:val="es-ES"/>
+              </w:rPr>
+              <w:t>]:se actualizan los datos de ese elemento en específico.</w:t>
+            </w:r>
+          </w:p>
+          <w:p>
+            <w:pPr>
+              <w:spacing w:after="0"/>
+              <w:rPr>
+                <w:lang w:val="es-ES"/>
+              </w:rPr>
+            </w:pPr>
+            <w:proofErr w:type="spellStart"/>
+            <w:r>
+              <w:rPr>
+                <w:lang w:val="es-ES"/>
+              </w:rPr>
+              <w:t>remove</w:t>
+            </w:r>
+            <w:proofErr w:type="spellEnd"/>
+            <w:r>
+              <w:rPr>
+                <w:lang w:val="es-ES"/>
+              </w:rPr>
+              <w:t>(id)[</w:t>
+            </w:r>
+            <w:proofErr w:type="spellStart"/>
+            <w:r>
+              <w:rPr>
+                <w:lang w:val="es-ES"/>
+              </w:rPr>
+              <w:t>Trz</w:t>
+            </w:r>
+            <w:proofErr w:type="spellEnd"/>
+            <w:r>
+              <w:rPr>
+                <w:lang w:val="es-ES"/>
+              </w:rPr>
+              <w:t>]:elimina de forma lógica el elemento</w:t>
+            </w:r>
+          </w:p>
+          <w:p>
+            <w:pPr>
+              <w:spacing w:after="0"/>
+              <w:rPr>
+                <w:lang w:val="es-ES"/>
+              </w:rPr>
+            </w:pPr>
+            <w:proofErr w:type="spellStart"/>
+            <w:r>
+              <w:rPr>
+                <w:lang w:val="es-ES"/>
+              </w:rPr>
+              <w:t>search</w:t>
+            </w:r>
+            <w:proofErr w:type="spellEnd"/>
+            <w:r>
+              <w:rPr>
+                <w:lang w:val="es-ES"/>
+              </w:rPr>
+              <w:t>(criterio):se busca en criterios de nombre</w:t>
+            </w:r>
+          </w:p>
+        </w:tc>
+      </w:tr>
+      <w:tr>
+        <w:tc>
+          <w:tcPr>
+            <w:tcW w:w="1800" w:type="dxa"/>
+            <w:tcBorders>
+              <w:top w:val="single" w:sz="4" w:space="0" w:color="000000"/>
+              <w:left w:val="single" w:sz="4" w:space="0" w:color="000000"/>
+              <w:bottom w:val="single" w:sz="4" w:space="0" w:color="000000"/>
+              <w:right w:val="single" w:sz="4" w:space="0" w:color="000000"/>
+            </w:tcBorders>
+          </w:tcPr>
+          <w:p>
+            <w:pPr>
+              <w:spacing w:after="0"/>
+              <w:rPr>
+                <w:lang w:val="es-ES"/>
+              </w:rPr>
+            </w:pPr>
+            <w:r>
+              <w:rPr>
+                <w:lang w:val="es-ES"/>
+              </w:rPr>
+              <w:t>Dependencia</w:t>
+            </w:r>
+          </w:p>
+        </w:tc>
+        <w:tc>
+          <w:tcPr>
+            <w:tcW w:w="8009" w:type="dxa"/>
+            <w:tcBorders>
+              <w:top w:val="single" w:sz="4" w:space="0" w:color="000000"/>
+              <w:left w:val="single" w:sz="4" w:space="0" w:color="000000"/>
+              <w:bottom w:val="single" w:sz="4" w:space="0" w:color="000000"/>
+              <w:right w:val="single" w:sz="4" w:space="0" w:color="000000"/>
+            </w:tcBorders>
+          </w:tcPr>
+          <w:p>
+            <w:pPr>
+              <w:spacing w:after="0"/>
+              <w:rPr>
+                <w:lang w:val="es-ES"/>
+              </w:rPr>
+            </w:pPr>
+            <w:r>
+              <w:rPr>
+                <w:lang w:val="es-ES"/>
+              </w:rPr>
+              <w:t>Entidad=&gt; entidad id a la que pertenece</w:t>
+            </w:r>
+          </w:p>
+          <w:p>
+            <w:pPr>
+              <w:spacing w:after="0"/>
+              <w:rPr>
+                <w:lang w:val="es-ES"/>
+              </w:rPr>
+            </w:pPr>
+            <w:r>
+              <w:rPr>
+                <w:lang w:val="es-ES"/>
+              </w:rPr>
+              <w:t>Subordinadas=&gt;[ entidades ID subordinadas a las que puede acceder ]</w:t>
+            </w:r>
+          </w:p>
+          <w:p>
+            <w:pPr>
+              <w:spacing w:after="0"/>
+              <w:rPr>
+                <w:lang w:val="es-ES"/>
+              </w:rPr>
+            </w:pPr>
+            <w:r>
+              <w:rPr>
+                <w:lang w:val="es-ES"/>
+              </w:rPr>
+              <w:t xml:space="preserve">Categorías de Menú =&gt; </w:t>
+            </w:r>
+            <w:proofErr w:type="spellStart"/>
+            <w:r>
+              <w:rPr>
+                <w:lang w:val="es-ES"/>
+              </w:rPr>
+              <w:t>Categorie</w:t>
+            </w:r>
+            <w:proofErr w:type="spellEnd"/>
+          </w:p>
+        </w:tc>
+      </w:tr>
+    </w:tbl>
+    <w:p>
+      <w:pPr>
+        <w:rPr>
+          <w:lang w:val="es-ES"/>
+        </w:rPr>
+      </w:pPr>
+    </w:p>
+    <w:p>
+      <w:pPr>
+        <w:pStyle w:val="Ttulo2"/>
+      </w:pPr>
+      <w:r>
+        <w:t xml:space="preserve">Categorías [Módulos que tendrá acceso]  </w:t>
+      </w:r>
+    </w:p>
+    <w:tbl>
+      <w:tblPr>
+        <w:tblW w:w="9810" w:type="dxa"/>
+        <w:tblInd w:w="-15" w:type="dxa"/>
+        <w:tblLayout w:type="fixed"/>
+        <w:tblLook w:val="0000" w:firstRow="0" w:lastRow="0" w:firstColumn="0" w:lastColumn="0" w:noHBand="0" w:noVBand="0"/>
+      </w:tblPr>
+      <w:tblGrid>
+        <w:gridCol w:w="1800"/>
+        <w:gridCol w:w="8010"/>
+      </w:tblGrid>
+      <w:tr>
+        <w:tc>
+          <w:tcPr>
+            <w:tcW w:w="1800" w:type="dxa"/>
+            <w:tcBorders>
+              <w:top w:val="single" w:sz="4" w:space="0" w:color="000000"/>
+              <w:left w:val="single" w:sz="4" w:space="0" w:color="000000"/>
+              <w:bottom w:val="single" w:sz="4" w:space="0" w:color="000000"/>
+              <w:right w:val="single" w:sz="4" w:space="0" w:color="000000"/>
+            </w:tcBorders>
+          </w:tcPr>
+          <w:p>
+            <w:pPr>
+              <w:spacing w:after="0"/>
+            </w:pPr>
+            <w:r>
+              <w:t>Collection</w:t>
+            </w:r>
+          </w:p>
+        </w:tc>
+        <w:tc>
+          <w:tcPr>
+            <w:tcW w:w="8009" w:type="dxa"/>
+            <w:tcBorders>
+              <w:top w:val="single" w:sz="4" w:space="0" w:color="000000"/>
+              <w:left w:val="single" w:sz="4" w:space="0" w:color="000000"/>
+              <w:bottom w:val="single" w:sz="4" w:space="0" w:color="000000"/>
+              <w:right w:val="single" w:sz="4" w:space="0" w:color="000000"/>
+            </w:tcBorders>
+          </w:tcPr>
+          <w:p>
+            <w:pPr>
+              <w:spacing w:after="0"/>
+              <w:rPr>
+                <w:lang w:val="es-ES"/>
+              </w:rPr>
+            </w:pPr>
+            <w:proofErr w:type="spellStart"/>
+            <w:r>
+              <w:rPr>
+                <w:lang w:val="es-ES"/>
+              </w:rPr>
+              <w:t>categorie</w:t>
+            </w:r>
+            <w:proofErr w:type="spellEnd"/>
+          </w:p>
+          <w:p>
+            <w:pPr>
+              <w:spacing w:after="0"/>
+              <w:rPr>
+                <w:lang w:val="es-ES"/>
+              </w:rPr>
+            </w:pPr>
+            <w:proofErr w:type="spellStart"/>
+            <w:r>
+              <w:rPr>
+                <w:lang w:val="es-ES"/>
+              </w:rPr>
+              <w:t>name</w:t>
+            </w:r>
+            <w:proofErr w:type="spellEnd"/>
+            <w:r>
+              <w:rPr>
+                <w:lang w:val="es-ES"/>
+              </w:rPr>
+              <w:t xml:space="preserve">: nombre </w:t>
+            </w:r>
+            <w:r>
+              <w:rPr>
+                <w:lang w:val="es-ES"/>
+              </w:rPr>
+              <w:t>del modulo</w:t>
+            </w:r>
+          </w:p>
+          <w:p>
+            <w:pPr>
+              <w:spacing w:after="0"/>
+              <w:rPr>
+                <w:lang w:val="es-ES"/>
+              </w:rPr>
+            </w:pPr>
+            <w:proofErr w:type="spellStart"/>
+            <w:r>
+              <w:rPr>
+                <w:lang w:val="es-ES"/>
+              </w:rPr>
+              <w:t>nameTitle</w:t>
+            </w:r>
+            <w:proofErr w:type="spellEnd"/>
+            <w:r>
+              <w:rPr>
+                <w:lang w:val="es-ES"/>
+              </w:rPr>
+              <w:t xml:space="preserve">: </w:t>
+            </w:r>
+            <w:r>
+              <w:rPr>
+                <w:lang w:val="es-ES"/>
+              </w:rPr>
+              <w:t>título</w:t>
+            </w:r>
+            <w:r>
+              <w:rPr>
+                <w:lang w:val="es-ES"/>
+              </w:rPr>
+              <w:t xml:space="preserve"> que se</w:t>
+            </w:r>
+            <w:r>
+              <w:rPr>
+                <w:lang w:val="es-ES"/>
+              </w:rPr>
+              <w:t xml:space="preserve"> </w:t>
+            </w:r>
+            <w:r>
+              <w:rPr>
+                <w:lang w:val="es-ES"/>
+              </w:rPr>
+              <w:t>pondrá</w:t>
+            </w:r>
+            <w:r>
+              <w:rPr>
+                <w:lang w:val="es-ES"/>
+              </w:rPr>
+              <w:t xml:space="preserve"> en el</w:t>
+            </w:r>
+            <w:r>
+              <w:rPr>
+                <w:lang w:val="es-ES"/>
+              </w:rPr>
+              <w:t xml:space="preserve"> menú</w:t>
+            </w:r>
+          </w:p>
+          <w:p>
+            <w:pPr>
+              <w:spacing w:after="0"/>
+              <w:rPr>
+                <w:lang w:val="es-ES"/>
+              </w:rPr>
+            </w:pPr>
+            <w:r>
+              <w:rPr>
+                <w:lang w:val="es-ES"/>
+              </w:rPr>
+              <w:t>link: dcc del vínculo de acceso al modulo</w:t>
+            </w:r>
+          </w:p>
+          <w:p>
+            <w:pPr>
+              <w:spacing w:after="0"/>
+              <w:rPr>
+                <w:lang w:val="es-ES"/>
+              </w:rPr>
+            </w:pPr>
+            <w:proofErr w:type="spellStart"/>
+            <w:r>
+              <w:rPr>
+                <w:lang w:val="es-ES"/>
+              </w:rPr>
+              <w:t>access_point</w:t>
+            </w:r>
+            <w:proofErr w:type="spellEnd"/>
+            <w:r>
+              <w:rPr>
+                <w:lang w:val="es-ES"/>
+              </w:rPr>
+              <w:t xml:space="preserve">: [ </w:t>
+            </w:r>
+            <w:proofErr w:type="spellStart"/>
+            <w:r>
+              <w:rPr>
+                <w:lang w:val="es-ES"/>
+              </w:rPr>
+              <w:t>api_struct</w:t>
+            </w:r>
+            <w:proofErr w:type="spellEnd"/>
+            <w:r>
+              <w:rPr>
+                <w:lang w:val="es-ES"/>
+              </w:rPr>
+              <w:t xml:space="preserve"> ]</w:t>
+            </w:r>
+          </w:p>
+        </w:tc>
+      </w:tr>
+      <w:tr>
+        <w:tc>
+          <w:tcPr>
+            <w:tcW w:w="1800" w:type="dxa"/>
+            <w:tcBorders>
+              <w:top w:val="single" w:sz="4" w:space="0" w:color="000000"/>
+              <w:left w:val="single" w:sz="4" w:space="0" w:color="000000"/>
+              <w:bottom w:val="single" w:sz="4" w:space="0" w:color="000000"/>
+              <w:right w:val="single" w:sz="4" w:space="0" w:color="000000"/>
+            </w:tcBorders>
+          </w:tcPr>
+          <w:p>
+            <w:pPr>
+              <w:spacing w:after="0"/>
+            </w:pPr>
+            <w:proofErr w:type="spellStart"/>
+            <w:r>
+              <w:t>Controlador</w:t>
+            </w:r>
+            <w:proofErr w:type="spellEnd"/>
+          </w:p>
+        </w:tc>
+        <w:tc>
+          <w:tcPr>
+            <w:tcW w:w="8009" w:type="dxa"/>
+            <w:tcBorders>
+              <w:top w:val="single" w:sz="4" w:space="0" w:color="000000"/>
+              <w:left w:val="single" w:sz="4" w:space="0" w:color="000000"/>
+              <w:bottom w:val="single" w:sz="4" w:space="0" w:color="000000"/>
+              <w:right w:val="single" w:sz="4" w:space="0" w:color="000000"/>
+            </w:tcBorders>
+          </w:tcPr>
+          <w:p>
+            <w:pPr>
+              <w:spacing w:after="0"/>
+              <w:rPr>
+                <w:lang w:val="es-ES"/>
+              </w:rPr>
+            </w:pPr>
+            <w:proofErr w:type="spellStart"/>
+            <w:r>
+              <w:rPr>
+                <w:lang w:val="es-ES"/>
+              </w:rPr>
+              <w:t>categori</w:t>
+            </w:r>
+            <w:r>
+              <w:rPr>
+                <w:lang w:val="es-ES"/>
+              </w:rPr>
+              <w:t>e</w:t>
+            </w:r>
+            <w:proofErr w:type="spellEnd"/>
+          </w:p>
+          <w:p>
+            <w:pPr>
+              <w:spacing w:after="0"/>
+              <w:rPr>
+                <w:lang w:val="es-ES"/>
+              </w:rPr>
+            </w:pPr>
+            <w:proofErr w:type="spellStart"/>
+            <w:r>
+              <w:rPr>
+                <w:lang w:val="es-ES"/>
+              </w:rPr>
+              <w:t>create</w:t>
+            </w:r>
+            <w:proofErr w:type="spellEnd"/>
+            <w:r>
+              <w:rPr>
+                <w:lang w:val="es-ES"/>
+              </w:rPr>
+              <w:t>(</w:t>
+            </w:r>
+            <w:proofErr w:type="spellStart"/>
+            <w:r>
+              <w:rPr>
+                <w:lang w:val="es-ES"/>
+              </w:rPr>
+              <w:t>name,hierarchy</w:t>
+            </w:r>
+            <w:proofErr w:type="spellEnd"/>
+            <w:r>
+              <w:rPr>
+                <w:lang w:val="es-ES"/>
+              </w:rPr>
+              <w:t>)[</w:t>
+            </w:r>
+            <w:proofErr w:type="spellStart"/>
+            <w:r>
+              <w:rPr>
+                <w:lang w:val="es-ES"/>
+              </w:rPr>
+              <w:t>Trz</w:t>
+            </w:r>
+            <w:proofErr w:type="spellEnd"/>
+            <w:r>
+              <w:rPr>
+                <w:lang w:val="es-ES"/>
+              </w:rPr>
+              <w:t>]:mínimo 3 letras</w:t>
+            </w:r>
+          </w:p>
+          <w:p>
+            <w:pPr>
+              <w:spacing w:after="0"/>
+              <w:rPr>
+                <w:lang w:val="es-ES"/>
+              </w:rPr>
+            </w:pPr>
+            <w:proofErr w:type="spellStart"/>
+            <w:r>
+              <w:rPr>
+                <w:lang w:val="es-ES"/>
+              </w:rPr>
+              <w:t>findAll</w:t>
+            </w:r>
+            <w:proofErr w:type="spellEnd"/>
+            <w:r>
+              <w:rPr>
+                <w:lang w:val="es-ES"/>
+              </w:rPr>
+              <w:t>(</w:t>
+            </w:r>
+            <w:proofErr w:type="spellStart"/>
+            <w:r>
+              <w:rPr>
+                <w:lang w:val="es-ES"/>
+              </w:rPr>
+              <w:t>paginaActual,cantidaXPagina</w:t>
+            </w:r>
+            <w:proofErr w:type="spellEnd"/>
+            <w:r>
+              <w:rPr>
+                <w:lang w:val="es-ES"/>
+              </w:rPr>
+              <w:t>):se devuelven todos los elementos en paginación</w:t>
+            </w:r>
+          </w:p>
+          <w:p>
+            <w:pPr>
+              <w:spacing w:after="0"/>
+              <w:rPr>
+                <w:lang w:val="es-ES"/>
+              </w:rPr>
+            </w:pPr>
+            <w:proofErr w:type="spellStart"/>
+            <w:r>
+              <w:rPr>
+                <w:lang w:val="es-ES"/>
+              </w:rPr>
+              <w:t>findOne</w:t>
+            </w:r>
+            <w:proofErr w:type="spellEnd"/>
+            <w:r>
+              <w:rPr>
+                <w:lang w:val="es-ES"/>
+              </w:rPr>
+              <w:t>(id):devuelve los atributos de ese documento en especifico</w:t>
+            </w:r>
+          </w:p>
+          <w:p>
+            <w:pPr>
+              <w:spacing w:after="0"/>
+              <w:rPr>
+                <w:lang w:val="es-ES"/>
+              </w:rPr>
+            </w:pPr>
+            <w:proofErr w:type="spellStart"/>
+            <w:proofErr w:type="gramStart"/>
+            <w:r>
+              <w:rPr>
+                <w:lang w:val="es-ES"/>
+              </w:rPr>
+              <w:t>update</w:t>
+            </w:r>
+            <w:proofErr w:type="spellEnd"/>
+            <w:r>
+              <w:rPr>
+                <w:lang w:val="es-ES"/>
+              </w:rPr>
+              <w:t>(</w:t>
+            </w:r>
+            <w:proofErr w:type="spellStart"/>
+            <w:proofErr w:type="gramEnd"/>
+            <w:r>
+              <w:rPr>
+                <w:lang w:val="es-ES"/>
+              </w:rPr>
+              <w:t>id,datos</w:t>
+            </w:r>
+            <w:proofErr w:type="spellEnd"/>
+            <w:r>
+              <w:rPr>
+                <w:lang w:val="es-ES"/>
+              </w:rPr>
+              <w:t>)[</w:t>
+            </w:r>
+            <w:proofErr w:type="spellStart"/>
+            <w:r>
+              <w:rPr>
+                <w:lang w:val="es-ES"/>
+              </w:rPr>
+              <w:t>Trz</w:t>
+            </w:r>
+            <w:proofErr w:type="spellEnd"/>
+            <w:r>
+              <w:rPr>
+                <w:lang w:val="es-ES"/>
+              </w:rPr>
+              <w:t>]:se actualizan los datos de ese elemento en específico.</w:t>
+            </w:r>
+          </w:p>
+          <w:p>
+            <w:pPr>
+              <w:spacing w:after="0"/>
+              <w:rPr>
+                <w:lang w:val="es-ES"/>
+              </w:rPr>
+            </w:pPr>
+            <w:proofErr w:type="spellStart"/>
+            <w:r>
+              <w:rPr>
+                <w:lang w:val="es-ES"/>
+              </w:rPr>
+              <w:t>remove</w:t>
+            </w:r>
+            <w:proofErr w:type="spellEnd"/>
+            <w:r>
+              <w:rPr>
+                <w:lang w:val="es-ES"/>
+              </w:rPr>
+              <w:t>(id)[</w:t>
+            </w:r>
+            <w:proofErr w:type="spellStart"/>
+            <w:r>
+              <w:rPr>
+                <w:lang w:val="es-ES"/>
+              </w:rPr>
+              <w:t>Trz</w:t>
+            </w:r>
+            <w:proofErr w:type="spellEnd"/>
+            <w:r>
+              <w:rPr>
+                <w:lang w:val="es-ES"/>
+              </w:rPr>
+              <w:t>]:elimina de forma lógica el elemento</w:t>
+            </w:r>
+          </w:p>
+          <w:p>
+            <w:pPr>
+              <w:spacing w:after="0"/>
+              <w:rPr>
+                <w:lang w:val="es-ES"/>
+              </w:rPr>
+            </w:pPr>
+            <w:proofErr w:type="spellStart"/>
+            <w:r>
+              <w:rPr>
+                <w:lang w:val="es-ES"/>
+              </w:rPr>
+              <w:t>search</w:t>
+            </w:r>
+            <w:proofErr w:type="spellEnd"/>
+            <w:r>
+              <w:rPr>
+                <w:lang w:val="es-ES"/>
+              </w:rPr>
+              <w:t>(criterio):se busca en criterios de nombre</w:t>
+            </w:r>
+          </w:p>
+        </w:tc>
+      </w:tr>
+      <w:tr>
+        <w:tc>
+          <w:tcPr>
+            <w:tcW w:w="1800" w:type="dxa"/>
+            <w:tcBorders>
+              <w:top w:val="single" w:sz="4" w:space="0" w:color="000000"/>
+              <w:left w:val="single" w:sz="4" w:space="0" w:color="000000"/>
+              <w:bottom w:val="single" w:sz="4" w:space="0" w:color="000000"/>
+              <w:right w:val="single" w:sz="4" w:space="0" w:color="000000"/>
+            </w:tcBorders>
+          </w:tcPr>
+          <w:p>
+            <w:pPr>
+              <w:spacing w:after="0"/>
+              <w:rPr>
+                <w:lang w:val="es-ES"/>
+              </w:rPr>
+            </w:pPr>
+            <w:r>
+              <w:rPr>
+                <w:lang w:val="es-ES"/>
+              </w:rPr>
+              <w:t>Dependencia</w:t>
+            </w:r>
+          </w:p>
+        </w:tc>
+        <w:tc>
+          <w:tcPr>
+            <w:tcW w:w="8009" w:type="dxa"/>
+            <w:tcBorders>
+              <w:top w:val="single" w:sz="4" w:space="0" w:color="000000"/>
+              <w:left w:val="single" w:sz="4" w:space="0" w:color="000000"/>
+              <w:bottom w:val="single" w:sz="4" w:space="0" w:color="000000"/>
+              <w:right w:val="single" w:sz="4" w:space="0" w:color="000000"/>
+            </w:tcBorders>
+          </w:tcPr>
+          <w:p>
+            <w:pPr>
+              <w:spacing w:after="0"/>
+              <w:rPr>
+                <w:lang w:val="es-ES"/>
+              </w:rPr>
+            </w:pPr>
+            <w:r>
+              <w:rPr>
+                <w:lang w:val="es-ES"/>
+              </w:rPr>
+              <w:t>-</w:t>
+            </w:r>
+          </w:p>
+        </w:tc>
+      </w:tr>
+    </w:tbl>
+    <w:p>
+      <w:pPr>
+        <w:ind w:left="720"/>
+        <w:rPr>
+          <w:rStyle w:val="Ttulo2Car"/>
+          <w:rFonts w:eastAsia="Calibri"/>
+        </w:rPr>
+      </w:pPr>
+    </w:p>
+    <w:p>
+      <w:pPr>
+        <w:rPr>
+          <w:rStyle w:val="Ttulo2Car"/>
+          <w:rFonts w:eastAsia="Calibri"/>
+        </w:rPr>
+      </w:pPr>
+      <w:r>
+        <w:rPr>
+          <w:rStyle w:val="Ttulo2Car"/>
+          <w:rFonts w:eastAsia="Calibri"/>
+        </w:rPr>
+        <w:br w:type="page"/>
+      </w:r>
+    </w:p>
+    <w:p>
+      <w:pPr>
+        <w:ind w:left="720"/>
+        <w:rPr>
+          <w:rStyle w:val="Ttulo2Car"/>
+          <w:rFonts w:eastAsia="Calibri"/>
+        </w:rPr>
+      </w:pPr>
+      <w:proofErr w:type="spellStart"/>
+      <w:r>
+        <w:rPr>
+          <w:rStyle w:val="Ttulo2Car"/>
+          <w:rFonts w:eastAsia="Calibri"/>
+        </w:rPr>
+        <w:lastRenderedPageBreak/>
+        <w:t>API_Struct</w:t>
+      </w:r>
+      <w:proofErr w:type="spellEnd"/>
+    </w:p>
+    <w:p>
+      <w:r>
+        <w:t>{</w:t>
+      </w:r>
+    </w:p>
+    <w:p>
+      <w:r>
+        <w:tab/>
+      </w:r>
+      <w:proofErr w:type="spellStart"/>
+      <w:proofErr w:type="gramStart"/>
+      <w:r>
+        <w:t>nameA</w:t>
+      </w:r>
+      <w:r>
+        <w:t>PI</w:t>
+      </w:r>
+      <w:proofErr w:type="spellEnd"/>
+      <w:proofErr w:type="gramEnd"/>
+      <w:r>
+        <w:t xml:space="preserve">: </w:t>
+      </w:r>
+      <w:proofErr w:type="spellStart"/>
+      <w:r>
+        <w:t>post,get,put,etc</w:t>
+      </w:r>
+      <w:proofErr w:type="spellEnd"/>
+    </w:p>
+    <w:p>
+      <w:r>
+        <w:tab/>
+      </w:r>
+      <w:proofErr w:type="spellStart"/>
+      <w:proofErr w:type="gramStart"/>
+      <w:r>
+        <w:t>linkAPI</w:t>
+      </w:r>
+      <w:proofErr w:type="spellEnd"/>
+      <w:proofErr w:type="gramEnd"/>
+      <w:r>
+        <w:t>: dcc</w:t>
+      </w:r>
+    </w:p>
+    <w:p>
+      <w:r>
+        <w:tab/>
+      </w:r>
+      <w:proofErr w:type="spellStart"/>
+      <w:proofErr w:type="gramStart"/>
+      <w:r>
+        <w:t>nameMenuTitle</w:t>
+      </w:r>
+      <w:proofErr w:type="spellEnd"/>
+      <w:proofErr w:type="gramEnd"/>
+      <w:r>
+        <w:t xml:space="preserve">: </w:t>
+      </w:r>
+      <w:proofErr w:type="spellStart"/>
+      <w:r>
+        <w:t>nombre</w:t>
+      </w:r>
+      <w:proofErr w:type="spellEnd"/>
+    </w:p>
+    <w:p>
+      <w:r>
+        <w:tab/>
+      </w:r>
+      <w:proofErr w:type="gramStart"/>
+      <w:r>
+        <w:t>active</w:t>
+      </w:r>
+      <w:proofErr w:type="gramEnd"/>
+      <w:r>
+        <w:t xml:space="preserve">: </w:t>
+      </w:r>
+      <w:proofErr w:type="spellStart"/>
+      <w:r>
+        <w:t>si</w:t>
+      </w:r>
+      <w:proofErr w:type="spellEnd"/>
+      <w:r>
+        <w:t xml:space="preserve"> / no</w:t>
+      </w:r>
+    </w:p>
+    <w:p>
+      <w:r>
+        <w:t>}</w:t>
+      </w:r>
+    </w:p>
     <w:p/>
     <w:p>
       <w:r>
@@ -1834,13 +3716,7 @@
         <w:rPr>
           <w:lang w:val="es-ES"/>
         </w:rPr>
-        <w:t xml:space="preserve">    'AIC' = 'Act</w:t>
-      </w:r>
-      <w:r>
-        <w:rPr>
-          <w:lang w:val="es-ES"/>
-        </w:rPr>
-        <w:t>ividad Institución Cultural'</w:t>
+        <w:t xml:space="preserve">    'AIC' = 'Actividad Institución Cultural'</w:t>
       </w:r>
     </w:p>
     <w:p>
@@ -2207,13 +4083,7 @@
           <w:lang w:val="es-ES"/>
         </w:rPr>
         <w:lastRenderedPageBreak/>
-        <w:t xml:space="preserve">  'N'='Niño</w:t>
-      </w:r>
-      <w:r>
-        <w:rPr>
-          <w:lang w:val="es-ES"/>
-        </w:rPr>
-        <w:t xml:space="preserve"> (N)',</w:t>
+        <w:t xml:space="preserve">  'N'='Niño (N)',</w:t>
       </w:r>
     </w:p>
     <w:p>
@@ -2592,13 +4462,7 @@
         <w:rPr>
           <w:lang w:val="es-ES"/>
         </w:rPr>
-        <w:t>" = "Nivel Provin</w:t>
-      </w:r>
-      <w:r>
-        <w:rPr>
-          <w:lang w:val="es-ES"/>
-        </w:rPr>
-        <w:t>cial</w:t>
+        <w:t>" = "Nivel Provincial</w:t>
       </w:r>
       <w:proofErr w:type="gramStart"/>
       <w:r>
@@ -2698,15 +4562,8 @@
     </w:p>
     <w:p>
       <w:pPr>
-        <w:pStyle w:val="Sinespaciado"/>
-        <w:rPr>
-          <w:lang w:val="es-ES"/>
-        </w:rPr>
-      </w:pPr>
-    </w:p>
-    <w:p>
-      <w:pPr>
         <w:pStyle w:val="Ttulo1"/>
+        <w:ind w:left="1440" w:hanging="720"/>
         <w:rPr>
           <w:lang w:val="es-ES"/>
         </w:rPr>
@@ -2852,13 +4709,7 @@
               <w:rPr>
                 <w:lang w:val="es-ES"/>
               </w:rPr>
-              <w:t xml:space="preserve">: </w:t>
-            </w:r>
-            <w:r>
-              <w:rPr>
-                <w:lang w:val="es-ES"/>
-              </w:rPr>
-              <w:t>id del municipio</w:t>
+              <w:t>: id del municipio</w:t>
             </w:r>
           </w:p>
         </w:tc>
@@ -2994,13 +4845,7 @@
               <w:rPr>
                 <w:lang w:val="es-ES"/>
               </w:rPr>
-              <w:t xml:space="preserve">):se devuelven todos los elementos en </w:t>
-            </w:r>
-            <w:r>
-              <w:rPr>
-                <w:lang w:val="es-ES"/>
-              </w:rPr>
-              <w:t>paginación</w:t>
+              <w:t>):se devuelven todos los elementos en paginación</w:t>
             </w:r>
           </w:p>
           <w:p>
@@ -3132,13 +4977,7 @@
               <w:rPr>
                 <w:lang w:val="es-ES"/>
               </w:rPr>
-              <w:t>(criterio):se busca en criterios de nomb</w:t>
-            </w:r>
-            <w:r>
-              <w:rPr>
-                <w:lang w:val="es-ES"/>
-              </w:rPr>
-              <w:t>re, provincia y municipio</w:t>
+              <w:t>(criterio):se busca en criterios de nombre, provincia y municipio</w:t>
             </w:r>
           </w:p>
         </w:tc>
@@ -3329,13 +5168,7 @@
               <w:rPr>
                 <w:lang w:val="es-ES"/>
               </w:rPr>
-              <w:t>:  id consejo popular a</w:t>
-            </w:r>
-            <w:r>
-              <w:rPr>
-                <w:lang w:val="es-ES"/>
-              </w:rPr>
-              <w:t xml:space="preserve">l que pertenece </w:t>
+              <w:t xml:space="preserve">:  id consejo popular al que pertenece </w:t>
             </w:r>
           </w:p>
           <w:p>
@@ -3429,13 +5262,7 @@
               <w:rPr>
                 <w:lang w:val="es-ES"/>
               </w:rPr>
-              <w:t xml:space="preserve">aprobado: contrato que lo aprueba [acuerdo #x acta #x fecha </w:t>
-            </w:r>
-            <w:r>
-              <w:rPr>
-                <w:lang w:val="es-ES"/>
-              </w:rPr>
-              <w:t>día del mes del año]</w:t>
+              <w:t>aprobado: contrato que lo aprueba [acuerdo #x acta #x fecha día del mes del año]</w:t>
             </w:r>
           </w:p>
           <w:p>
@@ -3592,13 +5419,7 @@
               <w:rPr>
                 <w:lang w:val="es-ES"/>
               </w:rPr>
-              <w:t>pagina</w:t>
-            </w:r>
-            <w:r>
-              <w:rPr>
-                <w:lang w:val="es-ES"/>
-              </w:rPr>
-              <w:t>Actual,cantidaXPagina</w:t>
+              <w:t>paginaActual,cantidaXPagina</w:t>
             </w:r>
             <w:proofErr w:type="spellEnd"/>
             <w:r>
@@ -3729,13 +5550,7 @@
               <w:rPr>
                 <w:lang w:val="es-ES"/>
               </w:rPr>
-              <w:t xml:space="preserve"> el </w:t>
-            </w:r>
-            <w:r>
-              <w:rPr>
-                <w:lang w:val="es-ES"/>
-              </w:rPr>
-              <w:t>elemento</w:t>
+              <w:t xml:space="preserve"> el elemento</w:t>
             </w:r>
           </w:p>
           <w:p>
@@ -3840,7 +5655,7 @@
     <w:p>
       <w:pPr>
         <w:rPr>
-          <w:rFonts w:ascii="Liberation Sans" w:eastAsia="MS Gothic" w:hAnsi="Liberation Sans" w:cs="Tahoma" w:hint="eastAsia"/>
+          <w:rFonts w:ascii="Liberation Sans" w:eastAsia="MS Gothic" w:hAnsi="Liberation Sans" w:cs="Tahoma"/>
           <w:b/>
           <w:bCs/>
           <w:sz w:val="28"/>
@@ -3853,7 +5668,7 @@
       <w:pPr>
         <w:suppressAutoHyphens w:val="0"/>
         <w:rPr>
-          <w:rFonts w:ascii="Liberation Sans" w:eastAsia="MS Gothic" w:hAnsi="Liberation Sans" w:cs="Tahoma" w:hint="eastAsia"/>
+          <w:rFonts w:ascii="Liberation Sans" w:eastAsia="MS Gothic" w:hAnsi="Liberation Sans" w:cs="Tahoma"/>
           <w:b/>
           <w:bCs/>
           <w:sz w:val="28"/>
@@ -3871,7 +5686,7 @@
     <w:p>
       <w:pPr>
         <w:rPr>
-          <w:rFonts w:ascii="Liberation Sans" w:eastAsia="MS Gothic" w:hAnsi="Liberation Sans" w:cs="Tahoma" w:hint="eastAsia"/>
+          <w:rFonts w:ascii="Liberation Sans" w:eastAsia="MS Gothic" w:hAnsi="Liberation Sans" w:cs="Tahoma"/>
           <w:b/>
           <w:bCs/>
           <w:sz w:val="28"/>
@@ -4072,13 +5887,7 @@
               <w:rPr>
                 <w:lang w:val="es-ES"/>
               </w:rPr>
-              <w:t xml:space="preserve">: cosas que se desean decir de la </w:t>
-            </w:r>
-            <w:r>
-              <w:rPr>
-                <w:lang w:val="es-ES"/>
-              </w:rPr>
-              <w:t>comunidad</w:t>
+              <w:t>: cosas que se desean decir de la comunidad</w:t>
             </w:r>
           </w:p>
         </w:tc>
@@ -4288,13 +6097,7 @@
               <w:rPr>
                 <w:lang w:val="es-ES"/>
               </w:rPr>
-              <w:t>]</w:t>
-            </w:r>
-            <w:r>
-              <w:rPr>
-                <w:lang w:val="es-ES"/>
-              </w:rPr>
-              <w:t>:se actualizan los datos de ese elemento en específico.</w:t>
+              <w:t>]:se actualizan los datos de ese elemento en específico.</w:t>
             </w:r>
           </w:p>
           <w:p>
@@ -4435,7 +6238,7 @@
     <w:p>
       <w:pPr>
         <w:rPr>
-          <w:rFonts w:ascii="Liberation Sans" w:eastAsia="MS Gothic" w:hAnsi="Liberation Sans" w:cs="Tahoma" w:hint="eastAsia"/>
+          <w:rFonts w:ascii="Liberation Sans" w:eastAsia="MS Gothic" w:hAnsi="Liberation Sans" w:cs="Tahoma"/>
           <w:b/>
           <w:bCs/>
           <w:sz w:val="28"/>
@@ -4455,13 +6258,7 @@
         <w:rPr>
           <w:rFonts w:eastAsia="MS Gothic"/>
         </w:rPr>
-        <w:t xml:space="preserve">Programas Sociales </w:t>
-      </w:r>
-      <w:r>
-        <w:rPr>
-          <w:rFonts w:eastAsia="MS Gothic"/>
-        </w:rPr>
-        <w:t>Priorizados o Especiales</w:t>
+        <w:t>Programas Sociales Priorizados o Especiales</w:t>
       </w:r>
     </w:p>
     <w:tbl>
@@ -4668,13 +6465,7 @@
               <w:rPr>
                 <w:lang w:val="es-ES"/>
               </w:rPr>
-              <w:t>]:mínimo 3 letras, único y priorizado (true por defecto) y especia</w:t>
-            </w:r>
-            <w:r>
-              <w:rPr>
-                <w:lang w:val="es-ES"/>
-              </w:rPr>
-              <w:t>l (false)</w:t>
+              <w:t>]:mínimo 3 letras, único y priorizado (true por defecto) y especial (false)</w:t>
             </w:r>
           </w:p>
           <w:p>
@@ -4834,13 +6625,7 @@
               <w:rPr>
                 <w:lang w:val="es-ES"/>
               </w:rPr>
-              <w:t>]:e</w:t>
-            </w:r>
-            <w:r>
-              <w:rPr>
-                <w:lang w:val="es-ES"/>
-              </w:rPr>
-              <w:t>limina de forma lógica el elemento</w:t>
+              <w:t>]:elimina de forma lógica el elemento</w:t>
             </w:r>
           </w:p>
           <w:p>
@@ -4923,7 +6708,7 @@
     <w:p>
       <w:pPr>
         <w:rPr>
-          <w:rFonts w:ascii="Liberation Sans" w:eastAsia="MS Gothic" w:hAnsi="Liberation Sans" w:cs="Tahoma" w:hint="eastAsia"/>
+          <w:rFonts w:ascii="Liberation Sans" w:eastAsia="MS Gothic" w:hAnsi="Liberation Sans" w:cs="Tahoma"/>
           <w:b/>
           <w:bCs/>
           <w:sz w:val="28"/>
@@ -5043,13 +6828,7 @@
               <w:rPr>
                 <w:lang w:val="es-ES"/>
               </w:rPr>
-              <w:t xml:space="preserve">: </w:t>
-            </w:r>
-            <w:r>
-              <w:rPr>
-                <w:lang w:val="es-ES"/>
-              </w:rPr>
-              <w:t xml:space="preserve">falso(manifestación) o verdadero(apoyo: luces, audio, </w:t>
+              <w:t xml:space="preserve">: falso(manifestación) o verdadero(apoyo: luces, audio, </w:t>
             </w:r>
             <w:proofErr w:type="spellStart"/>
             <w:r>
@@ -5214,13 +6993,7 @@
               <w:rPr>
                 <w:lang w:val="es-ES"/>
               </w:rPr>
-              <w:t>fi</w:t>
-            </w:r>
-            <w:r>
-              <w:rPr>
-                <w:lang w:val="es-ES"/>
-              </w:rPr>
-              <w:t>ndOne</w:t>
+              <w:t>findOne</w:t>
             </w:r>
             <w:proofErr w:type="spellEnd"/>
             <w:r>
@@ -5403,13 +7176,7 @@
               <w:rPr>
                 <w:lang w:val="es-ES"/>
               </w:rPr>
-              <w:t>N</w:t>
-            </w:r>
-            <w:r>
-              <w:rPr>
-                <w:lang w:val="es-ES"/>
-              </w:rPr>
-              <w:t>o</w:t>
+              <w:t>No</w:t>
             </w:r>
           </w:p>
         </w:tc>
@@ -5729,13 +7496,7 @@
               <w:rPr>
                 <w:lang w:val="es-ES"/>
               </w:rPr>
-              <w:t>(id):devuelve los atributos de ese do</w:t>
-            </w:r>
-            <w:r>
-              <w:rPr>
-                <w:lang w:val="es-ES"/>
-              </w:rPr>
-              <w:t>cumento en especifico</w:t>
+              <w:t>(id):devuelve los atributos de ese documento en especifico</w:t>
             </w:r>
           </w:p>
           <w:p>
@@ -5954,13 +7715,7 @@
               <w:rPr>
                 <w:lang w:val="es-ES"/>
               </w:rPr>
-              <w:t>a</w:t>
-            </w:r>
-            <w:r>
-              <w:rPr>
-                <w:lang w:val="es-ES"/>
-              </w:rPr>
-              <w:t>rtistica</w:t>
+              <w:t>artistica</w:t>
             </w:r>
             <w:proofErr w:type="spellEnd"/>
           </w:p>
@@ -6140,13 +7895,7 @@
               <w:rPr>
                 <w:lang w:val="es-ES"/>
               </w:rPr>
-              <w:t>":  cuál es la especialidad"666b7d6e80597b171ef1495d</w:t>
-            </w:r>
-            <w:r>
-              <w:rPr>
-                <w:lang w:val="es-ES"/>
-              </w:rPr>
-              <w:t xml:space="preserve"> Danza </w:t>
+              <w:t xml:space="preserve">":  cuál es la especialidad"666b7d6e80597b171ef1495d Danza </w:t>
             </w:r>
             <w:proofErr w:type="spellStart"/>
             <w:r>
@@ -6329,13 +8078,7 @@
               <w:rPr>
                 <w:lang w:val="es-ES"/>
               </w:rPr>
-              <w:t>name,c</w:t>
-            </w:r>
-            <w:r>
-              <w:rPr>
-                <w:lang w:val="es-ES"/>
-              </w:rPr>
-              <w:t>ategoria_mani</w:t>
+              <w:t>name,categoria_mani</w:t>
             </w:r>
             <w:proofErr w:type="spellEnd"/>
             <w:r>
@@ -6480,13 +8223,7 @@
               <w:rPr>
                 <w:lang w:val="es-ES"/>
               </w:rPr>
-              <w:t>]:se actualizan los d</w:t>
-            </w:r>
-            <w:r>
-              <w:rPr>
-                <w:lang w:val="es-ES"/>
-              </w:rPr>
-              <w:t>atos de ese elemento en específico.</w:t>
+              <w:t>]:se actualizan los datos de ese elemento en específico.</w:t>
             </w:r>
           </w:p>
           <w:p>
@@ -6712,13 +8449,7 @@
         <w:rPr>
           <w:lang w:val="es-ES"/>
         </w:rPr>
-        <w:t xml:space="preserve">Jerarquía Instituciones </w:t>
-      </w:r>
-      <w:r>
-        <w:rPr>
-          <w:lang w:val="es-ES"/>
-        </w:rPr>
-        <w:t>[</w:t>
+        <w:t>Jerarquía Instituciones [</w:t>
       </w:r>
       <w:proofErr w:type="spellStart"/>
       <w:r>
@@ -6956,10 +8687,7 @@
             </w:r>
             <w:proofErr w:type="spellStart"/>
             <w:r>
-              <w:t>Clasifica_Nivel_Entid</w:t>
-            </w:r>
-            <w:r>
-              <w:t>adCultural</w:t>
+              <w:t>Clasifica_Nivel_EntidadCultural</w:t>
             </w:r>
             <w:proofErr w:type="spellEnd"/>
           </w:p>
@@ -7105,10 +8833,7 @@
             </w:r>
             <w:proofErr w:type="spellStart"/>
             <w:r>
-              <w:t>commercialRegi</w:t>
-            </w:r>
-            <w:r>
-              <w:t>ster</w:t>
+              <w:t>commercialRegister</w:t>
             </w:r>
             <w:proofErr w:type="spellEnd"/>
             <w:r>
@@ -7270,13 +8995,7 @@
               <w:rPr>
                 <w:lang w:val="es-ES"/>
               </w:rPr>
-              <w:t xml:space="preserve">(id):devuelve los </w:t>
-            </w:r>
-            <w:r>
-              <w:rPr>
-                <w:lang w:val="es-ES"/>
-              </w:rPr>
-              <w:t>atributos de ese documento en especifico</w:t>
+              <w:t>(id):devuelve los atributos de ese documento en especifico</w:t>
             </w:r>
           </w:p>
           <w:p>
@@ -7446,13 +9165,7 @@
               <w:rPr>
                 <w:lang w:val="es-ES"/>
               </w:rPr>
-              <w:t>Entidad Padre =&gt; Enti</w:t>
-            </w:r>
-            <w:r>
-              <w:rPr>
-                <w:lang w:val="es-ES"/>
-              </w:rPr>
-              <w:t>dad</w:t>
+              <w:t>Entidad Padre =&gt; Entidad</w:t>
             </w:r>
           </w:p>
           <w:p>
@@ -7817,13 +9530,7 @@
               <w:rPr>
                 <w:lang w:val="es-ES"/>
               </w:rPr>
-              <w:t xml:space="preserve">    </w:t>
-            </w:r>
-            <w:r>
-              <w:rPr>
-                <w:lang w:val="es-ES"/>
-              </w:rPr>
-              <w:t>edad?:</w:t>
+              <w:t xml:space="preserve">    edad?:</w:t>
             </w:r>
             <w:proofErr w:type="spellStart"/>
             <w:r>
@@ -8038,13 +9745,7 @@
               <w:rPr>
                 <w:lang w:val="es-ES"/>
               </w:rPr>
-              <w:t xml:space="preserve"> //estado ac</w:t>
-            </w:r>
-            <w:r>
-              <w:rPr>
-                <w:lang w:val="es-ES"/>
-              </w:rPr>
-              <w:t xml:space="preserve">tividad </w:t>
+              <w:t xml:space="preserve"> //estado actividad </w:t>
             </w:r>
             <w:r>
               <w:rPr>
@@ -8125,13 +9826,7 @@
               <w:rPr>
                 <w:lang w:val="es-ES"/>
               </w:rPr>
-              <w:t xml:space="preserve"> //justifica No se hizo, Fin 1ra opción        manifestacio</w:t>
-            </w:r>
-            <w:r>
-              <w:rPr>
-                <w:lang w:val="es-ES"/>
-              </w:rPr>
-              <w:t>nes_artisticas?:NomenclaCat_ContManifestacion_Especialidad_Entity[]//manifestaciones implicadas, la principal es la primera</w:t>
+              <w:t xml:space="preserve"> //justifica No se hizo, Fin 1ra opción        manifestaciones_artisticas?:NomenclaCat_ContManifestacion_Especialidad_Entity[]//manifestaciones implicadas, la principal es la primera</w:t>
             </w:r>
           </w:p>
           <w:p>
@@ -8201,13 +9896,7 @@
               <w:rPr>
                 <w:lang w:val="es-ES"/>
               </w:rPr>
-              <w:t>[] //</w:t>
-            </w:r>
-            <w:r>
-              <w:rPr>
-                <w:lang w:val="es-ES"/>
-              </w:rPr>
-              <w:t xml:space="preserve">programas sociales </w:t>
+              <w:t xml:space="preserve">[] //programas sociales </w:t>
             </w:r>
             <w:proofErr w:type="spellStart"/>
             <w:r>
@@ -8380,10 +10069,7 @@
             <w:proofErr w:type="spellStart"/>
             <w:r>
               <w:lastRenderedPageBreak/>
-              <w:t>Contr</w:t>
-            </w:r>
-            <w:r>
-              <w:t>olador</w:t>
+              <w:t>Controlador</w:t>
             </w:r>
             <w:proofErr w:type="spellEnd"/>
           </w:p>
@@ -8513,13 +10199,7 @@
               <w:rPr>
                 <w:lang w:val="es-ES"/>
               </w:rPr>
-              <w:t>):se devuelven todos los elementos que se desean filtrar .</w:t>
-            </w:r>
-            <w:r>
-              <w:rPr>
-                <w:lang w:val="es-ES"/>
-              </w:rPr>
-              <w:t xml:space="preserve"> con paginación</w:t>
+              <w:t>):se devuelven todos los elementos que se desean filtrar . con paginación</w:t>
             </w:r>
           </w:p>
           <w:p>
@@ -8655,23 +10335,7 @@
                 <w:highlight w:val="green"/>
                 <w:lang w:val="es-ES"/>
               </w:rPr>
-              <w:t xml:space="preserve">(datos de suma de pagos </w:t>
-            </w:r>
-            <w:r>
-              <w:rPr>
-                <w:highlight w:val="green"/>
-                <w:lang w:val="es-ES"/>
-              </w:rPr>
-              <w:t xml:space="preserve">por: </w:t>
-            </w:r>
-            <w:bookmarkStart w:id="0" w:name="_GoBack"/>
-            <w:bookmarkEnd w:id="0"/>
-            <w:r>
-              <w:rPr>
-                <w:highlight w:val="green"/>
-                <w:lang w:val="es-ES"/>
-              </w:rPr>
-              <w:t xml:space="preserve">cada actividad, general de la </w:t>
+              <w:t xml:space="preserve">(datos de suma de pagos por: cada actividad, general de la </w:t>
             </w:r>
             <w:proofErr w:type="spellStart"/>
             <w:r>
@@ -8817,13 +10481,7 @@
               <w:rPr>
                 <w:lang w:val="es-ES"/>
               </w:rPr>
-              <w:t>Programas tributa=&gt;</w:t>
-            </w:r>
-            <w:r>
-              <w:rPr>
-                <w:lang w:val="es-ES"/>
-              </w:rPr>
-              <w:t>programa social priorizados y especiales</w:t>
+              <w:t>Programas tributa=&gt;programa social priorizados y especiales</w:t>
             </w:r>
           </w:p>
           <w:p>
@@ -8876,7 +10534,6 @@
       <w:pPr>
         <w:pStyle w:val="Ttulo3"/>
         <w:rPr>
-          <w:rFonts w:hint="eastAsia"/>
           <w:lang w:val="es-ES"/>
         </w:rPr>
       </w:pPr>
@@ -9837,10 +11494,12 @@
     <w:next w:val="Normal"/>
     <w:autoRedefine/>
     <w:qFormat/>
+    <w:rsid w:val="003B7F3D"/>
     <w:pPr>
       <w:keepNext/>
       <w:keepLines/>
       <w:spacing w:before="240" w:after="0"/>
+      <w:ind w:left="720"/>
       <w:outlineLvl w:val="0"/>
     </w:pPr>
     <w:rPr>

</xml_diff>

<commit_message>
trabajando en reportes de act cultural: cambios en... searchDTo reportsDTo Documento de ayuda
</commit_message>
<xml_diff>
--- a/docs/Servilo_Kerno Cult API Justificacion .docx
+++ b/docs/Servilo_Kerno Cult API Justificacion .docx
@@ -1974,16 +1974,10 @@
             </w:r>
             <w:proofErr w:type="spellStart"/>
             <w:r>
-              <w:rPr>
-                <w:lang w:val="es-ES"/>
-              </w:rPr>
               <w:t>isDeleted:boolean</w:t>
             </w:r>
             <w:proofErr w:type="spellEnd"/>
             <w:r>
-              <w:rPr>
-                <w:lang w:val="es-ES"/>
-              </w:rPr>
               <w:t>;</w:t>
             </w:r>
           </w:p>
@@ -2345,10 +2339,7 @@
         <w:br w:type="page"/>
       </w:r>
     </w:p>
-    <w:p>
-      <w:bookmarkStart w:id="0" w:name="_GoBack"/>
-      <w:bookmarkEnd w:id="0"/>
-    </w:p>
+    <w:p/>
     <w:p>
       <w:pPr>
         <w:pStyle w:val="Ttulo2"/>
@@ -3532,52 +3523,78 @@
       </w:r>
     </w:p>
     <w:p>
+      <w:pPr>
+        <w:rPr>
+          <w:lang w:val="es-ES"/>
+        </w:rPr>
+      </w:pPr>
       <w:r>
         <w:tab/>
       </w:r>
       <w:proofErr w:type="spellStart"/>
       <w:proofErr w:type="gramStart"/>
       <w:r>
+        <w:rPr>
+          <w:lang w:val="es-ES"/>
+        </w:rPr>
         <w:t>nameMenuTitle</w:t>
       </w:r>
       <w:proofErr w:type="spellEnd"/>
       <w:proofErr w:type="gramEnd"/>
       <w:r>
-        <w:t xml:space="preserve">: </w:t>
-      </w:r>
-      <w:proofErr w:type="spellStart"/>
-      <w:r>
-        <w:t>nombre</w:t>
-      </w:r>
-      <w:proofErr w:type="spellEnd"/>
+        <w:rPr>
+          <w:lang w:val="es-ES"/>
+        </w:rPr>
+        <w:t>: nombre</w:t>
+      </w:r>
     </w:p>
     <w:p>
-      <w:r>
+      <w:pPr>
+        <w:rPr>
+          <w:lang w:val="es-ES"/>
+        </w:rPr>
+      </w:pPr>
+      <w:r>
+        <w:rPr>
+          <w:lang w:val="es-ES"/>
+        </w:rPr>
         <w:tab/>
       </w:r>
       <w:proofErr w:type="gramStart"/>
       <w:r>
+        <w:rPr>
+          <w:lang w:val="es-ES"/>
+        </w:rPr>
         <w:t>active</w:t>
       </w:r>
       <w:proofErr w:type="gramEnd"/>
       <w:r>
-        <w:t xml:space="preserve">: </w:t>
-      </w:r>
-      <w:proofErr w:type="spellStart"/>
-      <w:r>
-        <w:t>si</w:t>
-      </w:r>
-      <w:proofErr w:type="spellEnd"/>
-      <w:r>
-        <w:t xml:space="preserve"> / no</w:t>
+        <w:rPr>
+          <w:lang w:val="es-ES"/>
+        </w:rPr>
+        <w:t>: si / no</w:t>
       </w:r>
     </w:p>
     <w:p>
-      <w:r>
+      <w:pPr>
+        <w:rPr>
+          <w:lang w:val="es-ES"/>
+        </w:rPr>
+      </w:pPr>
+      <w:r>
+        <w:rPr>
+          <w:lang w:val="es-ES"/>
+        </w:rPr>
         <w:t>}</w:t>
       </w:r>
     </w:p>
-    <w:p/>
+    <w:p>
+      <w:pPr>
+        <w:rPr>
+          <w:lang w:val="es-ES"/>
+        </w:rPr>
+      </w:pPr>
+    </w:p>
     <w:p>
       <w:r>
         <w:rPr>
@@ -7839,6 +7856,104 @@
               <w:rPr>
                 <w:lang w:val="es-ES"/>
               </w:rPr>
+              <w:t>CI: carnet identidad,</w:t>
+            </w:r>
+          </w:p>
+          <w:p>
+            <w:pPr>
+              <w:spacing w:after="0"/>
+              <w:rPr>
+                <w:lang w:val="es-ES"/>
+              </w:rPr>
+            </w:pPr>
+            <w:r>
+              <w:rPr>
+                <w:lang w:val="es-ES"/>
+              </w:rPr>
+              <w:t xml:space="preserve"> "</w:t>
+            </w:r>
+            <w:proofErr w:type="spellStart"/>
+            <w:r>
+              <w:rPr>
+                <w:lang w:val="es-ES"/>
+              </w:rPr>
+              <w:t>manifest</w:t>
+            </w:r>
+            <w:proofErr w:type="spellEnd"/>
+            <w:r>
+              <w:rPr>
+                <w:lang w:val="es-ES"/>
+              </w:rPr>
+              <w:t xml:space="preserve">": listado de  cuál es la especialidad"666b7d6e80597b171ef1495d Danza </w:t>
+            </w:r>
+            <w:proofErr w:type="spellStart"/>
+            <w:r>
+              <w:rPr>
+                <w:lang w:val="es-ES"/>
+              </w:rPr>
+              <w:t>Folklorica</w:t>
+            </w:r>
+            <w:proofErr w:type="spellEnd"/>
+            <w:r>
+              <w:rPr>
+                <w:lang w:val="es-ES"/>
+              </w:rPr>
+              <w:t>",</w:t>
+            </w:r>
+          </w:p>
+          <w:p>
+            <w:pPr>
+              <w:spacing w:after="0"/>
+              <w:rPr>
+                <w:lang w:val="es-ES"/>
+              </w:rPr>
+            </w:pPr>
+            <w:r>
+              <w:rPr>
+                <w:lang w:val="es-ES"/>
+              </w:rPr>
+              <w:t>//no por ahora  "</w:t>
+            </w:r>
+            <w:proofErr w:type="spellStart"/>
+            <w:r>
+              <w:rPr>
+                <w:lang w:val="es-ES"/>
+              </w:rPr>
+              <w:t>manifest_esp</w:t>
+            </w:r>
+            <w:proofErr w:type="spellEnd"/>
+            <w:r>
+              <w:rPr>
+                <w:lang w:val="es-ES"/>
+              </w:rPr>
+              <w:t xml:space="preserve">":  cuál es la especialidad"666b7d6e80597b171ef1495d Danza </w:t>
+            </w:r>
+            <w:proofErr w:type="spellStart"/>
+            <w:r>
+              <w:rPr>
+                <w:lang w:val="es-ES"/>
+              </w:rPr>
+              <w:t>Folklorica</w:t>
+            </w:r>
+            <w:proofErr w:type="spellEnd"/>
+            <w:r>
+              <w:rPr>
+                <w:lang w:val="es-ES"/>
+              </w:rPr>
+              <w:t>",</w:t>
+            </w:r>
+          </w:p>
+          <w:p>
+            <w:pPr>
+              <w:spacing w:after="0"/>
+              <w:rPr>
+                <w:lang w:val="es-ES"/>
+              </w:rPr>
+            </w:pPr>
+            <w:r>
+              <w:rPr>
+                <w:lang w:val="es-ES"/>
+              </w:rPr>
               <w:t xml:space="preserve">  "</w:t>
             </w:r>
             <w:proofErr w:type="spellStart"/>
@@ -7846,70 +7961,14 @@
               <w:rPr>
                 <w:lang w:val="es-ES"/>
               </w:rPr>
-              <w:t>manifest</w:t>
-            </w:r>
-            <w:proofErr w:type="spellEnd"/>
-            <w:r>
-              <w:rPr>
-                <w:lang w:val="es-ES"/>
-              </w:rPr>
-              <w:t xml:space="preserve">": listado de  cuál es la especialidad"666b7d6e80597b171ef1495d Danza </w:t>
-            </w:r>
-            <w:proofErr w:type="spellStart"/>
-            <w:r>
-              <w:rPr>
-                <w:lang w:val="es-ES"/>
-              </w:rPr>
-              <w:t>Folklorica</w:t>
-            </w:r>
-            <w:proofErr w:type="spellEnd"/>
-            <w:r>
-              <w:rPr>
-                <w:lang w:val="es-ES"/>
-              </w:rPr>
-              <w:t>",</w:t>
-            </w:r>
-          </w:p>
-          <w:p>
-            <w:pPr>
-              <w:spacing w:after="0"/>
-              <w:rPr>
-                <w:lang w:val="es-ES"/>
-              </w:rPr>
-            </w:pPr>
-            <w:r>
-              <w:rPr>
-                <w:lang w:val="es-ES"/>
-              </w:rPr>
-              <w:t>//no por ahora  "</w:t>
-            </w:r>
-            <w:proofErr w:type="spellStart"/>
-            <w:r>
-              <w:rPr>
-                <w:lang w:val="es-ES"/>
-              </w:rPr>
-              <w:t>manifest_esp</w:t>
-            </w:r>
-            <w:proofErr w:type="spellEnd"/>
-            <w:r>
-              <w:rPr>
-                <w:lang w:val="es-ES"/>
-              </w:rPr>
-              <w:t xml:space="preserve">":  cuál es la especialidad"666b7d6e80597b171ef1495d Danza </w:t>
-            </w:r>
-            <w:proofErr w:type="spellStart"/>
-            <w:r>
-              <w:rPr>
-                <w:lang w:val="es-ES"/>
-              </w:rPr>
-              <w:t>Folklorica</w:t>
-            </w:r>
-            <w:proofErr w:type="spellEnd"/>
-            <w:r>
-              <w:rPr>
-                <w:lang w:val="es-ES"/>
-              </w:rPr>
-              <w:t>",</w:t>
+              <w:t>persona_Talento_Artistico</w:t>
+            </w:r>
+            <w:proofErr w:type="spellEnd"/>
+            <w:r>
+              <w:rPr>
+                <w:lang w:val="es-ES"/>
+              </w:rPr>
+              <w:t>": true si es artista, false si es apoyo</w:t>
             </w:r>
           </w:p>
           <w:p>
@@ -7930,15 +7989,23 @@
               <w:rPr>
                 <w:lang w:val="es-ES"/>
               </w:rPr>
-              <w:t>persona_Talento_Artistico</w:t>
-            </w:r>
-            <w:proofErr w:type="spellEnd"/>
-            <w:r>
-              <w:rPr>
-                <w:lang w:val="es-ES"/>
-              </w:rPr>
-              <w:t>": true si es artista, false si es apoyo</w:t>
-            </w:r>
+              <w:t>contrato_talento</w:t>
+            </w:r>
+            <w:proofErr w:type="spellEnd"/>
+            <w:r>
+              <w:rPr>
+                <w:lang w:val="es-ES"/>
+              </w:rPr>
+              <w:t>": "Aficionado",[</w:t>
+            </w:r>
+            <w:proofErr w:type="spellStart"/>
+            <w:r>
+              <w:rPr>
+                <w:lang w:val="es-ES"/>
+              </w:rPr>
+              <w:t>Nomenclador_Clasifica_ContratoTalento</w:t>
+            </w:r>
+            <w:proofErr w:type="spellEnd"/>
           </w:p>
           <w:p>
             <w:pPr>
@@ -7958,50 +8025,38 @@
               <w:rPr>
                 <w:lang w:val="es-ES"/>
               </w:rPr>
-              <w:t>contrato_talento</w:t>
-            </w:r>
-            <w:proofErr w:type="spellEnd"/>
-            <w:r>
-              <w:rPr>
-                <w:lang w:val="es-ES"/>
-              </w:rPr>
-              <w:t>": "Aficionado",[</w:t>
-            </w:r>
-            <w:proofErr w:type="spellStart"/>
-            <w:r>
-              <w:rPr>
-                <w:lang w:val="es-ES"/>
-              </w:rPr>
-              <w:t>Nomenclador_Clasifica_ContratoTalento</w:t>
-            </w:r>
-            <w:proofErr w:type="spellEnd"/>
-          </w:p>
-          <w:p>
-            <w:pPr>
-              <w:spacing w:after="0"/>
-              <w:rPr>
-                <w:lang w:val="es-ES"/>
-              </w:rPr>
-            </w:pPr>
-            <w:r>
-              <w:rPr>
-                <w:lang w:val="es-ES"/>
-              </w:rPr>
-              <w:t xml:space="preserve">  "</w:t>
-            </w:r>
-            <w:proofErr w:type="spellStart"/>
-            <w:r>
-              <w:rPr>
-                <w:lang w:val="es-ES"/>
-              </w:rPr>
-              <w:t>entidad_talento":el</w:t>
-            </w:r>
-            <w:proofErr w:type="spellEnd"/>
-            <w:r>
-              <w:rPr>
-                <w:lang w:val="es-ES"/>
-              </w:rPr>
-              <w:t xml:space="preserve"> id e la entidad a la que pertenece</w:t>
+              <w:t>entidad_talento</w:t>
+            </w:r>
+            <w:proofErr w:type="spellEnd"/>
+            <w:r>
+              <w:rPr>
+                <w:lang w:val="es-ES"/>
+              </w:rPr>
+              <w:t>":</w:t>
+            </w:r>
+            <w:r>
+              <w:rPr>
+                <w:lang w:val="es-ES"/>
+              </w:rPr>
+              <w:t xml:space="preserve"> </w:t>
+            </w:r>
+            <w:r>
+              <w:rPr>
+                <w:lang w:val="es-ES"/>
+              </w:rPr>
+              <w:t xml:space="preserve">el id </w:t>
+            </w:r>
+            <w:r>
+              <w:rPr>
+                <w:lang w:val="es-ES"/>
+              </w:rPr>
+              <w:t>d</w:t>
+            </w:r>
+            <w:r>
+              <w:rPr>
+                <w:lang w:val="es-ES"/>
+              </w:rPr>
+              <w:t>e la entidad a la que pertenece</w:t>
             </w:r>
           </w:p>
         </w:tc>
@@ -10107,6 +10162,19 @@
                 <w:lang w:val="es-ES"/>
               </w:rPr>
             </w:pPr>
+            <w:r>
+              <w:rPr>
+                <w:shd w:val="clear" w:color="auto" w:fill="92D050"/>
+                <w:lang w:val="es-ES"/>
+              </w:rPr>
+              <w:t>[POST]</w:t>
+            </w:r>
+            <w:r>
+              <w:rPr>
+                <w:lang w:val="es-ES"/>
+              </w:rPr>
+              <w:t xml:space="preserve"> </w:t>
+            </w:r>
             <w:proofErr w:type="spellStart"/>
             <w:r>
               <w:rPr>
@@ -10119,9 +10187,23 @@
               <w:rPr>
                 <w:lang w:val="es-ES"/>
               </w:rPr>
+              <w:t>=</w:t>
+            </w:r>
+            <w:proofErr w:type="gramStart"/>
+            <w:r>
+              <w:rPr>
+                <w:lang w:val="es-ES"/>
+              </w:rPr>
+              <w:t>&gt;</w:t>
+            </w:r>
+            <w:r>
+              <w:rPr>
+                <w:lang w:val="es-ES"/>
+              </w:rPr>
               <w:t>(</w:t>
             </w:r>
             <w:proofErr w:type="spellStart"/>
+            <w:proofErr w:type="gramEnd"/>
             <w:r>
               <w:rPr>
                 <w:lang w:val="es-ES"/>
@@ -10147,23 +10229,301 @@
               <w:rPr>
                 <w:lang w:val="es-ES"/>
               </w:rPr>
-              <w:t>]:mínimo 3 letras, único y orden jerárquico de la entidad y lugar en el municipio</w:t>
-            </w:r>
-          </w:p>
-          <w:p>
-            <w:pPr>
-              <w:spacing w:after="0"/>
-              <w:rPr>
-                <w:lang w:val="es-ES"/>
-              </w:rPr>
-            </w:pPr>
+              <w:t xml:space="preserve">]:mínimo 3 letras, único y </w:t>
+            </w:r>
+            <w:r>
+              <w:rPr>
+                <w:lang w:val="es-ES"/>
+              </w:rPr>
+              <w:t>dependiendo</w:t>
+            </w:r>
+            <w:r>
+              <w:rPr>
+                <w:lang w:val="es-ES"/>
+              </w:rPr>
+              <w:t xml:space="preserve"> de la entidad y lugar en el municipio</w:t>
+            </w:r>
+            <w:r>
+              <w:rPr>
+                <w:lang w:val="es-ES"/>
+              </w:rPr>
+              <w:t>…</w:t>
+            </w:r>
+          </w:p>
+          <w:p>
+            <w:pPr>
+              <w:spacing w:after="0"/>
+              <w:rPr>
+                <w:lang w:val="es-ES"/>
+              </w:rPr>
+            </w:pPr>
+            <w:r>
+              <w:rPr>
+                <w:shd w:val="clear" w:color="auto" w:fill="F4B083" w:themeFill="accent2" w:themeFillTint="99"/>
+                <w:lang w:val="es-ES"/>
+              </w:rPr>
+              <w:t>[PUT]</w:t>
+            </w:r>
+            <w:r>
+              <w:rPr>
+                <w:lang w:val="es-ES"/>
+              </w:rPr>
+              <w:t xml:space="preserve"> </w:t>
+            </w:r>
+            <w:proofErr w:type="spellStart"/>
+            <w:r>
+              <w:rPr>
+                <w:lang w:val="es-ES"/>
+              </w:rPr>
+              <w:t>findAll</w:t>
+            </w:r>
+            <w:proofErr w:type="spellEnd"/>
+            <w:r>
+              <w:rPr>
+                <w:lang w:val="es-ES"/>
+              </w:rPr>
+              <w:t xml:space="preserve"> =&gt; </w:t>
+            </w:r>
+            <w:r>
+              <w:rPr>
+                <w:lang w:val="es-ES"/>
+              </w:rPr>
+              <w:t>se devuelven todos los elementos que se desean filtrar</w:t>
+            </w:r>
+            <w:r>
+              <w:rPr>
+                <w:lang w:val="es-ES"/>
+              </w:rPr>
+              <w:t>, los datos propios de las actividades</w:t>
+            </w:r>
+            <w:r>
+              <w:rPr>
+                <w:lang w:val="es-ES"/>
+              </w:rPr>
+              <w:t>,</w:t>
+            </w:r>
+            <w:r>
+              <w:rPr>
+                <w:lang w:val="es-ES"/>
+              </w:rPr>
+              <w:t xml:space="preserve"> con paginación</w:t>
+            </w:r>
+            <w:r>
+              <w:rPr>
+                <w:lang w:val="es-ES"/>
+              </w:rPr>
+              <w:t xml:space="preserve"> </w:t>
+            </w:r>
+          </w:p>
+          <w:p>
+            <w:pPr>
+              <w:spacing w:after="0"/>
+              <w:ind w:left="720"/>
+              <w:rPr>
+                <w:lang w:val="es-ES"/>
+              </w:rPr>
+            </w:pPr>
+            <w:r>
+              <w:rPr>
+                <w:lang w:val="es-ES"/>
+              </w:rPr>
+              <w:t>vacío</w:t>
+            </w:r>
+            <w:r>
+              <w:rPr>
+                <w:lang w:val="es-ES"/>
+              </w:rPr>
+              <w:t>:</w:t>
+            </w:r>
+            <w:r>
+              <w:rPr>
+                <w:lang w:val="es-ES"/>
+              </w:rPr>
+              <w:t xml:space="preserve"> lo devuelve todo</w:t>
+            </w:r>
+            <w:r>
+              <w:rPr>
+                <w:lang w:val="es-ES"/>
+              </w:rPr>
+              <w:t xml:space="preserve"> </w:t>
+            </w:r>
+          </w:p>
+          <w:p>
+            <w:pPr>
+              <w:spacing w:after="0"/>
+              <w:ind w:left="720"/>
+              <w:rPr>
+                <w:lang w:val="es-ES"/>
+              </w:rPr>
+            </w:pPr>
+            <w:r>
+              <w:rPr>
+                <w:lang w:val="es-ES"/>
+              </w:rPr>
+              <w:t xml:space="preserve">  "page": cantidad de páginas,  1 por</w:t>
+            </w:r>
+            <w:r>
+              <w:rPr>
+                <w:lang w:val="es-ES"/>
+              </w:rPr>
+              <w:t xml:space="preserve"> </w:t>
+            </w:r>
+            <w:r>
+              <w:rPr>
+                <w:lang w:val="es-ES"/>
+              </w:rPr>
+              <w:t>defecto</w:t>
+            </w:r>
+          </w:p>
+          <w:p>
+            <w:pPr>
+              <w:spacing w:after="0"/>
+              <w:ind w:left="720"/>
+              <w:rPr>
+                <w:lang w:val="es-ES"/>
+              </w:rPr>
+            </w:pPr>
+            <w:r>
+              <w:rPr>
+                <w:lang w:val="es-ES"/>
+              </w:rPr>
+              <w:t xml:space="preserve">  "</w:t>
+            </w:r>
+            <w:proofErr w:type="spellStart"/>
+            <w:r>
+              <w:rPr>
+                <w:lang w:val="es-ES"/>
+              </w:rPr>
+              <w:t>pageSize</w:t>
+            </w:r>
+            <w:proofErr w:type="spellEnd"/>
+            <w:r>
+              <w:rPr>
+                <w:lang w:val="es-ES"/>
+              </w:rPr>
+              <w:t xml:space="preserve">": cantidad de elementos por página, 15 por defecto  </w:t>
+            </w:r>
+          </w:p>
+          <w:p>
+            <w:pPr>
+              <w:spacing w:after="0"/>
+              <w:ind w:left="720"/>
+              <w:rPr>
+                <w:lang w:val="es-ES"/>
+              </w:rPr>
+            </w:pPr>
+            <w:r>
+              <w:rPr>
+                <w:lang w:val="es-ES"/>
+              </w:rPr>
+              <w:t xml:space="preserve"> "id": id de la actividad</w:t>
+            </w:r>
+            <w:r>
+              <w:rPr>
+                <w:lang w:val="es-ES"/>
+              </w:rPr>
+              <w:t>,</w:t>
+            </w:r>
+          </w:p>
+          <w:p>
+            <w:pPr>
+              <w:spacing w:after="0"/>
+              <w:ind w:left="720"/>
+              <w:rPr>
+                <w:lang w:val="es-ES"/>
+              </w:rPr>
+            </w:pPr>
+            <w:r>
+              <w:rPr>
+                <w:lang w:val="es-ES"/>
+              </w:rPr>
+              <w:t xml:space="preserve"> </w:t>
+            </w:r>
+            <w:r>
+              <w:rPr>
+                <w:lang w:val="es-ES"/>
+              </w:rPr>
+              <w:t>(</w:t>
+            </w:r>
+            <w:r>
+              <w:rPr>
+                <w:lang w:val="es-ES"/>
+              </w:rPr>
+              <w:t>"</w:t>
+            </w:r>
+            <w:proofErr w:type="spellStart"/>
+            <w:r>
+              <w:rPr>
+                <w:lang w:val="es-ES"/>
+              </w:rPr>
+              <w:t>name</w:t>
+            </w:r>
+            <w:proofErr w:type="spellEnd"/>
+            <w:r>
+              <w:rPr>
+                <w:lang w:val="es-ES"/>
+              </w:rPr>
+              <w:t>": "</w:t>
+            </w:r>
+            <w:proofErr w:type="spellStart"/>
+            <w:r>
+              <w:rPr>
+                <w:lang w:val="es-ES"/>
+              </w:rPr>
+              <w:t>string</w:t>
+            </w:r>
+            <w:proofErr w:type="spellEnd"/>
+            <w:r>
+              <w:rPr>
+                <w:lang w:val="es-ES"/>
+              </w:rPr>
+              <w:t>"</w:t>
+            </w:r>
+            <w:r>
+              <w:rPr>
+                <w:lang w:val="es-ES"/>
+              </w:rPr>
+              <w:t xml:space="preserve"> y ["</w:t>
+            </w:r>
+            <w:proofErr w:type="spellStart"/>
+            <w:r>
+              <w:rPr>
+                <w:lang w:val="es-ES"/>
+              </w:rPr>
+              <w:t>exactName</w:t>
+            </w:r>
+            <w:proofErr w:type="spellEnd"/>
+            <w:r>
+              <w:rPr>
+                <w:lang w:val="es-ES"/>
+              </w:rPr>
+              <w:t>"]: true)</w:t>
+            </w:r>
+            <w:r>
+              <w:rPr>
+                <w:lang w:val="es-ES"/>
+              </w:rPr>
+              <w:t xml:space="preserve"> </w:t>
+            </w:r>
+            <w:r>
+              <w:rPr>
+                <w:lang w:val="es-ES"/>
+              </w:rPr>
+              <w:t xml:space="preserve">se busca por nombre, solo poner </w:t>
+            </w:r>
             <w:proofErr w:type="spellStart"/>
             <w:proofErr w:type="gramStart"/>
             <w:r>
               <w:rPr>
                 <w:lang w:val="es-ES"/>
               </w:rPr>
-              <w:t>findAll</w:t>
+              <w:t>exact</w:t>
+            </w:r>
+            <w:r>
+              <w:rPr>
+                <w:lang w:val="es-ES"/>
+              </w:rPr>
+              <w:t>Name</w:t>
             </w:r>
             <w:proofErr w:type="spellEnd"/>
             <w:r>
@@ -10172,79 +10532,1019 @@
               </w:rPr>
               <w:t>(</w:t>
             </w:r>
-            <w:proofErr w:type="spellStart"/>
             <w:proofErr w:type="gramEnd"/>
             <w:r>
               <w:rPr>
                 <w:lang w:val="es-ES"/>
               </w:rPr>
-              <w:t>lemento</w:t>
-            </w:r>
-            <w:proofErr w:type="spellEnd"/>
-            <w:r>
-              <w:rPr>
-                <w:lang w:val="es-ES"/>
-              </w:rPr>
-              <w:t xml:space="preserve"> s a </w:t>
-            </w:r>
-            <w:proofErr w:type="spellStart"/>
-            <w:r>
-              <w:rPr>
-                <w:lang w:val="es-ES"/>
-              </w:rPr>
-              <w:t>preguntar,paginaActual,cantidaXPagina</w:t>
-            </w:r>
-            <w:proofErr w:type="spellEnd"/>
-            <w:r>
-              <w:rPr>
-                <w:lang w:val="es-ES"/>
-              </w:rPr>
-              <w:t>):se devuelven todos los elementos que se desean filtrar . con paginación</w:t>
-            </w:r>
-          </w:p>
-          <w:p>
-            <w:pPr>
-              <w:spacing w:after="0"/>
-              <w:rPr>
-                <w:lang w:val="es-ES"/>
-              </w:rPr>
-            </w:pPr>
-            <w:proofErr w:type="spellStart"/>
-            <w:r>
-              <w:rPr>
-                <w:lang w:val="es-ES"/>
-              </w:rPr>
-              <w:t>findOne</w:t>
-            </w:r>
-            <w:proofErr w:type="spellEnd"/>
-            <w:r>
-              <w:rPr>
-                <w:lang w:val="es-ES"/>
-              </w:rPr>
-              <w:t>(id):devuelve los atributos de ese documento en especifico</w:t>
-            </w:r>
-          </w:p>
-          <w:p>
-            <w:pPr>
-              <w:spacing w:after="0"/>
-              <w:rPr>
-                <w:lang w:val="es-ES"/>
-              </w:rPr>
-            </w:pPr>
-            <w:proofErr w:type="spellStart"/>
+              <w:t xml:space="preserve">false) </w:t>
+            </w:r>
+            <w:proofErr w:type="spellStart"/>
+            <w:r>
+              <w:rPr>
+                <w:lang w:val="es-ES"/>
+              </w:rPr>
+              <w:t>cdo</w:t>
+            </w:r>
+            <w:proofErr w:type="spellEnd"/>
+            <w:r>
+              <w:rPr>
+                <w:lang w:val="es-ES"/>
+              </w:rPr>
+              <w:t xml:space="preserve"> se quiera buscar por nombre aproximado. por defecto, si se usa </w:t>
+            </w:r>
+            <w:proofErr w:type="spellStart"/>
+            <w:r>
+              <w:rPr>
+                <w:lang w:val="es-ES"/>
+              </w:rPr>
+              <w:t>exactName</w:t>
+            </w:r>
+            <w:proofErr w:type="spellEnd"/>
+            <w:r>
+              <w:rPr>
+                <w:lang w:val="es-ES"/>
+              </w:rPr>
+              <w:t>(true) o no se pone, se busca por nombre exacto</w:t>
+            </w:r>
+          </w:p>
+          <w:p>
+            <w:pPr>
+              <w:spacing w:after="0"/>
+              <w:ind w:left="720"/>
+              <w:rPr>
+                <w:lang w:val="es-ES"/>
+              </w:rPr>
+            </w:pPr>
+            <w:r>
+              <w:rPr>
+                <w:lang w:val="es-ES"/>
+              </w:rPr>
+              <w:t xml:space="preserve">  </w:t>
+            </w:r>
+            <w:r>
+              <w:rPr>
+                <w:lang w:val="es-ES"/>
+              </w:rPr>
+              <w:t>"dia_</w:t>
+            </w:r>
+            <w:proofErr w:type="spellStart"/>
+            <w:r>
+              <w:rPr>
+                <w:lang w:val="es-ES"/>
+              </w:rPr>
+              <w:t>actcult</w:t>
+            </w:r>
+            <w:proofErr w:type="spellEnd"/>
+            <w:r>
+              <w:rPr>
+                <w:lang w:val="es-ES"/>
+              </w:rPr>
+              <w:t>":</w:t>
+            </w:r>
+            <w:r>
+              <w:rPr>
+                <w:lang w:val="es-ES"/>
+              </w:rPr>
+              <w:t>"</w:t>
+            </w:r>
+            <w:proofErr w:type="spellStart"/>
+            <w:r>
+              <w:rPr>
+                <w:lang w:val="es-ES"/>
+              </w:rPr>
+              <w:t>yyyy</w:t>
+            </w:r>
+            <w:proofErr w:type="spellEnd"/>
+            <w:r>
+              <w:rPr>
+                <w:lang w:val="es-ES"/>
+              </w:rPr>
+              <w:t>-mm-</w:t>
+            </w:r>
+            <w:proofErr w:type="spellStart"/>
+            <w:r>
+              <w:rPr>
+                <w:lang w:val="es-ES"/>
+              </w:rPr>
+              <w:t>dd</w:t>
+            </w:r>
+            <w:proofErr w:type="spellEnd"/>
+            <w:r>
+              <w:rPr>
+                <w:lang w:val="es-ES"/>
+              </w:rPr>
+              <w:t>"</w:t>
+            </w:r>
+            <w:r>
+              <w:rPr>
+                <w:lang w:val="es-ES"/>
+              </w:rPr>
+              <w:t>,</w:t>
+            </w:r>
+            <w:proofErr w:type="spellStart"/>
+            <w:r>
+              <w:rPr>
+                <w:lang w:val="es-ES"/>
+              </w:rPr>
+              <w:t>dia</w:t>
+            </w:r>
+            <w:proofErr w:type="spellEnd"/>
+            <w:r>
+              <w:rPr>
+                <w:lang w:val="es-ES"/>
+              </w:rPr>
+              <w:t xml:space="preserve"> de una actividad</w:t>
+            </w:r>
+          </w:p>
+          <w:p>
+            <w:pPr>
+              <w:spacing w:after="0"/>
+              <w:ind w:left="720"/>
+              <w:rPr>
+                <w:lang w:val="es-ES"/>
+              </w:rPr>
+            </w:pPr>
+            <w:r>
+              <w:rPr>
+                <w:lang w:val="es-ES"/>
+              </w:rPr>
+              <w:t xml:space="preserve">  "</w:t>
+            </w:r>
+            <w:proofErr w:type="spellStart"/>
+            <w:r>
+              <w:rPr>
+                <w:lang w:val="es-ES"/>
+              </w:rPr>
+              <w:t>hora_actcult</w:t>
+            </w:r>
+            <w:proofErr w:type="spellEnd"/>
+            <w:r>
+              <w:rPr>
+                <w:lang w:val="es-ES"/>
+              </w:rPr>
+              <w:t>": "20:06",</w:t>
+            </w:r>
+            <w:r>
+              <w:rPr>
+                <w:lang w:val="es-ES"/>
+              </w:rPr>
+              <w:t>hora de la actividad</w:t>
+            </w:r>
+          </w:p>
+          <w:p>
+            <w:pPr>
+              <w:spacing w:after="0"/>
+              <w:ind w:left="720"/>
+              <w:rPr>
+                <w:lang w:val="es-ES"/>
+              </w:rPr>
+            </w:pPr>
+            <w:r>
+              <w:rPr>
+                <w:lang w:val="es-ES"/>
+              </w:rPr>
+              <w:t xml:space="preserve">  "</w:t>
+            </w:r>
+            <w:proofErr w:type="spellStart"/>
+            <w:r>
+              <w:rPr>
+                <w:lang w:val="es-ES"/>
+              </w:rPr>
+              <w:t>findia_actcult</w:t>
+            </w:r>
+            <w:proofErr w:type="spellEnd"/>
+            <w:r>
+              <w:rPr>
+                <w:lang w:val="es-ES"/>
+              </w:rPr>
+              <w:t>": "</w:t>
+            </w:r>
+            <w:proofErr w:type="spellStart"/>
+            <w:r>
+              <w:rPr>
+                <w:lang w:val="es-ES"/>
+              </w:rPr>
+              <w:t>yyyy</w:t>
+            </w:r>
+            <w:proofErr w:type="spellEnd"/>
+            <w:r>
+              <w:rPr>
+                <w:lang w:val="es-ES"/>
+              </w:rPr>
+              <w:t>-mm-</w:t>
+            </w:r>
+            <w:proofErr w:type="spellStart"/>
+            <w:r>
+              <w:rPr>
+                <w:lang w:val="es-ES"/>
+              </w:rPr>
+              <w:t>dd</w:t>
+            </w:r>
+            <w:proofErr w:type="spellEnd"/>
+            <w:r>
+              <w:rPr>
+                <w:lang w:val="es-ES"/>
+              </w:rPr>
+              <w:t>",</w:t>
+            </w:r>
+            <w:proofErr w:type="spellStart"/>
+            <w:r>
+              <w:rPr>
+                <w:lang w:val="es-ES"/>
+              </w:rPr>
+              <w:t>dia</w:t>
+            </w:r>
+            <w:proofErr w:type="spellEnd"/>
+            <w:r>
+              <w:rPr>
+                <w:lang w:val="es-ES"/>
+              </w:rPr>
+              <w:t xml:space="preserve"> final de un rango de fecha</w:t>
+            </w:r>
+          </w:p>
+          <w:p>
+            <w:pPr>
+              <w:spacing w:after="0"/>
+              <w:ind w:left="720"/>
+              <w:rPr>
+                <w:lang w:val="es-ES"/>
+              </w:rPr>
+            </w:pPr>
+            <w:r>
+              <w:rPr>
+                <w:lang w:val="es-ES"/>
+              </w:rPr>
+              <w:t xml:space="preserve">  "</w:t>
+            </w:r>
+            <w:proofErr w:type="spellStart"/>
+            <w:r>
+              <w:rPr>
+                <w:lang w:val="es-ES"/>
+              </w:rPr>
+              <w:t>finhora_actcult</w:t>
+            </w:r>
+            <w:proofErr w:type="spellEnd"/>
+            <w:r>
+              <w:rPr>
+                <w:lang w:val="es-ES"/>
+              </w:rPr>
+              <w:t>": "20:06",</w:t>
+            </w:r>
+            <w:r>
+              <w:rPr>
+                <w:lang w:val="es-ES"/>
+              </w:rPr>
+              <w:t>hora final de un rango de horas</w:t>
+            </w:r>
+          </w:p>
+          <w:p>
+            <w:pPr>
+              <w:spacing w:after="0"/>
+              <w:ind w:left="720"/>
+              <w:rPr>
+                <w:lang w:val="es-ES"/>
+              </w:rPr>
+            </w:pPr>
+            <w:r>
+              <w:rPr>
+                <w:lang w:val="es-ES"/>
+              </w:rPr>
+              <w:t xml:space="preserve">  "</w:t>
+            </w:r>
+            <w:proofErr w:type="spellStart"/>
+            <w:r>
+              <w:rPr>
+                <w:lang w:val="es-ES"/>
+              </w:rPr>
+              <w:t>entidad_responsable</w:t>
+            </w:r>
+            <w:proofErr w:type="spellEnd"/>
+            <w:r>
+              <w:rPr>
+                <w:lang w:val="es-ES"/>
+              </w:rPr>
+              <w:t>": id entidad responsable</w:t>
+            </w:r>
+            <w:r>
+              <w:rPr>
+                <w:lang w:val="es-ES"/>
+              </w:rPr>
+              <w:t>,</w:t>
+            </w:r>
+          </w:p>
+          <w:p>
+            <w:pPr>
+              <w:spacing w:after="0"/>
+              <w:ind w:left="720"/>
+              <w:rPr>
+                <w:lang w:val="es-ES"/>
+              </w:rPr>
+            </w:pPr>
+            <w:r>
+              <w:rPr>
+                <w:lang w:val="es-ES"/>
+              </w:rPr>
+              <w:t xml:space="preserve">  </w:t>
+            </w:r>
+            <w:r>
+              <w:rPr>
+                <w:lang w:val="es-ES"/>
+              </w:rPr>
+              <w:t>(</w:t>
+            </w:r>
+            <w:r>
+              <w:rPr>
+                <w:lang w:val="es-ES"/>
+              </w:rPr>
+              <w:t>"</w:t>
+            </w:r>
+            <w:proofErr w:type="spellStart"/>
+            <w:r>
+              <w:rPr>
+                <w:lang w:val="es-ES"/>
+              </w:rPr>
+              <w:t>programas_tributa</w:t>
+            </w:r>
+            <w:proofErr w:type="spellEnd"/>
+            <w:r>
+              <w:rPr>
+                <w:lang w:val="es-ES"/>
+              </w:rPr>
+              <w:t>": id programa</w:t>
+            </w:r>
+            <w:r>
+              <w:rPr>
+                <w:lang w:val="es-ES"/>
+              </w:rPr>
+              <w:t xml:space="preserve"> relacionado</w:t>
+            </w:r>
+            <w:r>
+              <w:rPr>
+                <w:lang w:val="es-ES"/>
+              </w:rPr>
+              <w:t xml:space="preserve">, </w:t>
+            </w:r>
+            <w:r>
+              <w:rPr>
+                <w:lang w:val="es-ES"/>
+              </w:rPr>
+              <w:t>[principal: si por defecto</w:t>
+            </w:r>
+            <w:r>
+              <w:rPr>
+                <w:lang w:val="es-ES"/>
+              </w:rPr>
+              <w:t>] si lo pones es en f</w:t>
+            </w:r>
+            <w:r>
+              <w:rPr>
+                <w:lang w:val="es-ES"/>
+              </w:rPr>
+              <w:t>a</w:t>
+            </w:r>
+            <w:r>
+              <w:rPr>
+                <w:lang w:val="es-ES"/>
+              </w:rPr>
+              <w:t>l</w:t>
+            </w:r>
+            <w:r>
+              <w:rPr>
+                <w:lang w:val="es-ES"/>
+              </w:rPr>
+              <w:t>so para buscar si tiene un programa secundario)</w:t>
+            </w:r>
+          </w:p>
+          <w:p>
+            <w:pPr>
+              <w:spacing w:after="0"/>
+              <w:ind w:left="720"/>
+              <w:rPr>
+                <w:lang w:val="es-ES"/>
+              </w:rPr>
+            </w:pPr>
+            <w:r>
+              <w:rPr>
+                <w:lang w:val="es-ES"/>
+              </w:rPr>
+              <w:t xml:space="preserve">  </w:t>
+            </w:r>
+            <w:r>
+              <w:rPr>
+                <w:lang w:val="es-ES"/>
+              </w:rPr>
+              <w:t>(</w:t>
+            </w:r>
+            <w:r>
+              <w:rPr>
+                <w:lang w:val="es-ES"/>
+              </w:rPr>
+              <w:t>"</w:t>
+            </w:r>
+            <w:proofErr w:type="spellStart"/>
+            <w:r>
+              <w:rPr>
+                <w:lang w:val="es-ES"/>
+              </w:rPr>
+              <w:t>manifestaciones_artisticas</w:t>
+            </w:r>
+            <w:proofErr w:type="spellEnd"/>
+            <w:r>
+              <w:rPr>
+                <w:lang w:val="es-ES"/>
+              </w:rPr>
+              <w:t xml:space="preserve">": id </w:t>
+            </w:r>
+            <w:r>
+              <w:rPr>
+                <w:lang w:val="es-ES"/>
+              </w:rPr>
+              <w:t xml:space="preserve">manifestaciones artísticas </w:t>
+            </w:r>
+            <w:r>
+              <w:rPr>
+                <w:lang w:val="es-ES"/>
+              </w:rPr>
+              <w:t>relacionad</w:t>
+            </w:r>
+            <w:r>
+              <w:rPr>
+                <w:lang w:val="es-ES"/>
+              </w:rPr>
+              <w:t>as</w:t>
+            </w:r>
+            <w:r>
+              <w:rPr>
+                <w:lang w:val="es-ES"/>
+              </w:rPr>
+              <w:t xml:space="preserve">, </w:t>
+            </w:r>
+            <w:r>
+              <w:rPr>
+                <w:lang w:val="es-ES"/>
+              </w:rPr>
+              <w:t>[principal: si por defecto] si lo pones es en fal</w:t>
+            </w:r>
+            <w:r>
+              <w:rPr>
+                <w:lang w:val="es-ES"/>
+              </w:rPr>
+              <w:t>so para buscar si tiene una</w:t>
+            </w:r>
+            <w:r>
+              <w:rPr>
+                <w:lang w:val="es-ES"/>
+              </w:rPr>
+              <w:t xml:space="preserve"> secundari</w:t>
+            </w:r>
+            <w:r>
+              <w:rPr>
+                <w:lang w:val="es-ES"/>
+              </w:rPr>
+              <w:t>a</w:t>
+            </w:r>
+            <w:r>
+              <w:rPr>
+                <w:lang w:val="es-ES"/>
+              </w:rPr>
+              <w:t>)</w:t>
+            </w:r>
+          </w:p>
+          <w:p>
+            <w:pPr>
+              <w:spacing w:after="0"/>
+              <w:ind w:left="720"/>
+              <w:rPr>
+                <w:lang w:val="es-ES"/>
+              </w:rPr>
+            </w:pPr>
+            <w:r>
+              <w:rPr>
+                <w:lang w:val="es-ES"/>
+              </w:rPr>
+              <w:t xml:space="preserve">  </w:t>
+            </w:r>
+            <w:r>
+              <w:rPr>
+                <w:lang w:val="es-ES"/>
+              </w:rPr>
+              <w:t>"</w:t>
+            </w:r>
+            <w:proofErr w:type="spellStart"/>
+            <w:r>
+              <w:rPr>
+                <w:lang w:val="es-ES"/>
+              </w:rPr>
+              <w:t>lugar_planificado</w:t>
+            </w:r>
+            <w:proofErr w:type="spellEnd"/>
+            <w:r>
+              <w:rPr>
+                <w:lang w:val="es-ES"/>
+              </w:rPr>
+              <w:t xml:space="preserve">": </w:t>
+            </w:r>
+            <w:r>
+              <w:rPr>
+                <w:lang w:val="es-ES"/>
+              </w:rPr>
+              <w:t xml:space="preserve">id del lugar donde se </w:t>
+            </w:r>
+            <w:r>
+              <w:rPr>
+                <w:lang w:val="es-ES"/>
+              </w:rPr>
+              <w:t>realizó</w:t>
+            </w:r>
+            <w:r>
+              <w:rPr>
+                <w:lang w:val="es-ES"/>
+              </w:rPr>
+              <w:t>,</w:t>
+            </w:r>
+          </w:p>
+          <w:p>
+            <w:pPr>
+              <w:spacing w:after="0"/>
+              <w:ind w:left="720"/>
+              <w:rPr>
+                <w:lang w:val="es-ES"/>
+              </w:rPr>
+            </w:pPr>
+            <w:r>
+              <w:rPr>
+                <w:lang w:val="es-ES"/>
+              </w:rPr>
+              <w:t xml:space="preserve">  "</w:t>
+            </w:r>
+            <w:proofErr w:type="spellStart"/>
+            <w:r>
+              <w:rPr>
+                <w:lang w:val="es-ES"/>
+              </w:rPr>
+              <w:t>ic_planificado</w:t>
+            </w:r>
+            <w:proofErr w:type="spellEnd"/>
+            <w:r>
+              <w:rPr>
+                <w:lang w:val="es-ES"/>
+              </w:rPr>
+              <w:t xml:space="preserve">": </w:t>
+            </w:r>
+            <w:r>
+              <w:rPr>
+                <w:lang w:val="es-ES"/>
+              </w:rPr>
+              <w:t xml:space="preserve">id del instituto cultural donde se </w:t>
+            </w:r>
+            <w:r>
+              <w:rPr>
+                <w:lang w:val="es-ES"/>
+              </w:rPr>
+              <w:t>realizó</w:t>
+            </w:r>
+            <w:r>
+              <w:rPr>
+                <w:lang w:val="es-ES"/>
+              </w:rPr>
+              <w:t>,</w:t>
+            </w:r>
+          </w:p>
+          <w:p>
+            <w:pPr>
+              <w:spacing w:after="0"/>
+              <w:ind w:left="720"/>
+              <w:rPr>
+                <w:lang w:val="es-ES"/>
+              </w:rPr>
+            </w:pPr>
+            <w:r>
+              <w:rPr>
+                <w:lang w:val="es-ES"/>
+              </w:rPr>
+              <w:t xml:space="preserve">  "</w:t>
+            </w:r>
+            <w:proofErr w:type="spellStart"/>
+            <w:r>
+              <w:rPr>
+                <w:lang w:val="es-ES"/>
+              </w:rPr>
+              <w:t>cp_planificado</w:t>
+            </w:r>
+            <w:proofErr w:type="spellEnd"/>
+            <w:r>
+              <w:rPr>
+                <w:lang w:val="es-ES"/>
+              </w:rPr>
+              <w:t>":</w:t>
+            </w:r>
+            <w:r>
+              <w:rPr>
+                <w:lang w:val="es-ES"/>
+              </w:rPr>
+              <w:t xml:space="preserve"> </w:t>
+            </w:r>
+            <w:r>
+              <w:rPr>
+                <w:lang w:val="es-ES"/>
+              </w:rPr>
+              <w:t>id del consejo popular</w:t>
+            </w:r>
+            <w:r>
+              <w:rPr>
+                <w:lang w:val="es-ES"/>
+              </w:rPr>
+              <w:t xml:space="preserve"> donde se </w:t>
+            </w:r>
+            <w:r>
+              <w:rPr>
+                <w:lang w:val="es-ES"/>
+              </w:rPr>
+              <w:t>realizó</w:t>
+            </w:r>
+            <w:r>
+              <w:rPr>
+                <w:lang w:val="es-ES"/>
+              </w:rPr>
+              <w:t>,</w:t>
+            </w:r>
+          </w:p>
+          <w:p>
+            <w:pPr>
+              <w:spacing w:after="0"/>
+              <w:ind w:left="720"/>
+              <w:rPr>
+                <w:lang w:val="es-ES"/>
+              </w:rPr>
+            </w:pPr>
+            <w:r>
+              <w:rPr>
+                <w:lang w:val="es-ES"/>
+              </w:rPr>
+              <w:t xml:space="preserve">  "</w:t>
+            </w:r>
+            <w:proofErr w:type="spellStart"/>
+            <w:r>
+              <w:rPr>
+                <w:lang w:val="es-ES"/>
+              </w:rPr>
+              <w:t>ct_planificado</w:t>
+            </w:r>
+            <w:proofErr w:type="spellEnd"/>
+            <w:r>
+              <w:rPr>
+                <w:lang w:val="es-ES"/>
+              </w:rPr>
+              <w:t xml:space="preserve">": </w:t>
+            </w:r>
+            <w:r>
+              <w:rPr>
+                <w:lang w:val="es-ES"/>
+              </w:rPr>
+              <w:t xml:space="preserve">id de la comunidad en </w:t>
+            </w:r>
+            <w:r>
+              <w:rPr>
+                <w:lang w:val="es-ES"/>
+              </w:rPr>
+              <w:t>transformación</w:t>
+            </w:r>
+            <w:r>
+              <w:rPr>
+                <w:lang w:val="es-ES"/>
+              </w:rPr>
+              <w:t xml:space="preserve"> </w:t>
+            </w:r>
+            <w:r>
+              <w:rPr>
+                <w:lang w:val="es-ES"/>
+              </w:rPr>
+              <w:t xml:space="preserve">donde se </w:t>
+            </w:r>
+            <w:r>
+              <w:rPr>
+                <w:lang w:val="es-ES"/>
+              </w:rPr>
+              <w:t>realizó</w:t>
+            </w:r>
+            <w:r>
+              <w:rPr>
+                <w:lang w:val="es-ES"/>
+              </w:rPr>
+              <w:t>,</w:t>
+            </w:r>
+          </w:p>
+          <w:p>
+            <w:pPr>
+              <w:spacing w:after="0"/>
+              <w:ind w:left="720"/>
+              <w:rPr>
+                <w:lang w:val="es-ES"/>
+              </w:rPr>
+            </w:pPr>
+            <w:r>
+              <w:rPr>
+                <w:lang w:val="es-ES"/>
+              </w:rPr>
+              <w:t xml:space="preserve">  </w:t>
+            </w:r>
+            <w:r>
+              <w:rPr>
+                <w:lang w:val="es-ES"/>
+              </w:rPr>
+              <w:t xml:space="preserve">"edad": grupo </w:t>
+            </w:r>
+            <w:proofErr w:type="spellStart"/>
+            <w:r>
+              <w:rPr>
+                <w:lang w:val="es-ES"/>
+              </w:rPr>
+              <w:t>etareo</w:t>
+            </w:r>
+            <w:proofErr w:type="spellEnd"/>
+            <w:r>
+              <w:rPr>
+                <w:lang w:val="es-ES"/>
+              </w:rPr>
+              <w:t xml:space="preserve"> que se busca</w:t>
+            </w:r>
+            <w:r>
+              <w:rPr>
+                <w:lang w:val="es-ES"/>
+              </w:rPr>
+              <w:t>,</w:t>
+            </w:r>
+          </w:p>
+          <w:p>
+            <w:pPr>
+              <w:spacing w:after="0"/>
+              <w:ind w:left="720"/>
+              <w:rPr>
+                <w:lang w:val="es-ES"/>
+              </w:rPr>
+            </w:pPr>
+            <w:r>
+              <w:rPr>
+                <w:lang w:val="es-ES"/>
+              </w:rPr>
+              <w:t xml:space="preserve">  </w:t>
+            </w:r>
+            <w:r>
+              <w:rPr>
+                <w:lang w:val="es-ES"/>
+              </w:rPr>
+              <w:t>"</w:t>
+            </w:r>
+            <w:proofErr w:type="spellStart"/>
+            <w:r>
+              <w:rPr>
+                <w:lang w:val="es-ES"/>
+              </w:rPr>
+              <w:t>tipoActividad_extraPlan</w:t>
+            </w:r>
+            <w:proofErr w:type="spellEnd"/>
+            <w:r>
+              <w:rPr>
+                <w:lang w:val="es-ES"/>
+              </w:rPr>
+              <w:t xml:space="preserve">": si la actividad es </w:t>
+            </w:r>
+            <w:proofErr w:type="spellStart"/>
+            <w:r>
+              <w:rPr>
+                <w:lang w:val="es-ES"/>
+              </w:rPr>
+              <w:t>extraplan</w:t>
+            </w:r>
+            <w:proofErr w:type="spellEnd"/>
+            <w:r>
+              <w:rPr>
+                <w:lang w:val="es-ES"/>
+              </w:rPr>
+              <w:t xml:space="preserve"> o no</w:t>
+            </w:r>
+            <w:r>
+              <w:rPr>
+                <w:lang w:val="es-ES"/>
+              </w:rPr>
+              <w:t>,</w:t>
+            </w:r>
+          </w:p>
+          <w:p>
+            <w:pPr>
+              <w:spacing w:after="0"/>
+              <w:ind w:left="720"/>
+              <w:rPr>
+                <w:lang w:val="es-ES"/>
+              </w:rPr>
+            </w:pPr>
+            <w:r>
+              <w:rPr>
+                <w:lang w:val="es-ES"/>
+              </w:rPr>
+              <w:t xml:space="preserve">  "</w:t>
+            </w:r>
+            <w:proofErr w:type="spellStart"/>
+            <w:r>
+              <w:rPr>
+                <w:lang w:val="es-ES"/>
+              </w:rPr>
+              <w:t>tipoActividad_Prov_Entidad</w:t>
+            </w:r>
+            <w:proofErr w:type="spellEnd"/>
+            <w:r>
+              <w:rPr>
+                <w:lang w:val="es-ES"/>
+              </w:rPr>
+              <w:t xml:space="preserve">": </w:t>
+            </w:r>
+            <w:r>
+              <w:rPr>
+                <w:lang w:val="es-ES"/>
+              </w:rPr>
+              <w:t>id de</w:t>
+            </w:r>
+            <w:r>
+              <w:rPr>
+                <w:lang w:val="es-ES"/>
+              </w:rPr>
+              <w:t xml:space="preserve"> la entidad superior que la convoco</w:t>
+            </w:r>
+            <w:r>
+              <w:rPr>
+                <w:lang w:val="es-ES"/>
+              </w:rPr>
+              <w:t>,</w:t>
+            </w:r>
+          </w:p>
+          <w:p>
+            <w:pPr>
+              <w:spacing w:after="0"/>
+              <w:ind w:left="720"/>
+              <w:rPr>
+                <w:lang w:val="es-ES"/>
+              </w:rPr>
+            </w:pPr>
+            <w:r>
+              <w:rPr>
+                <w:lang w:val="es-ES"/>
+              </w:rPr>
+              <w:t xml:space="preserve">  </w:t>
+            </w:r>
+            <w:r>
+              <w:rPr>
+                <w:lang w:val="es-ES"/>
+              </w:rPr>
+              <w:t>"</w:t>
+            </w:r>
+            <w:proofErr w:type="spellStart"/>
+            <w:r>
+              <w:rPr>
+                <w:lang w:val="es-ES"/>
+              </w:rPr>
+              <w:t>estado_actividad</w:t>
+            </w:r>
+            <w:proofErr w:type="spellEnd"/>
+            <w:r>
+              <w:rPr>
+                <w:lang w:val="es-ES"/>
+              </w:rPr>
+              <w:t xml:space="preserve">": </w:t>
+            </w:r>
+            <w:r>
+              <w:rPr>
+                <w:lang w:val="es-ES"/>
+              </w:rPr>
+              <w:t>estado de la actividad</w:t>
+            </w:r>
+            <w:r>
+              <w:rPr>
+                <w:lang w:val="es-ES"/>
+              </w:rPr>
+              <w:t>,</w:t>
+            </w:r>
+          </w:p>
+          <w:p>
+            <w:pPr>
+              <w:spacing w:after="0"/>
+              <w:ind w:left="720"/>
+              <w:rPr>
+                <w:lang w:val="es-ES"/>
+              </w:rPr>
+            </w:pPr>
+            <w:r>
+              <w:rPr>
+                <w:lang w:val="es-ES"/>
+              </w:rPr>
+              <w:t xml:space="preserve">  "TV": true,</w:t>
+            </w:r>
+          </w:p>
+          <w:p>
+            <w:pPr>
+              <w:spacing w:after="0"/>
+              <w:ind w:left="720"/>
+              <w:rPr>
+                <w:lang w:val="es-ES"/>
+              </w:rPr>
+            </w:pPr>
+            <w:r>
+              <w:rPr>
+                <w:lang w:val="es-ES"/>
+              </w:rPr>
+              <w:t xml:space="preserve">  "</w:t>
+            </w:r>
+            <w:proofErr w:type="spellStart"/>
+            <w:r>
+              <w:rPr>
+                <w:lang w:val="es-ES"/>
+              </w:rPr>
+              <w:t>redes_plataforma</w:t>
+            </w:r>
+            <w:proofErr w:type="spellEnd"/>
+            <w:r>
+              <w:rPr>
+                <w:lang w:val="es-ES"/>
+              </w:rPr>
+              <w:t>": true,</w:t>
+            </w:r>
+          </w:p>
+          <w:p>
+            <w:pPr>
+              <w:spacing w:after="0"/>
+              <w:ind w:left="720"/>
+              <w:rPr>
+                <w:lang w:val="es-ES"/>
+              </w:rPr>
+            </w:pPr>
+            <w:r>
+              <w:rPr>
+                <w:lang w:val="es-ES"/>
+              </w:rPr>
+              <w:t xml:space="preserve">  "</w:t>
+            </w:r>
+            <w:proofErr w:type="spellStart"/>
+            <w:r>
+              <w:rPr>
+                <w:lang w:val="es-ES"/>
+              </w:rPr>
+              <w:t>isDeleted</w:t>
+            </w:r>
+            <w:proofErr w:type="spellEnd"/>
+            <w:r>
+              <w:rPr>
+                <w:lang w:val="es-ES"/>
+              </w:rPr>
+              <w:t>": false</w:t>
+            </w:r>
+          </w:p>
+          <w:p>
+            <w:pPr>
+              <w:spacing w:after="0"/>
+              <w:rPr>
+                <w:lang w:val="es-ES"/>
+              </w:rPr>
+            </w:pPr>
+            <w:r>
+              <w:rPr>
+                <w:shd w:val="clear" w:color="auto" w:fill="9CC2E5" w:themeFill="accent1" w:themeFillTint="99"/>
+                <w:lang w:val="es-ES"/>
+              </w:rPr>
+              <w:t>[PATCH]</w:t>
+            </w:r>
+            <w:r>
+              <w:rPr>
+                <w:shd w:val="clear" w:color="auto" w:fill="9CC2E5" w:themeFill="accent1" w:themeFillTint="99"/>
+                <w:lang w:val="es-ES"/>
+              </w:rPr>
+              <w:t xml:space="preserve"> </w:t>
+            </w:r>
+            <w:proofErr w:type="spellStart"/>
+            <w:r>
+              <w:rPr>
+                <w:lang w:val="es-ES"/>
+              </w:rPr>
+              <w:t>update</w:t>
+            </w:r>
+            <w:proofErr w:type="spellEnd"/>
+            <w:r>
+              <w:rPr>
+                <w:lang w:val="es-ES"/>
+              </w:rPr>
+              <w:t xml:space="preserve"> (</w:t>
+            </w:r>
+            <w:r>
+              <w:rPr>
+                <w:lang w:val="es-ES"/>
+              </w:rPr>
+              <w:t>datos</w:t>
+            </w:r>
             <w:proofErr w:type="gramStart"/>
             <w:r>
               <w:rPr>
                 <w:lang w:val="es-ES"/>
               </w:rPr>
-              <w:t>update</w:t>
-            </w:r>
-            <w:proofErr w:type="spellEnd"/>
-            <w:r>
-              <w:rPr>
-                <w:lang w:val="es-ES"/>
-              </w:rPr>
-              <w:t>(</w:t>
+              <w:t>)[</w:t>
             </w:r>
             <w:proofErr w:type="spellStart"/>
             <w:proofErr w:type="gramEnd"/>
@@ -10252,20 +11552,6 @@
               <w:rPr>
                 <w:lang w:val="es-ES"/>
               </w:rPr>
-              <w:t>id,datos</w:t>
-            </w:r>
-            <w:proofErr w:type="spellEnd"/>
-            <w:r>
-              <w:rPr>
-                <w:lang w:val="es-ES"/>
-              </w:rPr>
-              <w:t>)[</w:t>
-            </w:r>
-            <w:proofErr w:type="spellStart"/>
-            <w:r>
-              <w:rPr>
-                <w:lang w:val="es-ES"/>
-              </w:rPr>
               <w:t>Trz</w:t>
             </w:r>
             <w:proofErr w:type="spellEnd"/>
@@ -10273,16 +11559,36 @@
               <w:rPr>
                 <w:lang w:val="es-ES"/>
               </w:rPr>
-              <w:t>]:  se actualizan los datos de ese elemento en específico.</w:t>
-            </w:r>
-          </w:p>
-          <w:p>
-            <w:pPr>
-              <w:spacing w:after="0"/>
-              <w:rPr>
-                <w:lang w:val="es-ES"/>
-              </w:rPr>
-            </w:pPr>
+              <w:t>]:  se actualizan los datos de ese elemento en específico</w:t>
+            </w:r>
+            <w:r>
+              <w:rPr>
+                <w:lang w:val="es-ES"/>
+              </w:rPr>
+              <w:t xml:space="preserve"> y se traza</w:t>
+            </w:r>
+            <w:r>
+              <w:rPr>
+                <w:lang w:val="es-ES"/>
+              </w:rPr>
+              <w:t>.</w:t>
+            </w:r>
+          </w:p>
+          <w:p>
+            <w:pPr>
+              <w:spacing w:after="0"/>
+              <w:rPr>
+                <w:lang w:val="es-ES"/>
+              </w:rPr>
+            </w:pPr>
+            <w:r>
+              <w:rPr>
+                <w:color w:val="FFFFFF" w:themeColor="background1"/>
+                <w:highlight w:val="red"/>
+                <w:lang w:val="es-ES"/>
+              </w:rPr>
+              <w:t>[DELETE]</w:t>
+            </w:r>
             <w:proofErr w:type="spellStart"/>
             <w:r>
               <w:rPr>
@@ -10311,15 +11617,29 @@
               </w:rPr>
               <w:t>]:elimina de forma lógica el elemento</w:t>
             </w:r>
-          </w:p>
-          <w:p>
-            <w:pPr>
-              <w:spacing w:after="0"/>
-              <w:rPr>
-                <w:lang w:val="es-ES"/>
-              </w:rPr>
-            </w:pPr>
-            <w:proofErr w:type="spellStart"/>
+            <w:r>
+              <w:rPr>
+                <w:lang w:val="es-ES"/>
+              </w:rPr>
+              <w:t xml:space="preserve"> y se traza</w:t>
+            </w:r>
+          </w:p>
+          <w:p>
+            <w:pPr>
+              <w:spacing w:after="0"/>
+              <w:rPr>
+                <w:lang w:val="es-ES"/>
+              </w:rPr>
+            </w:pPr>
+            <w:r>
+              <w:rPr>
+                <w:b/>
+                <w:bCs/>
+                <w:highlight w:val="green"/>
+                <w:lang w:val="es-ES"/>
+              </w:rPr>
+              <w:t>[POST]</w:t>
+            </w:r>
             <w:r>
               <w:rPr>
                 <w:b/>
@@ -10327,7 +11647,44 @@
                 <w:highlight w:val="yellow"/>
                 <w:lang w:val="es-ES"/>
               </w:rPr>
-              <w:t>reportsBasic</w:t>
+              <w:t xml:space="preserve"> /</w:t>
+            </w:r>
+            <w:proofErr w:type="spellStart"/>
+            <w:r>
+              <w:rPr>
+                <w:b/>
+                <w:bCs/>
+                <w:highlight w:val="yellow"/>
+                <w:lang w:val="es-ES"/>
+              </w:rPr>
+              <w:t>report</w:t>
+            </w:r>
+            <w:proofErr w:type="spellEnd"/>
+            <w:r>
+              <w:rPr>
+                <w:b/>
+                <w:bCs/>
+                <w:highlight w:val="yellow"/>
+                <w:lang w:val="es-ES"/>
+              </w:rPr>
+              <w:t xml:space="preserve"> </w:t>
+            </w:r>
+            <w:proofErr w:type="spellStart"/>
+            <w:r>
+              <w:rPr>
+                <w:b/>
+                <w:bCs/>
+                <w:lang w:val="es-ES"/>
+              </w:rPr>
+              <w:t>s</w:t>
+            </w:r>
+            <w:r>
+              <w:rPr>
+                <w:b/>
+                <w:bCs/>
+                <w:lang w:val="es-ES"/>
+              </w:rPr>
+              <w:t>earchReport</w:t>
             </w:r>
             <w:proofErr w:type="spellEnd"/>
             <w:r>
@@ -10337,15 +11694,13 @@
               </w:rPr>
               <w:t xml:space="preserve">(datos de suma de pagos por: cada actividad, general de la </w:t>
             </w:r>
-            <w:proofErr w:type="spellStart"/>
             <w:r>
               <w:rPr>
                 <w:highlight w:val="green"/>
                 <w:lang w:val="es-ES"/>
               </w:rPr>
-              <w:t>busqueda</w:t>
-            </w:r>
-            <w:proofErr w:type="spellEnd"/>
+              <w:t>búsqueda</w:t>
+            </w:r>
             <w:r>
               <w:rPr>
                 <w:highlight w:val="green"/>
@@ -10353,6 +11708,901 @@
               </w:rPr>
               <w:t>)</w:t>
             </w:r>
+          </w:p>
+          <w:p>
+            <w:pPr>
+              <w:shd w:val="clear" w:color="auto" w:fill="A8D08D" w:themeFill="accent6" w:themeFillTint="99"/>
+              <w:spacing w:after="0"/>
+              <w:rPr>
+                <w:lang w:val="es-ES"/>
+              </w:rPr>
+            </w:pPr>
+            <w:r>
+              <w:rPr>
+                <w:lang w:val="es-ES"/>
+              </w:rPr>
+              <w:t xml:space="preserve">   {</w:t>
+            </w:r>
+            <w:r>
+              <w:rPr>
+                <w:lang w:val="es-ES"/>
+              </w:rPr>
+              <w:t xml:space="preserve"> "</w:t>
+            </w:r>
+            <w:proofErr w:type="spellStart"/>
+            <w:r>
+              <w:rPr>
+                <w:lang w:val="es-ES"/>
+              </w:rPr>
+              <w:t>paraCadaActCult</w:t>
+            </w:r>
+            <w:proofErr w:type="spellEnd"/>
+            <w:r>
+              <w:rPr>
+                <w:lang w:val="es-ES"/>
+              </w:rPr>
+              <w:t>": [</w:t>
+            </w:r>
+          </w:p>
+          <w:p>
+            <w:pPr>
+              <w:shd w:val="clear" w:color="auto" w:fill="A8D08D" w:themeFill="accent6" w:themeFillTint="99"/>
+              <w:spacing w:after="0"/>
+              <w:rPr>
+                <w:lang w:val="es-ES"/>
+              </w:rPr>
+            </w:pPr>
+            <w:r>
+              <w:rPr>
+                <w:lang w:val="es-ES"/>
+              </w:rPr>
+              <w:t xml:space="preserve">      {</w:t>
+            </w:r>
+          </w:p>
+          <w:p>
+            <w:pPr>
+              <w:shd w:val="clear" w:color="auto" w:fill="A8D08D" w:themeFill="accent6" w:themeFillTint="99"/>
+              <w:spacing w:after="0"/>
+              <w:rPr>
+                <w:lang w:val="es-ES"/>
+              </w:rPr>
+            </w:pPr>
+            <w:r>
+              <w:rPr>
+                <w:lang w:val="es-ES"/>
+              </w:rPr>
+              <w:t xml:space="preserve">        "_id": "69ca32a5959b84ee04c1b626",</w:t>
+            </w:r>
+          </w:p>
+          <w:p>
+            <w:pPr>
+              <w:shd w:val="clear" w:color="auto" w:fill="A8D08D" w:themeFill="accent6" w:themeFillTint="99"/>
+              <w:spacing w:after="0"/>
+              <w:rPr>
+                <w:lang w:val="es-ES"/>
+              </w:rPr>
+            </w:pPr>
+            <w:r>
+              <w:rPr>
+                <w:lang w:val="es-ES"/>
+              </w:rPr>
+              <w:lastRenderedPageBreak/>
+              <w:t xml:space="preserve">        "</w:t>
+            </w:r>
+            <w:proofErr w:type="spellStart"/>
+            <w:r>
+              <w:rPr>
+                <w:lang w:val="es-ES"/>
+              </w:rPr>
+              <w:t>totalPagarArt</w:t>
+            </w:r>
+            <w:proofErr w:type="spellEnd"/>
+            <w:r>
+              <w:rPr>
+                <w:lang w:val="es-ES"/>
+              </w:rPr>
+              <w:t>": 269,</w:t>
+            </w:r>
+          </w:p>
+          <w:p>
+            <w:pPr>
+              <w:shd w:val="clear" w:color="auto" w:fill="A8D08D" w:themeFill="accent6" w:themeFillTint="99"/>
+              <w:spacing w:after="0"/>
+              <w:rPr>
+                <w:lang w:val="es-ES"/>
+              </w:rPr>
+            </w:pPr>
+            <w:r>
+              <w:rPr>
+                <w:lang w:val="es-ES"/>
+              </w:rPr>
+              <w:t xml:space="preserve">        "</w:t>
+            </w:r>
+            <w:proofErr w:type="spellStart"/>
+            <w:r>
+              <w:rPr>
+                <w:lang w:val="es-ES"/>
+              </w:rPr>
+              <w:t>totalPagarApy</w:t>
+            </w:r>
+            <w:proofErr w:type="spellEnd"/>
+            <w:r>
+              <w:rPr>
+                <w:lang w:val="es-ES"/>
+              </w:rPr>
+              <w:t>": 3034,</w:t>
+            </w:r>
+          </w:p>
+          <w:p>
+            <w:pPr>
+              <w:shd w:val="clear" w:color="auto" w:fill="A8D08D" w:themeFill="accent6" w:themeFillTint="99"/>
+              <w:spacing w:after="0"/>
+              <w:rPr>
+                <w:lang w:val="es-ES"/>
+              </w:rPr>
+            </w:pPr>
+            <w:r>
+              <w:rPr>
+                <w:lang w:val="es-ES"/>
+              </w:rPr>
+              <w:t xml:space="preserve">        "</w:t>
+            </w:r>
+            <w:proofErr w:type="spellStart"/>
+            <w:r>
+              <w:rPr>
+                <w:lang w:val="es-ES"/>
+              </w:rPr>
+              <w:t>totalPagarAct</w:t>
+            </w:r>
+            <w:proofErr w:type="spellEnd"/>
+            <w:r>
+              <w:rPr>
+                <w:lang w:val="es-ES"/>
+              </w:rPr>
+              <w:t>": 3303</w:t>
+            </w:r>
+          </w:p>
+          <w:p>
+            <w:pPr>
+              <w:shd w:val="clear" w:color="auto" w:fill="A8D08D" w:themeFill="accent6" w:themeFillTint="99"/>
+              <w:spacing w:after="0"/>
+              <w:rPr>
+                <w:lang w:val="es-ES"/>
+              </w:rPr>
+            </w:pPr>
+            <w:r>
+              <w:rPr>
+                <w:lang w:val="es-ES"/>
+              </w:rPr>
+              <w:t xml:space="preserve">      },</w:t>
+            </w:r>
+            <w:r>
+              <w:rPr>
+                <w:lang w:val="es-ES"/>
+              </w:rPr>
+              <w:t>…</w:t>
+            </w:r>
+          </w:p>
+          <w:p>
+            <w:pPr>
+              <w:shd w:val="clear" w:color="auto" w:fill="A8D08D" w:themeFill="accent6" w:themeFillTint="99"/>
+              <w:spacing w:after="0"/>
+            </w:pPr>
+            <w:r>
+              <w:t xml:space="preserve">      </w:t>
+            </w:r>
+            <w:r>
+              <w:t>],</w:t>
+            </w:r>
+          </w:p>
+          <w:p>
+            <w:pPr>
+              <w:shd w:val="clear" w:color="auto" w:fill="A8D08D" w:themeFill="accent6" w:themeFillTint="99"/>
+              <w:spacing w:after="0"/>
+            </w:pPr>
+            <w:r>
+              <w:t xml:space="preserve">    "</w:t>
+            </w:r>
+            <w:proofErr w:type="spellStart"/>
+            <w:r>
+              <w:t>paraTodos</w:t>
+            </w:r>
+            <w:proofErr w:type="spellEnd"/>
+            <w:r>
+              <w:t>": [</w:t>
+            </w:r>
+          </w:p>
+          <w:p>
+            <w:pPr>
+              <w:shd w:val="clear" w:color="auto" w:fill="A8D08D" w:themeFill="accent6" w:themeFillTint="99"/>
+              <w:spacing w:after="0"/>
+            </w:pPr>
+            <w:r>
+              <w:t xml:space="preserve">      {</w:t>
+            </w:r>
+          </w:p>
+          <w:p>
+            <w:pPr>
+              <w:shd w:val="clear" w:color="auto" w:fill="A8D08D" w:themeFill="accent6" w:themeFillTint="99"/>
+              <w:spacing w:after="0"/>
+            </w:pPr>
+            <w:r>
+              <w:t xml:space="preserve">        "count": 5,</w:t>
+            </w:r>
+          </w:p>
+          <w:p>
+            <w:pPr>
+              <w:shd w:val="clear" w:color="auto" w:fill="A8D08D" w:themeFill="accent6" w:themeFillTint="99"/>
+              <w:spacing w:after="0"/>
+            </w:pPr>
+            <w:r>
+              <w:t xml:space="preserve">        "</w:t>
+            </w:r>
+            <w:proofErr w:type="spellStart"/>
+            <w:r>
+              <w:t>TAr</w:t>
+            </w:r>
+            <w:proofErr w:type="spellEnd"/>
+            <w:r>
+              <w:t>": 5498,</w:t>
+            </w:r>
+          </w:p>
+          <w:p>
+            <w:pPr>
+              <w:shd w:val="clear" w:color="auto" w:fill="A8D08D" w:themeFill="accent6" w:themeFillTint="99"/>
+              <w:spacing w:after="0"/>
+            </w:pPr>
+            <w:r>
+              <w:t xml:space="preserve">        "</w:t>
+            </w:r>
+            <w:proofErr w:type="spellStart"/>
+            <w:r>
+              <w:t>TAp</w:t>
+            </w:r>
+            <w:proofErr w:type="spellEnd"/>
+            <w:r>
+              <w:t>": 10044,</w:t>
+            </w:r>
+          </w:p>
+          <w:p>
+            <w:pPr>
+              <w:shd w:val="clear" w:color="auto" w:fill="A8D08D" w:themeFill="accent6" w:themeFillTint="99"/>
+              <w:spacing w:after="0"/>
+            </w:pPr>
+            <w:r>
+              <w:t xml:space="preserve">        "TAA": 15542</w:t>
+            </w:r>
+          </w:p>
+          <w:p>
+            <w:pPr>
+              <w:shd w:val="clear" w:color="auto" w:fill="A8D08D" w:themeFill="accent6" w:themeFillTint="99"/>
+              <w:spacing w:after="0"/>
+              <w:rPr>
+                <w:lang w:val="es-ES"/>
+              </w:rPr>
+            </w:pPr>
+            <w:r>
+              <w:t xml:space="preserve">      </w:t>
+            </w:r>
+            <w:r>
+              <w:rPr>
+                <w:lang w:val="es-ES"/>
+              </w:rPr>
+              <w:t>}</w:t>
+            </w:r>
+          </w:p>
+          <w:p>
+            <w:pPr>
+              <w:shd w:val="clear" w:color="auto" w:fill="A8D08D" w:themeFill="accent6" w:themeFillTint="99"/>
+              <w:spacing w:after="0"/>
+              <w:rPr>
+                <w:lang w:val="es-ES"/>
+              </w:rPr>
+            </w:pPr>
+            <w:r>
+              <w:rPr>
+                <w:lang w:val="es-ES"/>
+              </w:rPr>
+              <w:t xml:space="preserve">    ]</w:t>
+            </w:r>
+          </w:p>
+          <w:p>
+            <w:pPr>
+              <w:spacing w:after="0"/>
+              <w:ind w:left="720"/>
+              <w:rPr>
+                <w:lang w:val="es-ES"/>
+              </w:rPr>
+            </w:pPr>
+            <w:r>
+              <w:rPr>
+                <w:lang w:val="es-ES"/>
+              </w:rPr>
+              <w:t>Id: id actividad cultural</w:t>
+            </w:r>
+          </w:p>
+          <w:p>
+            <w:pPr>
+              <w:spacing w:after="0"/>
+              <w:ind w:left="720"/>
+              <w:rPr>
+                <w:lang w:val="es-ES"/>
+              </w:rPr>
+            </w:pPr>
+            <w:r>
+              <w:rPr>
+                <w:lang w:val="es-ES"/>
+              </w:rPr>
+              <w:t>("</w:t>
+            </w:r>
+            <w:proofErr w:type="spellStart"/>
+            <w:r>
+              <w:rPr>
+                <w:lang w:val="es-ES"/>
+              </w:rPr>
+              <w:t>name</w:t>
+            </w:r>
+            <w:proofErr w:type="spellEnd"/>
+            <w:r>
+              <w:rPr>
+                <w:lang w:val="es-ES"/>
+              </w:rPr>
+              <w:t>": "</w:t>
+            </w:r>
+            <w:proofErr w:type="spellStart"/>
+            <w:r>
+              <w:rPr>
+                <w:lang w:val="es-ES"/>
+              </w:rPr>
+              <w:t>string</w:t>
+            </w:r>
+            <w:proofErr w:type="spellEnd"/>
+            <w:r>
+              <w:rPr>
+                <w:lang w:val="es-ES"/>
+              </w:rPr>
+              <w:t>" y ["</w:t>
+            </w:r>
+            <w:proofErr w:type="spellStart"/>
+            <w:r>
+              <w:rPr>
+                <w:lang w:val="es-ES"/>
+              </w:rPr>
+              <w:t>exactName</w:t>
+            </w:r>
+            <w:proofErr w:type="spellEnd"/>
+            <w:r>
+              <w:rPr>
+                <w:lang w:val="es-ES"/>
+              </w:rPr>
+              <w:t>"]: true)</w:t>
+            </w:r>
+            <w:r>
+              <w:rPr>
+                <w:lang w:val="es-ES"/>
+              </w:rPr>
+              <w:t xml:space="preserve"> </w:t>
+            </w:r>
+            <w:r>
+              <w:rPr>
+                <w:lang w:val="es-ES"/>
+              </w:rPr>
+              <w:t xml:space="preserve">se busca por nombre, solo poner </w:t>
+            </w:r>
+            <w:proofErr w:type="spellStart"/>
+            <w:proofErr w:type="gramStart"/>
+            <w:r>
+              <w:rPr>
+                <w:lang w:val="es-ES"/>
+              </w:rPr>
+              <w:t>exact</w:t>
+            </w:r>
+            <w:r>
+              <w:rPr>
+                <w:lang w:val="es-ES"/>
+              </w:rPr>
+              <w:t>Name</w:t>
+            </w:r>
+            <w:proofErr w:type="spellEnd"/>
+            <w:r>
+              <w:rPr>
+                <w:lang w:val="es-ES"/>
+              </w:rPr>
+              <w:t>(</w:t>
+            </w:r>
+            <w:proofErr w:type="gramEnd"/>
+            <w:r>
+              <w:rPr>
+                <w:lang w:val="es-ES"/>
+              </w:rPr>
+              <w:t xml:space="preserve">false) </w:t>
+            </w:r>
+            <w:proofErr w:type="spellStart"/>
+            <w:r>
+              <w:rPr>
+                <w:lang w:val="es-ES"/>
+              </w:rPr>
+              <w:t>cdo</w:t>
+            </w:r>
+            <w:proofErr w:type="spellEnd"/>
+            <w:r>
+              <w:rPr>
+                <w:lang w:val="es-ES"/>
+              </w:rPr>
+              <w:t xml:space="preserve"> se quiera buscar por nombre aproximado. por defecto, si se usa </w:t>
+            </w:r>
+            <w:proofErr w:type="spellStart"/>
+            <w:r>
+              <w:rPr>
+                <w:lang w:val="es-ES"/>
+              </w:rPr>
+              <w:t>exactName</w:t>
+            </w:r>
+            <w:proofErr w:type="spellEnd"/>
+            <w:r>
+              <w:rPr>
+                <w:lang w:val="es-ES"/>
+              </w:rPr>
+              <w:t>(true) o no se pone, se busca por nombre exacto</w:t>
+            </w:r>
+          </w:p>
+          <w:p>
+            <w:pPr>
+              <w:spacing w:after="0"/>
+              <w:ind w:left="720"/>
+              <w:rPr>
+                <w:lang w:val="es-ES"/>
+              </w:rPr>
+            </w:pPr>
+            <w:r>
+              <w:rPr>
+                <w:lang w:val="es-ES"/>
+              </w:rPr>
+              <w:t>"dia_</w:t>
+            </w:r>
+            <w:proofErr w:type="spellStart"/>
+            <w:r>
+              <w:rPr>
+                <w:lang w:val="es-ES"/>
+              </w:rPr>
+              <w:t>actcult</w:t>
+            </w:r>
+            <w:proofErr w:type="spellEnd"/>
+            <w:r>
+              <w:rPr>
+                <w:lang w:val="es-ES"/>
+              </w:rPr>
+              <w:t>":"</w:t>
+            </w:r>
+            <w:proofErr w:type="spellStart"/>
+            <w:r>
+              <w:rPr>
+                <w:lang w:val="es-ES"/>
+              </w:rPr>
+              <w:t>yyyy</w:t>
+            </w:r>
+            <w:proofErr w:type="spellEnd"/>
+            <w:r>
+              <w:rPr>
+                <w:lang w:val="es-ES"/>
+              </w:rPr>
+              <w:t>-mm-</w:t>
+            </w:r>
+            <w:proofErr w:type="spellStart"/>
+            <w:r>
+              <w:rPr>
+                <w:lang w:val="es-ES"/>
+              </w:rPr>
+              <w:t>dd</w:t>
+            </w:r>
+            <w:proofErr w:type="spellEnd"/>
+            <w:r>
+              <w:rPr>
+                <w:lang w:val="es-ES"/>
+              </w:rPr>
+              <w:t>",</w:t>
+            </w:r>
+            <w:proofErr w:type="spellStart"/>
+            <w:r>
+              <w:rPr>
+                <w:lang w:val="es-ES"/>
+              </w:rPr>
+              <w:t>dia</w:t>
+            </w:r>
+            <w:proofErr w:type="spellEnd"/>
+            <w:r>
+              <w:rPr>
+                <w:lang w:val="es-ES"/>
+              </w:rPr>
+              <w:t xml:space="preserve"> de una actividad</w:t>
+            </w:r>
+          </w:p>
+          <w:p>
+            <w:pPr>
+              <w:spacing w:after="0"/>
+              <w:ind w:left="720"/>
+              <w:rPr>
+                <w:lang w:val="es-ES"/>
+              </w:rPr>
+            </w:pPr>
+            <w:r>
+              <w:rPr>
+                <w:lang w:val="es-ES"/>
+              </w:rPr>
+              <w:t>"</w:t>
+            </w:r>
+            <w:proofErr w:type="spellStart"/>
+            <w:r>
+              <w:rPr>
+                <w:lang w:val="es-ES"/>
+              </w:rPr>
+              <w:t>findia_actcult</w:t>
+            </w:r>
+            <w:proofErr w:type="spellEnd"/>
+            <w:r>
+              <w:rPr>
+                <w:lang w:val="es-ES"/>
+              </w:rPr>
+              <w:t>": "</w:t>
+            </w:r>
+            <w:proofErr w:type="spellStart"/>
+            <w:r>
+              <w:rPr>
+                <w:lang w:val="es-ES"/>
+              </w:rPr>
+              <w:t>yyyy</w:t>
+            </w:r>
+            <w:proofErr w:type="spellEnd"/>
+            <w:r>
+              <w:rPr>
+                <w:lang w:val="es-ES"/>
+              </w:rPr>
+              <w:t>-mm-</w:t>
+            </w:r>
+            <w:proofErr w:type="spellStart"/>
+            <w:r>
+              <w:rPr>
+                <w:lang w:val="es-ES"/>
+              </w:rPr>
+              <w:t>dd</w:t>
+            </w:r>
+            <w:proofErr w:type="spellEnd"/>
+            <w:r>
+              <w:rPr>
+                <w:lang w:val="es-ES"/>
+              </w:rPr>
+              <w:t>",</w:t>
+            </w:r>
+            <w:proofErr w:type="spellStart"/>
+            <w:r>
+              <w:rPr>
+                <w:lang w:val="es-ES"/>
+              </w:rPr>
+              <w:t>dia</w:t>
+            </w:r>
+            <w:proofErr w:type="spellEnd"/>
+            <w:r>
+              <w:rPr>
+                <w:lang w:val="es-ES"/>
+              </w:rPr>
+              <w:t xml:space="preserve"> final de un rango de fecha</w:t>
+            </w:r>
+          </w:p>
+          <w:p>
+            <w:pPr>
+              <w:spacing w:after="0"/>
+              <w:ind w:left="720"/>
+              <w:rPr>
+                <w:lang w:val="es-ES"/>
+              </w:rPr>
+            </w:pPr>
+            <w:r>
+              <w:rPr>
+                <w:lang w:val="es-ES"/>
+              </w:rPr>
+              <w:t>"</w:t>
+            </w:r>
+            <w:proofErr w:type="spellStart"/>
+            <w:r>
+              <w:rPr>
+                <w:lang w:val="es-ES"/>
+              </w:rPr>
+              <w:t>entidad_responsable</w:t>
+            </w:r>
+            <w:proofErr w:type="spellEnd"/>
+            <w:r>
+              <w:rPr>
+                <w:lang w:val="es-ES"/>
+              </w:rPr>
+              <w:t>": id entidad responsable</w:t>
+            </w:r>
+            <w:r>
+              <w:rPr>
+                <w:lang w:val="es-ES"/>
+              </w:rPr>
+              <w:t>,</w:t>
+            </w:r>
+            <w:r>
+              <w:rPr>
+                <w:lang w:val="es-ES"/>
+              </w:rPr>
+              <w:t xml:space="preserve"> </w:t>
+            </w:r>
+          </w:p>
+          <w:p>
+            <w:pPr>
+              <w:spacing w:after="0"/>
+              <w:ind w:left="720"/>
+              <w:rPr>
+                <w:lang w:val="es-ES"/>
+              </w:rPr>
+            </w:pPr>
+            <w:r>
+              <w:rPr>
+                <w:lang w:val="es-ES"/>
+              </w:rPr>
+              <w:t>"</w:t>
+            </w:r>
+            <w:proofErr w:type="spellStart"/>
+            <w:r>
+              <w:rPr>
+                <w:lang w:val="es-ES"/>
+              </w:rPr>
+              <w:t>lugar_planificado</w:t>
+            </w:r>
+            <w:proofErr w:type="spellEnd"/>
+            <w:r>
+              <w:rPr>
+                <w:lang w:val="es-ES"/>
+              </w:rPr>
+              <w:t>": id del lugar donde se realizó,</w:t>
+            </w:r>
+          </w:p>
+          <w:p>
+            <w:pPr>
+              <w:spacing w:after="0"/>
+              <w:ind w:left="720"/>
+              <w:rPr>
+                <w:lang w:val="es-ES"/>
+              </w:rPr>
+            </w:pPr>
+            <w:r>
+              <w:rPr>
+                <w:lang w:val="es-ES"/>
+              </w:rPr>
+              <w:t>"</w:t>
+            </w:r>
+            <w:proofErr w:type="spellStart"/>
+            <w:r>
+              <w:rPr>
+                <w:lang w:val="es-ES"/>
+              </w:rPr>
+              <w:t>ic_planificado</w:t>
+            </w:r>
+            <w:proofErr w:type="spellEnd"/>
+            <w:r>
+              <w:rPr>
+                <w:lang w:val="es-ES"/>
+              </w:rPr>
+              <w:t>": id del instituto cultural donde se realizó,</w:t>
+            </w:r>
+          </w:p>
+          <w:p>
+            <w:pPr>
+              <w:spacing w:after="0"/>
+              <w:ind w:left="720"/>
+              <w:rPr>
+                <w:lang w:val="es-ES"/>
+              </w:rPr>
+            </w:pPr>
+            <w:r>
+              <w:rPr>
+                <w:lang w:val="es-ES"/>
+              </w:rPr>
+              <w:t xml:space="preserve">  "</w:t>
+            </w:r>
+            <w:proofErr w:type="spellStart"/>
+            <w:r>
+              <w:rPr>
+                <w:lang w:val="es-ES"/>
+              </w:rPr>
+              <w:t>cp_planificado</w:t>
+            </w:r>
+            <w:proofErr w:type="spellEnd"/>
+            <w:r>
+              <w:rPr>
+                <w:lang w:val="es-ES"/>
+              </w:rPr>
+              <w:t xml:space="preserve">": </w:t>
+            </w:r>
+            <w:r>
+              <w:rPr>
+                <w:lang w:val="es-ES"/>
+              </w:rPr>
+              <w:t>id del consejo popular</w:t>
+            </w:r>
+            <w:r>
+              <w:rPr>
+                <w:lang w:val="es-ES"/>
+              </w:rPr>
+              <w:t xml:space="preserve"> donde se realizó,</w:t>
+            </w:r>
+          </w:p>
+          <w:p>
+            <w:pPr>
+              <w:spacing w:after="0"/>
+              <w:ind w:left="720"/>
+              <w:rPr>
+                <w:lang w:val="es-ES"/>
+              </w:rPr>
+            </w:pPr>
+            <w:r>
+              <w:rPr>
+                <w:lang w:val="es-ES"/>
+              </w:rPr>
+              <w:t xml:space="preserve">  "</w:t>
+            </w:r>
+            <w:proofErr w:type="spellStart"/>
+            <w:r>
+              <w:rPr>
+                <w:lang w:val="es-ES"/>
+              </w:rPr>
+              <w:t>ct_planificado</w:t>
+            </w:r>
+            <w:proofErr w:type="spellEnd"/>
+            <w:r>
+              <w:rPr>
+                <w:lang w:val="es-ES"/>
+              </w:rPr>
+              <w:t xml:space="preserve">": </w:t>
+            </w:r>
+            <w:r>
+              <w:rPr>
+                <w:lang w:val="es-ES"/>
+              </w:rPr>
+              <w:t xml:space="preserve">id de la comunidad en transformación </w:t>
+            </w:r>
+            <w:r>
+              <w:rPr>
+                <w:lang w:val="es-ES"/>
+              </w:rPr>
+              <w:t>donde se realizó,</w:t>
+            </w:r>
+          </w:p>
+          <w:p>
+            <w:pPr>
+              <w:spacing w:after="0"/>
+              <w:ind w:left="720"/>
+              <w:rPr>
+                <w:lang w:val="es-ES"/>
+              </w:rPr>
+            </w:pPr>
+            <w:r>
+              <w:rPr>
+                <w:lang w:val="es-ES"/>
+              </w:rPr>
+              <w:t xml:space="preserve">  </w:t>
+            </w:r>
+            <w:r>
+              <w:rPr>
+                <w:lang w:val="es-ES"/>
+              </w:rPr>
+              <w:t xml:space="preserve"> </w:t>
+            </w:r>
+            <w:r>
+              <w:rPr>
+                <w:lang w:val="es-ES"/>
+              </w:rPr>
+              <w:t>(</w:t>
+            </w:r>
+            <w:r>
+              <w:rPr>
+                <w:lang w:val="es-ES"/>
+              </w:rPr>
+              <w:t>"</w:t>
+            </w:r>
+            <w:proofErr w:type="spellStart"/>
+            <w:r>
+              <w:rPr>
+                <w:lang w:val="es-ES"/>
+              </w:rPr>
+              <w:t>programas_tributa</w:t>
+            </w:r>
+            <w:proofErr w:type="spellEnd"/>
+            <w:r>
+              <w:rPr>
+                <w:lang w:val="es-ES"/>
+              </w:rPr>
+              <w:t>": id programa</w:t>
+            </w:r>
+            <w:r>
+              <w:rPr>
+                <w:lang w:val="es-ES"/>
+              </w:rPr>
+              <w:t xml:space="preserve"> relacionado</w:t>
+            </w:r>
+            <w:r>
+              <w:rPr>
+                <w:lang w:val="es-ES"/>
+              </w:rPr>
+              <w:t xml:space="preserve">, </w:t>
+            </w:r>
+            <w:r>
+              <w:rPr>
+                <w:lang w:val="es-ES"/>
+              </w:rPr>
+              <w:t>[principal: si por defecto] si lo pones es en falso para buscar si tiene un programa secundario)</w:t>
+            </w:r>
+          </w:p>
+          <w:p>
+            <w:pPr>
+              <w:spacing w:after="0"/>
+              <w:ind w:left="720"/>
+              <w:rPr>
+                <w:lang w:val="es-ES"/>
+              </w:rPr>
+            </w:pPr>
+            <w:r>
+              <w:rPr>
+                <w:lang w:val="es-ES"/>
+              </w:rPr>
+              <w:t xml:space="preserve">  </w:t>
+            </w:r>
+            <w:r>
+              <w:rPr>
+                <w:lang w:val="es-ES"/>
+              </w:rPr>
+              <w:t>(</w:t>
+            </w:r>
+            <w:r>
+              <w:rPr>
+                <w:lang w:val="es-ES"/>
+              </w:rPr>
+              <w:t>"</w:t>
+            </w:r>
+            <w:proofErr w:type="spellStart"/>
+            <w:r>
+              <w:rPr>
+                <w:lang w:val="es-ES"/>
+              </w:rPr>
+              <w:t>manifestaciones_artisticas</w:t>
+            </w:r>
+            <w:proofErr w:type="spellEnd"/>
+            <w:r>
+              <w:rPr>
+                <w:lang w:val="es-ES"/>
+              </w:rPr>
+              <w:t xml:space="preserve">": id </w:t>
+            </w:r>
+            <w:r>
+              <w:rPr>
+                <w:lang w:val="es-ES"/>
+              </w:rPr>
+              <w:t>manifestaciones artísticas relacionadas</w:t>
+            </w:r>
+            <w:r>
+              <w:rPr>
+                <w:lang w:val="es-ES"/>
+              </w:rPr>
+              <w:t xml:space="preserve">, </w:t>
+            </w:r>
+            <w:r>
+              <w:rPr>
+                <w:lang w:val="es-ES"/>
+              </w:rPr>
+              <w:t>[principal: si por defecto] si lo pones es en falso para buscar si tiene una secundaria)</w:t>
+            </w:r>
+            <w:bookmarkStart w:id="0" w:name="_GoBack"/>
+            <w:bookmarkEnd w:id="0"/>
+          </w:p>
+          <w:p>
+            <w:pPr>
+              <w:spacing w:after="0"/>
+              <w:ind w:left="720"/>
+              <w:rPr>
+                <w:lang w:val="es-ES"/>
+              </w:rPr>
+            </w:pPr>
           </w:p>
           <w:p>
             <w:pPr>
@@ -10414,6 +12664,7 @@
               <w:rPr>
                 <w:lang w:val="es-ES"/>
               </w:rPr>
+              <w:lastRenderedPageBreak/>
               <w:t>Dependencia</w:t>
             </w:r>
           </w:p>
@@ -10558,6 +12809,12 @@
         </w:rPr>
         <w:t xml:space="preserve"> {//solo existe en actividad</w:t>
       </w:r>
+      <w:r>
+        <w:rPr>
+          <w:lang w:val="es-ES"/>
+        </w:rPr>
+        <w:t xml:space="preserve">. </w:t>
+      </w:r>
     </w:p>
     <w:p>
       <w:r>
@@ -10566,10 +12823,15 @@
         </w:rPr>
         <w:t xml:space="preserve">    </w:t>
       </w:r>
+      <w:proofErr w:type="spellStart"/>
       <w:proofErr w:type="gramStart"/>
       <w:r>
         <w:t>id</w:t>
       </w:r>
+      <w:r>
+        <w:t>Talento</w:t>
+      </w:r>
+      <w:proofErr w:type="spellEnd"/>
       <w:proofErr w:type="gramEnd"/>
       <w:r>
         <w:t>: string</w:t>
@@ -10577,85 +12839,54 @@
     </w:p>
     <w:p>
       <w:r>
-        <w:t xml:space="preserve">    </w:t>
-      </w:r>
-      <w:proofErr w:type="gramStart"/>
-      <w:r>
-        <w:t>name</w:t>
-      </w:r>
-      <w:proofErr w:type="gramEnd"/>
-      <w:r>
-        <w:t>: string</w:t>
+        <w:t xml:space="preserve">  //</w:t>
+      </w:r>
+      <w:r>
+        <w:t>name: string</w:t>
       </w:r>
     </w:p>
     <w:p>
       <w:r>
         <w:t xml:space="preserve">    </w:t>
       </w:r>
+      <w:r>
+        <w:t>//</w:t>
+      </w:r>
       <w:proofErr w:type="spellStart"/>
-      <w:proofErr w:type="gramStart"/>
-      <w:r>
-        <w:t>manifest:</w:t>
-      </w:r>
-      <w:proofErr w:type="gramEnd"/>
-      <w:r>
-        <w:t>string</w:t>
+      <w:r>
+        <w:t>manifest:string</w:t>
       </w:r>
       <w:proofErr w:type="spellEnd"/>
     </w:p>
     <w:p>
+      <w:pPr>
+        <w:rPr>
+          <w:lang w:val="es-ES"/>
+        </w:rPr>
+      </w:pPr>
       <w:r>
         <w:t xml:space="preserve">    </w:t>
       </w:r>
       <w:proofErr w:type="spellStart"/>
       <w:r>
+        <w:rPr>
+          <w:lang w:val="es-ES"/>
+        </w:rPr>
         <w:t>numero_contrato</w:t>
       </w:r>
       <w:proofErr w:type="spellEnd"/>
       <w:r>
-        <w:t>: string</w:t>
-      </w:r>
-    </w:p>
-    <w:p>
-      <w:r>
-        <w:t xml:space="preserve">    </w:t>
+        <w:rPr>
+          <w:lang w:val="es-ES"/>
+        </w:rPr>
+        <w:t xml:space="preserve">: </w:t>
       </w:r>
       <w:proofErr w:type="spellStart"/>
       <w:r>
-        <w:t>numero_prefactura</w:t>
-      </w:r>
-      <w:proofErr w:type="spellEnd"/>
-      <w:r>
-        <w:t>: string</w:t>
-      </w:r>
-    </w:p>
-    <w:p>
-      <w:r>
-        <w:t xml:space="preserve">    </w:t>
-      </w:r>
-      <w:proofErr w:type="spellStart"/>
-      <w:proofErr w:type="gramStart"/>
-      <w:r>
-        <w:t>cantidad</w:t>
-      </w:r>
-      <w:proofErr w:type="spellEnd"/>
-      <w:proofErr w:type="gramEnd"/>
-      <w:r>
-        <w:t>: number</w:t>
-      </w:r>
-    </w:p>
-    <w:p>
-      <w:r>
-        <w:t xml:space="preserve">    </w:t>
-      </w:r>
-      <w:proofErr w:type="spellStart"/>
-      <w:proofErr w:type="gramStart"/>
-      <w:r>
-        <w:t>pagado:</w:t>
-      </w:r>
-      <w:proofErr w:type="gramEnd"/>
-      <w:r>
-        <w:t>boolean</w:t>
+        <w:rPr>
+          <w:lang w:val="es-ES"/>
+        </w:rPr>
+        <w:t>string</w:t>
       </w:r>
       <w:proofErr w:type="spellEnd"/>
     </w:p>
@@ -10669,16 +12900,1054 @@
         <w:rPr>
           <w:lang w:val="es-ES"/>
         </w:rPr>
-        <w:t>}</w:t>
-      </w:r>
+        <w:t xml:space="preserve">    </w:t>
+      </w:r>
+      <w:proofErr w:type="spellStart"/>
+      <w:r>
+        <w:rPr>
+          <w:lang w:val="es-ES"/>
+        </w:rPr>
+        <w:t>numero_prefactura</w:t>
+      </w:r>
+      <w:proofErr w:type="spellEnd"/>
+      <w:r>
+        <w:rPr>
+          <w:lang w:val="es-ES"/>
+        </w:rPr>
+        <w:t xml:space="preserve">: </w:t>
+      </w:r>
+      <w:proofErr w:type="spellStart"/>
+      <w:r>
+        <w:rPr>
+          <w:lang w:val="es-ES"/>
+        </w:rPr>
+        <w:t>string</w:t>
+      </w:r>
+      <w:proofErr w:type="spellEnd"/>
     </w:p>
     <w:p>
       <w:pPr>
+        <w:rPr>
+          <w:lang w:val="es-ES"/>
+        </w:rPr>
+      </w:pPr>
+      <w:r>
+        <w:rPr>
+          <w:lang w:val="es-ES"/>
+        </w:rPr>
+        <w:t xml:space="preserve">    </w:t>
+      </w:r>
+      <w:proofErr w:type="gramStart"/>
+      <w:r>
+        <w:rPr>
+          <w:lang w:val="es-ES"/>
+        </w:rPr>
+        <w:t>cantidad</w:t>
+      </w:r>
+      <w:proofErr w:type="gramEnd"/>
+      <w:r>
+        <w:rPr>
+          <w:lang w:val="es-ES"/>
+        </w:rPr>
+        <w:t xml:space="preserve">: </w:t>
+      </w:r>
+      <w:proofErr w:type="spellStart"/>
+      <w:r>
+        <w:rPr>
+          <w:lang w:val="es-ES"/>
+        </w:rPr>
+        <w:t>number</w:t>
+      </w:r>
+      <w:proofErr w:type="spellEnd"/>
+    </w:p>
+    <w:p>
+      <w:pPr>
+        <w:rPr>
+          <w:lang w:val="es-ES"/>
+        </w:rPr>
+      </w:pPr>
+      <w:r>
+        <w:rPr>
+          <w:lang w:val="es-ES"/>
+        </w:rPr>
+        <w:lastRenderedPageBreak/>
+        <w:t xml:space="preserve">    </w:t>
+      </w:r>
+      <w:proofErr w:type="spellStart"/>
+      <w:proofErr w:type="gramStart"/>
+      <w:r>
+        <w:rPr>
+          <w:lang w:val="es-ES"/>
+        </w:rPr>
+        <w:t>pagado:</w:t>
+      </w:r>
+      <w:proofErr w:type="gramEnd"/>
+      <w:r>
+        <w:rPr>
+          <w:lang w:val="es-ES"/>
+        </w:rPr>
+        <w:t>boolean</w:t>
+      </w:r>
+      <w:proofErr w:type="spellEnd"/>
+      <w:r>
+        <w:rPr>
+          <w:lang w:val="es-ES"/>
+        </w:rPr>
+        <w:t xml:space="preserve"> //solo se paga </w:t>
+      </w:r>
+      <w:proofErr w:type="spellStart"/>
+      <w:r>
+        <w:rPr>
+          <w:lang w:val="es-ES"/>
+        </w:rPr>
+        <w:t>cdo</w:t>
+      </w:r>
+      <w:proofErr w:type="spellEnd"/>
+      <w:r>
+        <w:rPr>
+          <w:lang w:val="es-ES"/>
+        </w:rPr>
+        <w:t xml:space="preserve"> la actividad se realiza</w:t>
+      </w:r>
+    </w:p>
+    <w:p>
+      <w:pPr>
+        <w:rPr>
+          <w:lang w:val="es-ES"/>
+        </w:rPr>
+      </w:pPr>
+      <w:r>
+        <w:rPr>
+          <w:lang w:val="es-ES"/>
+        </w:rPr>
+        <w:t>}</w:t>
+      </w:r>
+    </w:p>
+    <w:p>
+      <w:pPr>
+        <w:spacing w:after="0"/>
+        <w:textAlignment w:val="auto"/>
+        <w:rPr>
+          <w:lang w:val="es-ES"/>
+        </w:rPr>
+      </w:pPr>
+      <w:r>
+        <w:rPr>
+          <w:lang w:val="es-ES"/>
+        </w:rPr>
+        <w:br w:type="page"/>
+      </w:r>
+    </w:p>
+    <w:p>
+      <w:pPr>
+        <w:pStyle w:val="Ttulo1"/>
+        <w:rPr>
+          <w:lang w:val="es-ES"/>
+        </w:rPr>
+      </w:pPr>
+      <w:r>
+        <w:rPr>
+          <w:lang w:val="es-ES"/>
+        </w:rPr>
+        <w:lastRenderedPageBreak/>
+        <w:t>Salidas</w:t>
+      </w:r>
+      <w:r>
+        <w:rPr>
+          <w:lang w:val="es-ES"/>
+        </w:rPr>
+        <w:t xml:space="preserve"> </w:t>
+      </w:r>
+      <w:proofErr w:type="gramStart"/>
+      <w:r>
+        <w:rPr>
+          <w:lang w:val="es-ES"/>
+        </w:rPr>
+        <w:t>[ información</w:t>
+      </w:r>
+      <w:proofErr w:type="gramEnd"/>
+      <w:r>
+        <w:rPr>
+          <w:lang w:val="es-ES"/>
+        </w:rPr>
+        <w:t xml:space="preserve"> de actividades ]</w:t>
+      </w:r>
+    </w:p>
+    <w:p>
+      <w:pPr>
+        <w:pStyle w:val="Ttulo2"/>
+      </w:pPr>
+      <w:r>
+        <w:t xml:space="preserve">Modelo 1: </w:t>
+      </w:r>
+      <w:r>
+        <w:t>Modelo de Programación Mensual</w:t>
+      </w:r>
+    </w:p>
+    <w:p>
+      <w:pPr>
         <w:pStyle w:val="Textbody"/>
         <w:rPr>
-          <w:lang w:val="es-ES"/>
-        </w:rPr>
-      </w:pPr>
+          <w:sz w:val="24"/>
+          <w:lang w:val="es-ES"/>
+        </w:rPr>
+      </w:pPr>
+      <w:r>
+        <w:rPr>
+          <w:sz w:val="24"/>
+          <w:lang w:val="es-ES"/>
+        </w:rPr>
+        <w:t xml:space="preserve">Figura </w:t>
+      </w:r>
+      <w:r>
+        <w:rPr>
+          <w:sz w:val="24"/>
+          <w:lang w:val="es-ES"/>
+        </w:rPr>
+        <w:t>3</w:t>
+      </w:r>
+      <w:r>
+        <w:rPr>
+          <w:sz w:val="24"/>
+          <w:lang w:val="es-ES"/>
+        </w:rPr>
+        <w:t xml:space="preserve"> - Modelo de Programación Mensual</w:t>
+      </w:r>
+    </w:p>
+    <w:p>
+      <w:pPr>
+        <w:pStyle w:val="Textbody"/>
+        <w:rPr>
+          <w:sz w:val="24"/>
+          <w:lang w:val="es-ES"/>
+        </w:rPr>
+      </w:pPr>
+      <w:r>
+        <w:rPr>
+          <w:sz w:val="24"/>
+          <w:lang w:val="es-ES"/>
+        </w:rPr>
+        <w:t xml:space="preserve">Tabla </w:t>
+      </w:r>
+      <w:proofErr w:type="spellStart"/>
+      <w:r>
+        <w:rPr>
+          <w:sz w:val="24"/>
+          <w:lang w:val="es-ES"/>
+        </w:rPr>
+        <w:t>Control_</w:t>
+      </w:r>
+      <w:proofErr w:type="gramStart"/>
+      <w:r>
+        <w:rPr>
+          <w:sz w:val="24"/>
+          <w:lang w:val="es-ES"/>
+        </w:rPr>
+        <w:t>ActCult</w:t>
+      </w:r>
+      <w:proofErr w:type="spellEnd"/>
+      <w:r>
+        <w:rPr>
+          <w:sz w:val="24"/>
+          <w:lang w:val="es-ES"/>
+        </w:rPr>
+        <w:t xml:space="preserve"> ,</w:t>
+      </w:r>
+      <w:proofErr w:type="gramEnd"/>
+      <w:r>
+        <w:rPr>
+          <w:sz w:val="24"/>
+          <w:lang w:val="es-ES"/>
+        </w:rPr>
+        <w:t xml:space="preserve"> </w:t>
+      </w:r>
+      <w:r>
+        <w:rPr>
+          <w:sz w:val="24"/>
+          <w:lang w:val="es-ES"/>
+        </w:rPr>
+        <w:t xml:space="preserve">Por </w:t>
+      </w:r>
+      <w:proofErr w:type="spellStart"/>
+      <w:r>
+        <w:rPr>
+          <w:sz w:val="24"/>
+          <w:lang w:val="es-ES"/>
+        </w:rPr>
+        <w:t>entidad_responsable</w:t>
+      </w:r>
+      <w:proofErr w:type="spellEnd"/>
+      <w:r>
+        <w:rPr>
+          <w:sz w:val="24"/>
+          <w:lang w:val="es-ES"/>
+        </w:rPr>
+        <w:t>(isDeleted_0)</w:t>
+      </w:r>
+      <w:r>
+        <w:rPr>
+          <w:sz w:val="24"/>
+          <w:lang w:val="es-ES"/>
+        </w:rPr>
+        <w:t>:</w:t>
+      </w:r>
+    </w:p>
+    <w:p>
+      <w:pPr>
+        <w:pStyle w:val="Textbody"/>
+        <w:numPr>
+          <w:ilvl w:val="0"/>
+          <w:numId w:val="4"/>
+        </w:numPr>
+        <w:rPr>
+          <w:sz w:val="24"/>
+          <w:lang w:val="es-ES"/>
+        </w:rPr>
+      </w:pPr>
+      <w:proofErr w:type="spellStart"/>
+      <w:r>
+        <w:rPr>
+          <w:sz w:val="24"/>
+          <w:lang w:val="es-ES"/>
+        </w:rPr>
+        <w:t>InformacionGral</w:t>
+      </w:r>
+      <w:proofErr w:type="spellEnd"/>
+      <w:r>
+        <w:rPr>
+          <w:sz w:val="24"/>
+          <w:lang w:val="es-ES"/>
+        </w:rPr>
+        <w:t xml:space="preserve">: </w:t>
+      </w:r>
+      <w:r>
+        <w:rPr>
+          <w:sz w:val="24"/>
+          <w:lang w:val="es-ES"/>
+        </w:rPr>
+        <w:t>extraPlan_0{</w:t>
+      </w:r>
+      <w:r>
+        <w:rPr>
+          <w:sz w:val="24"/>
+          <w:lang w:val="es-ES"/>
+        </w:rPr>
+        <w:t>planificadas</w:t>
+      </w:r>
+      <w:r>
+        <w:rPr>
+          <w:sz w:val="24"/>
+          <w:lang w:val="es-ES"/>
+        </w:rPr>
+        <w:t xml:space="preserve">( se cuentan todas menos las </w:t>
+      </w:r>
+      <w:proofErr w:type="spellStart"/>
+      <w:r>
+        <w:rPr>
+          <w:sz w:val="24"/>
+          <w:lang w:val="es-ES"/>
+        </w:rPr>
+        <w:t>extraPlan:true</w:t>
+      </w:r>
+      <w:proofErr w:type="spellEnd"/>
+      <w:r>
+        <w:rPr>
+          <w:sz w:val="24"/>
+          <w:lang w:val="es-ES"/>
+        </w:rPr>
+        <w:t>)</w:t>
+      </w:r>
+      <w:r>
+        <w:rPr>
+          <w:sz w:val="24"/>
+          <w:lang w:val="es-ES"/>
+        </w:rPr>
+        <w:t>, cumplidas (realizadas)[cantidad,%planificadas,asistencia</w:t>
+      </w:r>
+      <w:r>
+        <w:rPr>
+          <w:sz w:val="24"/>
+          <w:lang w:val="es-ES"/>
+        </w:rPr>
+        <w:t>,presupuestado,gastado</w:t>
+      </w:r>
+      <w:r>
+        <w:rPr>
+          <w:sz w:val="24"/>
+          <w:lang w:val="es-ES"/>
+        </w:rPr>
+        <w:t>]</w:t>
+      </w:r>
+      <w:r>
+        <w:rPr>
+          <w:sz w:val="24"/>
+          <w:lang w:val="es-ES"/>
+        </w:rPr>
+        <w:t xml:space="preserve"> , suspendidas(cantidad de suspendidas y rechazadas)</w:t>
+      </w:r>
+      <w:r>
+        <w:rPr>
+          <w:sz w:val="24"/>
+          <w:lang w:val="es-ES"/>
+        </w:rPr>
+        <w:t>} ,extraPlan_1(cantidad)</w:t>
+      </w:r>
+    </w:p>
+    <w:p>
+      <w:pPr>
+        <w:pStyle w:val="Textbody"/>
+        <w:numPr>
+          <w:ilvl w:val="0"/>
+          <w:numId w:val="4"/>
+        </w:numPr>
+        <w:rPr>
+          <w:sz w:val="24"/>
+          <w:lang w:val="es-ES"/>
+        </w:rPr>
+      </w:pPr>
+      <w:proofErr w:type="spellStart"/>
+      <w:r>
+        <w:rPr>
+          <w:sz w:val="24"/>
+          <w:lang w:val="es-ES"/>
+        </w:rPr>
+        <w:t>InformacionGrupoEtareo</w:t>
+      </w:r>
+      <w:proofErr w:type="spellEnd"/>
+      <w:r>
+        <w:rPr>
+          <w:sz w:val="24"/>
+          <w:lang w:val="es-ES"/>
+        </w:rPr>
+        <w:t xml:space="preserve">: </w:t>
+      </w:r>
+      <w:r>
+        <w:rPr>
+          <w:sz w:val="24"/>
+          <w:lang w:val="es-ES"/>
+        </w:rPr>
+        <w:t>(</w:t>
+      </w:r>
+      <w:r>
+        <w:rPr>
+          <w:sz w:val="24"/>
+          <w:lang w:val="es-ES"/>
+        </w:rPr>
+        <w:t>extraPlan_0 y Realizada</w:t>
+      </w:r>
+      <w:r>
+        <w:rPr>
+          <w:sz w:val="24"/>
+          <w:lang w:val="es-ES"/>
+        </w:rPr>
+        <w:t xml:space="preserve"> </w:t>
+      </w:r>
+      <w:r>
+        <w:rPr>
+          <w:sz w:val="24"/>
+          <w:lang w:val="es-ES"/>
+        </w:rPr>
+        <w:t>)</w:t>
+      </w:r>
+      <w:r>
+        <w:rPr>
+          <w:sz w:val="24"/>
+          <w:lang w:val="es-ES"/>
+        </w:rPr>
+        <w:t>{edad}</w:t>
+      </w:r>
+      <w:r>
+        <w:rPr>
+          <w:sz w:val="24"/>
+          <w:lang w:val="es-ES"/>
+        </w:rPr>
+        <w:t>=&gt; cantidad y cantidad de asistentes</w:t>
+      </w:r>
+    </w:p>
+    <w:p>
+      <w:pPr>
+        <w:pStyle w:val="Textbody"/>
+        <w:numPr>
+          <w:ilvl w:val="0"/>
+          <w:numId w:val="4"/>
+        </w:numPr>
+        <w:rPr>
+          <w:sz w:val="24"/>
+          <w:lang w:val="es-ES"/>
+        </w:rPr>
+      </w:pPr>
+      <w:proofErr w:type="spellStart"/>
+      <w:r>
+        <w:rPr>
+          <w:sz w:val="24"/>
+          <w:lang w:val="es-ES"/>
+        </w:rPr>
+        <w:t>InformacionManifestacion</w:t>
+      </w:r>
+      <w:proofErr w:type="spellEnd"/>
+      <w:r>
+        <w:rPr>
+          <w:sz w:val="24"/>
+          <w:lang w:val="es-ES"/>
+        </w:rPr>
+        <w:t>:</w:t>
+      </w:r>
+      <w:r>
+        <w:rPr>
+          <w:sz w:val="24"/>
+          <w:lang w:val="es-ES"/>
+        </w:rPr>
+        <w:t xml:space="preserve"> </w:t>
+      </w:r>
+      <w:r>
+        <w:rPr>
+          <w:sz w:val="24"/>
+          <w:lang w:val="es-ES"/>
+        </w:rPr>
+        <w:t>(extraPlan_0 y Realizada ) y (</w:t>
+      </w:r>
+      <w:proofErr w:type="spellStart"/>
+      <w:r>
+        <w:rPr>
+          <w:sz w:val="24"/>
+          <w:lang w:val="es-ES"/>
+        </w:rPr>
+        <w:t>ítem.talentos</w:t>
+      </w:r>
+      <w:proofErr w:type="spellEnd"/>
+      <w:r>
+        <w:rPr>
+          <w:sz w:val="24"/>
+          <w:lang w:val="es-ES"/>
+        </w:rPr>
+        <w:t xml:space="preserve"> )</w:t>
+      </w:r>
+      <w:r>
+        <w:rPr>
+          <w:sz w:val="24"/>
+          <w:lang w:val="es-ES"/>
+        </w:rPr>
+        <w:t xml:space="preserve"> {</w:t>
+      </w:r>
+      <w:proofErr w:type="spellStart"/>
+      <w:r>
+        <w:rPr>
+          <w:sz w:val="24"/>
+          <w:lang w:val="es-ES"/>
+        </w:rPr>
+        <w:t>manifestaciones_artisticas</w:t>
+      </w:r>
+      <w:proofErr w:type="spellEnd"/>
+      <w:r>
+        <w:rPr>
+          <w:sz w:val="24"/>
+          <w:lang w:val="es-ES"/>
+        </w:rPr>
+        <w:t xml:space="preserve"> y </w:t>
+      </w:r>
+      <w:proofErr w:type="spellStart"/>
+      <w:r>
+        <w:rPr>
+          <w:sz w:val="24"/>
+          <w:lang w:val="es-ES"/>
+        </w:rPr>
+        <w:t>persona_Talento_Artistico</w:t>
+      </w:r>
+      <w:proofErr w:type="spellEnd"/>
+      <w:r>
+        <w:rPr>
+          <w:sz w:val="24"/>
+          <w:lang w:val="es-ES"/>
+        </w:rPr>
+        <w:t>}</w:t>
+      </w:r>
+      <w:r>
+        <w:rPr>
+          <w:sz w:val="24"/>
+          <w:lang w:val="es-ES"/>
+        </w:rPr>
+        <w:t>=&gt; cantidad profesionales y cantidad de aficionados</w:t>
+      </w:r>
+    </w:p>
+    <w:p>
+      <w:pPr>
+        <w:pStyle w:val="Textbody"/>
+        <w:numPr>
+          <w:ilvl w:val="0"/>
+          <w:numId w:val="4"/>
+        </w:numPr>
+        <w:rPr>
+          <w:sz w:val="24"/>
+          <w:lang w:val="es-ES"/>
+        </w:rPr>
+      </w:pPr>
+      <w:proofErr w:type="spellStart"/>
+      <w:r>
+        <w:rPr>
+          <w:sz w:val="24"/>
+          <w:lang w:val="es-ES"/>
+        </w:rPr>
+        <w:t>InformacionApoyoManifestacion</w:t>
+      </w:r>
+      <w:proofErr w:type="spellEnd"/>
+      <w:r>
+        <w:rPr>
+          <w:sz w:val="24"/>
+          <w:lang w:val="es-ES"/>
+        </w:rPr>
+        <w:t>:</w:t>
+      </w:r>
+      <w:r>
+        <w:rPr>
+          <w:sz w:val="24"/>
+          <w:lang w:val="es-ES"/>
+        </w:rPr>
+        <w:t xml:space="preserve"> </w:t>
+      </w:r>
+      <w:r>
+        <w:rPr>
+          <w:sz w:val="24"/>
+          <w:lang w:val="es-ES"/>
+        </w:rPr>
+        <w:t>(extraPlan_0 y Realizada ) y (</w:t>
+      </w:r>
+      <w:proofErr w:type="spellStart"/>
+      <w:r>
+        <w:rPr>
+          <w:sz w:val="24"/>
+          <w:lang w:val="es-ES"/>
+        </w:rPr>
+        <w:t>ítem.apoyos</w:t>
+      </w:r>
+      <w:proofErr w:type="spellEnd"/>
+      <w:r>
+        <w:rPr>
+          <w:sz w:val="24"/>
+          <w:lang w:val="es-ES"/>
+        </w:rPr>
+        <w:t xml:space="preserve"> ) { </w:t>
+      </w:r>
+      <w:proofErr w:type="spellStart"/>
+      <w:r>
+        <w:rPr>
+          <w:sz w:val="24"/>
+          <w:lang w:val="es-ES"/>
+        </w:rPr>
+        <w:t>ítem.apoyos.manifest</w:t>
+      </w:r>
+      <w:proofErr w:type="spellEnd"/>
+      <w:r>
+        <w:rPr>
+          <w:sz w:val="24"/>
+          <w:lang w:val="es-ES"/>
+        </w:rPr>
+        <w:t xml:space="preserve"> }=&gt; cantidad </w:t>
+      </w:r>
+      <w:r>
+        <w:rPr>
+          <w:sz w:val="24"/>
+          <w:lang w:val="es-ES"/>
+        </w:rPr>
+        <w:t>apoyo</w:t>
+      </w:r>
+      <w:r>
+        <w:rPr>
+          <w:sz w:val="24"/>
+          <w:lang w:val="es-ES"/>
+        </w:rPr>
+        <w:t xml:space="preserve"> y cantidad de </w:t>
+      </w:r>
+      <w:r>
+        <w:rPr>
+          <w:sz w:val="24"/>
+          <w:lang w:val="es-ES"/>
+        </w:rPr>
+        <w:t>dinero</w:t>
+      </w:r>
+    </w:p>
+    <w:p>
+      <w:pPr>
+        <w:pStyle w:val="Textbody"/>
+        <w:numPr>
+          <w:ilvl w:val="0"/>
+          <w:numId w:val="4"/>
+        </w:numPr>
+        <w:rPr>
+          <w:sz w:val="24"/>
+          <w:lang w:val="es-ES"/>
+        </w:rPr>
+      </w:pPr>
+      <w:proofErr w:type="spellStart"/>
+      <w:r>
+        <w:rPr>
+          <w:sz w:val="24"/>
+          <w:lang w:val="es-ES"/>
+        </w:rPr>
+        <w:t>InformacionProgramas</w:t>
+      </w:r>
+      <w:proofErr w:type="spellEnd"/>
+      <w:r>
+        <w:rPr>
+          <w:sz w:val="24"/>
+          <w:lang w:val="es-ES"/>
+        </w:rPr>
+        <w:t>:{extraPlan_0 y Realizada){</w:t>
+      </w:r>
+      <w:proofErr w:type="spellStart"/>
+      <w:r>
+        <w:rPr>
+          <w:sz w:val="24"/>
+          <w:lang w:val="es-ES"/>
+        </w:rPr>
+        <w:t>programas_tributa</w:t>
+      </w:r>
+      <w:proofErr w:type="spellEnd"/>
+      <w:r>
+        <w:rPr>
+          <w:sz w:val="24"/>
+          <w:lang w:val="es-ES"/>
+        </w:rPr>
+        <w:t xml:space="preserve">} </w:t>
+      </w:r>
+      <w:r>
+        <w:rPr>
+          <w:sz w:val="24"/>
+          <w:lang w:val="es-ES"/>
+        </w:rPr>
+        <w:t xml:space="preserve">=&gt; cantidad </w:t>
+      </w:r>
+    </w:p>
+    <w:p>
+      <w:pPr>
+        <w:pStyle w:val="Textbody"/>
+        <w:numPr>
+          <w:ilvl w:val="0"/>
+          <w:numId w:val="4"/>
+        </w:numPr>
+        <w:rPr>
+          <w:sz w:val="24"/>
+          <w:lang w:val="es-ES"/>
+        </w:rPr>
+      </w:pPr>
+      <w:proofErr w:type="spellStart"/>
+      <w:r>
+        <w:rPr>
+          <w:sz w:val="24"/>
+          <w:lang w:val="es-ES"/>
+        </w:rPr>
+        <w:t>InformacionTV</w:t>
+      </w:r>
+      <w:proofErr w:type="spellEnd"/>
+      <w:r>
+        <w:rPr>
+          <w:sz w:val="24"/>
+          <w:lang w:val="es-ES"/>
+        </w:rPr>
+        <w:t>:{extraPlan_0 y</w:t>
+      </w:r>
+      <w:r>
+        <w:rPr>
+          <w:sz w:val="24"/>
+          <w:lang w:val="es-ES"/>
+        </w:rPr>
+        <w:t xml:space="preserve"> Realizada){tv_1</w:t>
+      </w:r>
+      <w:r>
+        <w:rPr>
+          <w:sz w:val="24"/>
+          <w:lang w:val="es-ES"/>
+        </w:rPr>
+        <w:t xml:space="preserve">} =&gt; cantidad </w:t>
+      </w:r>
+    </w:p>
+    <w:p>
+      <w:pPr>
+        <w:pStyle w:val="Textbody"/>
+        <w:numPr>
+          <w:ilvl w:val="0"/>
+          <w:numId w:val="4"/>
+        </w:numPr>
+        <w:rPr>
+          <w:sz w:val="24"/>
+          <w:lang w:val="es-ES"/>
+        </w:rPr>
+      </w:pPr>
+      <w:proofErr w:type="spellStart"/>
+      <w:r>
+        <w:rPr>
+          <w:sz w:val="24"/>
+          <w:lang w:val="es-ES"/>
+        </w:rPr>
+        <w:t>InformacionRed</w:t>
+      </w:r>
+      <w:proofErr w:type="spellEnd"/>
+      <w:r>
+        <w:rPr>
+          <w:sz w:val="24"/>
+          <w:lang w:val="es-ES"/>
+        </w:rPr>
+        <w:t xml:space="preserve">:{extraPlan_0 y Realizada){redes_plataformas_1} =&gt; cantidad </w:t>
+      </w:r>
+    </w:p>
+    <w:p>
+      <w:pPr>
+        <w:pStyle w:val="Textbody"/>
+        <w:ind w:left="360"/>
+        <w:rPr>
+          <w:sz w:val="24"/>
+          <w:lang w:val="es-ES"/>
+        </w:rPr>
+      </w:pPr>
+    </w:p>
+    <w:p>
+      <w:pPr>
+        <w:pStyle w:val="Ttulo2"/>
+      </w:pPr>
+      <w:r>
+        <w:t>Modelo 2: Pensar que poner</w:t>
+      </w:r>
+    </w:p>
+    <w:p>
+      <w:pPr>
+        <w:pStyle w:val="Textbody"/>
+        <w:rPr>
+          <w:sz w:val="24"/>
+          <w:lang w:val="es-ES"/>
+        </w:rPr>
+      </w:pPr>
+      <w:r>
+        <w:rPr>
+          <w:sz w:val="24"/>
+          <w:lang w:val="es-ES"/>
+        </w:rPr>
+        <w:t>Figura 2 - Modelo de Programación Mensual</w:t>
+      </w:r>
+    </w:p>
+    <w:p>
+      <w:pPr>
+        <w:pStyle w:val="Textbody"/>
+        <w:rPr>
+          <w:sz w:val="24"/>
+          <w:lang w:val="es-ES"/>
+        </w:rPr>
+      </w:pPr>
+      <w:r>
+        <w:rPr>
+          <w:sz w:val="24"/>
+          <w:lang w:val="es-ES"/>
+        </w:rPr>
+        <w:t xml:space="preserve">Tabla </w:t>
+      </w:r>
+      <w:proofErr w:type="spellStart"/>
+      <w:r>
+        <w:rPr>
+          <w:sz w:val="24"/>
+          <w:lang w:val="es-ES"/>
+        </w:rPr>
+        <w:t>Control_</w:t>
+      </w:r>
+      <w:proofErr w:type="gramStart"/>
+      <w:r>
+        <w:rPr>
+          <w:sz w:val="24"/>
+          <w:lang w:val="es-ES"/>
+        </w:rPr>
+        <w:t>ActCult</w:t>
+      </w:r>
+      <w:proofErr w:type="spellEnd"/>
+      <w:r>
+        <w:rPr>
+          <w:sz w:val="24"/>
+          <w:lang w:val="es-ES"/>
+        </w:rPr>
+        <w:t xml:space="preserve"> ,</w:t>
+      </w:r>
+      <w:proofErr w:type="gramEnd"/>
+      <w:r>
+        <w:rPr>
+          <w:sz w:val="24"/>
+          <w:lang w:val="es-ES"/>
+        </w:rPr>
+        <w:t xml:space="preserve"> Por </w:t>
+      </w:r>
+      <w:proofErr w:type="spellStart"/>
+      <w:r>
+        <w:rPr>
+          <w:sz w:val="24"/>
+          <w:lang w:val="es-ES"/>
+        </w:rPr>
+        <w:t>entidad_responsable</w:t>
+      </w:r>
+      <w:proofErr w:type="spellEnd"/>
+      <w:r>
+        <w:rPr>
+          <w:sz w:val="24"/>
+          <w:lang w:val="es-ES"/>
+        </w:rPr>
+        <w:t>(isDeleted_0):</w:t>
+      </w:r>
+    </w:p>
+    <w:p>
+      <w:pPr>
+        <w:pStyle w:val="Textbody"/>
+        <w:numPr>
+          <w:ilvl w:val="0"/>
+          <w:numId w:val="5"/>
+        </w:numPr>
+        <w:rPr>
+          <w:sz w:val="24"/>
+          <w:lang w:val="es-ES"/>
+        </w:rPr>
+      </w:pPr>
+      <w:proofErr w:type="spellStart"/>
+      <w:r>
+        <w:rPr>
+          <w:sz w:val="24"/>
+          <w:lang w:val="es-ES"/>
+        </w:rPr>
+        <w:t>InformacionGral</w:t>
+      </w:r>
+      <w:proofErr w:type="spellEnd"/>
+      <w:r>
+        <w:rPr>
+          <w:sz w:val="24"/>
+          <w:lang w:val="es-ES"/>
+        </w:rPr>
+        <w:t xml:space="preserve">: extraPlan_0{planificadas( se cuentan todas menos las </w:t>
+      </w:r>
+      <w:proofErr w:type="spellStart"/>
+      <w:r>
+        <w:rPr>
+          <w:sz w:val="24"/>
+          <w:lang w:val="es-ES"/>
+        </w:rPr>
+        <w:t>extraPlan:true</w:t>
+      </w:r>
+      <w:proofErr w:type="spellEnd"/>
+      <w:r>
+        <w:rPr>
+          <w:sz w:val="24"/>
+          <w:lang w:val="es-ES"/>
+        </w:rPr>
+        <w:t>), cumplidas (realizadas)[cantidad,%planificadas,asistencia,presupuestado,gastado] , suspendidas(cantidad de suspendidas y rechazadas)} ,extraPlan_1(cantidad)</w:t>
+      </w:r>
+    </w:p>
+    <w:p>
+      <w:pPr>
+        <w:pStyle w:val="Textbody"/>
+        <w:numPr>
+          <w:ilvl w:val="0"/>
+          <w:numId w:val="5"/>
+        </w:numPr>
+        <w:rPr>
+          <w:sz w:val="24"/>
+          <w:lang w:val="es-ES"/>
+        </w:rPr>
+      </w:pPr>
+      <w:proofErr w:type="spellStart"/>
+      <w:r>
+        <w:rPr>
+          <w:sz w:val="24"/>
+          <w:lang w:val="es-ES"/>
+        </w:rPr>
+        <w:t>InformacionGrupoEtareo</w:t>
+      </w:r>
+      <w:proofErr w:type="spellEnd"/>
+      <w:r>
+        <w:rPr>
+          <w:sz w:val="24"/>
+          <w:lang w:val="es-ES"/>
+        </w:rPr>
+        <w:t>: (extraPlan_0 y Realizada ){edad}=&gt; cantidad y cantidad de asistentes</w:t>
+      </w:r>
+    </w:p>
+    <w:p>
+      <w:pPr>
+        <w:pStyle w:val="Textbody"/>
+        <w:ind w:left="360"/>
+        <w:rPr>
+          <w:sz w:val="24"/>
+          <w:lang w:val="es-ES"/>
+        </w:rPr>
+      </w:pPr>
+      <w:proofErr w:type="spellStart"/>
+      <w:r>
+        <w:rPr>
+          <w:sz w:val="24"/>
+          <w:lang w:val="es-ES"/>
+        </w:rPr>
+        <w:t>InformacionManifestacion</w:t>
+      </w:r>
+      <w:proofErr w:type="spellEnd"/>
+      <w:r>
+        <w:rPr>
+          <w:sz w:val="24"/>
+          <w:lang w:val="es-ES"/>
+        </w:rPr>
+        <w:t>:</w:t>
+      </w:r>
+      <w:r>
+        <w:rPr>
+          <w:sz w:val="24"/>
+          <w:lang w:val="es-ES"/>
+        </w:rPr>
+        <w:t xml:space="preserve"> </w:t>
+      </w:r>
+      <w:r>
+        <w:rPr>
+          <w:sz w:val="24"/>
+          <w:lang w:val="es-ES"/>
+        </w:rPr>
+        <w:t xml:space="preserve">(extraPlan_0 y </w:t>
+      </w:r>
+      <w:proofErr w:type="gramStart"/>
+      <w:r>
+        <w:rPr>
+          <w:sz w:val="24"/>
+          <w:lang w:val="es-ES"/>
+        </w:rPr>
+        <w:t>Realizada )</w:t>
+      </w:r>
+      <w:proofErr w:type="gramEnd"/>
+      <w:r>
+        <w:rPr>
+          <w:sz w:val="24"/>
+          <w:lang w:val="es-ES"/>
+        </w:rPr>
+        <w:t xml:space="preserve"> y (</w:t>
+      </w:r>
+      <w:proofErr w:type="spellStart"/>
+      <w:r>
+        <w:rPr>
+          <w:sz w:val="24"/>
+          <w:lang w:val="es-ES"/>
+        </w:rPr>
+        <w:t>ítem.talentos</w:t>
+      </w:r>
+      <w:proofErr w:type="spellEnd"/>
+      <w:r>
+        <w:rPr>
+          <w:sz w:val="24"/>
+          <w:lang w:val="es-ES"/>
+        </w:rPr>
+        <w:t xml:space="preserve"> ) {</w:t>
+      </w:r>
+      <w:proofErr w:type="spellStart"/>
+      <w:r>
+        <w:rPr>
+          <w:sz w:val="24"/>
+          <w:lang w:val="es-ES"/>
+        </w:rPr>
+        <w:t>manifestaciones_artisticas</w:t>
+      </w:r>
+      <w:proofErr w:type="spellEnd"/>
+      <w:r>
+        <w:rPr>
+          <w:sz w:val="24"/>
+          <w:lang w:val="es-ES"/>
+        </w:rPr>
+        <w:t xml:space="preserve"> y</w:t>
+      </w:r>
     </w:p>
     <w:sectPr>
       <w:type w:val="continuous"/>
@@ -10826,6 +14095,95 @@
     </w:lvl>
   </w:abstractNum>
   <w:abstractNum w:abstractNumId="1">
+    <w:nsid w:val="16476105"/>
+    <w:multiLevelType w:val="hybridMultilevel"/>
+    <w:tmpl w:val="52F285C2"/>
+    <w:lvl w:ilvl="0" w:tplc="78D4D134">
+      <w:start w:val="1"/>
+      <w:numFmt w:val="lowerLetter"/>
+      <w:lvlText w:val="%1-"/>
+      <w:lvlJc w:val="left"/>
+      <w:pPr>
+        <w:ind w:left="720" w:hanging="360"/>
+      </w:pPr>
+      <w:rPr>
+        <w:rFonts w:hint="default"/>
+      </w:rPr>
+    </w:lvl>
+    <w:lvl w:ilvl="1" w:tplc="04090019" w:tentative="1">
+      <w:start w:val="1"/>
+      <w:numFmt w:val="lowerLetter"/>
+      <w:lvlText w:val="%2."/>
+      <w:lvlJc w:val="left"/>
+      <w:pPr>
+        <w:ind w:left="1440" w:hanging="360"/>
+      </w:pPr>
+    </w:lvl>
+    <w:lvl w:ilvl="2" w:tplc="0409001B" w:tentative="1">
+      <w:start w:val="1"/>
+      <w:numFmt w:val="lowerRoman"/>
+      <w:lvlText w:val="%3."/>
+      <w:lvlJc w:val="right"/>
+      <w:pPr>
+        <w:ind w:left="2160" w:hanging="180"/>
+      </w:pPr>
+    </w:lvl>
+    <w:lvl w:ilvl="3" w:tplc="0409000F" w:tentative="1">
+      <w:start w:val="1"/>
+      <w:numFmt w:val="decimal"/>
+      <w:lvlText w:val="%4."/>
+      <w:lvlJc w:val="left"/>
+      <w:pPr>
+        <w:ind w:left="2880" w:hanging="360"/>
+      </w:pPr>
+    </w:lvl>
+    <w:lvl w:ilvl="4" w:tplc="04090019" w:tentative="1">
+      <w:start w:val="1"/>
+      <w:numFmt w:val="lowerLetter"/>
+      <w:lvlText w:val="%5."/>
+      <w:lvlJc w:val="left"/>
+      <w:pPr>
+        <w:ind w:left="3600" w:hanging="360"/>
+      </w:pPr>
+    </w:lvl>
+    <w:lvl w:ilvl="5" w:tplc="0409001B" w:tentative="1">
+      <w:start w:val="1"/>
+      <w:numFmt w:val="lowerRoman"/>
+      <w:lvlText w:val="%6."/>
+      <w:lvlJc w:val="right"/>
+      <w:pPr>
+        <w:ind w:left="4320" w:hanging="180"/>
+      </w:pPr>
+    </w:lvl>
+    <w:lvl w:ilvl="6" w:tplc="0409000F" w:tentative="1">
+      <w:start w:val="1"/>
+      <w:numFmt w:val="decimal"/>
+      <w:lvlText w:val="%7."/>
+      <w:lvlJc w:val="left"/>
+      <w:pPr>
+        <w:ind w:left="5040" w:hanging="360"/>
+      </w:pPr>
+    </w:lvl>
+    <w:lvl w:ilvl="7" w:tplc="04090019" w:tentative="1">
+      <w:start w:val="1"/>
+      <w:numFmt w:val="lowerLetter"/>
+      <w:lvlText w:val="%8."/>
+      <w:lvlJc w:val="left"/>
+      <w:pPr>
+        <w:ind w:left="5760" w:hanging="360"/>
+      </w:pPr>
+    </w:lvl>
+    <w:lvl w:ilvl="8" w:tplc="0409001B" w:tentative="1">
+      <w:start w:val="1"/>
+      <w:numFmt w:val="lowerRoman"/>
+      <w:lvlText w:val="%9."/>
+      <w:lvlJc w:val="right"/>
+      <w:pPr>
+        <w:ind w:left="6480" w:hanging="180"/>
+      </w:pPr>
+    </w:lvl>
+  </w:abstractNum>
+  <w:abstractNum w:abstractNumId="2">
     <w:nsid w:val="1A196E48"/>
     <w:multiLevelType w:val="multilevel"/>
     <w:tmpl w:val="1736BE86"/>
@@ -10956,7 +14314,7 @@
       </w:rPr>
     </w:lvl>
   </w:abstractNum>
-  <w:abstractNum w:abstractNumId="2">
+  <w:abstractNum w:abstractNumId="3">
     <w:nsid w:val="551C61EC"/>
     <w:multiLevelType w:val="multilevel"/>
     <w:tmpl w:val="EF50942C"/>
@@ -11078,14 +14436,109 @@
       </w:pPr>
     </w:lvl>
   </w:abstractNum>
+  <w:abstractNum w:abstractNumId="4">
+    <w:nsid w:val="55FB544F"/>
+    <w:multiLevelType w:val="hybridMultilevel"/>
+    <w:tmpl w:val="52F285C2"/>
+    <w:lvl w:ilvl="0" w:tplc="78D4D134">
+      <w:start w:val="1"/>
+      <w:numFmt w:val="lowerLetter"/>
+      <w:lvlText w:val="%1-"/>
+      <w:lvlJc w:val="left"/>
+      <w:pPr>
+        <w:ind w:left="720" w:hanging="360"/>
+      </w:pPr>
+      <w:rPr>
+        <w:rFonts w:hint="default"/>
+      </w:rPr>
+    </w:lvl>
+    <w:lvl w:ilvl="1" w:tplc="04090019" w:tentative="1">
+      <w:start w:val="1"/>
+      <w:numFmt w:val="lowerLetter"/>
+      <w:lvlText w:val="%2."/>
+      <w:lvlJc w:val="left"/>
+      <w:pPr>
+        <w:ind w:left="1440" w:hanging="360"/>
+      </w:pPr>
+    </w:lvl>
+    <w:lvl w:ilvl="2" w:tplc="0409001B" w:tentative="1">
+      <w:start w:val="1"/>
+      <w:numFmt w:val="lowerRoman"/>
+      <w:lvlText w:val="%3."/>
+      <w:lvlJc w:val="right"/>
+      <w:pPr>
+        <w:ind w:left="2160" w:hanging="180"/>
+      </w:pPr>
+    </w:lvl>
+    <w:lvl w:ilvl="3" w:tplc="0409000F" w:tentative="1">
+      <w:start w:val="1"/>
+      <w:numFmt w:val="decimal"/>
+      <w:lvlText w:val="%4."/>
+      <w:lvlJc w:val="left"/>
+      <w:pPr>
+        <w:ind w:left="2880" w:hanging="360"/>
+      </w:pPr>
+    </w:lvl>
+    <w:lvl w:ilvl="4" w:tplc="04090019" w:tentative="1">
+      <w:start w:val="1"/>
+      <w:numFmt w:val="lowerLetter"/>
+      <w:lvlText w:val="%5."/>
+      <w:lvlJc w:val="left"/>
+      <w:pPr>
+        <w:ind w:left="3600" w:hanging="360"/>
+      </w:pPr>
+    </w:lvl>
+    <w:lvl w:ilvl="5" w:tplc="0409001B" w:tentative="1">
+      <w:start w:val="1"/>
+      <w:numFmt w:val="lowerRoman"/>
+      <w:lvlText w:val="%6."/>
+      <w:lvlJc w:val="right"/>
+      <w:pPr>
+        <w:ind w:left="4320" w:hanging="180"/>
+      </w:pPr>
+    </w:lvl>
+    <w:lvl w:ilvl="6" w:tplc="0409000F" w:tentative="1">
+      <w:start w:val="1"/>
+      <w:numFmt w:val="decimal"/>
+      <w:lvlText w:val="%7."/>
+      <w:lvlJc w:val="left"/>
+      <w:pPr>
+        <w:ind w:left="5040" w:hanging="360"/>
+      </w:pPr>
+    </w:lvl>
+    <w:lvl w:ilvl="7" w:tplc="04090019" w:tentative="1">
+      <w:start w:val="1"/>
+      <w:numFmt w:val="lowerLetter"/>
+      <w:lvlText w:val="%8."/>
+      <w:lvlJc w:val="left"/>
+      <w:pPr>
+        <w:ind w:left="5760" w:hanging="360"/>
+      </w:pPr>
+    </w:lvl>
+    <w:lvl w:ilvl="8" w:tplc="0409001B" w:tentative="1">
+      <w:start w:val="1"/>
+      <w:numFmt w:val="lowerRoman"/>
+      <w:lvlText w:val="%9."/>
+      <w:lvlJc w:val="right"/>
+      <w:pPr>
+        <w:ind w:left="6480" w:hanging="180"/>
+      </w:pPr>
+    </w:lvl>
+  </w:abstractNum>
   <w:num w:numId="1">
     <w:abstractNumId w:val="0"/>
   </w:num>
   <w:num w:numId="2">
+    <w:abstractNumId w:val="2"/>
+  </w:num>
+  <w:num w:numId="3">
+    <w:abstractNumId w:val="3"/>
+  </w:num>
+  <w:num w:numId="4">
     <w:abstractNumId w:val="1"/>
   </w:num>
-  <w:num w:numId="3">
-    <w:abstractNumId w:val="2"/>
+  <w:num w:numId="5">
+    <w:abstractNumId w:val="4"/>
   </w:num>
 </w:numbering>
 </file>

</xml_diff>

<commit_message>
cambios en : cargo categorias dc Servilo_API
</commit_message>
<xml_diff>
--- a/docs/Servilo_Kerno Cult API Justificacion .docx
+++ b/docs/Servilo_Kerno Cult API Justificacion .docx
@@ -12,7 +12,7 @@
           <w:numId w:val="0"/>
         </w:numPr>
         <w:spacing w:before="240" w:after="0"/>
-        <w:ind w:left="720"/>
+        <w:ind w:hanging="0" w:left="720"/>
         <w:rPr/>
       </w:pPr>
       <w:r>
@@ -23,6 +23,7 @@
     <w:p>
       <w:pPr>
         <w:pStyle w:val="Heading2"/>
+        <w:ind w:hanging="0" w:left="720"/>
         <w:rPr/>
       </w:pPr>
       <w:r>
@@ -35,7 +36,7 @@
         <w:pStyle w:val="Prrafodelista1"/>
         <w:numPr>
           <w:ilvl w:val="0"/>
-          <w:numId w:val="3"/>
+          <w:numId w:val="2"/>
         </w:numPr>
         <w:rPr>
           <w:lang w:val="es-ES"/>
@@ -67,7 +68,7 @@
         <w:gridCol w:w="1559"/>
         <w:gridCol w:w="1559"/>
         <w:gridCol w:w="1701"/>
-        <w:gridCol w:w="1814"/>
+        <w:gridCol w:w="1813"/>
       </w:tblGrid>
       <w:tr>
         <w:trPr>
@@ -261,7 +262,7 @@
         </w:tc>
         <w:tc>
           <w:tcPr>
-            <w:tcW w:w="1814" w:type="dxa"/>
+            <w:tcW w:w="1813" w:type="dxa"/>
             <w:tcBorders>
               <w:top w:val="single" w:sz="4" w:space="0" w:color="000000"/>
               <w:left w:val="single" w:sz="4" w:space="0" w:color="000000"/>
@@ -302,7 +303,7 @@
         <w:pStyle w:val="ListParagraph"/>
         <w:numPr>
           <w:ilvl w:val="0"/>
-          <w:numId w:val="2"/>
+          <w:numId w:val="1"/>
         </w:numPr>
         <w:rPr>
           <w:lang w:val="es-ES"/>
@@ -320,7 +321,7 @@
         <w:pStyle w:val="ListParagraph"/>
         <w:numPr>
           <w:ilvl w:val="0"/>
-          <w:numId w:val="2"/>
+          <w:numId w:val="1"/>
         </w:numPr>
         <w:rPr>
           <w:lang w:val="es-ES"/>
@@ -338,7 +339,7 @@
         <w:pStyle w:val="ListParagraph"/>
         <w:numPr>
           <w:ilvl w:val="0"/>
-          <w:numId w:val="2"/>
+          <w:numId w:val="1"/>
         </w:numPr>
         <w:rPr>
           <w:lang w:val="es-ES"/>
@@ -354,6 +355,7 @@
     <w:p>
       <w:pPr>
         <w:pStyle w:val="Heading2"/>
+        <w:ind w:hanging="0" w:left="720"/>
         <w:rPr/>
       </w:pPr>
       <w:r>
@@ -376,7 +378,7 @@
       </w:tblPr>
       <w:tblGrid>
         <w:gridCol w:w="1620"/>
-        <w:gridCol w:w="7725"/>
+        <w:gridCol w:w="7724"/>
       </w:tblGrid>
       <w:tr>
         <w:trPr/>
@@ -404,7 +406,7 @@
         </w:tc>
         <w:tc>
           <w:tcPr>
-            <w:tcW w:w="7725" w:type="dxa"/>
+            <w:tcW w:w="7724" w:type="dxa"/>
             <w:tcBorders>
               <w:top w:val="single" w:sz="4" w:space="0" w:color="000000"/>
               <w:left w:val="single" w:sz="4" w:space="0" w:color="000000"/>
@@ -470,7 +472,7 @@
         </w:tc>
         <w:tc>
           <w:tcPr>
-            <w:tcW w:w="7725" w:type="dxa"/>
+            <w:tcW w:w="7724" w:type="dxa"/>
             <w:tcBorders>
               <w:top w:val="single" w:sz="4" w:space="0" w:color="000000"/>
               <w:left w:val="single" w:sz="4" w:space="0" w:color="000000"/>
@@ -615,7 +617,7 @@
         </w:tc>
         <w:tc>
           <w:tcPr>
-            <w:tcW w:w="7725" w:type="dxa"/>
+            <w:tcW w:w="7724" w:type="dxa"/>
             <w:tcBorders>
               <w:top w:val="single" w:sz="4" w:space="0" w:color="000000"/>
               <w:left w:val="single" w:sz="4" w:space="0" w:color="000000"/>
@@ -657,6 +659,7 @@
     <w:p>
       <w:pPr>
         <w:pStyle w:val="Heading2"/>
+        <w:ind w:hanging="0" w:left="720"/>
         <w:rPr/>
       </w:pPr>
       <w:r>
@@ -679,7 +682,7 @@
       </w:tblPr>
       <w:tblGrid>
         <w:gridCol w:w="1620"/>
-        <w:gridCol w:w="7725"/>
+        <w:gridCol w:w="7724"/>
       </w:tblGrid>
       <w:tr>
         <w:trPr/>
@@ -707,7 +710,7 @@
         </w:tc>
         <w:tc>
           <w:tcPr>
-            <w:tcW w:w="7725" w:type="dxa"/>
+            <w:tcW w:w="7724" w:type="dxa"/>
             <w:tcBorders>
               <w:top w:val="single" w:sz="4" w:space="0" w:color="000000"/>
               <w:left w:val="single" w:sz="4" w:space="0" w:color="000000"/>
@@ -788,7 +791,7 @@
         </w:tc>
         <w:tc>
           <w:tcPr>
-            <w:tcW w:w="7725" w:type="dxa"/>
+            <w:tcW w:w="7724" w:type="dxa"/>
             <w:tcBorders>
               <w:top w:val="single" w:sz="4" w:space="0" w:color="000000"/>
               <w:left w:val="single" w:sz="4" w:space="0" w:color="000000"/>
@@ -933,7 +936,7 @@
         </w:tc>
         <w:tc>
           <w:tcPr>
-            <w:tcW w:w="7725" w:type="dxa"/>
+            <w:tcW w:w="7724" w:type="dxa"/>
             <w:tcBorders>
               <w:top w:val="single" w:sz="4" w:space="0" w:color="000000"/>
               <w:left w:val="single" w:sz="4" w:space="0" w:color="000000"/>
@@ -1004,6 +1007,7 @@
     <w:p>
       <w:pPr>
         <w:pStyle w:val="Heading2"/>
+        <w:ind w:hanging="0" w:left="720"/>
         <w:rPr/>
       </w:pPr>
       <w:r>
@@ -1026,7 +1030,7 @@
       </w:tblPr>
       <w:tblGrid>
         <w:gridCol w:w="1800"/>
-        <w:gridCol w:w="8010"/>
+        <w:gridCol w:w="8009"/>
       </w:tblGrid>
       <w:tr>
         <w:trPr/>
@@ -1054,7 +1058,7 @@
         </w:tc>
         <w:tc>
           <w:tcPr>
-            <w:tcW w:w="8010" w:type="dxa"/>
+            <w:tcW w:w="8009" w:type="dxa"/>
             <w:tcBorders>
               <w:top w:val="single" w:sz="4" w:space="0" w:color="000000"/>
               <w:left w:val="single" w:sz="4" w:space="0" w:color="000000"/>
@@ -1135,7 +1139,7 @@
         </w:tc>
         <w:tc>
           <w:tcPr>
-            <w:tcW w:w="8010" w:type="dxa"/>
+            <w:tcW w:w="8009" w:type="dxa"/>
             <w:tcBorders>
               <w:top w:val="single" w:sz="4" w:space="0" w:color="000000"/>
               <w:left w:val="single" w:sz="4" w:space="0" w:color="000000"/>
@@ -1280,7 +1284,7 @@
         </w:tc>
         <w:tc>
           <w:tcPr>
-            <w:tcW w:w="8010" w:type="dxa"/>
+            <w:tcW w:w="8009" w:type="dxa"/>
             <w:tcBorders>
               <w:top w:val="single" w:sz="4" w:space="0" w:color="000000"/>
               <w:left w:val="single" w:sz="4" w:space="0" w:color="000000"/>
@@ -1318,6 +1322,7 @@
     <w:p>
       <w:pPr>
         <w:pStyle w:val="Heading2"/>
+        <w:ind w:hanging="0" w:left="720"/>
         <w:rPr/>
       </w:pPr>
       <w:r>
@@ -1340,7 +1345,7 @@
       </w:tblPr>
       <w:tblGrid>
         <w:gridCol w:w="1800"/>
-        <w:gridCol w:w="8010"/>
+        <w:gridCol w:w="8009"/>
       </w:tblGrid>
       <w:tr>
         <w:trPr/>
@@ -1368,7 +1373,7 @@
         </w:tc>
         <w:tc>
           <w:tcPr>
-            <w:tcW w:w="8010" w:type="dxa"/>
+            <w:tcW w:w="8009" w:type="dxa"/>
             <w:tcBorders>
               <w:top w:val="single" w:sz="4" w:space="0" w:color="000000"/>
               <w:left w:val="single" w:sz="4" w:space="0" w:color="000000"/>
@@ -1726,7 +1731,7 @@
         </w:tc>
         <w:tc>
           <w:tcPr>
-            <w:tcW w:w="8010" w:type="dxa"/>
+            <w:tcW w:w="8009" w:type="dxa"/>
             <w:tcBorders>
               <w:top w:val="single" w:sz="4" w:space="0" w:color="000000"/>
               <w:left w:val="single" w:sz="4" w:space="0" w:color="000000"/>
@@ -1871,7 +1876,7 @@
         </w:tc>
         <w:tc>
           <w:tcPr>
-            <w:tcW w:w="8010" w:type="dxa"/>
+            <w:tcW w:w="8009" w:type="dxa"/>
             <w:tcBorders>
               <w:top w:val="single" w:sz="4" w:space="0" w:color="000000"/>
               <w:left w:val="single" w:sz="4" w:space="0" w:color="000000"/>
@@ -1937,6 +1942,7 @@
     <w:p>
       <w:pPr>
         <w:pStyle w:val="Heading2"/>
+        <w:ind w:hanging="0" w:left="720"/>
         <w:rPr/>
       </w:pPr>
       <w:r>
@@ -1959,7 +1965,7 @@
       </w:tblPr>
       <w:tblGrid>
         <w:gridCol w:w="1800"/>
-        <w:gridCol w:w="8010"/>
+        <w:gridCol w:w="8009"/>
       </w:tblGrid>
       <w:tr>
         <w:trPr/>
@@ -1987,7 +1993,7 @@
         </w:tc>
         <w:tc>
           <w:tcPr>
-            <w:tcW w:w="8010" w:type="dxa"/>
+            <w:tcW w:w="8009" w:type="dxa"/>
             <w:tcBorders>
               <w:top w:val="single" w:sz="4" w:space="0" w:color="000000"/>
               <w:left w:val="single" w:sz="4" w:space="0" w:color="000000"/>
@@ -2134,7 +2140,7 @@
         </w:tc>
         <w:tc>
           <w:tcPr>
-            <w:tcW w:w="8010" w:type="dxa"/>
+            <w:tcW w:w="8009" w:type="dxa"/>
             <w:tcBorders>
               <w:top w:val="single" w:sz="4" w:space="0" w:color="000000"/>
               <w:left w:val="single" w:sz="4" w:space="0" w:color="000000"/>
@@ -2167,6 +2173,19 @@
             </w:pPr>
             <w:r>
               <w:rPr>
+                <w:shd w:fill="81D41A" w:val="clear"/>
+                <w:lang w:val="es-ES"/>
+              </w:rPr>
+              <w:t>POST</w:t>
+            </w:r>
+            <w:r>
+              <w:rPr>
+                <w:lang w:val="es-ES"/>
+              </w:rPr>
+              <w:t xml:space="preserve"> </w:t>
+            </w:r>
+            <w:r>
+              <w:rPr>
                 <w:lang w:val="es-ES"/>
               </w:rPr>
               <w:t>create(name,hierarchy)[Trz]:mínimo 3 letras, único y el id entidad</w:t>
@@ -2182,21 +2201,99 @@
             </w:pPr>
             <w:r>
               <w:rPr>
-                <w:lang w:val="es-ES"/>
-              </w:rPr>
-              <w:t>findAll(paginaActual,cantidaXPagina):se devuelven todos los elementos en paginación</w:t>
-            </w:r>
-          </w:p>
-          <w:p>
-            <w:pPr>
-              <w:pStyle w:val="Normal"/>
-              <w:spacing w:before="0" w:after="0"/>
-              <w:rPr>
-                <w:lang w:val="es-ES"/>
-              </w:rPr>
-            </w:pPr>
-            <w:r>
-              <w:rPr>
+                <w:shd w:fill="FFBF00" w:val="clear"/>
+                <w:lang w:val="es-ES"/>
+              </w:rPr>
+              <w:t>PUT</w:t>
+            </w:r>
+            <w:r>
+              <w:rPr>
+                <w:lang w:val="es-ES"/>
+              </w:rPr>
+              <w:t xml:space="preserve"> </w:t>
+            </w:r>
+            <w:r>
+              <w:rPr>
+                <w:lang w:val="es-ES"/>
+              </w:rPr>
+              <w:t>findAll(</w:t>
+            </w:r>
+            <w:r>
+              <w:rPr>
+                <w:lang w:val="es-ES"/>
+              </w:rPr>
+              <w:t>ID,</w:t>
+            </w:r>
+            <w:r>
+              <w:rPr>
+                <w:lang w:val="es-ES"/>
+              </w:rPr>
+              <w:t>paginaActual,cantidaXPagina):</w:t>
+            </w:r>
+          </w:p>
+          <w:p>
+            <w:pPr>
+              <w:pStyle w:val="Normal"/>
+              <w:numPr>
+                <w:ilvl w:val="0"/>
+                <w:numId w:val="5"/>
+              </w:numPr>
+              <w:spacing w:before="0" w:after="0"/>
+              <w:rPr>
+                <w:lang w:val="es-ES"/>
+              </w:rPr>
+            </w:pPr>
+            <w:r>
+              <w:rPr>
+                <w:lang w:val="es-ES"/>
+              </w:rPr>
+              <w:t>los elementos de pagina son opcionales para la devolucion de todos.</w:t>
+            </w:r>
+            <w:r>
+              <w:rPr>
+                <w:lang w:val="es-ES"/>
+              </w:rPr>
+              <w:t>se devuelven todos los elementos en paginación</w:t>
+            </w:r>
+          </w:p>
+          <w:p>
+            <w:pPr>
+              <w:pStyle w:val="Normal"/>
+              <w:numPr>
+                <w:ilvl w:val="0"/>
+                <w:numId w:val="5"/>
+              </w:numPr>
+              <w:spacing w:before="0" w:after="0"/>
+              <w:rPr>
+                <w:lang w:val="es-ES"/>
+              </w:rPr>
+            </w:pPr>
+            <w:r>
+              <w:rPr>
+                <w:lang w:val="es-ES"/>
+              </w:rPr>
+              <w:t xml:space="preserve">si se pone SOLO  el ID, funciona como un </w:t>
+            </w:r>
+            <w:r>
+              <w:rPr>
+                <w:b/>
+                <w:bCs/>
+                <w:lang w:val="es-ES"/>
+              </w:rPr>
+              <w:t>buscarId</w:t>
+            </w:r>
+          </w:p>
+          <w:p>
+            <w:pPr>
+              <w:pStyle w:val="Normal"/>
+              <w:spacing w:before="0" w:after="0"/>
+              <w:rPr>
+                <w:strike/>
+              </w:rPr>
+            </w:pPr>
+            <w:r>
+              <w:rPr>
+                <w:strike/>
                 <w:lang w:val="es-ES"/>
               </w:rPr>
               <w:t>findOne(id):devuelve los atributos de ese documento en especifico</w:t>
@@ -2212,19 +2309,45 @@
             </w:pPr>
             <w:r>
               <w:rPr>
-                <w:lang w:val="es-ES"/>
-              </w:rPr>
-              <w:t>update(id,datos)[Trz]:se actualizan los datos de ese elemento en específico.</w:t>
-            </w:r>
-          </w:p>
-          <w:p>
-            <w:pPr>
-              <w:pStyle w:val="Normal"/>
-              <w:spacing w:before="0" w:after="0"/>
-              <w:rPr>
-                <w:lang w:val="es-ES"/>
-              </w:rPr>
-            </w:pPr>
+                <w:shd w:fill="D4EA6B" w:val="clear"/>
+                <w:lang w:val="es-ES"/>
+              </w:rPr>
+              <w:t>PATCH</w:t>
+            </w:r>
+            <w:r>
+              <w:rPr>
+                <w:lang w:val="es-ES"/>
+              </w:rPr>
+              <w:t xml:space="preserve"> </w:t>
+            </w:r>
+            <w:r>
+              <w:rPr>
+                <w:lang w:val="es-ES"/>
+              </w:rPr>
+              <w:t>update(datos)[Trz]:se actualizan los datos de ese elemento en específico.</w:t>
+            </w:r>
+          </w:p>
+          <w:p>
+            <w:pPr>
+              <w:pStyle w:val="Normal"/>
+              <w:spacing w:before="0" w:after="0"/>
+              <w:rPr>
+                <w:lang w:val="es-ES"/>
+              </w:rPr>
+            </w:pPr>
+            <w:r>
+              <w:rPr>
+                <w:shd w:fill="F10D0C" w:val="clear"/>
+                <w:lang w:val="es-ES"/>
+              </w:rPr>
+              <w:t>DELETE</w:t>
+            </w:r>
+            <w:r>
+              <w:rPr>
+                <w:lang w:val="es-ES"/>
+              </w:rPr>
+              <w:t xml:space="preserve"> </w:t>
+            </w:r>
             <w:r>
               <w:rPr>
                 <w:lang w:val="es-ES"/>
@@ -2240,6 +2363,43 @@
                 <w:lang w:val="es-ES"/>
               </w:rPr>
             </w:pPr>
+            <w:r>
+              <w:rPr>
+                <w:shd w:fill="81D41A" w:val="clear"/>
+                <w:lang w:val="es-ES"/>
+              </w:rPr>
+              <w:t xml:space="preserve">POST </w:t>
+            </w:r>
+            <w:r>
+              <w:rPr>
+                <w:lang w:val="es-ES"/>
+              </w:rPr>
+              <w:t xml:space="preserve"> </w:t>
+            </w:r>
+            <w:r>
+              <w:rPr>
+                <w:color w:val="50938A"/>
+                <w:shd w:fill="2A6099" w:val="clear"/>
+                <w:lang w:val="es-ES"/>
+              </w:rPr>
+              <w:t>/</w:t>
+            </w:r>
+            <w:r>
+              <w:rPr>
+                <w:color w:val="FFFFFF"/>
+                <w:shd w:fill="2A6099" w:val="clear"/>
+                <w:lang w:val="es-ES"/>
+              </w:rPr>
+              <w:t>srch</w:t>
+            </w:r>
+            <w:r>
+              <w:rPr>
+                <w:color w:val="50938A"/>
+                <w:shd w:fill="2A6099" w:val="clear"/>
+                <w:lang w:val="es-ES"/>
+              </w:rPr>
+              <w:t xml:space="preserve"> </w:t>
+            </w:r>
             <w:r>
               <w:rPr>
                 <w:lang w:val="es-ES"/>
@@ -2279,7 +2439,7 @@
         </w:tc>
         <w:tc>
           <w:tcPr>
-            <w:tcW w:w="8010" w:type="dxa"/>
+            <w:tcW w:w="8009" w:type="dxa"/>
             <w:tcBorders>
               <w:top w:val="single" w:sz="4" w:space="0" w:color="000000"/>
               <w:left w:val="single" w:sz="4" w:space="0" w:color="000000"/>
@@ -2351,6 +2511,7 @@
     <w:p>
       <w:pPr>
         <w:pStyle w:val="Heading2"/>
+        <w:ind w:hanging="0" w:left="720"/>
         <w:rPr/>
       </w:pPr>
       <w:r>
@@ -2373,7 +2534,7 @@
       </w:tblPr>
       <w:tblGrid>
         <w:gridCol w:w="1800"/>
-        <w:gridCol w:w="8010"/>
+        <w:gridCol w:w="8009"/>
       </w:tblGrid>
       <w:tr>
         <w:trPr/>
@@ -2401,7 +2562,7 @@
         </w:tc>
         <w:tc>
           <w:tcPr>
-            <w:tcW w:w="8010" w:type="dxa"/>
+            <w:tcW w:w="8009" w:type="dxa"/>
             <w:tcBorders>
               <w:top w:val="single" w:sz="4" w:space="0" w:color="000000"/>
               <w:left w:val="single" w:sz="4" w:space="0" w:color="000000"/>
@@ -2512,7 +2673,7 @@
         </w:tc>
         <w:tc>
           <w:tcPr>
-            <w:tcW w:w="8010" w:type="dxa"/>
+            <w:tcW w:w="8009" w:type="dxa"/>
             <w:tcBorders>
               <w:top w:val="single" w:sz="4" w:space="0" w:color="000000"/>
               <w:left w:val="single" w:sz="4" w:space="0" w:color="000000"/>
@@ -2545,36 +2706,127 @@
             </w:pPr>
             <w:r>
               <w:rPr>
-                <w:lang w:val="es-ES"/>
-              </w:rPr>
-              <w:t>create(name,hierarchy)[Trz]:mínimo 3 letras</w:t>
-            </w:r>
-          </w:p>
-          <w:p>
-            <w:pPr>
-              <w:pStyle w:val="Normal"/>
-              <w:spacing w:before="0" w:after="0"/>
-              <w:rPr>
-                <w:lang w:val="es-ES"/>
-              </w:rPr>
-            </w:pPr>
-            <w:r>
-              <w:rPr>
-                <w:lang w:val="es-ES"/>
-              </w:rPr>
-              <w:t>findAll(paginaActual,cantidaXPagina):se devuelven todos los elementos en paginación</w:t>
-            </w:r>
-          </w:p>
-          <w:p>
-            <w:pPr>
-              <w:pStyle w:val="Normal"/>
-              <w:spacing w:before="0" w:after="0"/>
-              <w:rPr>
-                <w:lang w:val="es-ES"/>
-              </w:rPr>
-            </w:pPr>
-            <w:r>
-              <w:rPr>
+                <w:shd w:fill="81D41A" w:val="clear"/>
+                <w:lang w:val="es-ES"/>
+              </w:rPr>
+              <w:t>POST</w:t>
+            </w:r>
+            <w:r>
+              <w:rPr>
+                <w:lang w:val="es-ES"/>
+              </w:rPr>
+              <w:t xml:space="preserve"> </w:t>
+            </w:r>
+            <w:r>
+              <w:rPr>
+                <w:lang w:val="es-ES"/>
+              </w:rPr>
+              <w:t>create(name,hierarchy)[Trz]:mínimo 3 letras, único y el id entidad</w:t>
+            </w:r>
+          </w:p>
+          <w:p>
+            <w:pPr>
+              <w:pStyle w:val="Normal"/>
+              <w:spacing w:before="0" w:after="0"/>
+              <w:rPr>
+                <w:lang w:val="es-ES"/>
+              </w:rPr>
+            </w:pPr>
+            <w:r>
+              <w:rPr>
+                <w:shd w:fill="FFBF00" w:val="clear"/>
+                <w:lang w:val="es-ES"/>
+              </w:rPr>
+              <w:t>PUT</w:t>
+            </w:r>
+            <w:r>
+              <w:rPr>
+                <w:lang w:val="es-ES"/>
+              </w:rPr>
+              <w:t xml:space="preserve"> </w:t>
+            </w:r>
+            <w:r>
+              <w:rPr>
+                <w:lang w:val="es-ES"/>
+              </w:rPr>
+              <w:t>findAll(</w:t>
+            </w:r>
+            <w:r>
+              <w:rPr>
+                <w:lang w:val="es-ES"/>
+              </w:rPr>
+              <w:t>ID,</w:t>
+            </w:r>
+            <w:r>
+              <w:rPr>
+                <w:lang w:val="es-ES"/>
+              </w:rPr>
+              <w:t>paginaActual,cantidaXPagina):</w:t>
+            </w:r>
+          </w:p>
+          <w:p>
+            <w:pPr>
+              <w:pStyle w:val="Normal"/>
+              <w:numPr>
+                <w:ilvl w:val="0"/>
+                <w:numId w:val="5"/>
+              </w:numPr>
+              <w:spacing w:before="0" w:after="0"/>
+              <w:rPr>
+                <w:lang w:val="es-ES"/>
+              </w:rPr>
+            </w:pPr>
+            <w:r>
+              <w:rPr>
+                <w:lang w:val="es-ES"/>
+              </w:rPr>
+              <w:t>los elementos de pagina son opcionales para la devolucion de todos.</w:t>
+            </w:r>
+            <w:r>
+              <w:rPr>
+                <w:lang w:val="es-ES"/>
+              </w:rPr>
+              <w:t>se devuelven todos los elementos en paginación</w:t>
+            </w:r>
+          </w:p>
+          <w:p>
+            <w:pPr>
+              <w:pStyle w:val="Normal"/>
+              <w:numPr>
+                <w:ilvl w:val="0"/>
+                <w:numId w:val="5"/>
+              </w:numPr>
+              <w:spacing w:before="0" w:after="0"/>
+              <w:rPr>
+                <w:lang w:val="es-ES"/>
+              </w:rPr>
+            </w:pPr>
+            <w:r>
+              <w:rPr>
+                <w:lang w:val="es-ES"/>
+              </w:rPr>
+              <w:t xml:space="preserve">si se pone SOLO  el ID, funciona como un </w:t>
+            </w:r>
+            <w:r>
+              <w:rPr>
+                <w:b/>
+                <w:bCs/>
+                <w:lang w:val="es-ES"/>
+              </w:rPr>
+              <w:t>buscarId</w:t>
+            </w:r>
+          </w:p>
+          <w:p>
+            <w:pPr>
+              <w:pStyle w:val="Normal"/>
+              <w:spacing w:before="0" w:after="0"/>
+              <w:rPr>
+                <w:strike/>
+              </w:rPr>
+            </w:pPr>
+            <w:r>
+              <w:rPr>
+                <w:strike/>
                 <w:lang w:val="es-ES"/>
               </w:rPr>
               <w:t>findOne(id):devuelve los atributos de ese documento en especifico</w:t>
@@ -2590,19 +2842,45 @@
             </w:pPr>
             <w:r>
               <w:rPr>
-                <w:lang w:val="es-ES"/>
-              </w:rPr>
-              <w:t>update(id,datos)[Trz]:se actualizan los datos de ese elemento en específico.</w:t>
-            </w:r>
-          </w:p>
-          <w:p>
-            <w:pPr>
-              <w:pStyle w:val="Normal"/>
-              <w:spacing w:before="0" w:after="0"/>
-              <w:rPr>
-                <w:lang w:val="es-ES"/>
-              </w:rPr>
-            </w:pPr>
+                <w:shd w:fill="D4EA6B" w:val="clear"/>
+                <w:lang w:val="es-ES"/>
+              </w:rPr>
+              <w:t>PATCH</w:t>
+            </w:r>
+            <w:r>
+              <w:rPr>
+                <w:lang w:val="es-ES"/>
+              </w:rPr>
+              <w:t xml:space="preserve"> </w:t>
+            </w:r>
+            <w:r>
+              <w:rPr>
+                <w:lang w:val="es-ES"/>
+              </w:rPr>
+              <w:t>update(datos)[Trz]:se actualizan los datos de ese elemento en específico.</w:t>
+            </w:r>
+          </w:p>
+          <w:p>
+            <w:pPr>
+              <w:pStyle w:val="Normal"/>
+              <w:spacing w:before="0" w:after="0"/>
+              <w:rPr>
+                <w:lang w:val="es-ES"/>
+              </w:rPr>
+            </w:pPr>
+            <w:r>
+              <w:rPr>
+                <w:shd w:fill="F10D0C" w:val="clear"/>
+                <w:lang w:val="es-ES"/>
+              </w:rPr>
+              <w:t>DELETE</w:t>
+            </w:r>
+            <w:r>
+              <w:rPr>
+                <w:lang w:val="es-ES"/>
+              </w:rPr>
+              <w:t xml:space="preserve"> </w:t>
+            </w:r>
             <w:r>
               <w:rPr>
                 <w:lang w:val="es-ES"/>
@@ -2618,6 +2896,43 @@
                 <w:lang w:val="es-ES"/>
               </w:rPr>
             </w:pPr>
+            <w:r>
+              <w:rPr>
+                <w:shd w:fill="81D41A" w:val="clear"/>
+                <w:lang w:val="es-ES"/>
+              </w:rPr>
+              <w:t xml:space="preserve">POST </w:t>
+            </w:r>
+            <w:r>
+              <w:rPr>
+                <w:lang w:val="es-ES"/>
+              </w:rPr>
+              <w:t xml:space="preserve"> </w:t>
+            </w:r>
+            <w:r>
+              <w:rPr>
+                <w:color w:val="50938A"/>
+                <w:shd w:fill="2A6099" w:val="clear"/>
+                <w:lang w:val="es-ES"/>
+              </w:rPr>
+              <w:t>/</w:t>
+            </w:r>
+            <w:r>
+              <w:rPr>
+                <w:color w:val="FFFFFF"/>
+                <w:shd w:fill="2A6099" w:val="clear"/>
+                <w:lang w:val="es-ES"/>
+              </w:rPr>
+              <w:t>srch</w:t>
+            </w:r>
+            <w:r>
+              <w:rPr>
+                <w:color w:val="50938A"/>
+                <w:shd w:fill="2A6099" w:val="clear"/>
+                <w:lang w:val="es-ES"/>
+              </w:rPr>
+              <w:t xml:space="preserve"> </w:t>
+            </w:r>
             <w:r>
               <w:rPr>
                 <w:lang w:val="es-ES"/>
@@ -2657,7 +2972,7 @@
         </w:tc>
         <w:tc>
           <w:tcPr>
-            <w:tcW w:w="8010" w:type="dxa"/>
+            <w:tcW w:w="8009" w:type="dxa"/>
             <w:tcBorders>
               <w:top w:val="single" w:sz="4" w:space="0" w:color="000000"/>
               <w:left w:val="single" w:sz="4" w:space="0" w:color="000000"/>
@@ -2678,6 +2993,12 @@
                 <w:lang w:val="es-ES"/>
               </w:rPr>
               <w:t>-</w:t>
+            </w:r>
+            <w:r>
+              <w:rPr>
+                <w:lang w:val="es-ES"/>
+              </w:rPr>
+              <w:t>API_Struct</w:t>
             </w:r>
           </w:p>
         </w:tc>
@@ -2865,6 +3186,7 @@
                             <w:pPr>
                               <w:pStyle w:val="Heading2"/>
                               <w:spacing w:before="40" w:after="0"/>
+                              <w:ind w:hanging="0" w:left="720"/>
                               <w:rPr/>
                             </w:pPr>
                             <w:r>
@@ -2896,6 +3218,7 @@
                       <w:pPr>
                         <w:pStyle w:val="Heading2"/>
                         <w:spacing w:before="40" w:after="0"/>
+                        <w:ind w:hanging="0" w:left="720"/>
                         <w:rPr/>
                       </w:pPr>
                       <w:r>
@@ -3005,6 +3328,7 @@
     <w:p>
       <w:pPr>
         <w:pStyle w:val="Heading2"/>
+        <w:ind w:hanging="0" w:left="720"/>
         <w:rPr/>
       </w:pPr>
       <w:r>
@@ -3153,6 +3477,7 @@
     <w:p>
       <w:pPr>
         <w:pStyle w:val="Heading2"/>
+        <w:ind w:hanging="0" w:left="720"/>
         <w:rPr/>
       </w:pPr>
       <w:r>
@@ -3300,6 +3625,7 @@
     <w:p>
       <w:pPr>
         <w:pStyle w:val="Heading2"/>
+        <w:ind w:hanging="0" w:left="720"/>
         <w:rPr/>
       </w:pPr>
       <w:r>
@@ -3518,6 +3844,7 @@
     <w:p>
       <w:pPr>
         <w:pStyle w:val="Heading2"/>
+        <w:ind w:hanging="0" w:left="720"/>
         <w:rPr/>
       </w:pPr>
       <w:r>
@@ -3641,6 +3968,7 @@
     <w:p>
       <w:pPr>
         <w:pStyle w:val="Heading2"/>
+        <w:ind w:hanging="0" w:left="720"/>
         <w:rPr/>
       </w:pPr>
       <w:r>
@@ -3739,31 +4067,7 @@
         <w:rPr>
           <w:lang w:val="es-ES"/>
         </w:rPr>
-        <w:t>"</w:t>
-      </w:r>
-      <w:r>
-        <w:rPr>
-          <w:lang w:val="es-ES"/>
-        </w:rPr>
-        <w:t>Inst</w:t>
-      </w:r>
-      <w:r>
-        <w:rPr>
-          <w:lang w:val="es-ES"/>
-        </w:rPr>
-        <w:t xml:space="preserve">" = "Nivel </w:t>
-      </w:r>
-      <w:r>
-        <w:rPr>
-          <w:lang w:val="es-ES"/>
-        </w:rPr>
-        <w:t xml:space="preserve">Institucion </w:t>
-      </w:r>
-      <w:r>
-        <w:rPr>
-          <w:lang w:val="es-ES"/>
-        </w:rPr>
-        <w:t xml:space="preserve">Municipal " , </w:t>
+        <w:t xml:space="preserve">"Inst" = "Nivel Institucion Municipal " , </w:t>
       </w:r>
     </w:p>
     <w:p>
@@ -3835,6 +4139,7 @@
     <w:p>
       <w:pPr>
         <w:pStyle w:val="Heading2"/>
+        <w:ind w:hanging="0" w:left="720"/>
         <w:rPr>
           <w:rFonts w:eastAsia="MS Gothic"/>
         </w:rPr>
@@ -3861,7 +4166,7 @@
       </w:tblPr>
       <w:tblGrid>
         <w:gridCol w:w="1435"/>
-        <w:gridCol w:w="8375"/>
+        <w:gridCol w:w="8374"/>
       </w:tblGrid>
       <w:tr>
         <w:trPr/>
@@ -3889,7 +4194,7 @@
         </w:tc>
         <w:tc>
           <w:tcPr>
-            <w:tcW w:w="8375" w:type="dxa"/>
+            <w:tcW w:w="8374" w:type="dxa"/>
             <w:tcBorders>
               <w:top w:val="single" w:sz="4" w:space="0" w:color="000000"/>
               <w:left w:val="single" w:sz="4" w:space="0" w:color="000000"/>
@@ -3985,7 +4290,7 @@
         </w:tc>
         <w:tc>
           <w:tcPr>
-            <w:tcW w:w="8375" w:type="dxa"/>
+            <w:tcW w:w="8374" w:type="dxa"/>
             <w:tcBorders>
               <w:top w:val="single" w:sz="4" w:space="0" w:color="000000"/>
               <w:left w:val="single" w:sz="4" w:space="0" w:color="000000"/>
@@ -4130,7 +4435,7 @@
         </w:tc>
         <w:tc>
           <w:tcPr>
-            <w:tcW w:w="8375" w:type="dxa"/>
+            <w:tcW w:w="8374" w:type="dxa"/>
             <w:tcBorders>
               <w:top w:val="single" w:sz="4" w:space="0" w:color="000000"/>
               <w:left w:val="single" w:sz="4" w:space="0" w:color="000000"/>
@@ -4172,6 +4477,7 @@
     <w:p>
       <w:pPr>
         <w:pStyle w:val="Heading2"/>
+        <w:ind w:hanging="0" w:left="720"/>
         <w:rPr>
           <w:rFonts w:eastAsia="MS Gothic"/>
         </w:rPr>
@@ -4198,7 +4504,7 @@
       </w:tblPr>
       <w:tblGrid>
         <w:gridCol w:w="1435"/>
-        <w:gridCol w:w="8375"/>
+        <w:gridCol w:w="8374"/>
       </w:tblGrid>
       <w:tr>
         <w:trPr/>
@@ -4226,7 +4532,7 @@
         </w:tc>
         <w:tc>
           <w:tcPr>
-            <w:tcW w:w="8375" w:type="dxa"/>
+            <w:tcW w:w="8374" w:type="dxa"/>
             <w:tcBorders>
               <w:top w:val="single" w:sz="4" w:space="0" w:color="000000"/>
               <w:left w:val="single" w:sz="4" w:space="0" w:color="000000"/>
@@ -4412,7 +4718,7 @@
         </w:tc>
         <w:tc>
           <w:tcPr>
-            <w:tcW w:w="8375" w:type="dxa"/>
+            <w:tcW w:w="8374" w:type="dxa"/>
             <w:tcBorders>
               <w:top w:val="single" w:sz="4" w:space="0" w:color="000000"/>
               <w:left w:val="single" w:sz="4" w:space="0" w:color="000000"/>
@@ -4557,7 +4863,7 @@
         </w:tc>
         <w:tc>
           <w:tcPr>
-            <w:tcW w:w="8375" w:type="dxa"/>
+            <w:tcW w:w="8374" w:type="dxa"/>
             <w:tcBorders>
               <w:top w:val="single" w:sz="4" w:space="0" w:color="000000"/>
               <w:left w:val="single" w:sz="4" w:space="0" w:color="000000"/>
@@ -4675,6 +4981,7 @@
     <w:p>
       <w:pPr>
         <w:pStyle w:val="Heading2"/>
+        <w:ind w:hanging="0" w:left="720"/>
         <w:rPr>
           <w:rFonts w:eastAsia="MS Gothic"/>
         </w:rPr>
@@ -4701,7 +5008,7 @@
       </w:tblPr>
       <w:tblGrid>
         <w:gridCol w:w="1435"/>
-        <w:gridCol w:w="8375"/>
+        <w:gridCol w:w="8374"/>
       </w:tblGrid>
       <w:tr>
         <w:trPr/>
@@ -4729,7 +5036,7 @@
         </w:tc>
         <w:tc>
           <w:tcPr>
-            <w:tcW w:w="8375" w:type="dxa"/>
+            <w:tcW w:w="8374" w:type="dxa"/>
             <w:tcBorders>
               <w:top w:val="single" w:sz="4" w:space="0" w:color="000000"/>
               <w:left w:val="single" w:sz="4" w:space="0" w:color="000000"/>
@@ -4870,7 +5177,7 @@
         </w:tc>
         <w:tc>
           <w:tcPr>
-            <w:tcW w:w="8375" w:type="dxa"/>
+            <w:tcW w:w="8374" w:type="dxa"/>
             <w:tcBorders>
               <w:top w:val="single" w:sz="4" w:space="0" w:color="000000"/>
               <w:left w:val="single" w:sz="4" w:space="0" w:color="000000"/>
@@ -5015,7 +5322,7 @@
         </w:tc>
         <w:tc>
           <w:tcPr>
-            <w:tcW w:w="8375" w:type="dxa"/>
+            <w:tcW w:w="8374" w:type="dxa"/>
             <w:tcBorders>
               <w:top w:val="single" w:sz="4" w:space="0" w:color="000000"/>
               <w:left w:val="single" w:sz="4" w:space="0" w:color="000000"/>
@@ -5082,6 +5389,7 @@
     <w:p>
       <w:pPr>
         <w:pStyle w:val="Heading2"/>
+        <w:ind w:hanging="0" w:left="720"/>
         <w:rPr>
           <w:rFonts w:eastAsia="MS Gothic"/>
         </w:rPr>
@@ -5108,7 +5416,7 @@
       </w:tblPr>
       <w:tblGrid>
         <w:gridCol w:w="1435"/>
-        <w:gridCol w:w="8375"/>
+        <w:gridCol w:w="8374"/>
       </w:tblGrid>
       <w:tr>
         <w:trPr/>
@@ -5136,7 +5444,7 @@
         </w:tc>
         <w:tc>
           <w:tcPr>
-            <w:tcW w:w="8375" w:type="dxa"/>
+            <w:tcW w:w="8374" w:type="dxa"/>
             <w:tcBorders>
               <w:top w:val="single" w:sz="4" w:space="0" w:color="000000"/>
               <w:left w:val="single" w:sz="4" w:space="0" w:color="000000"/>
@@ -5232,7 +5540,7 @@
         </w:tc>
         <w:tc>
           <w:tcPr>
-            <w:tcW w:w="8375" w:type="dxa"/>
+            <w:tcW w:w="8374" w:type="dxa"/>
             <w:tcBorders>
               <w:top w:val="single" w:sz="4" w:space="0" w:color="000000"/>
               <w:left w:val="single" w:sz="4" w:space="0" w:color="000000"/>
@@ -5377,7 +5685,7 @@
         </w:tc>
         <w:tc>
           <w:tcPr>
-            <w:tcW w:w="8375" w:type="dxa"/>
+            <w:tcW w:w="8374" w:type="dxa"/>
             <w:tcBorders>
               <w:top w:val="single" w:sz="4" w:space="0" w:color="000000"/>
               <w:left w:val="single" w:sz="4" w:space="0" w:color="000000"/>
@@ -5427,6 +5735,7 @@
     <w:p>
       <w:pPr>
         <w:pStyle w:val="Heading2"/>
+        <w:ind w:hanging="0" w:left="720"/>
         <w:rPr>
           <w:rFonts w:eastAsia="MS Gothic"/>
         </w:rPr>
@@ -5453,7 +5762,7 @@
       </w:tblPr>
       <w:tblGrid>
         <w:gridCol w:w="1435"/>
-        <w:gridCol w:w="8375"/>
+        <w:gridCol w:w="8374"/>
       </w:tblGrid>
       <w:tr>
         <w:trPr/>
@@ -5481,7 +5790,7 @@
         </w:tc>
         <w:tc>
           <w:tcPr>
-            <w:tcW w:w="8375" w:type="dxa"/>
+            <w:tcW w:w="8374" w:type="dxa"/>
             <w:tcBorders>
               <w:top w:val="single" w:sz="4" w:space="0" w:color="000000"/>
               <w:left w:val="single" w:sz="4" w:space="0" w:color="000000"/>
@@ -5562,7 +5871,7 @@
         </w:tc>
         <w:tc>
           <w:tcPr>
-            <w:tcW w:w="8375" w:type="dxa"/>
+            <w:tcW w:w="8374" w:type="dxa"/>
             <w:tcBorders>
               <w:top w:val="single" w:sz="4" w:space="0" w:color="000000"/>
               <w:left w:val="single" w:sz="4" w:space="0" w:color="000000"/>
@@ -5707,7 +6016,7 @@
         </w:tc>
         <w:tc>
           <w:tcPr>
-            <w:tcW w:w="8375" w:type="dxa"/>
+            <w:tcW w:w="8374" w:type="dxa"/>
             <w:tcBorders>
               <w:top w:val="single" w:sz="4" w:space="0" w:color="000000"/>
               <w:left w:val="single" w:sz="4" w:space="0" w:color="000000"/>
@@ -5768,6 +6077,7 @@
     <w:p>
       <w:pPr>
         <w:pStyle w:val="Heading2"/>
+        <w:ind w:hanging="0" w:left="720"/>
         <w:rPr>
           <w:rFonts w:eastAsia="MS Gothic"/>
         </w:rPr>
@@ -5794,7 +6104,7 @@
       </w:tblPr>
       <w:tblGrid>
         <w:gridCol w:w="1435"/>
-        <w:gridCol w:w="8375"/>
+        <w:gridCol w:w="8374"/>
       </w:tblGrid>
       <w:tr>
         <w:trPr/>
@@ -5822,7 +6132,7 @@
         </w:tc>
         <w:tc>
           <w:tcPr>
-            <w:tcW w:w="8375" w:type="dxa"/>
+            <w:tcW w:w="8374" w:type="dxa"/>
             <w:tcBorders>
               <w:top w:val="single" w:sz="4" w:space="0" w:color="000000"/>
               <w:left w:val="single" w:sz="4" w:space="0" w:color="000000"/>
@@ -5903,7 +6213,7 @@
         </w:tc>
         <w:tc>
           <w:tcPr>
-            <w:tcW w:w="8375" w:type="dxa"/>
+            <w:tcW w:w="8374" w:type="dxa"/>
             <w:tcBorders>
               <w:top w:val="single" w:sz="4" w:space="0" w:color="000000"/>
               <w:left w:val="single" w:sz="4" w:space="0" w:color="000000"/>
@@ -6048,7 +6358,7 @@
         </w:tc>
         <w:tc>
           <w:tcPr>
-            <w:tcW w:w="8375" w:type="dxa"/>
+            <w:tcW w:w="8374" w:type="dxa"/>
             <w:tcBorders>
               <w:top w:val="single" w:sz="4" w:space="0" w:color="000000"/>
               <w:left w:val="single" w:sz="4" w:space="0" w:color="000000"/>
@@ -6090,6 +6400,7 @@
     <w:p>
       <w:pPr>
         <w:pStyle w:val="Heading2"/>
+        <w:ind w:hanging="0" w:left="720"/>
         <w:rPr>
           <w:rFonts w:eastAsia="MS Gothic"/>
         </w:rPr>
@@ -6116,7 +6427,7 @@
       </w:tblPr>
       <w:tblGrid>
         <w:gridCol w:w="1435"/>
-        <w:gridCol w:w="8375"/>
+        <w:gridCol w:w="8374"/>
       </w:tblGrid>
       <w:tr>
         <w:trPr/>
@@ -6144,7 +6455,7 @@
         </w:tc>
         <w:tc>
           <w:tcPr>
-            <w:tcW w:w="8375" w:type="dxa"/>
+            <w:tcW w:w="8374" w:type="dxa"/>
             <w:tcBorders>
               <w:top w:val="single" w:sz="4" w:space="0" w:color="000000"/>
               <w:left w:val="single" w:sz="4" w:space="0" w:color="000000"/>
@@ -6324,7 +6635,7 @@
         </w:tc>
         <w:tc>
           <w:tcPr>
-            <w:tcW w:w="8375" w:type="dxa"/>
+            <w:tcW w:w="8374" w:type="dxa"/>
             <w:tcBorders>
               <w:top w:val="single" w:sz="4" w:space="0" w:color="000000"/>
               <w:left w:val="single" w:sz="4" w:space="0" w:color="000000"/>
@@ -6469,7 +6780,7 @@
         </w:tc>
         <w:tc>
           <w:tcPr>
-            <w:tcW w:w="8375" w:type="dxa"/>
+            <w:tcW w:w="8374" w:type="dxa"/>
             <w:tcBorders>
               <w:top w:val="single" w:sz="4" w:space="0" w:color="000000"/>
               <w:left w:val="single" w:sz="4" w:space="0" w:color="000000"/>
@@ -6542,6 +6853,7 @@
     <w:p>
       <w:pPr>
         <w:pStyle w:val="Heading1"/>
+        <w:ind w:hanging="0" w:left="720"/>
         <w:rPr>
           <w:lang w:val="es-ES"/>
         </w:rPr>
@@ -6584,6 +6896,7 @@
     <w:p>
       <w:pPr>
         <w:pStyle w:val="Heading2"/>
+        <w:ind w:hanging="0" w:left="720"/>
         <w:rPr>
           <w:rFonts w:eastAsia="MS Gothic"/>
         </w:rPr>
@@ -6610,7 +6923,7 @@
       </w:tblPr>
       <w:tblGrid>
         <w:gridCol w:w="1435"/>
-        <w:gridCol w:w="8375"/>
+        <w:gridCol w:w="8374"/>
       </w:tblGrid>
       <w:tr>
         <w:trPr/>
@@ -6638,7 +6951,7 @@
         </w:tc>
         <w:tc>
           <w:tcPr>
-            <w:tcW w:w="8375" w:type="dxa"/>
+            <w:tcW w:w="8374" w:type="dxa"/>
             <w:tcBorders>
               <w:top w:val="single" w:sz="4" w:space="0" w:color="000000"/>
               <w:left w:val="single" w:sz="4" w:space="0" w:color="000000"/>
@@ -6895,7 +7208,7 @@
         </w:tc>
         <w:tc>
           <w:tcPr>
-            <w:tcW w:w="8375" w:type="dxa"/>
+            <w:tcW w:w="8374" w:type="dxa"/>
             <w:tcBorders>
               <w:top w:val="single" w:sz="4" w:space="0" w:color="000000"/>
               <w:left w:val="single" w:sz="4" w:space="0" w:color="000000"/>
@@ -7040,7 +7353,7 @@
         </w:tc>
         <w:tc>
           <w:tcPr>
-            <w:tcW w:w="8375" w:type="dxa"/>
+            <w:tcW w:w="8374" w:type="dxa"/>
             <w:tcBorders>
               <w:top w:val="single" w:sz="4" w:space="0" w:color="000000"/>
               <w:left w:val="single" w:sz="4" w:space="0" w:color="000000"/>
@@ -7141,6 +7454,7 @@
     <w:p>
       <w:pPr>
         <w:pStyle w:val="Heading2"/>
+        <w:ind w:hanging="0" w:left="720"/>
         <w:rPr>
           <w:rFonts w:eastAsia="MS Gothic"/>
         </w:rPr>
@@ -7167,7 +7481,7 @@
       </w:tblPr>
       <w:tblGrid>
         <w:gridCol w:w="1435"/>
-        <w:gridCol w:w="8375"/>
+        <w:gridCol w:w="8374"/>
       </w:tblGrid>
       <w:tr>
         <w:trPr/>
@@ -7195,7 +7509,7 @@
         </w:tc>
         <w:tc>
           <w:tcPr>
-            <w:tcW w:w="8375" w:type="dxa"/>
+            <w:tcW w:w="8374" w:type="dxa"/>
             <w:tcBorders>
               <w:top w:val="single" w:sz="4" w:space="0" w:color="000000"/>
               <w:left w:val="single" w:sz="4" w:space="0" w:color="000000"/>
@@ -7636,7 +7950,7 @@
         </w:tc>
         <w:tc>
           <w:tcPr>
-            <w:tcW w:w="8375" w:type="dxa"/>
+            <w:tcW w:w="8374" w:type="dxa"/>
             <w:tcBorders>
               <w:top w:val="single" w:sz="4" w:space="0" w:color="000000"/>
               <w:left w:val="single" w:sz="4" w:space="0" w:color="000000"/>
@@ -8281,7 +8595,7 @@
           <w:p>
             <w:pPr>
               <w:pStyle w:val="Normal"/>
-              <w:shd w:fill="A8D08D" w:val="clear"/>
+              <w:shd w:val="clear" w:fill="A8D08D"/>
               <w:spacing w:before="0" w:after="0"/>
               <w:rPr>
                 <w:lang w:val="es-ES"/>
@@ -8303,7 +8617,7 @@
           <w:p>
             <w:pPr>
               <w:pStyle w:val="Normal"/>
-              <w:shd w:fill="A8D08D" w:val="clear"/>
+              <w:shd w:val="clear" w:fill="A8D08D"/>
               <w:spacing w:before="0" w:after="0"/>
               <w:rPr>
                 <w:lang w:val="es-ES"/>
@@ -8325,7 +8639,7 @@
           <w:p>
             <w:pPr>
               <w:pStyle w:val="Normal"/>
-              <w:shd w:fill="A8D08D" w:val="clear"/>
+              <w:shd w:val="clear" w:fill="A8D08D"/>
               <w:spacing w:before="0" w:after="0"/>
               <w:rPr>
                 <w:lang w:val="es-ES"/>
@@ -8347,7 +8661,7 @@
           <w:p>
             <w:pPr>
               <w:pStyle w:val="Normal"/>
-              <w:shd w:fill="A8D08D" w:val="clear"/>
+              <w:shd w:val="clear" w:fill="A8D08D"/>
               <w:spacing w:before="0" w:after="0"/>
               <w:rPr>
                 <w:lang w:val="es-ES"/>
@@ -8369,7 +8683,7 @@
           <w:p>
             <w:pPr>
               <w:pStyle w:val="Normal"/>
-              <w:shd w:fill="A8D08D" w:val="clear"/>
+              <w:shd w:val="clear" w:fill="A8D08D"/>
               <w:spacing w:before="0" w:after="0"/>
               <w:rPr>
                 <w:lang w:val="es-ES"/>
@@ -8391,7 +8705,7 @@
           <w:p>
             <w:pPr>
               <w:pStyle w:val="Normal"/>
-              <w:shd w:fill="A8D08D" w:val="clear"/>
+              <w:shd w:val="clear" w:fill="A8D08D"/>
               <w:spacing w:before="0" w:after="0"/>
               <w:rPr>
                 <w:lang w:val="es-ES"/>
@@ -8413,7 +8727,7 @@
           <w:p>
             <w:pPr>
               <w:pStyle w:val="Normal"/>
-              <w:shd w:fill="A8D08D" w:val="clear"/>
+              <w:shd w:val="clear" w:fill="A8D08D"/>
               <w:spacing w:before="0" w:after="0"/>
               <w:rPr>
                 <w:lang w:val="es-ES"/>
@@ -8435,7 +8749,7 @@
           <w:p>
             <w:pPr>
               <w:pStyle w:val="Normal"/>
-              <w:shd w:fill="A8D08D" w:val="clear"/>
+              <w:shd w:val="clear" w:fill="A8D08D"/>
               <w:spacing w:before="0" w:after="0"/>
               <w:rPr>
                 <w:lang w:val="es-ES"/>
@@ -8457,7 +8771,7 @@
           <w:p>
             <w:pPr>
               <w:pStyle w:val="Normal"/>
-              <w:shd w:fill="A8D08D" w:val="clear"/>
+              <w:shd w:val="clear" w:fill="A8D08D"/>
               <w:spacing w:before="0" w:after="0"/>
               <w:rPr>
                 <w:lang w:val="es-ES"/>
@@ -8479,7 +8793,7 @@
           <w:p>
             <w:pPr>
               <w:pStyle w:val="Normal"/>
-              <w:shd w:fill="A8D08D" w:val="clear"/>
+              <w:shd w:val="clear" w:fill="A8D08D"/>
               <w:spacing w:before="0" w:after="0"/>
               <w:rPr>
                 <w:lang w:val="es-ES"/>
@@ -8501,7 +8815,7 @@
           <w:p>
             <w:pPr>
               <w:pStyle w:val="Normal"/>
-              <w:shd w:fill="A8D08D" w:val="clear"/>
+              <w:shd w:val="clear" w:fill="A8D08D"/>
               <w:spacing w:before="0" w:after="0"/>
               <w:rPr>
                 <w:lang w:val="es-ES"/>
@@ -8523,7 +8837,7 @@
           <w:p>
             <w:pPr>
               <w:pStyle w:val="Normal"/>
-              <w:shd w:fill="A8D08D" w:val="clear"/>
+              <w:shd w:val="clear" w:fill="A8D08D"/>
               <w:spacing w:before="0" w:after="0"/>
               <w:rPr>
                 <w:lang w:val="es-ES"/>
@@ -8545,7 +8859,7 @@
           <w:p>
             <w:pPr>
               <w:pStyle w:val="Normal"/>
-              <w:shd w:fill="A8D08D" w:val="clear"/>
+              <w:shd w:val="clear" w:fill="A8D08D"/>
               <w:spacing w:before="0" w:after="0"/>
               <w:rPr>
                 <w:lang w:val="es-ES"/>
@@ -8567,7 +8881,7 @@
           <w:p>
             <w:pPr>
               <w:pStyle w:val="Normal"/>
-              <w:shd w:fill="A8D08D" w:val="clear"/>
+              <w:shd w:val="clear" w:fill="A8D08D"/>
               <w:spacing w:before="0" w:after="0"/>
               <w:rPr>
                 <w:lang w:val="es-ES"/>
@@ -8589,7 +8903,7 @@
           <w:p>
             <w:pPr>
               <w:pStyle w:val="Normal"/>
-              <w:shd w:fill="A8D08D" w:val="clear"/>
+              <w:shd w:val="clear" w:fill="A8D08D"/>
               <w:spacing w:before="0" w:after="0"/>
               <w:rPr>
                 <w:lang w:val="es-ES"/>
@@ -8611,7 +8925,7 @@
           <w:p>
             <w:pPr>
               <w:pStyle w:val="Normal"/>
-              <w:shd w:fill="A8D08D" w:val="clear"/>
+              <w:shd w:val="clear" w:fill="A8D08D"/>
               <w:spacing w:before="0" w:after="0"/>
               <w:rPr>
                 <w:lang w:val="es-ES"/>
@@ -8994,7 +9308,7 @@
           <w:p>
             <w:pPr>
               <w:pStyle w:val="Normal"/>
-              <w:shd w:fill="D9D9D9" w:val="clear"/>
+              <w:shd w:val="clear" w:fill="D9D9D9"/>
               <w:spacing w:before="0" w:after="0"/>
               <w:ind w:left="720"/>
               <w:rPr>
@@ -9013,7 +9327,7 @@
           <w:p>
             <w:pPr>
               <w:pStyle w:val="Normal"/>
-              <w:shd w:fill="D9D9D9" w:val="clear"/>
+              <w:shd w:val="clear" w:fill="D9D9D9"/>
               <w:spacing w:before="0" w:after="0"/>
               <w:ind w:left="720"/>
               <w:rPr>
@@ -9039,7 +9353,7 @@
           <w:p>
             <w:pPr>
               <w:pStyle w:val="Normal"/>
-              <w:shd w:fill="D9D9D9" w:val="clear"/>
+              <w:shd w:val="clear" w:fill="D9D9D9"/>
               <w:spacing w:before="0" w:after="0"/>
               <w:ind w:left="720"/>
               <w:rPr>
@@ -9065,7 +9379,7 @@
           <w:p>
             <w:pPr>
               <w:pStyle w:val="Normal"/>
-              <w:shd w:fill="D9D9D9" w:val="clear"/>
+              <w:shd w:val="clear" w:fill="D9D9D9"/>
               <w:spacing w:before="0" w:after="0"/>
               <w:ind w:left="720"/>
               <w:rPr>
@@ -9091,7 +9405,7 @@
           <w:p>
             <w:pPr>
               <w:pStyle w:val="Normal"/>
-              <w:shd w:fill="D9D9D9" w:val="clear"/>
+              <w:shd w:val="clear" w:fill="D9D9D9"/>
               <w:spacing w:before="0" w:after="0"/>
               <w:ind w:left="720"/>
               <w:rPr>
@@ -9117,7 +9431,7 @@
           <w:p>
             <w:pPr>
               <w:pStyle w:val="Normal"/>
-              <w:shd w:fill="D9D9D9" w:val="clear"/>
+              <w:shd w:val="clear" w:fill="D9D9D9"/>
               <w:spacing w:before="0" w:after="0"/>
               <w:ind w:left="720"/>
               <w:rPr>
@@ -9141,7 +9455,7 @@
           <w:p>
             <w:pPr>
               <w:pStyle w:val="Normal"/>
-              <w:shd w:fill="D9D9D9" w:val="clear"/>
+              <w:shd w:val="clear" w:fill="D9D9D9"/>
               <w:spacing w:before="0" w:after="0"/>
               <w:ind w:left="720"/>
               <w:rPr>
@@ -9172,7 +9486,7 @@
           <w:p>
             <w:pPr>
               <w:pStyle w:val="Normal"/>
-              <w:shd w:fill="D9D9D9" w:val="clear"/>
+              <w:shd w:val="clear" w:fill="D9D9D9"/>
               <w:spacing w:before="0" w:after="0"/>
               <w:ind w:left="720"/>
               <w:rPr>
@@ -9220,7 +9534,7 @@
         </w:tc>
         <w:tc>
           <w:tcPr>
-            <w:tcW w:w="8375" w:type="dxa"/>
+            <w:tcW w:w="8374" w:type="dxa"/>
             <w:tcBorders>
               <w:top w:val="single" w:sz="4" w:space="0" w:color="000000"/>
               <w:left w:val="single" w:sz="4" w:space="0" w:color="000000"/>
@@ -9351,6 +9665,7 @@
     <w:p>
       <w:pPr>
         <w:pStyle w:val="Heading3"/>
+        <w:ind w:hanging="0" w:left="0"/>
         <w:rPr>
           <w:lang w:val="es-ES"/>
         </w:rPr>
@@ -9540,6 +9855,7 @@
       <w:pPr>
         <w:pStyle w:val="Heading1"/>
         <w:spacing w:before="0" w:after="0"/>
+        <w:ind w:hanging="0" w:left="720"/>
         <w:rPr>
           <w:lang w:val="es-ES"/>
         </w:rPr>
@@ -9554,6 +9870,7 @@
     <w:p>
       <w:pPr>
         <w:pStyle w:val="Heading2"/>
+        <w:ind w:hanging="0" w:left="720"/>
         <w:rPr/>
       </w:pPr>
       <w:r>
@@ -9730,6 +10047,879 @@
           <w:lang w:val="es-ES"/>
         </w:rPr>
         <w:t>Se busca sobre la base de [estos campos son de búsqueda a lo interno]: (isDeleted_0) y devuelve en un solo elemento:</w:t>
+      </w:r>
+    </w:p>
+    <w:p>
+      <w:pPr>
+        <w:pStyle w:val="Textbody"/>
+        <w:numPr>
+          <w:ilvl w:val="0"/>
+          <w:numId w:val="3"/>
+        </w:numPr>
+        <w:rPr>
+          <w:sz w:val="24"/>
+          <w:lang w:val="es-ES"/>
+        </w:rPr>
+      </w:pPr>
+      <w:r>
+        <w:rPr>
+          <w:sz w:val="24"/>
+          <w:lang w:val="es-ES"/>
+        </w:rPr>
+        <w:t xml:space="preserve">InformacionGral: </w:t>
+      </w:r>
+    </w:p>
+    <w:p>
+      <w:pPr>
+        <w:pStyle w:val="Textbody"/>
+        <w:ind w:left="1080"/>
+        <w:rPr>
+          <w:sz w:val="24"/>
+          <w:lang w:val="es-ES"/>
+        </w:rPr>
+      </w:pPr>
+      <w:r>
+        <w:rPr>
+          <w:color w:themeColor="accent4" w:themeTint="99" w:val="FFD966"/>
+          <w:sz w:val="24"/>
+          <w:shd w:fill="FF0000" w:val="clear"/>
+          <w:lang w:val="es-ES"/>
+        </w:rPr>
+        <w:t>Se pide</w:t>
+      </w:r>
+      <w:r>
+        <w:rPr>
+          <w:sz w:val="24"/>
+          <w:lang w:val="es-ES"/>
+        </w:rPr>
+        <w:t>extraPlan_0{planificadas( se cuentan todas menos las extraPlan:true), cumplidas (realizadas)[cantidad,%planificadas,asistencia,presupuestado,gastado] , suspendidas(cantidad de suspendidas y rechazadas)} ,extraPlan_1(cantidad)</w:t>
+      </w:r>
+    </w:p>
+    <w:p>
+      <w:pPr>
+        <w:pStyle w:val="Textbody"/>
+        <w:ind w:left="1080"/>
+        <w:rPr>
+          <w:sz w:val="24"/>
+          <w:lang w:val="es-ES"/>
+        </w:rPr>
+      </w:pPr>
+      <w:r>
+        <w:rPr>
+          <w:color w:themeColor="accent4" w:themeTint="99" w:val="FFD966"/>
+          <w:sz w:val="24"/>
+          <w:shd w:fill="008000" w:val="clear"/>
+          <w:lang w:val="es-ES"/>
+        </w:rPr>
+        <w:t>Se entrega</w:t>
+      </w:r>
+      <w:r>
+        <w:rPr>
+          <w:color w:themeColor="accent4" w:themeTint="99" w:val="FFD966"/>
+          <w:sz w:val="24"/>
+          <w:lang w:val="es-ES"/>
+        </w:rPr>
+        <w:t xml:space="preserve"> </w:t>
+      </w:r>
+      <w:r>
+        <w:rPr>
+          <w:sz w:val="24"/>
+          <w:lang w:val="es-ES"/>
+        </w:rPr>
+        <w:t>[{_id:{estado_actividad,extraPlan},cant_Actividades,cant_AsistenciaPersonas]:_id establece el orden de lo buscas, desglosado en estado de la actividad y si son extraPlan o no. Seguidamente se dan los datos de cantidad y asistencia</w:t>
+      </w:r>
+    </w:p>
+    <w:p>
+      <w:pPr>
+        <w:pStyle w:val="Textbody"/>
+        <w:ind w:left="1080"/>
+        <w:rPr>
+          <w:sz w:val="24"/>
+          <w:lang w:val="es-ES"/>
+        </w:rPr>
+      </w:pPr>
+      <w:r>
+        <w:rPr>
+          <w:sz w:val="24"/>
+          <w:lang w:val="es-ES"/>
+        </w:rPr>
+        <w:t>"informacion_gral": [</w:t>
+      </w:r>
+    </w:p>
+    <w:p>
+      <w:pPr>
+        <w:pStyle w:val="Textbody"/>
+        <w:ind w:left="1080"/>
+        <w:rPr>
+          <w:sz w:val="16"/>
+          <w:lang w:val="es-ES"/>
+        </w:rPr>
+      </w:pPr>
+      <w:r>
+        <w:rPr>
+          <w:sz w:val="16"/>
+          <w:lang w:val="es-ES"/>
+        </w:rPr>
+        <w:t xml:space="preserve">    </w:t>
+      </w:r>
+      <w:r>
+        <w:rPr>
+          <w:sz w:val="16"/>
+          <w:lang w:val="es-ES"/>
+        </w:rPr>
+        <w:t>{"_id": {"estado_actividad": "P","extraPlan": false},"cant_Actividades": 2, "cant_AsistenciaPersonas": 214 },</w:t>
+      </w:r>
+    </w:p>
+    <w:p>
+      <w:pPr>
+        <w:pStyle w:val="Textbody"/>
+        <w:ind w:left="1080"/>
+        <w:rPr>
+          <w:sz w:val="16"/>
+          <w:lang w:val="es-ES"/>
+        </w:rPr>
+      </w:pPr>
+      <w:r>
+        <w:rPr>
+          <w:sz w:val="16"/>
+          <w:lang w:val="es-ES"/>
+        </w:rPr>
+        <w:t xml:space="preserve">    </w:t>
+      </w:r>
+      <w:r>
+        <w:rPr>
+          <w:sz w:val="16"/>
+          <w:lang w:val="es-ES"/>
+        </w:rPr>
+        <w:t>{"_id": {"estado_actividad": "R","extraPlan": true },"cant_Actividades": 4, "cant_AsistenciaPersonas": 490 },</w:t>
+      </w:r>
+    </w:p>
+    <w:p>
+      <w:pPr>
+        <w:pStyle w:val="Textbody"/>
+        <w:ind w:left="1080"/>
+        <w:rPr>
+          <w:sz w:val="16"/>
+          <w:lang w:val="es-ES"/>
+        </w:rPr>
+      </w:pPr>
+      <w:r>
+        <w:rPr>
+          <w:sz w:val="16"/>
+          <w:lang w:val="es-ES"/>
+        </w:rPr>
+        <w:t xml:space="preserve">    </w:t>
+      </w:r>
+      <w:r>
+        <w:rPr>
+          <w:sz w:val="16"/>
+          <w:lang w:val="es-ES"/>
+        </w:rPr>
+        <w:t>{"_id": {"estado_actividad": "P","extraPlan": true }, "cant_Actividades": 2,"cant_AsistenciaPersonas": 552 },</w:t>
+      </w:r>
+    </w:p>
+    <w:p>
+      <w:pPr>
+        <w:pStyle w:val="Textbody"/>
+        <w:ind w:left="1080"/>
+        <w:rPr>
+          <w:sz w:val="16"/>
+          <w:lang w:val="es-ES"/>
+        </w:rPr>
+      </w:pPr>
+      <w:r>
+        <w:rPr>
+          <w:sz w:val="16"/>
+          <w:lang w:val="es-ES"/>
+        </w:rPr>
+        <w:t xml:space="preserve">    </w:t>
+      </w:r>
+      <w:r>
+        <w:rPr>
+          <w:sz w:val="16"/>
+          <w:lang w:val="es-ES"/>
+        </w:rPr>
+        <w:t>{"_id": {"estado_actividad": "R","extraPlan": false},"cant_Actividades": 2,"cant_AsistenciaPersonas": 295 }</w:t>
+      </w:r>
+    </w:p>
+    <w:p>
+      <w:pPr>
+        <w:pStyle w:val="Textbody"/>
+        <w:ind w:left="1080"/>
+        <w:rPr>
+          <w:sz w:val="24"/>
+          <w:lang w:val="es-ES"/>
+        </w:rPr>
+      </w:pPr>
+      <w:r>
+        <w:rPr>
+          <w:sz w:val="16"/>
+          <w:lang w:val="es-ES"/>
+        </w:rPr>
+        <w:t xml:space="preserve">  </w:t>
+      </w:r>
+      <w:r>
+        <w:rPr>
+          <w:sz w:val="16"/>
+          <w:lang w:val="es-ES"/>
+        </w:rPr>
+        <w:t>]</w:t>
+      </w:r>
+    </w:p>
+    <w:p>
+      <w:pPr>
+        <w:pStyle w:val="Textbody"/>
+        <w:numPr>
+          <w:ilvl w:val="0"/>
+          <w:numId w:val="3"/>
+        </w:numPr>
+        <w:rPr>
+          <w:sz w:val="24"/>
+          <w:lang w:val="es-ES"/>
+        </w:rPr>
+      </w:pPr>
+      <w:r>
+        <w:rPr>
+          <w:sz w:val="24"/>
+          <w:lang w:val="es-ES"/>
+        </w:rPr>
+        <w:t xml:space="preserve">InformacionGrupoEtareo: </w:t>
+      </w:r>
+    </w:p>
+    <w:p>
+      <w:pPr>
+        <w:pStyle w:val="Textbody"/>
+        <w:ind w:left="1080"/>
+        <w:rPr>
+          <w:sz w:val="24"/>
+          <w:lang w:val="es-ES"/>
+        </w:rPr>
+      </w:pPr>
+      <w:r>
+        <w:rPr>
+          <w:color w:themeColor="accent4" w:themeTint="99" w:val="FFD966"/>
+          <w:sz w:val="24"/>
+          <w:shd w:fill="FF0000" w:val="clear"/>
+          <w:lang w:val="es-ES"/>
+        </w:rPr>
+        <w:t>Se pide</w:t>
+      </w:r>
+      <w:r>
+        <w:rPr>
+          <w:sz w:val="24"/>
+          <w:lang w:val="es-ES"/>
+        </w:rPr>
+        <w:t xml:space="preserve"> [desde lo interno se  busca](extraPlan_0 y Realizada ){edad}=&gt; cantidad de actividades y cantidad de asistentes</w:t>
+      </w:r>
+    </w:p>
+    <w:p>
+      <w:pPr>
+        <w:pStyle w:val="Textbody"/>
+        <w:ind w:left="1080"/>
+        <w:rPr>
+          <w:sz w:val="24"/>
+          <w:lang w:val="es-ES"/>
+        </w:rPr>
+      </w:pPr>
+      <w:r>
+        <w:rPr>
+          <w:color w:themeColor="accent4" w:themeTint="99" w:val="FFD966"/>
+          <w:sz w:val="24"/>
+          <w:shd w:fill="008000" w:val="clear"/>
+          <w:lang w:val="es-ES"/>
+        </w:rPr>
+        <w:t>Se entrega</w:t>
+      </w:r>
+      <w:r>
+        <w:rPr>
+          <w:color w:themeColor="accent4" w:themeTint="99" w:val="FFD966"/>
+          <w:sz w:val="24"/>
+          <w:lang w:val="es-ES"/>
+        </w:rPr>
+        <w:t xml:space="preserve"> </w:t>
+      </w:r>
+      <w:r>
+        <w:rPr>
+          <w:sz w:val="24"/>
+          <w:lang w:val="es-ES"/>
+        </w:rPr>
+        <w:t>[{_Id,cantidad_Actividades,cantidad_AsistenciaPersonas}], solo las relacionadas con esa búsqueda id de lo que se busca y organiza y sus cantidades</w:t>
+      </w:r>
+    </w:p>
+    <w:p>
+      <w:pPr>
+        <w:pStyle w:val="Textbody"/>
+        <w:ind w:left="1080"/>
+        <w:rPr>
+          <w:sz w:val="24"/>
+          <w:lang w:val="es-ES"/>
+        </w:rPr>
+      </w:pPr>
+      <w:r>
+        <w:rPr>
+          <w:sz w:val="24"/>
+          <w:lang w:val="es-ES"/>
+        </w:rPr>
+        <w:t>"informe_edad": [</w:t>
+      </w:r>
+    </w:p>
+    <w:p>
+      <w:pPr>
+        <w:pStyle w:val="Textbody"/>
+        <w:ind w:left="1080"/>
+        <w:rPr>
+          <w:sz w:val="16"/>
+          <w:lang w:val="es-ES"/>
+        </w:rPr>
+      </w:pPr>
+      <w:r>
+        <w:rPr>
+          <w:sz w:val="24"/>
+          <w:lang w:val="es-ES"/>
+        </w:rPr>
+        <w:t xml:space="preserve">   </w:t>
+      </w:r>
+      <w:r>
+        <w:rPr>
+          <w:sz w:val="16"/>
+          <w:lang w:val="es-ES"/>
+        </w:rPr>
+        <w:t xml:space="preserve"> </w:t>
+      </w:r>
+      <w:r>
+        <w:rPr>
+          <w:sz w:val="16"/>
+          <w:lang w:val="es-ES"/>
+        </w:rPr>
+        <w:t>{"_id": "Niño (N)",      "cant_Actividades": 1,      "cant_AsistenciaPersonas": 211    },</w:t>
+      </w:r>
+    </w:p>
+    <w:p>
+      <w:pPr>
+        <w:pStyle w:val="Textbody"/>
+        <w:ind w:left="1080"/>
+        <w:rPr>
+          <w:sz w:val="16"/>
+          <w:lang w:val="es-ES"/>
+        </w:rPr>
+      </w:pPr>
+      <w:r>
+        <w:rPr>
+          <w:sz w:val="16"/>
+          <w:lang w:val="es-ES"/>
+        </w:rPr>
+        <w:t xml:space="preserve">    </w:t>
+      </w:r>
+      <w:r>
+        <w:rPr>
+          <w:sz w:val="16"/>
+          <w:lang w:val="es-ES"/>
+        </w:rPr>
+        <w:t>{"_id": "Adolescente (AD)",    "cant_Actividades": 1,    "cant_AsistenciaPersonas": 84    }</w:t>
+      </w:r>
+    </w:p>
+    <w:p>
+      <w:pPr>
+        <w:pStyle w:val="Textbody"/>
+        <w:ind w:left="1080"/>
+        <w:rPr>
+          <w:sz w:val="24"/>
+          <w:lang w:val="es-ES"/>
+        </w:rPr>
+      </w:pPr>
+      <w:r>
+        <w:rPr>
+          <w:sz w:val="24"/>
+          <w:lang w:val="es-ES"/>
+        </w:rPr>
+        <w:t xml:space="preserve">  </w:t>
+      </w:r>
+      <w:r>
+        <w:rPr>
+          <w:sz w:val="24"/>
+          <w:lang w:val="es-ES"/>
+        </w:rPr>
+        <w:t>]</w:t>
+      </w:r>
+    </w:p>
+    <w:p>
+      <w:pPr>
+        <w:pStyle w:val="Textbody"/>
+        <w:numPr>
+          <w:ilvl w:val="0"/>
+          <w:numId w:val="3"/>
+        </w:numPr>
+        <w:rPr>
+          <w:sz w:val="24"/>
+          <w:lang w:val="es-ES"/>
+        </w:rPr>
+      </w:pPr>
+      <w:r>
+        <w:rPr>
+          <w:sz w:val="24"/>
+          <w:lang w:val="es-ES"/>
+        </w:rPr>
+        <w:t xml:space="preserve">InformacionManifestacion: </w:t>
+      </w:r>
+    </w:p>
+    <w:p>
+      <w:pPr>
+        <w:pStyle w:val="Textbody"/>
+        <w:ind w:left="1080"/>
+        <w:rPr>
+          <w:sz w:val="24"/>
+          <w:lang w:val="es-ES"/>
+        </w:rPr>
+      </w:pPr>
+      <w:r>
+        <w:rPr>
+          <w:color w:themeColor="accent4" w:themeTint="99" w:val="FFD966"/>
+          <w:sz w:val="24"/>
+          <w:shd w:fill="FF0000" w:val="clear"/>
+          <w:lang w:val="es-ES"/>
+        </w:rPr>
+        <w:t>Se pide</w:t>
+      </w:r>
+      <w:r>
+        <w:rPr>
+          <w:sz w:val="24"/>
+          <w:lang w:val="es-ES"/>
+        </w:rPr>
+        <w:t xml:space="preserve"> [desde lo interno se  busca] (extraPlan_0 y Realizada ) y (ítem.talentos ) {manifestaciones_artisticas y persona_Talento_Artistico}=&gt; cantidad profesionales y cantidad de aficionados</w:t>
+      </w:r>
+    </w:p>
+    <w:p>
+      <w:pPr>
+        <w:pStyle w:val="Textbody"/>
+        <w:ind w:left="1080"/>
+        <w:rPr>
+          <w:sz w:val="24"/>
+          <w:lang w:val="es-ES"/>
+        </w:rPr>
+      </w:pPr>
+      <w:r>
+        <w:rPr>
+          <w:color w:themeColor="accent4" w:themeTint="99" w:val="FFD966"/>
+          <w:sz w:val="24"/>
+          <w:shd w:fill="008000" w:val="clear"/>
+          <w:lang w:val="es-ES"/>
+        </w:rPr>
+        <w:t>Se entrega</w:t>
+      </w:r>
+      <w:r>
+        <w:rPr>
+          <w:color w:themeColor="accent4" w:themeTint="99" w:val="FFD966"/>
+          <w:sz w:val="24"/>
+          <w:lang w:val="es-ES"/>
+        </w:rPr>
+        <w:t xml:space="preserve"> </w:t>
+      </w:r>
+      <w:r>
+        <w:rPr>
+          <w:sz w:val="24"/>
+          <w:lang w:val="es-ES"/>
+        </w:rPr>
+        <w:t>[{{_IdManifestacion,contratoTalento},cantidad_Talentos,{manifestación{nombre}}],ídem…</w:t>
+      </w:r>
+    </w:p>
+    <w:p>
+      <w:pPr>
+        <w:pStyle w:val="Textbody"/>
+        <w:ind w:left="1080"/>
+        <w:rPr>
+          <w:sz w:val="24"/>
+          <w:lang w:val="es-ES"/>
+        </w:rPr>
+      </w:pPr>
+      <w:r>
+        <w:rPr>
+          <w:sz w:val="24"/>
+          <w:lang w:val="es-ES"/>
+        </w:rPr>
+        <w:t>"informe_manifestacion": [</w:t>
+      </w:r>
+    </w:p>
+    <w:p>
+      <w:pPr>
+        <w:pStyle w:val="Textbody"/>
+        <w:ind w:left="1080"/>
+        <w:rPr>
+          <w:sz w:val="16"/>
+          <w:szCs w:val="16"/>
+          <w:lang w:val="es-ES"/>
+        </w:rPr>
+      </w:pPr>
+      <w:r>
+        <w:rPr>
+          <w:sz w:val="24"/>
+          <w:lang w:val="es-ES"/>
+        </w:rPr>
+        <w:t xml:space="preserve">  </w:t>
+      </w:r>
+      <w:r>
+        <w:rPr>
+          <w:sz w:val="16"/>
+          <w:szCs w:val="16"/>
+          <w:lang w:val="es-ES"/>
+        </w:rPr>
+        <w:t xml:space="preserve"> </w:t>
+      </w:r>
+      <w:r>
+        <w:rPr>
+          <w:sz w:val="16"/>
+          <w:szCs w:val="16"/>
+          <w:lang w:val="es-ES"/>
+        </w:rPr>
+        <w:t>{ "_id": { "idManifestacion": "69aafaa2f22af2ae403bcead","contratoTalento": "Aficionado"},"count": 1,</w:t>
+      </w:r>
+    </w:p>
+    <w:p>
+      <w:pPr>
+        <w:pStyle w:val="Textbody"/>
+        <w:ind w:left="1080"/>
+        <w:rPr>
+          <w:sz w:val="16"/>
+          <w:szCs w:val="16"/>
+          <w:lang w:val="es-ES"/>
+        </w:rPr>
+      </w:pPr>
+      <w:r>
+        <w:rPr>
+          <w:sz w:val="16"/>
+          <w:szCs w:val="16"/>
+          <w:lang w:val="es-ES"/>
+        </w:rPr>
+        <w:t xml:space="preserve">      </w:t>
+      </w:r>
+      <w:r>
+        <w:rPr>
+          <w:sz w:val="16"/>
+          <w:szCs w:val="16"/>
+          <w:lang w:val="es-ES"/>
+        </w:rPr>
+        <w:t>"manifest_name": {"name": "Teatro" }},</w:t>
+      </w:r>
+    </w:p>
+    <w:p>
+      <w:pPr>
+        <w:pStyle w:val="Textbody"/>
+        <w:ind w:left="1080"/>
+        <w:rPr>
+          <w:sz w:val="16"/>
+          <w:szCs w:val="16"/>
+          <w:lang w:val="es-ES"/>
+        </w:rPr>
+      </w:pPr>
+      <w:r>
+        <w:rPr>
+          <w:sz w:val="16"/>
+          <w:szCs w:val="16"/>
+          <w:lang w:val="es-ES"/>
+        </w:rPr>
+        <w:t xml:space="preserve">    </w:t>
+      </w:r>
+      <w:r>
+        <w:rPr>
+          <w:sz w:val="16"/>
+          <w:szCs w:val="16"/>
+          <w:lang w:val="es-ES"/>
+        </w:rPr>
+        <w:t>{ "_id": { "idManifestacion”: "69aafb0bf22af2ae403bcebd", "contratoTalento": "Aficionado" },"count": 2,</w:t>
+      </w:r>
+    </w:p>
+    <w:p>
+      <w:pPr>
+        <w:pStyle w:val="Textbody"/>
+        <w:ind w:left="1080"/>
+        <w:rPr>
+          <w:sz w:val="16"/>
+          <w:szCs w:val="16"/>
+          <w:lang w:val="es-ES"/>
+        </w:rPr>
+      </w:pPr>
+      <w:r>
+        <w:rPr>
+          <w:sz w:val="16"/>
+          <w:szCs w:val="16"/>
+          <w:lang w:val="es-ES"/>
+        </w:rPr>
+        <w:t xml:space="preserve">      </w:t>
+      </w:r>
+      <w:r>
+        <w:rPr>
+          <w:sz w:val="16"/>
+          <w:szCs w:val="16"/>
+          <w:lang w:val="es-ES"/>
+        </w:rPr>
+        <w:t>"manifest_name": {  "name": "Otras Manifestaciones"}}</w:t>
+      </w:r>
+    </w:p>
+    <w:p>
+      <w:pPr>
+        <w:pStyle w:val="Textbody"/>
+        <w:ind w:left="1080"/>
+        <w:rPr>
+          <w:sz w:val="16"/>
+          <w:szCs w:val="16"/>
+          <w:lang w:val="es-ES"/>
+        </w:rPr>
+      </w:pPr>
+      <w:r>
+        <w:rPr>
+          <w:sz w:val="16"/>
+          <w:szCs w:val="16"/>
+          <w:lang w:val="es-ES"/>
+        </w:rPr>
+        <w:t xml:space="preserve">  </w:t>
+      </w:r>
+      <w:r>
+        <w:rPr>
+          <w:sz w:val="16"/>
+          <w:szCs w:val="16"/>
+          <w:lang w:val="es-ES"/>
+        </w:rPr>
+        <w:t>]</w:t>
+      </w:r>
+    </w:p>
+    <w:p>
+      <w:pPr>
+        <w:pStyle w:val="Textbody"/>
+        <w:numPr>
+          <w:ilvl w:val="0"/>
+          <w:numId w:val="3"/>
+        </w:numPr>
+        <w:rPr>
+          <w:sz w:val="24"/>
+          <w:lang w:val="es-ES"/>
+        </w:rPr>
+      </w:pPr>
+      <w:r>
+        <w:rPr>
+          <w:sz w:val="24"/>
+          <w:lang w:val="es-ES"/>
+        </w:rPr>
+        <w:t>InformacionApoyoManifestacion: (extraPlan_0 y Realizada ) y (ítem.apoyos ) { ítem.apoyos.manifest }=&gt; cantidad apoyo y cantidad de dinero</w:t>
+      </w:r>
+    </w:p>
+    <w:p>
+      <w:pPr>
+        <w:pStyle w:val="Textbody"/>
+        <w:ind w:left="1080"/>
+        <w:rPr>
+          <w:sz w:val="24"/>
+          <w:lang w:val="es-ES"/>
+        </w:rPr>
+      </w:pPr>
+      <w:r>
+        <w:rPr>
+          <w:color w:themeColor="accent4" w:themeTint="99" w:val="FFD966"/>
+          <w:sz w:val="24"/>
+          <w:shd w:fill="FF0000" w:val="clear"/>
+          <w:lang w:val="es-ES"/>
+        </w:rPr>
+        <w:t>Se pide</w:t>
+      </w:r>
+      <w:r>
+        <w:rPr>
+          <w:sz w:val="24"/>
+          <w:lang w:val="es-ES"/>
+        </w:rPr>
+        <w:t xml:space="preserve"> [desde lo interno se  busca] (extraPlan_0 y Realizada ) y (ítem.talentos ) {manifestaciones_artisticas y persona_Talento_Artistico}=&gt; cantidad profesionales y cantidad de aficionados</w:t>
+      </w:r>
+    </w:p>
+    <w:p>
+      <w:pPr>
+        <w:pStyle w:val="Textbody"/>
+        <w:ind w:left="1080"/>
+        <w:rPr>
+          <w:sz w:val="24"/>
+          <w:lang w:val="es-ES"/>
+        </w:rPr>
+      </w:pPr>
+      <w:bookmarkStart w:id="0" w:name="_GoBack"/>
+      <w:r>
+        <w:rPr>
+          <w:color w:themeColor="accent4" w:themeTint="99" w:val="FFD966"/>
+          <w:sz w:val="24"/>
+          <w:shd w:fill="008000" w:val="clear"/>
+          <w:lang w:val="es-ES"/>
+        </w:rPr>
+        <w:t>Se entrega</w:t>
+      </w:r>
+      <w:r>
+        <w:rPr>
+          <w:sz w:val="24"/>
+          <w:lang w:val="es-ES"/>
+        </w:rPr>
+        <w:t xml:space="preserve"> </w:t>
+      </w:r>
+      <w:bookmarkEnd w:id="0"/>
+      <w:r>
+        <w:rPr>
+          <w:sz w:val="24"/>
+          <w:lang w:val="es-ES"/>
+        </w:rPr>
+        <w:t>[{{_IdManifestacion,contratoTalento},cantidad_Talentos,{manifestación{nombre}}],ídem…</w:t>
+      </w:r>
+    </w:p>
+    <w:p>
+      <w:pPr>
+        <w:pStyle w:val="Textbody"/>
+        <w:ind w:left="1080"/>
+        <w:rPr>
+          <w:sz w:val="24"/>
+          <w:lang w:val="es-ES"/>
+        </w:rPr>
+      </w:pPr>
+      <w:r>
+        <w:rPr>
+          <w:sz w:val="24"/>
+          <w:lang w:val="es-ES"/>
+        </w:rPr>
+        <w:t>"informe_manifestacion": [</w:t>
+      </w:r>
+    </w:p>
+    <w:p>
+      <w:pPr>
+        <w:pStyle w:val="Textbody"/>
+        <w:ind w:left="1080"/>
+        <w:rPr>
+          <w:sz w:val="24"/>
+          <w:lang w:val="es-ES"/>
+        </w:rPr>
+      </w:pPr>
+      <w:r>
+        <w:rPr>
+          <w:sz w:val="24"/>
+          <w:lang w:val="es-ES"/>
+        </w:rPr>
+        <w:t xml:space="preserve">   </w:t>
+      </w:r>
+      <w:r>
+        <w:rPr>
+          <w:sz w:val="24"/>
+          <w:lang w:val="es-ES"/>
+        </w:rPr>
+        <w:t>{ "_id": { "idManifestacion": "69aafaa2f22af2ae403bcead","contratoTalento": "Aficionado"},"count": 1,</w:t>
+      </w:r>
+    </w:p>
+    <w:p>
+      <w:pPr>
+        <w:pStyle w:val="Textbody"/>
+        <w:numPr>
+          <w:ilvl w:val="0"/>
+          <w:numId w:val="3"/>
+        </w:numPr>
+        <w:rPr>
+          <w:sz w:val="24"/>
+          <w:lang w:val="es-ES"/>
+        </w:rPr>
+      </w:pPr>
+      <w:r>
+        <w:rPr>
+          <w:sz w:val="24"/>
+          <w:lang w:val="es-ES"/>
+        </w:rPr>
+        <w:t xml:space="preserve">InformacionProgramas:{extraPlan_0 y Realizada){programas_tributa} =&gt; cantidad </w:t>
+      </w:r>
+    </w:p>
+    <w:p>
+      <w:pPr>
+        <w:pStyle w:val="Textbody"/>
+        <w:numPr>
+          <w:ilvl w:val="0"/>
+          <w:numId w:val="3"/>
+        </w:numPr>
+        <w:rPr>
+          <w:sz w:val="24"/>
+          <w:lang w:val="es-ES"/>
+        </w:rPr>
+      </w:pPr>
+      <w:r>
+        <w:rPr>
+          <w:sz w:val="24"/>
+          <w:lang w:val="es-ES"/>
+        </w:rPr>
+        <w:t xml:space="preserve">InformacionTV:{extraPlan_0 y Realizada){tv_1} =&gt; cantidad </w:t>
+      </w:r>
+    </w:p>
+    <w:p>
+      <w:pPr>
+        <w:pStyle w:val="Textbody"/>
+        <w:numPr>
+          <w:ilvl w:val="0"/>
+          <w:numId w:val="3"/>
+        </w:numPr>
+        <w:rPr>
+          <w:sz w:val="24"/>
+          <w:lang w:val="es-ES"/>
+        </w:rPr>
+      </w:pPr>
+      <w:r>
+        <w:rPr>
+          <w:sz w:val="24"/>
+          <w:lang w:val="es-ES"/>
+        </w:rPr>
+        <w:t xml:space="preserve">InformacionRed:{extraPlan_0 y Realizada){redes_plataformas_1} =&gt; cantidad </w:t>
+      </w:r>
+    </w:p>
+    <w:p>
+      <w:pPr>
+        <w:pStyle w:val="Textbody"/>
+        <w:ind w:left="360"/>
+        <w:rPr>
+          <w:sz w:val="24"/>
+          <w:lang w:val="es-ES"/>
+        </w:rPr>
+      </w:pPr>
+      <w:r>
+        <w:rPr>
+          <w:sz w:val="24"/>
+          <w:lang w:val="es-ES"/>
+        </w:rPr>
+      </w:r>
+    </w:p>
+    <w:p>
+      <w:pPr>
+        <w:pStyle w:val="Heading2"/>
+        <w:ind w:hanging="0" w:left="720"/>
+        <w:rPr/>
+      </w:pPr>
+      <w:r>
+        <w:rPr/>
+        <w:t>Modelo 2: Pensar que poner</w:t>
+      </w:r>
+    </w:p>
+    <w:p>
+      <w:pPr>
+        <w:pStyle w:val="Textbody"/>
+        <w:rPr>
+          <w:sz w:val="24"/>
+          <w:lang w:val="es-ES"/>
+        </w:rPr>
+      </w:pPr>
+      <w:r>
+        <w:rPr>
+          <w:sz w:val="24"/>
+          <w:lang w:val="es-ES"/>
+        </w:rPr>
+        <w:t>Figura 2 - Modelo de Programación Mensual</w:t>
+      </w:r>
+    </w:p>
+    <w:p>
+      <w:pPr>
+        <w:pStyle w:val="Textbody"/>
+        <w:rPr>
+          <w:sz w:val="24"/>
+          <w:lang w:val="es-ES"/>
+        </w:rPr>
+      </w:pPr>
+      <w:r>
+        <w:rPr>
+          <w:sz w:val="24"/>
+          <w:lang w:val="es-ES"/>
+        </w:rPr>
+        <w:t>Tabla Control_ActCult , Por entidad_responsable(isDeleted_0):</w:t>
       </w:r>
     </w:p>
     <w:p>
@@ -9749,204 +10939,7 @@
           <w:sz w:val="24"/>
           <w:lang w:val="es-ES"/>
         </w:rPr>
-        <w:t xml:space="preserve">InformacionGral: </w:t>
-      </w:r>
-    </w:p>
-    <w:p>
-      <w:pPr>
-        <w:pStyle w:val="Textbody"/>
-        <w:ind w:left="1080"/>
-        <w:rPr>
-          <w:sz w:val="24"/>
-          <w:lang w:val="es-ES"/>
-        </w:rPr>
-      </w:pPr>
-      <w:r>
-        <w:rPr>
-          <w:color w:themeColor="accent4" w:themeTint="99" w:val="FFD966"/>
-          <w:sz w:val="24"/>
-          <w:shd w:fill="FF0000" w:val="clear"/>
-          <w:lang w:val="es-ES"/>
-        </w:rPr>
-        <w:t>Se pide</w:t>
-      </w:r>
-      <w:r>
-        <w:rPr>
-          <w:sz w:val="24"/>
-          <w:lang w:val="es-ES"/>
-        </w:rPr>
-        <w:t>extraPlan_0{planificadas( se cuentan todas menos las extraPlan:true), cumplidas (realizadas)[cantidad,%planificadas,asistencia,presupuestado,gastado] , suspendidas(cantidad de suspendidas y rechazadas)} ,extraPlan_1(cantidad)</w:t>
-      </w:r>
-    </w:p>
-    <w:p>
-      <w:pPr>
-        <w:pStyle w:val="Textbody"/>
-        <w:ind w:left="1080"/>
-        <w:rPr>
-          <w:sz w:val="24"/>
-          <w:lang w:val="es-ES"/>
-        </w:rPr>
-      </w:pPr>
-      <w:r>
-        <w:rPr>
-          <w:color w:themeColor="accent4" w:themeTint="99" w:val="FFD966"/>
-          <w:sz w:val="24"/>
-          <w:shd w:fill="008000" w:val="clear"/>
-          <w:lang w:val="es-ES"/>
-        </w:rPr>
-        <w:t>Se entrega</w:t>
-      </w:r>
-      <w:r>
-        <w:rPr>
-          <w:color w:themeColor="accent4" w:themeTint="99" w:val="FFD966"/>
-          <w:sz w:val="24"/>
-          <w:lang w:val="es-ES"/>
-        </w:rPr>
-        <w:t xml:space="preserve"> </w:t>
-      </w:r>
-      <w:r>
-        <w:rPr>
-          <w:sz w:val="24"/>
-          <w:lang w:val="es-ES"/>
-        </w:rPr>
-        <w:t>[{_id:{estado_actividad,extraPlan},cant_Actividades,cant_AsistenciaPersonas]:_id establece el orden de lo buscas, desglosado en estado de la actividad y si son extraPlan o no. Seguidamente se dan los datos de cantidad y asistencia</w:t>
-      </w:r>
-    </w:p>
-    <w:p>
-      <w:pPr>
-        <w:pStyle w:val="Textbody"/>
-        <w:ind w:left="1080"/>
-        <w:rPr>
-          <w:sz w:val="24"/>
-          <w:lang w:val="es-ES"/>
-        </w:rPr>
-      </w:pPr>
-      <w:r>
-        <w:rPr>
-          <w:sz w:val="24"/>
-          <w:lang w:val="es-ES"/>
-        </w:rPr>
-        <w:t>"informacion_gral": [</w:t>
-      </w:r>
-    </w:p>
-    <w:p>
-      <w:pPr>
-        <w:pStyle w:val="Textbody"/>
-        <w:ind w:left="1080"/>
-        <w:rPr>
-          <w:sz w:val="16"/>
-          <w:lang w:val="es-ES"/>
-        </w:rPr>
-      </w:pPr>
-      <w:r>
-        <w:rPr>
-          <w:sz w:val="16"/>
-          <w:lang w:val="es-ES"/>
-        </w:rPr>
-        <w:t xml:space="preserve">    </w:t>
-      </w:r>
-      <w:r>
-        <w:rPr>
-          <w:sz w:val="16"/>
-          <w:lang w:val="es-ES"/>
-        </w:rPr>
-        <w:t>{"_id": {"estado_actividad": "P","extraPlan": false},"cant_Actividades": 2, "cant_AsistenciaPersonas": 214 },</w:t>
-      </w:r>
-    </w:p>
-    <w:p>
-      <w:pPr>
-        <w:pStyle w:val="Textbody"/>
-        <w:ind w:left="1080"/>
-        <w:rPr>
-          <w:sz w:val="16"/>
-          <w:lang w:val="es-ES"/>
-        </w:rPr>
-      </w:pPr>
-      <w:r>
-        <w:rPr>
-          <w:sz w:val="16"/>
-          <w:lang w:val="es-ES"/>
-        </w:rPr>
-        <w:t xml:space="preserve">    </w:t>
-      </w:r>
-      <w:r>
-        <w:rPr>
-          <w:sz w:val="16"/>
-          <w:lang w:val="es-ES"/>
-        </w:rPr>
-        <w:t>{"_id": {"estado_actividad": "R","extraPlan": true },"cant_Actividades": 4, "cant_AsistenciaPersonas": 490 },</w:t>
-      </w:r>
-    </w:p>
-    <w:p>
-      <w:pPr>
-        <w:pStyle w:val="Textbody"/>
-        <w:ind w:left="1080"/>
-        <w:rPr>
-          <w:sz w:val="16"/>
-          <w:lang w:val="es-ES"/>
-        </w:rPr>
-      </w:pPr>
-      <w:r>
-        <w:rPr>
-          <w:sz w:val="16"/>
-          <w:lang w:val="es-ES"/>
-        </w:rPr>
-        <w:t xml:space="preserve">    </w:t>
-      </w:r>
-      <w:r>
-        <w:rPr>
-          <w:sz w:val="16"/>
-          <w:lang w:val="es-ES"/>
-        </w:rPr>
-        <w:t>{"_id": {"estado_actividad": "P","extraPlan": true }, "cant_Actividades": 2,"cant_AsistenciaPersonas": 552 },</w:t>
-      </w:r>
-    </w:p>
-    <w:p>
-      <w:pPr>
-        <w:pStyle w:val="Textbody"/>
-        <w:ind w:left="1080"/>
-        <w:rPr>
-          <w:sz w:val="16"/>
-          <w:lang w:val="es-ES"/>
-        </w:rPr>
-      </w:pPr>
-      <w:r>
-        <w:rPr>
-          <w:sz w:val="16"/>
-          <w:lang w:val="es-ES"/>
-        </w:rPr>
-        <w:t xml:space="preserve">    </w:t>
-      </w:r>
-      <w:r>
-        <w:rPr>
-          <w:sz w:val="16"/>
-          <w:lang w:val="es-ES"/>
-        </w:rPr>
-        <w:t>{"_id": {"estado_actividad": "R","extraPlan": false},"cant_Actividades": 2,"cant_AsistenciaPersonas": 295 }</w:t>
-      </w:r>
-    </w:p>
-    <w:p>
-      <w:pPr>
-        <w:pStyle w:val="Textbody"/>
-        <w:ind w:left="1080"/>
-        <w:rPr>
-          <w:sz w:val="24"/>
-          <w:lang w:val="es-ES"/>
-        </w:rPr>
-      </w:pPr>
-      <w:r>
-        <w:rPr>
-          <w:sz w:val="16"/>
-          <w:lang w:val="es-ES"/>
-        </w:rPr>
-        <w:t xml:space="preserve">  </w:t>
-      </w:r>
-      <w:r>
-        <w:rPr>
-          <w:sz w:val="16"/>
-          <w:lang w:val="es-ES"/>
-        </w:rPr>
-        <w:t>]</w:t>
+        <w:t>InformacionGral: extraPlan_0{planificadas( se cuentan todas menos las extraPlan:true), cumplidas (realizadas)[cantidad,%planificadas,asistencia,presupuestado,gastado] , suspendidas(cantidad de suspendidas y rechazadas)} ,extraPlan_1(cantidad)</w:t>
       </w:r>
     </w:p>
     <w:p>
@@ -9955,681 +10948,6 @@
         <w:numPr>
           <w:ilvl w:val="0"/>
           <w:numId w:val="4"/>
-        </w:numPr>
-        <w:rPr>
-          <w:sz w:val="24"/>
-          <w:lang w:val="es-ES"/>
-        </w:rPr>
-      </w:pPr>
-      <w:r>
-        <w:rPr>
-          <w:sz w:val="24"/>
-          <w:lang w:val="es-ES"/>
-        </w:rPr>
-        <w:t xml:space="preserve">InformacionGrupoEtareo: </w:t>
-      </w:r>
-    </w:p>
-    <w:p>
-      <w:pPr>
-        <w:pStyle w:val="Textbody"/>
-        <w:ind w:left="1080"/>
-        <w:rPr>
-          <w:sz w:val="24"/>
-          <w:lang w:val="es-ES"/>
-        </w:rPr>
-      </w:pPr>
-      <w:r>
-        <w:rPr>
-          <w:color w:themeColor="accent4" w:themeTint="99" w:val="FFD966"/>
-          <w:sz w:val="24"/>
-          <w:shd w:fill="FF0000" w:val="clear"/>
-          <w:lang w:val="es-ES"/>
-        </w:rPr>
-        <w:t>Se pide</w:t>
-      </w:r>
-      <w:r>
-        <w:rPr>
-          <w:sz w:val="24"/>
-          <w:lang w:val="es-ES"/>
-        </w:rPr>
-        <w:t xml:space="preserve"> [desde lo interno se  busca](extraPlan_0 y Realizada ){edad}=&gt; cantidad de actividades y cantidad de asistentes</w:t>
-      </w:r>
-    </w:p>
-    <w:p>
-      <w:pPr>
-        <w:pStyle w:val="Textbody"/>
-        <w:ind w:left="1080"/>
-        <w:rPr>
-          <w:sz w:val="24"/>
-          <w:lang w:val="es-ES"/>
-        </w:rPr>
-      </w:pPr>
-      <w:r>
-        <w:rPr>
-          <w:color w:themeColor="accent4" w:themeTint="99" w:val="FFD966"/>
-          <w:sz w:val="24"/>
-          <w:shd w:fill="008000" w:val="clear"/>
-          <w:lang w:val="es-ES"/>
-        </w:rPr>
-        <w:t>Se entrega</w:t>
-      </w:r>
-      <w:r>
-        <w:rPr>
-          <w:color w:themeColor="accent4" w:themeTint="99" w:val="FFD966"/>
-          <w:sz w:val="24"/>
-          <w:lang w:val="es-ES"/>
-        </w:rPr>
-        <w:t xml:space="preserve"> </w:t>
-      </w:r>
-      <w:r>
-        <w:rPr>
-          <w:sz w:val="24"/>
-          <w:lang w:val="es-ES"/>
-        </w:rPr>
-        <w:t>[{_Id,cantidad_Actividades,cantidad_AsistenciaPersonas}], solo las relacionadas con esa búsqueda id de lo que se busca y organiza y sus cantidades</w:t>
-      </w:r>
-    </w:p>
-    <w:p>
-      <w:pPr>
-        <w:pStyle w:val="Textbody"/>
-        <w:ind w:left="1080"/>
-        <w:rPr>
-          <w:sz w:val="24"/>
-          <w:lang w:val="es-ES"/>
-        </w:rPr>
-      </w:pPr>
-      <w:r>
-        <w:rPr>
-          <w:sz w:val="24"/>
-          <w:lang w:val="es-ES"/>
-        </w:rPr>
-        <w:t>"informe_edad": [</w:t>
-      </w:r>
-    </w:p>
-    <w:p>
-      <w:pPr>
-        <w:pStyle w:val="Textbody"/>
-        <w:ind w:left="1080"/>
-        <w:rPr>
-          <w:sz w:val="16"/>
-          <w:lang w:val="es-ES"/>
-        </w:rPr>
-      </w:pPr>
-      <w:r>
-        <w:rPr>
-          <w:sz w:val="24"/>
-          <w:lang w:val="es-ES"/>
-        </w:rPr>
-        <w:t xml:space="preserve">   </w:t>
-      </w:r>
-      <w:r>
-        <w:rPr>
-          <w:sz w:val="16"/>
-          <w:lang w:val="es-ES"/>
-        </w:rPr>
-        <w:t xml:space="preserve"> </w:t>
-      </w:r>
-      <w:r>
-        <w:rPr>
-          <w:sz w:val="16"/>
-          <w:lang w:val="es-ES"/>
-        </w:rPr>
-        <w:t>{"_id": "Niño (N)",      "cant_Actividades": 1,      "cant_AsistenciaPersonas": 211    },</w:t>
-      </w:r>
-    </w:p>
-    <w:p>
-      <w:pPr>
-        <w:pStyle w:val="Textbody"/>
-        <w:ind w:left="1080"/>
-        <w:rPr>
-          <w:sz w:val="16"/>
-          <w:lang w:val="es-ES"/>
-        </w:rPr>
-      </w:pPr>
-      <w:r>
-        <w:rPr>
-          <w:sz w:val="16"/>
-          <w:lang w:val="es-ES"/>
-        </w:rPr>
-        <w:t xml:space="preserve">    </w:t>
-      </w:r>
-      <w:r>
-        <w:rPr>
-          <w:sz w:val="16"/>
-          <w:lang w:val="es-ES"/>
-        </w:rPr>
-        <w:t>{"_id": "Adolescente (AD)",    "cant_Actividades": 1,    "cant_AsistenciaPersonas": 84    }</w:t>
-      </w:r>
-    </w:p>
-    <w:p>
-      <w:pPr>
-        <w:pStyle w:val="Textbody"/>
-        <w:ind w:left="1080"/>
-        <w:rPr>
-          <w:sz w:val="24"/>
-          <w:lang w:val="es-ES"/>
-        </w:rPr>
-      </w:pPr>
-      <w:r>
-        <w:rPr>
-          <w:sz w:val="24"/>
-          <w:lang w:val="es-ES"/>
-        </w:rPr>
-        <w:t xml:space="preserve">  </w:t>
-      </w:r>
-      <w:r>
-        <w:rPr>
-          <w:sz w:val="24"/>
-          <w:lang w:val="es-ES"/>
-        </w:rPr>
-        <w:t>]</w:t>
-      </w:r>
-    </w:p>
-    <w:p>
-      <w:pPr>
-        <w:pStyle w:val="Textbody"/>
-        <w:numPr>
-          <w:ilvl w:val="0"/>
-          <w:numId w:val="4"/>
-        </w:numPr>
-        <w:rPr>
-          <w:sz w:val="24"/>
-          <w:lang w:val="es-ES"/>
-        </w:rPr>
-      </w:pPr>
-      <w:r>
-        <w:rPr>
-          <w:sz w:val="24"/>
-          <w:lang w:val="es-ES"/>
-        </w:rPr>
-        <w:t xml:space="preserve">InformacionManifestacion: </w:t>
-      </w:r>
-    </w:p>
-    <w:p>
-      <w:pPr>
-        <w:pStyle w:val="Textbody"/>
-        <w:ind w:left="1080"/>
-        <w:rPr>
-          <w:sz w:val="24"/>
-          <w:lang w:val="es-ES"/>
-        </w:rPr>
-      </w:pPr>
-      <w:r>
-        <w:rPr>
-          <w:color w:themeColor="accent4" w:themeTint="99" w:val="FFD966"/>
-          <w:sz w:val="24"/>
-          <w:shd w:fill="FF0000" w:val="clear"/>
-          <w:lang w:val="es-ES"/>
-        </w:rPr>
-        <w:t>Se pide</w:t>
-      </w:r>
-      <w:r>
-        <w:rPr>
-          <w:sz w:val="24"/>
-          <w:lang w:val="es-ES"/>
-        </w:rPr>
-        <w:t xml:space="preserve"> [desde lo interno se  busca] (extraPlan_0 y Realizada ) y (ítem.talentos ) {manifestaciones_artisticas y persona_Talento_Artistico}=&gt; cantidad profesionales y cantidad de aficionados</w:t>
-      </w:r>
-    </w:p>
-    <w:p>
-      <w:pPr>
-        <w:pStyle w:val="Textbody"/>
-        <w:ind w:left="1080"/>
-        <w:rPr>
-          <w:sz w:val="24"/>
-          <w:lang w:val="es-ES"/>
-        </w:rPr>
-      </w:pPr>
-      <w:r>
-        <w:rPr>
-          <w:color w:themeColor="accent4" w:themeTint="99" w:val="FFD966"/>
-          <w:sz w:val="24"/>
-          <w:shd w:fill="008000" w:val="clear"/>
-          <w:lang w:val="es-ES"/>
-        </w:rPr>
-        <w:t>Se entrega</w:t>
-      </w:r>
-      <w:r>
-        <w:rPr>
-          <w:color w:themeColor="accent4" w:themeTint="99" w:val="FFD966"/>
-          <w:sz w:val="24"/>
-          <w:lang w:val="es-ES"/>
-        </w:rPr>
-        <w:t xml:space="preserve"> </w:t>
-      </w:r>
-      <w:r>
-        <w:rPr>
-          <w:sz w:val="24"/>
-          <w:lang w:val="es-ES"/>
-        </w:rPr>
-        <w:t>[{{_IdManifestacion,contratoTalento},cantidad_Talentos,{manifestación{nombre}}],ídem…</w:t>
-      </w:r>
-    </w:p>
-    <w:p>
-      <w:pPr>
-        <w:pStyle w:val="Textbody"/>
-        <w:ind w:left="1080"/>
-        <w:rPr>
-          <w:sz w:val="24"/>
-          <w:lang w:val="es-ES"/>
-        </w:rPr>
-      </w:pPr>
-      <w:r>
-        <w:rPr>
-          <w:sz w:val="24"/>
-          <w:lang w:val="es-ES"/>
-        </w:rPr>
-        <w:t>"informe_manifestacion": [</w:t>
-      </w:r>
-    </w:p>
-    <w:p>
-      <w:pPr>
-        <w:pStyle w:val="Textbody"/>
-        <w:ind w:left="1080"/>
-        <w:rPr>
-          <w:sz w:val="16"/>
-          <w:szCs w:val="16"/>
-          <w:lang w:val="es-ES"/>
-        </w:rPr>
-      </w:pPr>
-      <w:r>
-        <w:rPr>
-          <w:sz w:val="24"/>
-          <w:lang w:val="es-ES"/>
-        </w:rPr>
-        <w:t xml:space="preserve">  </w:t>
-      </w:r>
-      <w:r>
-        <w:rPr>
-          <w:sz w:val="16"/>
-          <w:szCs w:val="16"/>
-          <w:lang w:val="es-ES"/>
-        </w:rPr>
-        <w:t xml:space="preserve"> </w:t>
-      </w:r>
-      <w:r>
-        <w:rPr>
-          <w:sz w:val="16"/>
-          <w:szCs w:val="16"/>
-          <w:lang w:val="es-ES"/>
-        </w:rPr>
-        <w:t>{ "_id": { "idManifestacion": "69aafaa2f22af2ae403bcead","contratoTalento": "Aficionado"},"count": 1,</w:t>
-      </w:r>
-    </w:p>
-    <w:p>
-      <w:pPr>
-        <w:pStyle w:val="Textbody"/>
-        <w:ind w:left="1080"/>
-        <w:rPr>
-          <w:sz w:val="16"/>
-          <w:szCs w:val="16"/>
-          <w:lang w:val="es-ES"/>
-        </w:rPr>
-      </w:pPr>
-      <w:r>
-        <w:rPr>
-          <w:sz w:val="16"/>
-          <w:szCs w:val="16"/>
-          <w:lang w:val="es-ES"/>
-        </w:rPr>
-        <w:t xml:space="preserve">      </w:t>
-      </w:r>
-      <w:r>
-        <w:rPr>
-          <w:sz w:val="16"/>
-          <w:szCs w:val="16"/>
-          <w:lang w:val="es-ES"/>
-        </w:rPr>
-        <w:t>"manifest_name": {"name": "Teatro" }},</w:t>
-      </w:r>
-    </w:p>
-    <w:p>
-      <w:pPr>
-        <w:pStyle w:val="Textbody"/>
-        <w:ind w:left="1080"/>
-        <w:rPr>
-          <w:sz w:val="16"/>
-          <w:szCs w:val="16"/>
-          <w:lang w:val="es-ES"/>
-        </w:rPr>
-      </w:pPr>
-      <w:r>
-        <w:rPr>
-          <w:sz w:val="16"/>
-          <w:szCs w:val="16"/>
-          <w:lang w:val="es-ES"/>
-        </w:rPr>
-        <w:t xml:space="preserve">    </w:t>
-      </w:r>
-      <w:r>
-        <w:rPr>
-          <w:sz w:val="16"/>
-          <w:szCs w:val="16"/>
-          <w:lang w:val="es-ES"/>
-        </w:rPr>
-        <w:t>{ "_id": { "idManifestacion”: "69aafb0bf22af2ae403bcebd", "contratoTalento": "Aficionado" },"count": 2,</w:t>
-      </w:r>
-    </w:p>
-    <w:p>
-      <w:pPr>
-        <w:pStyle w:val="Textbody"/>
-        <w:ind w:left="1080"/>
-        <w:rPr>
-          <w:sz w:val="16"/>
-          <w:szCs w:val="16"/>
-          <w:lang w:val="es-ES"/>
-        </w:rPr>
-      </w:pPr>
-      <w:r>
-        <w:rPr>
-          <w:sz w:val="16"/>
-          <w:szCs w:val="16"/>
-          <w:lang w:val="es-ES"/>
-        </w:rPr>
-        <w:t xml:space="preserve">      </w:t>
-      </w:r>
-      <w:r>
-        <w:rPr>
-          <w:sz w:val="16"/>
-          <w:szCs w:val="16"/>
-          <w:lang w:val="es-ES"/>
-        </w:rPr>
-        <w:t>"manifest_name": {  "name": "Otras Manifestaciones"}}</w:t>
-      </w:r>
-    </w:p>
-    <w:p>
-      <w:pPr>
-        <w:pStyle w:val="Textbody"/>
-        <w:ind w:left="1080"/>
-        <w:rPr>
-          <w:sz w:val="16"/>
-          <w:szCs w:val="16"/>
-          <w:lang w:val="es-ES"/>
-        </w:rPr>
-      </w:pPr>
-      <w:r>
-        <w:rPr>
-          <w:sz w:val="16"/>
-          <w:szCs w:val="16"/>
-          <w:lang w:val="es-ES"/>
-        </w:rPr>
-        <w:t xml:space="preserve">  </w:t>
-      </w:r>
-      <w:r>
-        <w:rPr>
-          <w:sz w:val="16"/>
-          <w:szCs w:val="16"/>
-          <w:lang w:val="es-ES"/>
-        </w:rPr>
-        <w:t>]</w:t>
-      </w:r>
-    </w:p>
-    <w:p>
-      <w:pPr>
-        <w:pStyle w:val="Textbody"/>
-        <w:numPr>
-          <w:ilvl w:val="0"/>
-          <w:numId w:val="4"/>
-        </w:numPr>
-        <w:rPr>
-          <w:sz w:val="24"/>
-          <w:lang w:val="es-ES"/>
-        </w:rPr>
-      </w:pPr>
-      <w:r>
-        <w:rPr>
-          <w:sz w:val="24"/>
-          <w:lang w:val="es-ES"/>
-        </w:rPr>
-        <w:t>InformacionApoyoManifestacion: (extraPlan_0 y Realizada ) y (ítem.apoyos ) { ítem.apoyos.manifest }=&gt; cantidad apoyo y cantidad de dinero</w:t>
-      </w:r>
-    </w:p>
-    <w:p>
-      <w:pPr>
-        <w:pStyle w:val="Textbody"/>
-        <w:ind w:left="1080"/>
-        <w:rPr>
-          <w:sz w:val="24"/>
-          <w:lang w:val="es-ES"/>
-        </w:rPr>
-      </w:pPr>
-      <w:r>
-        <w:rPr>
-          <w:color w:themeColor="accent4" w:themeTint="99" w:val="FFD966"/>
-          <w:sz w:val="24"/>
-          <w:shd w:fill="FF0000" w:val="clear"/>
-          <w:lang w:val="es-ES"/>
-        </w:rPr>
-        <w:t>Se pide</w:t>
-      </w:r>
-      <w:r>
-        <w:rPr>
-          <w:sz w:val="24"/>
-          <w:lang w:val="es-ES"/>
-        </w:rPr>
-        <w:t xml:space="preserve"> [desde lo interno se  busca] (extraPlan_0 y Realizada ) y (ítem.talentos ) {manifestaciones_artisticas y persona_Talento_Artistico}=&gt; cantidad profesionales y cantidad de aficionados</w:t>
-      </w:r>
-    </w:p>
-    <w:p>
-      <w:pPr>
-        <w:pStyle w:val="Textbody"/>
-        <w:ind w:left="1080"/>
-        <w:rPr>
-          <w:sz w:val="24"/>
-          <w:lang w:val="es-ES"/>
-        </w:rPr>
-      </w:pPr>
-      <w:bookmarkStart w:id="0" w:name="_GoBack"/>
-      <w:r>
-        <w:rPr>
-          <w:color w:themeColor="accent4" w:themeTint="99" w:val="FFD966"/>
-          <w:sz w:val="24"/>
-          <w:shd w:fill="008000" w:val="clear"/>
-          <w:lang w:val="es-ES"/>
-        </w:rPr>
-        <w:t>Se entrega</w:t>
-      </w:r>
-      <w:r>
-        <w:rPr>
-          <w:sz w:val="24"/>
-          <w:lang w:val="es-ES"/>
-        </w:rPr>
-        <w:t xml:space="preserve"> </w:t>
-      </w:r>
-      <w:bookmarkEnd w:id="0"/>
-      <w:r>
-        <w:rPr>
-          <w:sz w:val="24"/>
-          <w:lang w:val="es-ES"/>
-        </w:rPr>
-        <w:t>[{{_IdManifestacion,contratoTalento},cantidad_Talentos,{manifestación{nombre}}],ídem…</w:t>
-      </w:r>
-    </w:p>
-    <w:p>
-      <w:pPr>
-        <w:pStyle w:val="Textbody"/>
-        <w:ind w:left="1080"/>
-        <w:rPr>
-          <w:sz w:val="24"/>
-          <w:lang w:val="es-ES"/>
-        </w:rPr>
-      </w:pPr>
-      <w:r>
-        <w:rPr>
-          <w:sz w:val="24"/>
-          <w:lang w:val="es-ES"/>
-        </w:rPr>
-        <w:t>"informe_manifestacion": [</w:t>
-      </w:r>
-    </w:p>
-    <w:p>
-      <w:pPr>
-        <w:pStyle w:val="Textbody"/>
-        <w:ind w:left="1080"/>
-        <w:rPr>
-          <w:sz w:val="24"/>
-          <w:lang w:val="es-ES"/>
-        </w:rPr>
-      </w:pPr>
-      <w:r>
-        <w:rPr>
-          <w:sz w:val="24"/>
-          <w:lang w:val="es-ES"/>
-        </w:rPr>
-        <w:t xml:space="preserve">   </w:t>
-      </w:r>
-      <w:r>
-        <w:rPr>
-          <w:sz w:val="24"/>
-          <w:lang w:val="es-ES"/>
-        </w:rPr>
-        <w:t>{ "_id": { "idManifestacion": "69aafaa2f22af2ae403bcead","contratoTalento": "Aficionado"},"count": 1,</w:t>
-      </w:r>
-    </w:p>
-    <w:p>
-      <w:pPr>
-        <w:pStyle w:val="Textbody"/>
-        <w:numPr>
-          <w:ilvl w:val="0"/>
-          <w:numId w:val="4"/>
-        </w:numPr>
-        <w:rPr>
-          <w:sz w:val="24"/>
-          <w:lang w:val="es-ES"/>
-        </w:rPr>
-      </w:pPr>
-      <w:r>
-        <w:rPr>
-          <w:sz w:val="24"/>
-          <w:lang w:val="es-ES"/>
-        </w:rPr>
-        <w:t xml:space="preserve">InformacionProgramas:{extraPlan_0 y Realizada){programas_tributa} =&gt; cantidad </w:t>
-      </w:r>
-    </w:p>
-    <w:p>
-      <w:pPr>
-        <w:pStyle w:val="Textbody"/>
-        <w:numPr>
-          <w:ilvl w:val="0"/>
-          <w:numId w:val="4"/>
-        </w:numPr>
-        <w:rPr>
-          <w:sz w:val="24"/>
-          <w:lang w:val="es-ES"/>
-        </w:rPr>
-      </w:pPr>
-      <w:r>
-        <w:rPr>
-          <w:sz w:val="24"/>
-          <w:lang w:val="es-ES"/>
-        </w:rPr>
-        <w:t xml:space="preserve">InformacionTV:{extraPlan_0 y Realizada){tv_1} =&gt; cantidad </w:t>
-      </w:r>
-    </w:p>
-    <w:p>
-      <w:pPr>
-        <w:pStyle w:val="Textbody"/>
-        <w:numPr>
-          <w:ilvl w:val="0"/>
-          <w:numId w:val="4"/>
-        </w:numPr>
-        <w:rPr>
-          <w:sz w:val="24"/>
-          <w:lang w:val="es-ES"/>
-        </w:rPr>
-      </w:pPr>
-      <w:r>
-        <w:rPr>
-          <w:sz w:val="24"/>
-          <w:lang w:val="es-ES"/>
-        </w:rPr>
-        <w:t xml:space="preserve">InformacionRed:{extraPlan_0 y Realizada){redes_plataformas_1} =&gt; cantidad </w:t>
-      </w:r>
-    </w:p>
-    <w:p>
-      <w:pPr>
-        <w:pStyle w:val="Textbody"/>
-        <w:ind w:left="360"/>
-        <w:rPr>
-          <w:sz w:val="24"/>
-          <w:lang w:val="es-ES"/>
-        </w:rPr>
-      </w:pPr>
-      <w:r>
-        <w:rPr>
-          <w:sz w:val="24"/>
-          <w:lang w:val="es-ES"/>
-        </w:rPr>
-      </w:r>
-    </w:p>
-    <w:p>
-      <w:pPr>
-        <w:pStyle w:val="Heading2"/>
-        <w:rPr/>
-      </w:pPr>
-      <w:r>
-        <w:rPr/>
-        <w:t>Modelo 2: Pensar que poner</w:t>
-      </w:r>
-    </w:p>
-    <w:p>
-      <w:pPr>
-        <w:pStyle w:val="Textbody"/>
-        <w:rPr>
-          <w:sz w:val="24"/>
-          <w:lang w:val="es-ES"/>
-        </w:rPr>
-      </w:pPr>
-      <w:r>
-        <w:rPr>
-          <w:sz w:val="24"/>
-          <w:lang w:val="es-ES"/>
-        </w:rPr>
-        <w:t>Figura 2 - Modelo de Programación Mensual</w:t>
-      </w:r>
-    </w:p>
-    <w:p>
-      <w:pPr>
-        <w:pStyle w:val="Textbody"/>
-        <w:rPr>
-          <w:sz w:val="24"/>
-          <w:lang w:val="es-ES"/>
-        </w:rPr>
-      </w:pPr>
-      <w:r>
-        <w:rPr>
-          <w:sz w:val="24"/>
-          <w:lang w:val="es-ES"/>
-        </w:rPr>
-        <w:t>Tabla Control_ActCult , Por entidad_responsable(isDeleted_0):</w:t>
-      </w:r>
-    </w:p>
-    <w:p>
-      <w:pPr>
-        <w:pStyle w:val="Textbody"/>
-        <w:numPr>
-          <w:ilvl w:val="0"/>
-          <w:numId w:val="5"/>
-        </w:numPr>
-        <w:rPr>
-          <w:sz w:val="24"/>
-          <w:lang w:val="es-ES"/>
-        </w:rPr>
-      </w:pPr>
-      <w:r>
-        <w:rPr>
-          <w:sz w:val="24"/>
-          <w:lang w:val="es-ES"/>
-        </w:rPr>
-        <w:t>InformacionGral: extraPlan_0{planificadas( se cuentan todas menos las extraPlan:true), cumplidas (realizadas)[cantidad,%planificadas,asistencia,presupuestado,gastado] , suspendidas(cantidad de suspendidas y rechazadas)} ,extraPlan_1(cantidad)</w:t>
-      </w:r>
-    </w:p>
-    <w:p>
-      <w:pPr>
-        <w:pStyle w:val="Textbody"/>
-        <w:numPr>
-          <w:ilvl w:val="0"/>
-          <w:numId w:val="5"/>
         </w:numPr>
         <w:rPr>
           <w:sz w:val="24"/>
@@ -10679,125 +10997,6 @@
   <w:abstractNum w:abstractNumId="1">
     <w:lvl w:ilvl="0">
       <w:start w:val="1"/>
-      <w:numFmt w:val="none"/>
-      <w:suff w:val="nothing"/>
-      <w:lvlText w:val="%1"/>
-      <w:lvlJc w:val="left"/>
-      <w:pPr>
-        <w:tabs>
-          <w:tab w:val="num" w:pos="0"/>
-        </w:tabs>
-        <w:ind w:left="0" w:hanging="0"/>
-      </w:pPr>
-    </w:lvl>
-    <w:lvl w:ilvl="1">
-      <w:start w:val="1"/>
-      <w:numFmt w:val="none"/>
-      <w:suff w:val="nothing"/>
-      <w:lvlText w:val="%2"/>
-      <w:lvlJc w:val="left"/>
-      <w:pPr>
-        <w:tabs>
-          <w:tab w:val="num" w:pos="0"/>
-        </w:tabs>
-        <w:ind w:left="0" w:hanging="0"/>
-      </w:pPr>
-    </w:lvl>
-    <w:lvl w:ilvl="2">
-      <w:start w:val="1"/>
-      <w:numFmt w:val="none"/>
-      <w:suff w:val="nothing"/>
-      <w:lvlText w:val="%3"/>
-      <w:lvlJc w:val="left"/>
-      <w:pPr>
-        <w:tabs>
-          <w:tab w:val="num" w:pos="0"/>
-        </w:tabs>
-        <w:ind w:left="0" w:hanging="0"/>
-      </w:pPr>
-    </w:lvl>
-    <w:lvl w:ilvl="3">
-      <w:start w:val="1"/>
-      <w:numFmt w:val="none"/>
-      <w:suff w:val="nothing"/>
-      <w:lvlText w:val="%4"/>
-      <w:lvlJc w:val="left"/>
-      <w:pPr>
-        <w:tabs>
-          <w:tab w:val="num" w:pos="0"/>
-        </w:tabs>
-        <w:ind w:left="0" w:hanging="0"/>
-      </w:pPr>
-    </w:lvl>
-    <w:lvl w:ilvl="4">
-      <w:start w:val="1"/>
-      <w:numFmt w:val="none"/>
-      <w:suff w:val="nothing"/>
-      <w:lvlText w:val="%5"/>
-      <w:lvlJc w:val="left"/>
-      <w:pPr>
-        <w:tabs>
-          <w:tab w:val="num" w:pos="0"/>
-        </w:tabs>
-        <w:ind w:left="0" w:hanging="0"/>
-      </w:pPr>
-    </w:lvl>
-    <w:lvl w:ilvl="5">
-      <w:start w:val="1"/>
-      <w:numFmt w:val="none"/>
-      <w:suff w:val="nothing"/>
-      <w:lvlText w:val="%6"/>
-      <w:lvlJc w:val="left"/>
-      <w:pPr>
-        <w:tabs>
-          <w:tab w:val="num" w:pos="0"/>
-        </w:tabs>
-        <w:ind w:left="0" w:hanging="0"/>
-      </w:pPr>
-    </w:lvl>
-    <w:lvl w:ilvl="6">
-      <w:start w:val="1"/>
-      <w:numFmt w:val="none"/>
-      <w:suff w:val="nothing"/>
-      <w:lvlText w:val="%7"/>
-      <w:lvlJc w:val="left"/>
-      <w:pPr>
-        <w:tabs>
-          <w:tab w:val="num" w:pos="0"/>
-        </w:tabs>
-        <w:ind w:left="0" w:hanging="0"/>
-      </w:pPr>
-    </w:lvl>
-    <w:lvl w:ilvl="7">
-      <w:start w:val="1"/>
-      <w:numFmt w:val="none"/>
-      <w:suff w:val="nothing"/>
-      <w:lvlText w:val="%8"/>
-      <w:lvlJc w:val="left"/>
-      <w:pPr>
-        <w:tabs>
-          <w:tab w:val="num" w:pos="0"/>
-        </w:tabs>
-        <w:ind w:left="0" w:hanging="0"/>
-      </w:pPr>
-    </w:lvl>
-    <w:lvl w:ilvl="8">
-      <w:start w:val="1"/>
-      <w:numFmt w:val="none"/>
-      <w:suff w:val="nothing"/>
-      <w:lvlText w:val="%9"/>
-      <w:lvlJc w:val="left"/>
-      <w:pPr>
-        <w:tabs>
-          <w:tab w:val="num" w:pos="0"/>
-        </w:tabs>
-        <w:ind w:left="0" w:hanging="0"/>
-      </w:pPr>
-    </w:lvl>
-  </w:abstractNum>
-  <w:abstractNum w:abstractNumId="2">
-    <w:lvl w:ilvl="0">
-      <w:start w:val="1"/>
       <w:numFmt w:val="bullet"/>
       <w:lvlText w:val=""/>
       <w:lvlJc w:val="left"/>
@@ -10932,7 +11131,7 @@
       </w:rPr>
     </w:lvl>
   </w:abstractNum>
-  <w:abstractNum w:abstractNumId="3">
+  <w:abstractNum w:abstractNumId="2">
     <w:lvl w:ilvl="0">
       <w:start w:val="1"/>
       <w:numFmt w:val="bullet"/>
@@ -11069,7 +11268,7 @@
       </w:rPr>
     </w:lvl>
   </w:abstractNum>
-  <w:abstractNum w:abstractNumId="4">
+  <w:abstractNum w:abstractNumId="3">
     <w:lvl w:ilvl="0">
       <w:start w:val="1"/>
       <w:numFmt w:val="lowerLetter"/>
@@ -11188,7 +11387,7 @@
       <w:rPr/>
     </w:lvl>
   </w:abstractNum>
-  <w:abstractNum w:abstractNumId="5">
+  <w:abstractNum w:abstractNumId="4">
     <w:lvl w:ilvl="0">
       <w:start w:val="1"/>
       <w:numFmt w:val="lowerLetter"/>
@@ -11305,6 +11504,262 @@
         <w:ind w:left="6480" w:hanging="180"/>
       </w:pPr>
       <w:rPr/>
+    </w:lvl>
+  </w:abstractNum>
+  <w:abstractNum w:abstractNumId="5">
+    <w:lvl w:ilvl="0">
+      <w:start w:val="1"/>
+      <w:numFmt w:val="bullet"/>
+      <w:lvlText w:val=""/>
+      <w:lvlJc w:val="left"/>
+      <w:pPr>
+        <w:tabs>
+          <w:tab w:val="num" w:pos="720"/>
+        </w:tabs>
+        <w:ind w:left="720" w:hanging="360"/>
+      </w:pPr>
+      <w:rPr>
+        <w:rFonts w:ascii="Symbol" w:hAnsi="Symbol" w:cs="Symbol" w:hint="default"/>
+      </w:rPr>
+    </w:lvl>
+    <w:lvl w:ilvl="1">
+      <w:start w:val="1"/>
+      <w:numFmt w:val="bullet"/>
+      <w:lvlText w:val="◦"/>
+      <w:lvlJc w:val="left"/>
+      <w:pPr>
+        <w:tabs>
+          <w:tab w:val="num" w:pos="1080"/>
+        </w:tabs>
+        <w:ind w:left="1080" w:hanging="360"/>
+      </w:pPr>
+      <w:rPr>
+        <w:rFonts w:ascii="OpenSymbol" w:hAnsi="OpenSymbol" w:cs="OpenSymbol" w:hint="default"/>
+      </w:rPr>
+    </w:lvl>
+    <w:lvl w:ilvl="2">
+      <w:start w:val="1"/>
+      <w:numFmt w:val="bullet"/>
+      <w:lvlText w:val="▪"/>
+      <w:lvlJc w:val="left"/>
+      <w:pPr>
+        <w:tabs>
+          <w:tab w:val="num" w:pos="1440"/>
+        </w:tabs>
+        <w:ind w:left="1440" w:hanging="360"/>
+      </w:pPr>
+      <w:rPr>
+        <w:rFonts w:ascii="OpenSymbol" w:hAnsi="OpenSymbol" w:cs="OpenSymbol" w:hint="default"/>
+      </w:rPr>
+    </w:lvl>
+    <w:lvl w:ilvl="3">
+      <w:start w:val="1"/>
+      <w:numFmt w:val="bullet"/>
+      <w:lvlText w:val=""/>
+      <w:lvlJc w:val="left"/>
+      <w:pPr>
+        <w:tabs>
+          <w:tab w:val="num" w:pos="1800"/>
+        </w:tabs>
+        <w:ind w:left="1800" w:hanging="360"/>
+      </w:pPr>
+      <w:rPr>
+        <w:rFonts w:ascii="Symbol" w:hAnsi="Symbol" w:cs="Symbol" w:hint="default"/>
+      </w:rPr>
+    </w:lvl>
+    <w:lvl w:ilvl="4">
+      <w:start w:val="1"/>
+      <w:numFmt w:val="bullet"/>
+      <w:lvlText w:val="◦"/>
+      <w:lvlJc w:val="left"/>
+      <w:pPr>
+        <w:tabs>
+          <w:tab w:val="num" w:pos="2160"/>
+        </w:tabs>
+        <w:ind w:left="2160" w:hanging="360"/>
+      </w:pPr>
+      <w:rPr>
+        <w:rFonts w:ascii="OpenSymbol" w:hAnsi="OpenSymbol" w:cs="OpenSymbol" w:hint="default"/>
+      </w:rPr>
+    </w:lvl>
+    <w:lvl w:ilvl="5">
+      <w:start w:val="1"/>
+      <w:numFmt w:val="bullet"/>
+      <w:lvlText w:val="▪"/>
+      <w:lvlJc w:val="left"/>
+      <w:pPr>
+        <w:tabs>
+          <w:tab w:val="num" w:pos="2520"/>
+        </w:tabs>
+        <w:ind w:left="2520" w:hanging="360"/>
+      </w:pPr>
+      <w:rPr>
+        <w:rFonts w:ascii="OpenSymbol" w:hAnsi="OpenSymbol" w:cs="OpenSymbol" w:hint="default"/>
+      </w:rPr>
+    </w:lvl>
+    <w:lvl w:ilvl="6">
+      <w:start w:val="1"/>
+      <w:numFmt w:val="bullet"/>
+      <w:lvlText w:val=""/>
+      <w:lvlJc w:val="left"/>
+      <w:pPr>
+        <w:tabs>
+          <w:tab w:val="num" w:pos="2880"/>
+        </w:tabs>
+        <w:ind w:left="2880" w:hanging="360"/>
+      </w:pPr>
+      <w:rPr>
+        <w:rFonts w:ascii="Symbol" w:hAnsi="Symbol" w:cs="Symbol" w:hint="default"/>
+      </w:rPr>
+    </w:lvl>
+    <w:lvl w:ilvl="7">
+      <w:start w:val="1"/>
+      <w:numFmt w:val="bullet"/>
+      <w:lvlText w:val="◦"/>
+      <w:lvlJc w:val="left"/>
+      <w:pPr>
+        <w:tabs>
+          <w:tab w:val="num" w:pos="3240"/>
+        </w:tabs>
+        <w:ind w:left="3240" w:hanging="360"/>
+      </w:pPr>
+      <w:rPr>
+        <w:rFonts w:ascii="OpenSymbol" w:hAnsi="OpenSymbol" w:cs="OpenSymbol" w:hint="default"/>
+      </w:rPr>
+    </w:lvl>
+    <w:lvl w:ilvl="8">
+      <w:start w:val="1"/>
+      <w:numFmt w:val="bullet"/>
+      <w:lvlText w:val="▪"/>
+      <w:lvlJc w:val="left"/>
+      <w:pPr>
+        <w:tabs>
+          <w:tab w:val="num" w:pos="3600"/>
+        </w:tabs>
+        <w:ind w:left="3600" w:hanging="360"/>
+      </w:pPr>
+      <w:rPr>
+        <w:rFonts w:ascii="OpenSymbol" w:hAnsi="OpenSymbol" w:cs="OpenSymbol" w:hint="default"/>
+      </w:rPr>
+    </w:lvl>
+  </w:abstractNum>
+  <w:abstractNum w:abstractNumId="6">
+    <w:lvl w:ilvl="0">
+      <w:start w:val="1"/>
+      <w:numFmt w:val="none"/>
+      <w:suff w:val="nothing"/>
+      <w:lvlText w:val=""/>
+      <w:lvlJc w:val="left"/>
+      <w:pPr>
+        <w:tabs>
+          <w:tab w:val="num" w:pos="0"/>
+        </w:tabs>
+        <w:ind w:left="0" w:hanging="0"/>
+      </w:pPr>
+    </w:lvl>
+    <w:lvl w:ilvl="1">
+      <w:start w:val="1"/>
+      <w:numFmt w:val="none"/>
+      <w:suff w:val="nothing"/>
+      <w:lvlText w:val=""/>
+      <w:lvlJc w:val="left"/>
+      <w:pPr>
+        <w:tabs>
+          <w:tab w:val="num" w:pos="0"/>
+        </w:tabs>
+        <w:ind w:left="0" w:hanging="0"/>
+      </w:pPr>
+    </w:lvl>
+    <w:lvl w:ilvl="2">
+      <w:start w:val="1"/>
+      <w:numFmt w:val="none"/>
+      <w:suff w:val="nothing"/>
+      <w:lvlText w:val=""/>
+      <w:lvlJc w:val="left"/>
+      <w:pPr>
+        <w:tabs>
+          <w:tab w:val="num" w:pos="0"/>
+        </w:tabs>
+        <w:ind w:left="0" w:hanging="0"/>
+      </w:pPr>
+    </w:lvl>
+    <w:lvl w:ilvl="3">
+      <w:start w:val="1"/>
+      <w:numFmt w:val="none"/>
+      <w:suff w:val="nothing"/>
+      <w:lvlText w:val=""/>
+      <w:lvlJc w:val="left"/>
+      <w:pPr>
+        <w:tabs>
+          <w:tab w:val="num" w:pos="0"/>
+        </w:tabs>
+        <w:ind w:left="0" w:hanging="0"/>
+      </w:pPr>
+    </w:lvl>
+    <w:lvl w:ilvl="4">
+      <w:start w:val="1"/>
+      <w:numFmt w:val="none"/>
+      <w:suff w:val="nothing"/>
+      <w:lvlText w:val=""/>
+      <w:lvlJc w:val="left"/>
+      <w:pPr>
+        <w:tabs>
+          <w:tab w:val="num" w:pos="0"/>
+        </w:tabs>
+        <w:ind w:left="0" w:hanging="0"/>
+      </w:pPr>
+    </w:lvl>
+    <w:lvl w:ilvl="5">
+      <w:start w:val="1"/>
+      <w:numFmt w:val="none"/>
+      <w:suff w:val="nothing"/>
+      <w:lvlText w:val=""/>
+      <w:lvlJc w:val="left"/>
+      <w:pPr>
+        <w:tabs>
+          <w:tab w:val="num" w:pos="0"/>
+        </w:tabs>
+        <w:ind w:left="0" w:hanging="0"/>
+      </w:pPr>
+    </w:lvl>
+    <w:lvl w:ilvl="6">
+      <w:start w:val="1"/>
+      <w:numFmt w:val="none"/>
+      <w:suff w:val="nothing"/>
+      <w:lvlText w:val=""/>
+      <w:lvlJc w:val="left"/>
+      <w:pPr>
+        <w:tabs>
+          <w:tab w:val="num" w:pos="0"/>
+        </w:tabs>
+        <w:ind w:left="0" w:hanging="0"/>
+      </w:pPr>
+    </w:lvl>
+    <w:lvl w:ilvl="7">
+      <w:start w:val="1"/>
+      <w:numFmt w:val="none"/>
+      <w:suff w:val="nothing"/>
+      <w:lvlText w:val=""/>
+      <w:lvlJc w:val="left"/>
+      <w:pPr>
+        <w:tabs>
+          <w:tab w:val="num" w:pos="0"/>
+        </w:tabs>
+        <w:ind w:left="0" w:hanging="0"/>
+      </w:pPr>
+    </w:lvl>
+    <w:lvl w:ilvl="8">
+      <w:start w:val="1"/>
+      <w:numFmt w:val="none"/>
+      <w:suff w:val="nothing"/>
+      <w:lvlText w:val=""/>
+      <w:lvlJc w:val="left"/>
+      <w:pPr>
+        <w:tabs>
+          <w:tab w:val="num" w:pos="0"/>
+        </w:tabs>
+        <w:ind w:left="0" w:hanging="0"/>
+      </w:pPr>
     </w:lvl>
   </w:abstractNum>
   <w:num w:numId="1">
@@ -11322,6 +11777,9 @@
   <w:num w:numId="5">
     <w:abstractNumId w:val="5"/>
   </w:num>
+  <w:num w:numId="6">
+    <w:abstractNumId w:val="6"/>
+  </w:num>
 </w:numbering>
 </file>
 
@@ -11348,9 +11806,7 @@
     <w:pPr>
       <w:widowControl/>
       <w:suppressAutoHyphens w:val="true"/>
-      <w:kinsoku w:val="true"/>
-      <w:overflowPunct w:val="true"/>
-      <w:autoSpaceDE w:val="true"/>
+      <w:overflowPunct w:val="false"/>
       <w:bidi w:val="0"/>
       <w:spacing w:before="0" w:after="160"/>
       <w:jc w:val="left"/>
@@ -11483,6 +11939,13 @@
       <w:szCs w:val="18"/>
     </w:rPr>
   </w:style>
+  <w:style w:type="character" w:styleId="Bullets">
+    <w:name w:val="Bullets"/>
+    <w:qFormat/>
+    <w:rPr>
+      <w:rFonts w:ascii="OpenSymbol" w:hAnsi="OpenSymbol" w:eastAsia="OpenSymbol" w:cs="OpenSymbol"/>
+    </w:rPr>
+  </w:style>
   <w:style w:type="paragraph" w:styleId="Heading">
     <w:name w:val="Heading"/>
     <w:basedOn w:val="Standard"/>
@@ -11547,9 +12010,7 @@
     <w:pPr>
       <w:widowControl/>
       <w:suppressAutoHyphens w:val="true"/>
-      <w:kinsoku w:val="true"/>
-      <w:overflowPunct w:val="true"/>
-      <w:autoSpaceDE w:val="true"/>
+      <w:overflowPunct w:val="false"/>
       <w:bidi w:val="0"/>
       <w:spacing w:before="0" w:after="160"/>
       <w:jc w:val="left"/>
@@ -11630,9 +12091,7 @@
     <w:pPr>
       <w:widowControl/>
       <w:suppressAutoHyphens w:val="true"/>
-      <w:kinsoku w:val="true"/>
-      <w:overflowPunct w:val="true"/>
-      <w:autoSpaceDE w:val="true"/>
+      <w:overflowPunct w:val="false"/>
       <w:bidi w:val="0"/>
       <w:spacing w:before="0" w:after="0"/>
       <w:jc w:val="left"/>

</xml_diff>